<commit_message>
Step 1D backend: live speech recognition and translation from any language
</commit_message>
<xml_diff>
--- a/docs/DEVELOPER-HANDBOOK.docx
+++ b/docs/DEVELOPER-HANDBOOK.docx
@@ -170,7 +170,7 @@
                 <w:sz w:val="19"/>
                 <w:szCs w:val="19"/>
               </w:rPr>
-              <w:t xml:space="preserve">https://github.com/vikasvardhan7/Ai-translator</w:t>
+              <w:t xml:space="preserve">The project repository on GitHub (copy its address from the Code button)</w:t>
             </w:r>
           </w:p>
         </w:tc>
@@ -230,7 +230,7 @@
                 <w:sz w:val="19"/>
                 <w:szCs w:val="19"/>
               </w:rPr>
-              <w:t xml:space="preserve">1.1, 18 October 2026 (aligned with docs/PROTOCOL.md after Step 1C)</w:t>
+              <w:t xml:space="preserve">1.2, 18 October 2026 (aligned with docs/PROTOCOL.md during Step 1D)</w:t>
             </w:r>
           </w:p>
         </w:tc>
@@ -1899,55 +1899,6 @@
     </w:p>
     <w:p>
       <w:pPr>
-        <w:pBdr>
-          <w:left w:val="single" w:color="BF8700" w:sz="18" w:space="6"/>
-        </w:pBdr>
-        <w:shd w:fill="FFF8E6" w:color="auto" w:val="clear"/>
-        <w:spacing w:after="160" w:before="80" w:line="264"/>
-        <w:ind w:left="180"/>
-      </w:pPr>
-      <w:r>
-        <w:rPr>
-          <w:sz w:val="20"/>
-          <w:szCs w:val="20"/>
-        </w:rPr>
-        <w:t xml:space="preserve">Each developer may use a coding agent. Agent files such as </w:t>
-      </w:r>
-      <w:r>
-        <w:rPr>
-          <w:rFonts w:ascii="Consolas" w:cs="Consolas" w:eastAsia="Consolas" w:hAnsi="Consolas"/>
-          <w:color w:val="24292F"/>
-          <w:sz w:val="20"/>
-          <w:szCs w:val="20"/>
-        </w:rPr>
-        <w:t xml:space="preserve">CLAUDE.md</w:t>
-      </w:r>
-      <w:r>
-        <w:rPr>
-          <w:sz w:val="20"/>
-          <w:szCs w:val="20"/>
-        </w:rPr>
-        <w:t xml:space="preserve"> and </w:t>
-      </w:r>
-      <w:r>
-        <w:rPr>
-          <w:rFonts w:ascii="Consolas" w:cs="Consolas" w:eastAsia="Consolas" w:hAnsi="Consolas"/>
-          <w:color w:val="24292F"/>
-          <w:sz w:val="20"/>
-          <w:szCs w:val="20"/>
-        </w:rPr>
-        <w:t xml:space="preserve">AGENTS.md</w:t>
-      </w:r>
-      <w:r>
-        <w:rPr>
-          <w:sz w:val="20"/>
-          <w:szCs w:val="20"/>
-        </w:rPr>
-        <w:t xml:space="preserve"> stay on each computer and are ignored by Git. Give your agent the rules in section 4 and tell it to work only inside your folder.</w:t>
-      </w:r>
-    </w:p>
-    <w:p>
-      <w:pPr>
         <w:pStyle w:val="Heading1"/>
         <w:pageBreakBefore/>
         <w:spacing w:after="160" w:before="0"/>
@@ -1961,7 +1912,7 @@
         <w:spacing w:after="120" w:line="276"/>
       </w:pPr>
       <w:r>
-        <w:t xml:space="preserve">The browser records and plays audio and shows captions. The backend runs speech recognition, translation and voice behind three replaceable interfaces. One WebSocket carries audio to the backend and results back. Normal REST calls handle sessions, the language list, history and exports.</w:t>
+        <w:t xml:space="preserve">The browser records and plays audio and shows captions. The backend runs speech recognition, translation and voice behind three replaceable interfaces. One WebSocket carries audio to the backend and results back. Normal REST calls handle sessions, history and exports.</w:t>
       </w:r>
     </w:p>
     <w:p>
@@ -3011,7 +2962,7 @@
                 <w:sz w:val="19"/>
                 <w:szCs w:val="19"/>
               </w:rPr>
-              <w:t xml:space="preserve">Languages list and sessions API</w:t>
+              <w:t xml:space="preserve">Language codes and sessions API</w:t>
             </w:r>
           </w:p>
         </w:tc>
@@ -4074,7 +4025,7 @@
           <w:sz w:val="18"/>
           <w:szCs w:val="18"/>
         </w:rPr>
-        <w:t xml:space="preserve">git clone https://github.com/vikasvardhan7/Ai-translator.git C:\dev\Ai-translator</w:t>
+        <w:t xml:space="preserve">git clone &lt;repository address&gt; C:\dev\Ai-translator</w:t>
       </w:r>
     </w:p>
     <w:p>
@@ -4290,7 +4241,7 @@
           <w:sz w:val="19"/>
           <w:szCs w:val="19"/>
         </w:rPr>
-        <w:t xml:space="preserve">{"status":"ok","version":"0.3.0"}</w:t>
+        <w:t xml:space="preserve">{"status":"ok","version":"0.4.0"}</w:t>
       </w:r>
       <w:r>
         <w:t xml:space="preserve">.</w:t>
@@ -6737,7 +6688,7 @@
                 <w:sz w:val="19"/>
                 <w:szCs w:val="19"/>
               </w:rPr>
-              <w:t xml:space="preserve">{"status":"ok","version":"0.3.0"}</w:t>
+              <w:t xml:space="preserve">{"status":"ok","version":"0.4.0"}</w:t>
             </w:r>
             <w:r>
               <w:rPr>
@@ -6777,7 +6728,7 @@
                 <w:sz w:val="19"/>
                 <w:szCs w:val="19"/>
               </w:rPr>
-              <w:t xml:space="preserve">GET /api/languages</w:t>
+              <w:t xml:space="preserve">POST /api/sessions</w:t>
             </w:r>
           </w:p>
         </w:tc>
@@ -6835,7 +6786,7 @@
                 <w:sz w:val="19"/>
                 <w:szCs w:val="19"/>
               </w:rPr>
-              <w:t xml:space="preserve">List of supported languages for the pickers.</w:t>
+              <w:t xml:space="preserve">Start a conversation with two participants and their preferred languages. Returns the session id.</w:t>
             </w:r>
           </w:p>
         </w:tc>
@@ -6868,7 +6819,7 @@
                 <w:sz w:val="19"/>
                 <w:szCs w:val="19"/>
               </w:rPr>
-              <w:t xml:space="preserve">POST /api/sessions</w:t>
+              <w:t xml:space="preserve">WS /api/sessions/{session_id}/stream</w:t>
             </w:r>
           </w:p>
         </w:tc>
@@ -6926,7 +6877,7 @@
                 <w:sz w:val="19"/>
                 <w:szCs w:val="19"/>
               </w:rPr>
-              <w:t xml:space="preserve">Start a conversation with two participants and their preferred languages. Returns the session id.</w:t>
+              <w:t xml:space="preserve">Live channel: audio in, captions and events out.</w:t>
             </w:r>
           </w:p>
         </w:tc>
@@ -6959,7 +6910,7 @@
                 <w:sz w:val="19"/>
                 <w:szCs w:val="19"/>
               </w:rPr>
-              <w:t xml:space="preserve">WS /api/sessions/{session_id}/stream</w:t>
+              <w:t xml:space="preserve">POST /api/sessions/{session_id}/stop</w:t>
             </w:r>
           </w:p>
         </w:tc>
@@ -6988,7 +6939,7 @@
                 <w:sz w:val="19"/>
                 <w:szCs w:val="19"/>
               </w:rPr>
-              <w:t xml:space="preserve">1B</w:t>
+              <w:t xml:space="preserve">1F</w:t>
             </w:r>
           </w:p>
         </w:tc>
@@ -7017,7 +6968,7 @@
                 <w:sz w:val="19"/>
                 <w:szCs w:val="19"/>
               </w:rPr>
-              <w:t xml:space="preserve">Live channel: audio in, captions and events out.</w:t>
+              <w:t xml:space="preserve">End the conversation and save the transcript.</w:t>
             </w:r>
           </w:p>
         </w:tc>
@@ -7050,7 +7001,7 @@
                 <w:sz w:val="19"/>
                 <w:szCs w:val="19"/>
               </w:rPr>
-              <w:t xml:space="preserve">POST /api/sessions/{session_id}/stop</w:t>
+              <w:t xml:space="preserve">GET /api/sessions</w:t>
             </w:r>
           </w:p>
         </w:tc>
@@ -7108,7 +7059,7 @@
                 <w:sz w:val="19"/>
                 <w:szCs w:val="19"/>
               </w:rPr>
-              <w:t xml:space="preserve">End the conversation and save the transcript.</w:t>
+              <w:t xml:space="preserve">List past conversations, newest first.</w:t>
             </w:r>
           </w:p>
         </w:tc>
@@ -7141,7 +7092,7 @@
                 <w:sz w:val="19"/>
                 <w:szCs w:val="19"/>
               </w:rPr>
-              <w:t xml:space="preserve">GET /api/sessions</w:t>
+              <w:t xml:space="preserve">GET /api/sessions/{session_id}/transcript</w:t>
             </w:r>
           </w:p>
         </w:tc>
@@ -7199,7 +7150,7 @@
                 <w:sz w:val="19"/>
                 <w:szCs w:val="19"/>
               </w:rPr>
-              <w:t xml:space="preserve">List past conversations, newest first.</w:t>
+              <w:t xml:space="preserve">All saved turns of one conversation.</w:t>
             </w:r>
           </w:p>
         </w:tc>
@@ -7232,7 +7183,7 @@
                 <w:sz w:val="19"/>
                 <w:szCs w:val="19"/>
               </w:rPr>
-              <w:t xml:space="preserve">GET /api/sessions/{session_id}/transcript</w:t>
+              <w:t xml:space="preserve">GET /api/sessions/{session_id}/export?format=txt|srt|vtt|json</w:t>
             </w:r>
           </w:p>
         </w:tc>
@@ -7290,7 +7241,7 @@
                 <w:sz w:val="19"/>
                 <w:szCs w:val="19"/>
               </w:rPr>
-              <w:t xml:space="preserve">All saved turns of one conversation.</w:t>
+              <w:t xml:space="preserve">Download the transcript as a file.</w:t>
             </w:r>
           </w:p>
         </w:tc>
@@ -7323,97 +7274,6 @@
                 <w:sz w:val="19"/>
                 <w:szCs w:val="19"/>
               </w:rPr>
-              <w:t xml:space="preserve">GET /api/sessions/{session_id}/export?format=txt|srt|vtt|json</w:t>
-            </w:r>
-          </w:p>
-        </w:tc>
-        <w:tc>
-          <w:tcPr>
-            <w:tcW w:type="dxa" w:w="771"/>
-            <w:tcBorders>
-              <w:top w:val="single" w:color="C9D1D9" w:sz="4"/>
-              <w:left w:val="single" w:color="C9D1D9" w:sz="4"/>
-              <w:bottom w:val="single" w:color="C9D1D9" w:sz="4"/>
-              <w:right w:val="single" w:color="C9D1D9" w:sz="4"/>
-            </w:tcBorders>
-            <w:tcMar>
-              <w:top w:type="dxa" w:w="60"/>
-              <w:left w:type="dxa" w:w="100"/>
-              <w:bottom w:type="dxa" w:w="60"/>
-              <w:right w:type="dxa" w:w="100"/>
-            </w:tcMar>
-          </w:tcPr>
-          <w:p>
-            <w:pPr>
-              <w:spacing w:after="40" w:line="252"/>
-            </w:pPr>
-            <w:r>
-              <w:rPr>
-                <w:sz w:val="19"/>
-                <w:szCs w:val="19"/>
-              </w:rPr>
-              <w:t xml:space="preserve">1F</w:t>
-            </w:r>
-          </w:p>
-        </w:tc>
-        <w:tc>
-          <w:tcPr>
-            <w:tcW w:type="dxa" w:w="4241"/>
-            <w:tcBorders>
-              <w:top w:val="single" w:color="C9D1D9" w:sz="4"/>
-              <w:left w:val="single" w:color="C9D1D9" w:sz="4"/>
-              <w:bottom w:val="single" w:color="C9D1D9" w:sz="4"/>
-              <w:right w:val="single" w:color="C9D1D9" w:sz="4"/>
-            </w:tcBorders>
-            <w:tcMar>
-              <w:top w:type="dxa" w:w="60"/>
-              <w:left w:type="dxa" w:w="100"/>
-              <w:bottom w:type="dxa" w:w="60"/>
-              <w:right w:type="dxa" w:w="100"/>
-            </w:tcMar>
-          </w:tcPr>
-          <w:p>
-            <w:pPr>
-              <w:spacing w:after="40" w:line="252"/>
-            </w:pPr>
-            <w:r>
-              <w:rPr>
-                <w:sz w:val="19"/>
-                <w:szCs w:val="19"/>
-              </w:rPr>
-              <w:t xml:space="preserve">Download the transcript as a file.</w:t>
-            </w:r>
-          </w:p>
-        </w:tc>
-      </w:tr>
-      <w:tr>
-        <w:tc>
-          <w:tcPr>
-            <w:tcW w:type="dxa" w:w="4626"/>
-            <w:tcBorders>
-              <w:top w:val="single" w:color="C9D1D9" w:sz="4"/>
-              <w:left w:val="single" w:color="C9D1D9" w:sz="4"/>
-              <w:bottom w:val="single" w:color="C9D1D9" w:sz="4"/>
-              <w:right w:val="single" w:color="C9D1D9" w:sz="4"/>
-            </w:tcBorders>
-            <w:tcMar>
-              <w:top w:type="dxa" w:w="60"/>
-              <w:left w:type="dxa" w:w="100"/>
-              <w:bottom w:type="dxa" w:w="60"/>
-              <w:right w:type="dxa" w:w="100"/>
-            </w:tcMar>
-          </w:tcPr>
-          <w:p>
-            <w:pPr>
-              <w:spacing w:after="40" w:line="252"/>
-            </w:pPr>
-            <w:r>
-              <w:rPr>
-                <w:rFonts w:ascii="Consolas" w:cs="Consolas" w:eastAsia="Consolas" w:hAnsi="Consolas"/>
-                <w:color w:val="24292F"/>
-                <w:sz w:val="19"/>
-                <w:szCs w:val="19"/>
-              </w:rPr>
               <w:t xml:space="preserve">DELETE /api/sessions/{session_id}</w:t>
             </w:r>
           </w:p>
@@ -7489,7 +7349,140 @@
         <w:spacing w:after="80" w:before="200"/>
       </w:pPr>
       <w:r>
-        <w:t xml:space="preserve">GET /api/languages: response</w:t>
+        <w:t xml:space="preserve">Language codes</w:t>
+      </w:r>
+    </w:p>
+    <w:p>
+      <w:pPr>
+        <w:spacing w:after="120" w:line="276"/>
+      </w:pPr>
+      <w:r>
+        <w:t xml:space="preserve">There is no fixed language list. A language is any ISO 639 code: two letters when one exists, otherwise three (</w:t>
+      </w:r>
+      <w:r>
+        <w:rPr>
+          <w:rFonts w:ascii="Consolas" w:cs="Consolas" w:eastAsia="Consolas" w:hAnsi="Consolas"/>
+          <w:color w:val="24292F"/>
+          <w:sz w:val="19"/>
+          <w:szCs w:val="19"/>
+        </w:rPr>
+        <w:t xml:space="preserve">te</w:t>
+      </w:r>
+      <w:r>
+        <w:t xml:space="preserve">, </w:t>
+      </w:r>
+      <w:r>
+        <w:rPr>
+          <w:rFonts w:ascii="Consolas" w:cs="Consolas" w:eastAsia="Consolas" w:hAnsi="Consolas"/>
+          <w:color w:val="24292F"/>
+          <w:sz w:val="19"/>
+          <w:szCs w:val="19"/>
+        </w:rPr>
+        <w:t xml:space="preserve">hi</w:t>
+      </w:r>
+      <w:r>
+        <w:t xml:space="preserve">, </w:t>
+      </w:r>
+      <w:r>
+        <w:rPr>
+          <w:rFonts w:ascii="Consolas" w:cs="Consolas" w:eastAsia="Consolas" w:hAnsi="Consolas"/>
+          <w:color w:val="24292F"/>
+          <w:sz w:val="19"/>
+          <w:szCs w:val="19"/>
+        </w:rPr>
+        <w:t xml:space="preserve">en</w:t>
+      </w:r>
+      <w:r>
+        <w:t xml:space="preserve">, </w:t>
+      </w:r>
+      <w:r>
+        <w:rPr>
+          <w:rFonts w:ascii="Consolas" w:cs="Consolas" w:eastAsia="Consolas" w:hAnsi="Consolas"/>
+          <w:color w:val="24292F"/>
+          <w:sz w:val="19"/>
+          <w:szCs w:val="19"/>
+        </w:rPr>
+        <w:t xml:space="preserve">yue</w:t>
+      </w:r>
+      <w:r>
+        <w:t xml:space="preserve">, </w:t>
+      </w:r>
+      <w:r>
+        <w:rPr>
+          <w:rFonts w:ascii="Consolas" w:cs="Consolas" w:eastAsia="Consolas" w:hAnsi="Consolas"/>
+          <w:color w:val="24292F"/>
+          <w:sz w:val="19"/>
+          <w:szCs w:val="19"/>
+        </w:rPr>
+        <w:t xml:space="preserve">fil</w:t>
+      </w:r>
+      <w:r>
+        <w:t xml:space="preserve">). The backend accepts regional forms such as </w:t>
+      </w:r>
+      <w:r>
+        <w:rPr>
+          <w:rFonts w:ascii="Consolas" w:cs="Consolas" w:eastAsia="Consolas" w:hAnsi="Consolas"/>
+          <w:color w:val="24292F"/>
+          <w:sz w:val="19"/>
+          <w:szCs w:val="19"/>
+        </w:rPr>
+        <w:t xml:space="preserve">pt-BR</w:t>
+      </w:r>
+      <w:r>
+        <w:t xml:space="preserve"> and keeps only the language part. Text that is not a code, such as </w:t>
+      </w:r>
+      <w:r>
+        <w:rPr>
+          <w:rFonts w:ascii="Consolas" w:cs="Consolas" w:eastAsia="Consolas" w:hAnsi="Consolas"/>
+          <w:color w:val="24292F"/>
+          <w:sz w:val="19"/>
+          <w:szCs w:val="19"/>
+        </w:rPr>
+        <w:t xml:space="preserve">Telugu</w:t>
+      </w:r>
+      <w:r>
+        <w:t xml:space="preserve">, is refused.</w:t>
+      </w:r>
+    </w:p>
+    <w:p>
+      <w:pPr>
+        <w:spacing w:after="120" w:line="276"/>
+      </w:pPr>
+      <w:r>
+        <w:t xml:space="preserve">The frontend builds the language picker from the browser: </w:t>
+      </w:r>
+      <w:r>
+        <w:rPr>
+          <w:rFonts w:ascii="Consolas" w:cs="Consolas" w:eastAsia="Consolas" w:hAnsi="Consolas"/>
+          <w:color w:val="24292F"/>
+          <w:sz w:val="19"/>
+          <w:szCs w:val="19"/>
+        </w:rPr>
+        <w:t xml:space="preserve">Intl.DisplayNames</w:t>
+      </w:r>
+      <w:r>
+        <w:t xml:space="preserve"> gives the name of every code it knows, in English and in the language itself. The speech service reports the detected language code and its English name live in </w:t>
+      </w:r>
+      <w:r>
+        <w:rPr>
+          <w:rFonts w:ascii="Consolas" w:cs="Consolas" w:eastAsia="Consolas" w:hAnsi="Consolas"/>
+          <w:color w:val="24292F"/>
+          <w:sz w:val="19"/>
+          <w:szCs w:val="19"/>
+        </w:rPr>
+        <w:t xml:space="preserve">transcript.final</w:t>
+      </w:r>
+      <w:r>
+        <w:t xml:space="preserve">.</w:t>
+      </w:r>
+    </w:p>
+    <w:p>
+      <w:pPr>
+        <w:pStyle w:val="Heading3"/>
+        <w:spacing w:after="80" w:before="200"/>
+      </w:pPr>
+      <w:r>
+        <w:t xml:space="preserve">POST /api/sessions: request and response</w:t>
       </w:r>
     </w:p>
     <w:p>
@@ -7508,7 +7501,7 @@
           <w:sz w:val="18"/>
           <w:szCs w:val="18"/>
         </w:rPr>
-        <w:t xml:space="preserve">{</w:t>
+        <w:t xml:space="preserve">// request</w:t>
       </w:r>
     </w:p>
     <w:p>
@@ -7527,7 +7520,7 @@
           <w:sz w:val="18"/>
           <w:szCs w:val="18"/>
         </w:rPr>
-        <w:t xml:space="preserve">  "languages": [</w:t>
+        <w:t xml:space="preserve">{</w:t>
       </w:r>
     </w:p>
     <w:p>
@@ -7546,7 +7539,7 @@
           <w:sz w:val="18"/>
           <w:szCs w:val="18"/>
         </w:rPr>
-        <w:t xml:space="preserve">    { "code": "en", "name": "English", "native_name": "English" },</w:t>
+        <w:t xml:space="preserve">  "consent": true,</w:t>
       </w:r>
     </w:p>
     <w:p>
@@ -7565,7 +7558,7 @@
           <w:sz w:val="18"/>
           <w:szCs w:val="18"/>
         </w:rPr>
-        <w:t xml:space="preserve">    { "code": "te", "name": "Telugu",  "native_name": "తెలుగు" },</w:t>
+        <w:t xml:space="preserve">  "participants": [</w:t>
       </w:r>
     </w:p>
     <w:p>
@@ -7584,7 +7577,7 @@
           <w:sz w:val="18"/>
           <w:szCs w:val="18"/>
         </w:rPr>
-        <w:t xml:space="preserve">    { "code": "hi", "name": "Hindi",   "native_name": "हिन्दी" }</w:t>
+        <w:t xml:space="preserve">    { "id": "A", "name": "Person A", "preferred_language": "en" },</w:t>
       </w:r>
     </w:p>
     <w:p>
@@ -7603,7 +7596,159 @@
           <w:sz w:val="18"/>
           <w:szCs w:val="18"/>
         </w:rPr>
+        <w:t xml:space="preserve">    { "id": "B", "name": "Person B", "preferred_language": "te" }</w:t>
+      </w:r>
+    </w:p>
+    <w:p>
+      <w:pPr>
+        <w:pBdr>
+          <w:left w:val="single" w:color="0969DA" w:sz="12" w:space="6"/>
+        </w:pBdr>
+        <w:shd w:fill="F6F8FA" w:color="auto" w:val="clear"/>
+        <w:spacing w:after="0" w:before="0" w:line="252"/>
+        <w:ind w:left="180"/>
+      </w:pPr>
+      <w:r>
+        <w:rPr>
+          <w:rFonts w:ascii="Consolas" w:cs="Consolas" w:eastAsia="Consolas" w:hAnsi="Consolas"/>
+          <w:color w:val="24292F"/>
+          <w:sz w:val="18"/>
+          <w:szCs w:val="18"/>
+        </w:rPr>
         <w:t xml:space="preserve">  ]</w:t>
+      </w:r>
+    </w:p>
+    <w:p>
+      <w:pPr>
+        <w:pBdr>
+          <w:left w:val="single" w:color="0969DA" w:sz="12" w:space="6"/>
+        </w:pBdr>
+        <w:shd w:fill="F6F8FA" w:color="auto" w:val="clear"/>
+        <w:spacing w:after="0" w:before="0" w:line="252"/>
+        <w:ind w:left="180"/>
+      </w:pPr>
+      <w:r>
+        <w:rPr>
+          <w:rFonts w:ascii="Consolas" w:cs="Consolas" w:eastAsia="Consolas" w:hAnsi="Consolas"/>
+          <w:color w:val="24292F"/>
+          <w:sz w:val="18"/>
+          <w:szCs w:val="18"/>
+        </w:rPr>
+        <w:t xml:space="preserve">}</w:t>
+      </w:r>
+    </w:p>
+    <w:p>
+      <w:pPr>
+        <w:pBdr>
+          <w:left w:val="single" w:color="0969DA" w:sz="12" w:space="6"/>
+        </w:pBdr>
+        <w:shd w:fill="F6F8FA" w:color="auto" w:val="clear"/>
+        <w:spacing w:after="0" w:before="0" w:line="252"/>
+        <w:ind w:left="180"/>
+      </w:pPr>
+      <w:r>
+        <w:rPr>
+          <w:rFonts w:ascii="Consolas" w:cs="Consolas" w:eastAsia="Consolas" w:hAnsi="Consolas"/>
+          <w:color w:val="24292F"/>
+          <w:sz w:val="18"/>
+          <w:szCs w:val="18"/>
+        </w:rPr>
+        <w:t xml:space="preserve"> </w:t>
+      </w:r>
+    </w:p>
+    <w:p>
+      <w:pPr>
+        <w:pBdr>
+          <w:left w:val="single" w:color="0969DA" w:sz="12" w:space="6"/>
+        </w:pBdr>
+        <w:shd w:fill="F6F8FA" w:color="auto" w:val="clear"/>
+        <w:spacing w:after="0" w:before="0" w:line="252"/>
+        <w:ind w:left="180"/>
+      </w:pPr>
+      <w:r>
+        <w:rPr>
+          <w:rFonts w:ascii="Consolas" w:cs="Consolas" w:eastAsia="Consolas" w:hAnsi="Consolas"/>
+          <w:color w:val="24292F"/>
+          <w:sz w:val="18"/>
+          <w:szCs w:val="18"/>
+        </w:rPr>
+        <w:t xml:space="preserve">// response: 201 Created</w:t>
+      </w:r>
+    </w:p>
+    <w:p>
+      <w:pPr>
+        <w:pBdr>
+          <w:left w:val="single" w:color="0969DA" w:sz="12" w:space="6"/>
+        </w:pBdr>
+        <w:shd w:fill="F6F8FA" w:color="auto" w:val="clear"/>
+        <w:spacing w:after="0" w:before="0" w:line="252"/>
+        <w:ind w:left="180"/>
+      </w:pPr>
+      <w:r>
+        <w:rPr>
+          <w:rFonts w:ascii="Consolas" w:cs="Consolas" w:eastAsia="Consolas" w:hAnsi="Consolas"/>
+          <w:color w:val="24292F"/>
+          <w:sz w:val="18"/>
+          <w:szCs w:val="18"/>
+        </w:rPr>
+        <w:t xml:space="preserve">{</w:t>
+      </w:r>
+    </w:p>
+    <w:p>
+      <w:pPr>
+        <w:pBdr>
+          <w:left w:val="single" w:color="0969DA" w:sz="12" w:space="6"/>
+        </w:pBdr>
+        <w:shd w:fill="F6F8FA" w:color="auto" w:val="clear"/>
+        <w:spacing w:after="0" w:before="0" w:line="252"/>
+        <w:ind w:left="180"/>
+      </w:pPr>
+      <w:r>
+        <w:rPr>
+          <w:rFonts w:ascii="Consolas" w:cs="Consolas" w:eastAsia="Consolas" w:hAnsi="Consolas"/>
+          <w:color w:val="24292F"/>
+          <w:sz w:val="18"/>
+          <w:szCs w:val="18"/>
+        </w:rPr>
+        <w:t xml:space="preserve">  "session_id": "6f1c2a9e-0d4b-4b8e-9a51-2f0e7c3d1a77",</w:t>
+      </w:r>
+    </w:p>
+    <w:p>
+      <w:pPr>
+        <w:pBdr>
+          <w:left w:val="single" w:color="0969DA" w:sz="12" w:space="6"/>
+        </w:pBdr>
+        <w:shd w:fill="F6F8FA" w:color="auto" w:val="clear"/>
+        <w:spacing w:after="0" w:before="0" w:line="252"/>
+        <w:ind w:left="180"/>
+      </w:pPr>
+      <w:r>
+        <w:rPr>
+          <w:rFonts w:ascii="Consolas" w:cs="Consolas" w:eastAsia="Consolas" w:hAnsi="Consolas"/>
+          <w:color w:val="24292F"/>
+          <w:sz w:val="18"/>
+          <w:szCs w:val="18"/>
+        </w:rPr>
+        <w:t xml:space="preserve">  "participants": [ ...same as sent... ],</w:t>
+      </w:r>
+    </w:p>
+    <w:p>
+      <w:pPr>
+        <w:pBdr>
+          <w:left w:val="single" w:color="0969DA" w:sz="12" w:space="6"/>
+        </w:pBdr>
+        <w:shd w:fill="F6F8FA" w:color="auto" w:val="clear"/>
+        <w:spacing w:after="0" w:before="0" w:line="252"/>
+        <w:ind w:left="180"/>
+      </w:pPr>
+      <w:r>
+        <w:rPr>
+          <w:rFonts w:ascii="Consolas" w:cs="Consolas" w:eastAsia="Consolas" w:hAnsi="Consolas"/>
+          <w:color w:val="24292F"/>
+          <w:sz w:val="18"/>
+          <w:szCs w:val="18"/>
+        </w:rPr>
+        <w:t xml:space="preserve">  "created_at": "2026-10-18T09:30:00Z"</w:t>
       </w:r>
     </w:p>
     <w:p>
@@ -7630,308 +7775,6 @@
         <w:spacing w:after="120" w:line="276"/>
       </w:pPr>
       <w:r>
-        <w:t xml:space="preserve">Language codes are ISO 639-1 (two letters) where one exists. The frontend shows them as "Telugu: తెలుగు" and must not hard-code the list.</w:t>
-      </w:r>
-    </w:p>
-    <w:p>
-      <w:pPr>
-        <w:pStyle w:val="Heading3"/>
-        <w:spacing w:after="80" w:before="200"/>
-      </w:pPr>
-      <w:r>
-        <w:t xml:space="preserve">POST /api/sessions: request and response</w:t>
-      </w:r>
-    </w:p>
-    <w:p>
-      <w:pPr>
-        <w:pBdr>
-          <w:left w:val="single" w:color="0969DA" w:sz="12" w:space="6"/>
-        </w:pBdr>
-        <w:shd w:fill="F6F8FA" w:color="auto" w:val="clear"/>
-        <w:spacing w:after="0" w:before="80" w:line="252"/>
-        <w:ind w:left="180"/>
-      </w:pPr>
-      <w:r>
-        <w:rPr>
-          <w:rFonts w:ascii="Consolas" w:cs="Consolas" w:eastAsia="Consolas" w:hAnsi="Consolas"/>
-          <w:color w:val="24292F"/>
-          <w:sz w:val="18"/>
-          <w:szCs w:val="18"/>
-        </w:rPr>
-        <w:t xml:space="preserve">// request</w:t>
-      </w:r>
-    </w:p>
-    <w:p>
-      <w:pPr>
-        <w:pBdr>
-          <w:left w:val="single" w:color="0969DA" w:sz="12" w:space="6"/>
-        </w:pBdr>
-        <w:shd w:fill="F6F8FA" w:color="auto" w:val="clear"/>
-        <w:spacing w:after="0" w:before="0" w:line="252"/>
-        <w:ind w:left="180"/>
-      </w:pPr>
-      <w:r>
-        <w:rPr>
-          <w:rFonts w:ascii="Consolas" w:cs="Consolas" w:eastAsia="Consolas" w:hAnsi="Consolas"/>
-          <w:color w:val="24292F"/>
-          <w:sz w:val="18"/>
-          <w:szCs w:val="18"/>
-        </w:rPr>
-        <w:t xml:space="preserve">{</w:t>
-      </w:r>
-    </w:p>
-    <w:p>
-      <w:pPr>
-        <w:pBdr>
-          <w:left w:val="single" w:color="0969DA" w:sz="12" w:space="6"/>
-        </w:pBdr>
-        <w:shd w:fill="F6F8FA" w:color="auto" w:val="clear"/>
-        <w:spacing w:after="0" w:before="0" w:line="252"/>
-        <w:ind w:left="180"/>
-      </w:pPr>
-      <w:r>
-        <w:rPr>
-          <w:rFonts w:ascii="Consolas" w:cs="Consolas" w:eastAsia="Consolas" w:hAnsi="Consolas"/>
-          <w:color w:val="24292F"/>
-          <w:sz w:val="18"/>
-          <w:szCs w:val="18"/>
-        </w:rPr>
-        <w:t xml:space="preserve">  "consent": true,</w:t>
-      </w:r>
-    </w:p>
-    <w:p>
-      <w:pPr>
-        <w:pBdr>
-          <w:left w:val="single" w:color="0969DA" w:sz="12" w:space="6"/>
-        </w:pBdr>
-        <w:shd w:fill="F6F8FA" w:color="auto" w:val="clear"/>
-        <w:spacing w:after="0" w:before="0" w:line="252"/>
-        <w:ind w:left="180"/>
-      </w:pPr>
-      <w:r>
-        <w:rPr>
-          <w:rFonts w:ascii="Consolas" w:cs="Consolas" w:eastAsia="Consolas" w:hAnsi="Consolas"/>
-          <w:color w:val="24292F"/>
-          <w:sz w:val="18"/>
-          <w:szCs w:val="18"/>
-        </w:rPr>
-        <w:t xml:space="preserve">  "participants": [</w:t>
-      </w:r>
-    </w:p>
-    <w:p>
-      <w:pPr>
-        <w:pBdr>
-          <w:left w:val="single" w:color="0969DA" w:sz="12" w:space="6"/>
-        </w:pBdr>
-        <w:shd w:fill="F6F8FA" w:color="auto" w:val="clear"/>
-        <w:spacing w:after="0" w:before="0" w:line="252"/>
-        <w:ind w:left="180"/>
-      </w:pPr>
-      <w:r>
-        <w:rPr>
-          <w:rFonts w:ascii="Consolas" w:cs="Consolas" w:eastAsia="Consolas" w:hAnsi="Consolas"/>
-          <w:color w:val="24292F"/>
-          <w:sz w:val="18"/>
-          <w:szCs w:val="18"/>
-        </w:rPr>
-        <w:t xml:space="preserve">    { "id": "A", "name": "Person A", "preferred_language": "en" },</w:t>
-      </w:r>
-    </w:p>
-    <w:p>
-      <w:pPr>
-        <w:pBdr>
-          <w:left w:val="single" w:color="0969DA" w:sz="12" w:space="6"/>
-        </w:pBdr>
-        <w:shd w:fill="F6F8FA" w:color="auto" w:val="clear"/>
-        <w:spacing w:after="0" w:before="0" w:line="252"/>
-        <w:ind w:left="180"/>
-      </w:pPr>
-      <w:r>
-        <w:rPr>
-          <w:rFonts w:ascii="Consolas" w:cs="Consolas" w:eastAsia="Consolas" w:hAnsi="Consolas"/>
-          <w:color w:val="24292F"/>
-          <w:sz w:val="18"/>
-          <w:szCs w:val="18"/>
-        </w:rPr>
-        <w:t xml:space="preserve">    { "id": "B", "name": "Person B", "preferred_language": "te" }</w:t>
-      </w:r>
-    </w:p>
-    <w:p>
-      <w:pPr>
-        <w:pBdr>
-          <w:left w:val="single" w:color="0969DA" w:sz="12" w:space="6"/>
-        </w:pBdr>
-        <w:shd w:fill="F6F8FA" w:color="auto" w:val="clear"/>
-        <w:spacing w:after="0" w:before="0" w:line="252"/>
-        <w:ind w:left="180"/>
-      </w:pPr>
-      <w:r>
-        <w:rPr>
-          <w:rFonts w:ascii="Consolas" w:cs="Consolas" w:eastAsia="Consolas" w:hAnsi="Consolas"/>
-          <w:color w:val="24292F"/>
-          <w:sz w:val="18"/>
-          <w:szCs w:val="18"/>
-        </w:rPr>
-        <w:t xml:space="preserve">  ]</w:t>
-      </w:r>
-    </w:p>
-    <w:p>
-      <w:pPr>
-        <w:pBdr>
-          <w:left w:val="single" w:color="0969DA" w:sz="12" w:space="6"/>
-        </w:pBdr>
-        <w:shd w:fill="F6F8FA" w:color="auto" w:val="clear"/>
-        <w:spacing w:after="0" w:before="0" w:line="252"/>
-        <w:ind w:left="180"/>
-      </w:pPr>
-      <w:r>
-        <w:rPr>
-          <w:rFonts w:ascii="Consolas" w:cs="Consolas" w:eastAsia="Consolas" w:hAnsi="Consolas"/>
-          <w:color w:val="24292F"/>
-          <w:sz w:val="18"/>
-          <w:szCs w:val="18"/>
-        </w:rPr>
-        <w:t xml:space="preserve">}</w:t>
-      </w:r>
-    </w:p>
-    <w:p>
-      <w:pPr>
-        <w:pBdr>
-          <w:left w:val="single" w:color="0969DA" w:sz="12" w:space="6"/>
-        </w:pBdr>
-        <w:shd w:fill="F6F8FA" w:color="auto" w:val="clear"/>
-        <w:spacing w:after="0" w:before="0" w:line="252"/>
-        <w:ind w:left="180"/>
-      </w:pPr>
-      <w:r>
-        <w:rPr>
-          <w:rFonts w:ascii="Consolas" w:cs="Consolas" w:eastAsia="Consolas" w:hAnsi="Consolas"/>
-          <w:color w:val="24292F"/>
-          <w:sz w:val="18"/>
-          <w:szCs w:val="18"/>
-        </w:rPr>
-        <w:t xml:space="preserve"> </w:t>
-      </w:r>
-    </w:p>
-    <w:p>
-      <w:pPr>
-        <w:pBdr>
-          <w:left w:val="single" w:color="0969DA" w:sz="12" w:space="6"/>
-        </w:pBdr>
-        <w:shd w:fill="F6F8FA" w:color="auto" w:val="clear"/>
-        <w:spacing w:after="0" w:before="0" w:line="252"/>
-        <w:ind w:left="180"/>
-      </w:pPr>
-      <w:r>
-        <w:rPr>
-          <w:rFonts w:ascii="Consolas" w:cs="Consolas" w:eastAsia="Consolas" w:hAnsi="Consolas"/>
-          <w:color w:val="24292F"/>
-          <w:sz w:val="18"/>
-          <w:szCs w:val="18"/>
-        </w:rPr>
-        <w:t xml:space="preserve">// response: 201 Created</w:t>
-      </w:r>
-    </w:p>
-    <w:p>
-      <w:pPr>
-        <w:pBdr>
-          <w:left w:val="single" w:color="0969DA" w:sz="12" w:space="6"/>
-        </w:pBdr>
-        <w:shd w:fill="F6F8FA" w:color="auto" w:val="clear"/>
-        <w:spacing w:after="0" w:before="0" w:line="252"/>
-        <w:ind w:left="180"/>
-      </w:pPr>
-      <w:r>
-        <w:rPr>
-          <w:rFonts w:ascii="Consolas" w:cs="Consolas" w:eastAsia="Consolas" w:hAnsi="Consolas"/>
-          <w:color w:val="24292F"/>
-          <w:sz w:val="18"/>
-          <w:szCs w:val="18"/>
-        </w:rPr>
-        <w:t xml:space="preserve">{</w:t>
-      </w:r>
-    </w:p>
-    <w:p>
-      <w:pPr>
-        <w:pBdr>
-          <w:left w:val="single" w:color="0969DA" w:sz="12" w:space="6"/>
-        </w:pBdr>
-        <w:shd w:fill="F6F8FA" w:color="auto" w:val="clear"/>
-        <w:spacing w:after="0" w:before="0" w:line="252"/>
-        <w:ind w:left="180"/>
-      </w:pPr>
-      <w:r>
-        <w:rPr>
-          <w:rFonts w:ascii="Consolas" w:cs="Consolas" w:eastAsia="Consolas" w:hAnsi="Consolas"/>
-          <w:color w:val="24292F"/>
-          <w:sz w:val="18"/>
-          <w:szCs w:val="18"/>
-        </w:rPr>
-        <w:t xml:space="preserve">  "session_id": "6f1c2a9e-0d4b-4b8e-9a51-2f0e7c3d1a77",</w:t>
-      </w:r>
-    </w:p>
-    <w:p>
-      <w:pPr>
-        <w:pBdr>
-          <w:left w:val="single" w:color="0969DA" w:sz="12" w:space="6"/>
-        </w:pBdr>
-        <w:shd w:fill="F6F8FA" w:color="auto" w:val="clear"/>
-        <w:spacing w:after="0" w:before="0" w:line="252"/>
-        <w:ind w:left="180"/>
-      </w:pPr>
-      <w:r>
-        <w:rPr>
-          <w:rFonts w:ascii="Consolas" w:cs="Consolas" w:eastAsia="Consolas" w:hAnsi="Consolas"/>
-          <w:color w:val="24292F"/>
-          <w:sz w:val="18"/>
-          <w:szCs w:val="18"/>
-        </w:rPr>
-        <w:t xml:space="preserve">  "participants": [ ...same as sent... ],</w:t>
-      </w:r>
-    </w:p>
-    <w:p>
-      <w:pPr>
-        <w:pBdr>
-          <w:left w:val="single" w:color="0969DA" w:sz="12" w:space="6"/>
-        </w:pBdr>
-        <w:shd w:fill="F6F8FA" w:color="auto" w:val="clear"/>
-        <w:spacing w:after="0" w:before="0" w:line="252"/>
-        <w:ind w:left="180"/>
-      </w:pPr>
-      <w:r>
-        <w:rPr>
-          <w:rFonts w:ascii="Consolas" w:cs="Consolas" w:eastAsia="Consolas" w:hAnsi="Consolas"/>
-          <w:color w:val="24292F"/>
-          <w:sz w:val="18"/>
-          <w:szCs w:val="18"/>
-        </w:rPr>
-        <w:t xml:space="preserve">  "created_at": "2026-10-18T09:30:00Z"</w:t>
-      </w:r>
-    </w:p>
-    <w:p>
-      <w:pPr>
-        <w:pBdr>
-          <w:left w:val="single" w:color="0969DA" w:sz="12" w:space="6"/>
-        </w:pBdr>
-        <w:shd w:fill="F6F8FA" w:color="auto" w:val="clear"/>
-        <w:spacing w:after="140" w:before="0" w:line="252"/>
-        <w:ind w:left="180"/>
-      </w:pPr>
-      <w:r>
-        <w:rPr>
-          <w:rFonts w:ascii="Consolas" w:cs="Consolas" w:eastAsia="Consolas" w:hAnsi="Consolas"/>
-          <w:color w:val="24292F"/>
-          <w:sz w:val="18"/>
-          <w:szCs w:val="18"/>
-        </w:rPr>
-        <w:t xml:space="preserve">}</w:t>
-      </w:r>
-    </w:p>
-    <w:p>
-      <w:pPr>
-        <w:spacing w:after="120" w:line="276"/>
-      </w:pPr>
-      <w:r>
         <w:t xml:space="preserve">Validation: exactly two participants with ids </w:t>
       </w:r>
       <w:r>
@@ -7968,19 +7811,7 @@
         <w:t xml:space="preserve">preferred_language</w:t>
       </w:r>
       <w:r>
-        <w:t xml:space="preserve"> from </w:t>
-      </w:r>
-      <w:r>
-        <w:rPr>
-          <w:rFonts w:ascii="Consolas" w:cs="Consolas" w:eastAsia="Consolas" w:hAnsi="Consolas"/>
-          <w:color w:val="24292F"/>
-          <w:sz w:val="19"/>
-          <w:szCs w:val="19"/>
-        </w:rPr>
-        <w:t xml:space="preserve">/api/languages</w:t>
-      </w:r>
-      <w:r>
-        <w:t xml:space="preserve">, and </w:t>
+        <w:t xml:space="preserve"> that is a language code, and </w:t>
       </w:r>
       <w:r>
         <w:rPr>
@@ -12600,18 +12431,6 @@
         <w:t xml:space="preserve">getHealth()</w:t>
       </w:r>
       <w:r>
-        <w:t xml:space="preserve">, </w:t>
-      </w:r>
-      <w:r>
-        <w:rPr>
-          <w:rFonts w:ascii="Consolas" w:cs="Consolas" w:eastAsia="Consolas" w:hAnsi="Consolas"/>
-          <w:color w:val="24292F"/>
-          <w:sz w:val="19"/>
-          <w:szCs w:val="19"/>
-        </w:rPr>
-        <w:t xml:space="preserve">getLanguages()</w:t>
-      </w:r>
-      <w:r>
         <w:t xml:space="preserve"> and </w:t>
       </w:r>
       <w:r>
@@ -12788,7 +12607,7 @@
         <w:t xml:space="preserve">src/features/consent/LanguageSelect.tsx</w:t>
       </w:r>
       <w:r>
-        <w:t xml:space="preserve">: a searchable dropdown filled from </w:t>
+        <w:t xml:space="preserve">: a searchable dropdown built in the browser with </w:t>
       </w:r>
       <w:r>
         <w:rPr>
@@ -12797,10 +12616,10 @@
           <w:sz w:val="19"/>
           <w:szCs w:val="19"/>
         </w:rPr>
-        <w:t xml:space="preserve">/api/languages</w:t>
-      </w:r>
-      <w:r>
-        <w:t xml:space="preserve">, showing "English name: native name". Typing "tel" or "తె" finds Telugu.</w:t>
+        <w:t xml:space="preserve">Intl.DisplayNames</w:t>
+      </w:r>
+      <w:r>
+        <w:t xml:space="preserve"> (no list from the backend), showing "English name: native name". Typing "tel" or "తె" finds Telugu.</w:t>
       </w:r>
     </w:p>
     <w:p>
@@ -12927,7 +12746,7 @@
         <w:spacing w:after="60" w:line="276"/>
       </w:pPr>
       <w:r>
-        <w:t xml:space="preserve">Show clear messages for: backend not running, language list failed to load, session rejected (the 422 message), and live channel closed unexpectedly.</w:t>
+        <w:t xml:space="preserve">Show clear messages for: backend not running, session rejected (the 422 message), and live channel closed unexpectedly.</w:t>
       </w:r>
     </w:p>
     <w:p>
@@ -13068,19 +12887,7 @@
         <w:t xml:space="preserve">app/core/languages.py</w:t>
       </w:r>
       <w:r>
-        <w:t xml:space="preserve">: the language list (code, English name, native name). </w:t>
-      </w:r>
-      <w:r>
-        <w:rPr>
-          <w:rFonts w:ascii="Consolas" w:cs="Consolas" w:eastAsia="Consolas" w:hAnsi="Consolas"/>
-          <w:color w:val="24292F"/>
-          <w:sz w:val="19"/>
-          <w:szCs w:val="19"/>
-        </w:rPr>
-        <w:t xml:space="preserve">GET /api/languages</w:t>
-      </w:r>
-      <w:r>
-        <w:t xml:space="preserve"> returns it.</w:t>
+        <w:t xml:space="preserve">: language code validation. Any ISO 639 code is accepted; there is no fixed list.</w:t>
       </w:r>
     </w:p>
     <w:p>
@@ -13683,19 +13490,7 @@
         <w:spacing w:after="60" w:line="276"/>
       </w:pPr>
       <w:r>
-        <w:t xml:space="preserve">In development mode, save each utterance as </w:t>
-      </w:r>
-      <w:r>
-        <w:rPr>
-          <w:rFonts w:ascii="Consolas" w:cs="Consolas" w:eastAsia="Consolas" w:hAnsi="Consolas"/>
-          <w:color w:val="24292F"/>
-          <w:sz w:val="19"/>
-          <w:szCs w:val="19"/>
-        </w:rPr>
-        <w:t xml:space="preserve">backend/data/debug/{utterance_id}.wav</w:t>
-      </w:r>
-      <w:r>
-        <w:t xml:space="preserve"> (Git ignores this folder).</w:t>
+        <w:t xml:space="preserve">Audio is never written to disk: each utterance is held in memory only until it is translated.</w:t>
       </w:r>
     </w:p>
     <w:p>
@@ -16227,7 +16022,7 @@
           <w:sz w:val="18"/>
           <w:szCs w:val="18"/>
         </w:rPr>
-        <w:t xml:space="preserve">│   └── data/                          database and debug audio (Git-ignored)</w:t>
+        <w:t xml:space="preserve">│   └── data/                          database (Git-ignored)</w:t>
       </w:r>
     </w:p>
     <w:p>

</xml_diff>

<commit_message>
Align docs with the no-storage rule; move local tool ignores out of the repository
</commit_message>
<xml_diff>
--- a/docs/DEVELOPER-HANDBOOK.docx
+++ b/docs/DEVELOPER-HANDBOOK.docx
@@ -1586,7 +1586,7 @@
                 <w:sz w:val="19"/>
                 <w:szCs w:val="19"/>
               </w:rPr>
-              <w:t xml:space="preserve">Consent and language screens, microphone capture, talk buttons, captions, voice playback, history and download screens. Opens a pull request for every step.</w:t>
+              <w:t xml:space="preserve">Consent and language screens, microphone capture, talk buttons, captions, voice playback and, if decided, transcript download. Opens a pull request for every step.</w:t>
             </w:r>
           </w:p>
         </w:tc>
@@ -1718,7 +1718,7 @@
                 <w:sz w:val="19"/>
                 <w:szCs w:val="19"/>
               </w:rPr>
-              <w:t xml:space="preserve">Sessions API, WebSocket server, audio ingestion, speech recognition and translation, database, exports. Reviews and merges all pull requests, including their own.</w:t>
+              <w:t xml:space="preserve">Sessions API, WebSocket server, audio ingestion, speech recognition and translation, voice. Reviews and merges all pull requests, including their own.</w:t>
             </w:r>
           </w:p>
         </w:tc>
@@ -1912,7 +1912,7 @@
         <w:spacing w:after="120" w:line="276"/>
       </w:pPr>
       <w:r>
-        <w:t xml:space="preserve">The browser records and plays audio and shows captions. The backend runs speech recognition, translation and voice behind three replaceable interfaces. One WebSocket carries audio to the backend and results back. Normal REST calls handle sessions, history and exports.</w:t>
+        <w:t xml:space="preserve">The browser records and plays audio and shows captions. The backend runs speech recognition, translation and voice behind three replaceable interfaces. One WebSocket carries audio to the backend and results back. A normal REST call starts each session.</w:t>
       </w:r>
     </w:p>
     <w:p>
@@ -2842,7 +2842,7 @@
                 <w:sz w:val="19"/>
                 <w:szCs w:val="19"/>
               </w:rPr>
-              <w:t xml:space="preserve">History and downloads</w:t>
+              <w:t xml:space="preserve">Transcript download (open decision)</w:t>
             </w:r>
           </w:p>
         </w:tc>
@@ -3548,142 +3548,6 @@
                 <w:szCs w:val="19"/>
               </w:rPr>
               <w:t xml:space="preserve">1E</w:t>
-            </w:r>
-          </w:p>
-        </w:tc>
-      </w:tr>
-      <w:tr>
-        <w:tc>
-          <w:tcPr>
-            <w:tcW w:type="dxa" w:w="3084"/>
-            <w:tcBorders>
-              <w:top w:val="single" w:color="C9D1D9" w:sz="4"/>
-              <w:left w:val="single" w:color="C9D1D9" w:sz="4"/>
-              <w:bottom w:val="single" w:color="C9D1D9" w:sz="4"/>
-              <w:right w:val="single" w:color="C9D1D9" w:sz="4"/>
-            </w:tcBorders>
-            <w:tcMar>
-              <w:top w:type="dxa" w:w="60"/>
-              <w:left w:type="dxa" w:w="100"/>
-              <w:bottom w:type="dxa" w:w="60"/>
-              <w:right w:type="dxa" w:w="100"/>
-            </w:tcMar>
-          </w:tcPr>
-          <w:p>
-            <w:pPr>
-              <w:spacing w:after="40" w:line="252"/>
-            </w:pPr>
-            <w:r>
-              <w:rPr>
-                <w:sz w:val="19"/>
-                <w:szCs w:val="19"/>
-              </w:rPr>
-              <w:t xml:space="preserve">Conversation manager, database, exports</w:t>
-            </w:r>
-          </w:p>
-        </w:tc>
-        <w:tc>
-          <w:tcPr>
-            <w:tcW w:type="dxa" w:w="3662"/>
-            <w:tcBorders>
-              <w:top w:val="single" w:color="C9D1D9" w:sz="4"/>
-              <w:left w:val="single" w:color="C9D1D9" w:sz="4"/>
-              <w:bottom w:val="single" w:color="C9D1D9" w:sz="4"/>
-              <w:right w:val="single" w:color="C9D1D9" w:sz="4"/>
-            </w:tcBorders>
-            <w:tcMar>
-              <w:top w:type="dxa" w:w="60"/>
-              <w:left w:type="dxa" w:w="100"/>
-              <w:bottom w:type="dxa" w:w="60"/>
-              <w:right w:type="dxa" w:w="100"/>
-            </w:tcMar>
-          </w:tcPr>
-          <w:p>
-            <w:pPr>
-              <w:spacing w:after="40" w:line="252"/>
-            </w:pPr>
-            <w:r>
-              <w:rPr>
-                <w:rFonts w:ascii="Consolas" w:cs="Consolas" w:eastAsia="Consolas" w:hAnsi="Consolas"/>
-                <w:color w:val="24292F"/>
-                <w:sz w:val="19"/>
-                <w:szCs w:val="19"/>
-              </w:rPr>
-              <w:t xml:space="preserve">backend/app/services/</w:t>
-            </w:r>
-            <w:r>
-              <w:rPr>
-                <w:sz w:val="19"/>
-                <w:szCs w:val="19"/>
-              </w:rPr>
-              <w:t xml:space="preserve">, </w:t>
-            </w:r>
-            <w:r>
-              <w:rPr>
-                <w:rFonts w:ascii="Consolas" w:cs="Consolas" w:eastAsia="Consolas" w:hAnsi="Consolas"/>
-                <w:color w:val="24292F"/>
-                <w:sz w:val="19"/>
-                <w:szCs w:val="19"/>
-              </w:rPr>
-              <w:t xml:space="preserve">backend/app/models/</w:t>
-            </w:r>
-          </w:p>
-        </w:tc>
-        <w:tc>
-          <w:tcPr>
-            <w:tcW w:type="dxa" w:w="1445"/>
-            <w:tcBorders>
-              <w:top w:val="single" w:color="C9D1D9" w:sz="4"/>
-              <w:left w:val="single" w:color="C9D1D9" w:sz="4"/>
-              <w:bottom w:val="single" w:color="C9D1D9" w:sz="4"/>
-              <w:right w:val="single" w:color="C9D1D9" w:sz="4"/>
-            </w:tcBorders>
-            <w:tcMar>
-              <w:top w:type="dxa" w:w="60"/>
-              <w:left w:type="dxa" w:w="100"/>
-              <w:bottom w:type="dxa" w:w="60"/>
-              <w:right w:type="dxa" w:w="100"/>
-            </w:tcMar>
-          </w:tcPr>
-          <w:p>
-            <w:pPr>
-              <w:spacing w:after="40" w:line="252"/>
-            </w:pPr>
-            <w:r>
-              <w:rPr>
-                <w:sz w:val="19"/>
-                <w:szCs w:val="19"/>
-              </w:rPr>
-              <w:t xml:space="preserve">Developer B</w:t>
-            </w:r>
-          </w:p>
-        </w:tc>
-        <w:tc>
-          <w:tcPr>
-            <w:tcW w:type="dxa" w:w="1447"/>
-            <w:tcBorders>
-              <w:top w:val="single" w:color="C9D1D9" w:sz="4"/>
-              <w:left w:val="single" w:color="C9D1D9" w:sz="4"/>
-              <w:bottom w:val="single" w:color="C9D1D9" w:sz="4"/>
-              <w:right w:val="single" w:color="C9D1D9" w:sz="4"/>
-            </w:tcBorders>
-            <w:tcMar>
-              <w:top w:type="dxa" w:w="60"/>
-              <w:left w:type="dxa" w:w="100"/>
-              <w:bottom w:type="dxa" w:w="60"/>
-              <w:right w:type="dxa" w:w="100"/>
-            </w:tcMar>
-          </w:tcPr>
-          <w:p>
-            <w:pPr>
-              <w:spacing w:after="40" w:line="252"/>
-            </w:pPr>
-            <w:r>
-              <w:rPr>
-                <w:sz w:val="19"/>
-                <w:szCs w:val="19"/>
-              </w:rPr>
-              <w:t xml:space="preserve">1F</w:t>
             </w:r>
           </w:p>
         </w:tc>
@@ -5251,7 +5115,7 @@
                 <w:sz w:val="19"/>
                 <w:szCs w:val="19"/>
               </w:rPr>
-              <w:t xml:space="preserve">1F Transcript and downloads</w:t>
+              <w:t xml:space="preserve">1F Transcript download (open decision)</w:t>
             </w:r>
           </w:p>
         </w:tc>
@@ -5308,12 +5172,10 @@
             </w:pPr>
             <w:r>
               <w:rPr>
-                <w:rFonts w:ascii="Consolas" w:cs="Consolas" w:eastAsia="Consolas" w:hAnsi="Consolas"/>
-                <w:color w:val="24292F"/>
-                <w:sz w:val="19"/>
-                <w:szCs w:val="19"/>
-              </w:rPr>
-              <w:t xml:space="preserve">1f-backend</w:t>
+                <w:sz w:val="19"/>
+                <w:szCs w:val="19"/>
+              </w:rPr>
+              <w:t xml:space="preserve">none planned</w:t>
             </w:r>
           </w:p>
         </w:tc>
@@ -6878,461 +6740,6 @@
                 <w:szCs w:val="19"/>
               </w:rPr>
               <w:t xml:space="preserve">Live channel: audio in, captions and events out.</w:t>
-            </w:r>
-          </w:p>
-        </w:tc>
-      </w:tr>
-      <w:tr>
-        <w:tc>
-          <w:tcPr>
-            <w:tcW w:type="dxa" w:w="4626"/>
-            <w:tcBorders>
-              <w:top w:val="single" w:color="C9D1D9" w:sz="4"/>
-              <w:left w:val="single" w:color="C9D1D9" w:sz="4"/>
-              <w:bottom w:val="single" w:color="C9D1D9" w:sz="4"/>
-              <w:right w:val="single" w:color="C9D1D9" w:sz="4"/>
-            </w:tcBorders>
-            <w:tcMar>
-              <w:top w:type="dxa" w:w="60"/>
-              <w:left w:type="dxa" w:w="100"/>
-              <w:bottom w:type="dxa" w:w="60"/>
-              <w:right w:type="dxa" w:w="100"/>
-            </w:tcMar>
-          </w:tcPr>
-          <w:p>
-            <w:pPr>
-              <w:spacing w:after="40" w:line="252"/>
-            </w:pPr>
-            <w:r>
-              <w:rPr>
-                <w:rFonts w:ascii="Consolas" w:cs="Consolas" w:eastAsia="Consolas" w:hAnsi="Consolas"/>
-                <w:color w:val="24292F"/>
-                <w:sz w:val="19"/>
-                <w:szCs w:val="19"/>
-              </w:rPr>
-              <w:t xml:space="preserve">POST /api/sessions/{session_id}/stop</w:t>
-            </w:r>
-          </w:p>
-        </w:tc>
-        <w:tc>
-          <w:tcPr>
-            <w:tcW w:type="dxa" w:w="771"/>
-            <w:tcBorders>
-              <w:top w:val="single" w:color="C9D1D9" w:sz="4"/>
-              <w:left w:val="single" w:color="C9D1D9" w:sz="4"/>
-              <w:bottom w:val="single" w:color="C9D1D9" w:sz="4"/>
-              <w:right w:val="single" w:color="C9D1D9" w:sz="4"/>
-            </w:tcBorders>
-            <w:tcMar>
-              <w:top w:type="dxa" w:w="60"/>
-              <w:left w:type="dxa" w:w="100"/>
-              <w:bottom w:type="dxa" w:w="60"/>
-              <w:right w:type="dxa" w:w="100"/>
-            </w:tcMar>
-          </w:tcPr>
-          <w:p>
-            <w:pPr>
-              <w:spacing w:after="40" w:line="252"/>
-            </w:pPr>
-            <w:r>
-              <w:rPr>
-                <w:sz w:val="19"/>
-                <w:szCs w:val="19"/>
-              </w:rPr>
-              <w:t xml:space="preserve">1F</w:t>
-            </w:r>
-          </w:p>
-        </w:tc>
-        <w:tc>
-          <w:tcPr>
-            <w:tcW w:type="dxa" w:w="4241"/>
-            <w:tcBorders>
-              <w:top w:val="single" w:color="C9D1D9" w:sz="4"/>
-              <w:left w:val="single" w:color="C9D1D9" w:sz="4"/>
-              <w:bottom w:val="single" w:color="C9D1D9" w:sz="4"/>
-              <w:right w:val="single" w:color="C9D1D9" w:sz="4"/>
-            </w:tcBorders>
-            <w:tcMar>
-              <w:top w:type="dxa" w:w="60"/>
-              <w:left w:type="dxa" w:w="100"/>
-              <w:bottom w:type="dxa" w:w="60"/>
-              <w:right w:type="dxa" w:w="100"/>
-            </w:tcMar>
-          </w:tcPr>
-          <w:p>
-            <w:pPr>
-              <w:spacing w:after="40" w:line="252"/>
-            </w:pPr>
-            <w:r>
-              <w:rPr>
-                <w:sz w:val="19"/>
-                <w:szCs w:val="19"/>
-              </w:rPr>
-              <w:t xml:space="preserve">End the conversation and save the transcript.</w:t>
-            </w:r>
-          </w:p>
-        </w:tc>
-      </w:tr>
-      <w:tr>
-        <w:tc>
-          <w:tcPr>
-            <w:tcW w:type="dxa" w:w="4626"/>
-            <w:tcBorders>
-              <w:top w:val="single" w:color="C9D1D9" w:sz="4"/>
-              <w:left w:val="single" w:color="C9D1D9" w:sz="4"/>
-              <w:bottom w:val="single" w:color="C9D1D9" w:sz="4"/>
-              <w:right w:val="single" w:color="C9D1D9" w:sz="4"/>
-            </w:tcBorders>
-            <w:tcMar>
-              <w:top w:type="dxa" w:w="60"/>
-              <w:left w:type="dxa" w:w="100"/>
-              <w:bottom w:type="dxa" w:w="60"/>
-              <w:right w:type="dxa" w:w="100"/>
-            </w:tcMar>
-          </w:tcPr>
-          <w:p>
-            <w:pPr>
-              <w:spacing w:after="40" w:line="252"/>
-            </w:pPr>
-            <w:r>
-              <w:rPr>
-                <w:rFonts w:ascii="Consolas" w:cs="Consolas" w:eastAsia="Consolas" w:hAnsi="Consolas"/>
-                <w:color w:val="24292F"/>
-                <w:sz w:val="19"/>
-                <w:szCs w:val="19"/>
-              </w:rPr>
-              <w:t xml:space="preserve">GET /api/sessions</w:t>
-            </w:r>
-          </w:p>
-        </w:tc>
-        <w:tc>
-          <w:tcPr>
-            <w:tcW w:type="dxa" w:w="771"/>
-            <w:tcBorders>
-              <w:top w:val="single" w:color="C9D1D9" w:sz="4"/>
-              <w:left w:val="single" w:color="C9D1D9" w:sz="4"/>
-              <w:bottom w:val="single" w:color="C9D1D9" w:sz="4"/>
-              <w:right w:val="single" w:color="C9D1D9" w:sz="4"/>
-            </w:tcBorders>
-            <w:tcMar>
-              <w:top w:type="dxa" w:w="60"/>
-              <w:left w:type="dxa" w:w="100"/>
-              <w:bottom w:type="dxa" w:w="60"/>
-              <w:right w:type="dxa" w:w="100"/>
-            </w:tcMar>
-          </w:tcPr>
-          <w:p>
-            <w:pPr>
-              <w:spacing w:after="40" w:line="252"/>
-            </w:pPr>
-            <w:r>
-              <w:rPr>
-                <w:sz w:val="19"/>
-                <w:szCs w:val="19"/>
-              </w:rPr>
-              <w:t xml:space="preserve">1F</w:t>
-            </w:r>
-          </w:p>
-        </w:tc>
-        <w:tc>
-          <w:tcPr>
-            <w:tcW w:type="dxa" w:w="4241"/>
-            <w:tcBorders>
-              <w:top w:val="single" w:color="C9D1D9" w:sz="4"/>
-              <w:left w:val="single" w:color="C9D1D9" w:sz="4"/>
-              <w:bottom w:val="single" w:color="C9D1D9" w:sz="4"/>
-              <w:right w:val="single" w:color="C9D1D9" w:sz="4"/>
-            </w:tcBorders>
-            <w:tcMar>
-              <w:top w:type="dxa" w:w="60"/>
-              <w:left w:type="dxa" w:w="100"/>
-              <w:bottom w:type="dxa" w:w="60"/>
-              <w:right w:type="dxa" w:w="100"/>
-            </w:tcMar>
-          </w:tcPr>
-          <w:p>
-            <w:pPr>
-              <w:spacing w:after="40" w:line="252"/>
-            </w:pPr>
-            <w:r>
-              <w:rPr>
-                <w:sz w:val="19"/>
-                <w:szCs w:val="19"/>
-              </w:rPr>
-              <w:t xml:space="preserve">List past conversations, newest first.</w:t>
-            </w:r>
-          </w:p>
-        </w:tc>
-      </w:tr>
-      <w:tr>
-        <w:tc>
-          <w:tcPr>
-            <w:tcW w:type="dxa" w:w="4626"/>
-            <w:tcBorders>
-              <w:top w:val="single" w:color="C9D1D9" w:sz="4"/>
-              <w:left w:val="single" w:color="C9D1D9" w:sz="4"/>
-              <w:bottom w:val="single" w:color="C9D1D9" w:sz="4"/>
-              <w:right w:val="single" w:color="C9D1D9" w:sz="4"/>
-            </w:tcBorders>
-            <w:tcMar>
-              <w:top w:type="dxa" w:w="60"/>
-              <w:left w:type="dxa" w:w="100"/>
-              <w:bottom w:type="dxa" w:w="60"/>
-              <w:right w:type="dxa" w:w="100"/>
-            </w:tcMar>
-          </w:tcPr>
-          <w:p>
-            <w:pPr>
-              <w:spacing w:after="40" w:line="252"/>
-            </w:pPr>
-            <w:r>
-              <w:rPr>
-                <w:rFonts w:ascii="Consolas" w:cs="Consolas" w:eastAsia="Consolas" w:hAnsi="Consolas"/>
-                <w:color w:val="24292F"/>
-                <w:sz w:val="19"/>
-                <w:szCs w:val="19"/>
-              </w:rPr>
-              <w:t xml:space="preserve">GET /api/sessions/{session_id}/transcript</w:t>
-            </w:r>
-          </w:p>
-        </w:tc>
-        <w:tc>
-          <w:tcPr>
-            <w:tcW w:type="dxa" w:w="771"/>
-            <w:tcBorders>
-              <w:top w:val="single" w:color="C9D1D9" w:sz="4"/>
-              <w:left w:val="single" w:color="C9D1D9" w:sz="4"/>
-              <w:bottom w:val="single" w:color="C9D1D9" w:sz="4"/>
-              <w:right w:val="single" w:color="C9D1D9" w:sz="4"/>
-            </w:tcBorders>
-            <w:tcMar>
-              <w:top w:type="dxa" w:w="60"/>
-              <w:left w:type="dxa" w:w="100"/>
-              <w:bottom w:type="dxa" w:w="60"/>
-              <w:right w:type="dxa" w:w="100"/>
-            </w:tcMar>
-          </w:tcPr>
-          <w:p>
-            <w:pPr>
-              <w:spacing w:after="40" w:line="252"/>
-            </w:pPr>
-            <w:r>
-              <w:rPr>
-                <w:sz w:val="19"/>
-                <w:szCs w:val="19"/>
-              </w:rPr>
-              <w:t xml:space="preserve">1F</w:t>
-            </w:r>
-          </w:p>
-        </w:tc>
-        <w:tc>
-          <w:tcPr>
-            <w:tcW w:type="dxa" w:w="4241"/>
-            <w:tcBorders>
-              <w:top w:val="single" w:color="C9D1D9" w:sz="4"/>
-              <w:left w:val="single" w:color="C9D1D9" w:sz="4"/>
-              <w:bottom w:val="single" w:color="C9D1D9" w:sz="4"/>
-              <w:right w:val="single" w:color="C9D1D9" w:sz="4"/>
-            </w:tcBorders>
-            <w:tcMar>
-              <w:top w:type="dxa" w:w="60"/>
-              <w:left w:type="dxa" w:w="100"/>
-              <w:bottom w:type="dxa" w:w="60"/>
-              <w:right w:type="dxa" w:w="100"/>
-            </w:tcMar>
-          </w:tcPr>
-          <w:p>
-            <w:pPr>
-              <w:spacing w:after="40" w:line="252"/>
-            </w:pPr>
-            <w:r>
-              <w:rPr>
-                <w:sz w:val="19"/>
-                <w:szCs w:val="19"/>
-              </w:rPr>
-              <w:t xml:space="preserve">All saved turns of one conversation.</w:t>
-            </w:r>
-          </w:p>
-        </w:tc>
-      </w:tr>
-      <w:tr>
-        <w:tc>
-          <w:tcPr>
-            <w:tcW w:type="dxa" w:w="4626"/>
-            <w:tcBorders>
-              <w:top w:val="single" w:color="C9D1D9" w:sz="4"/>
-              <w:left w:val="single" w:color="C9D1D9" w:sz="4"/>
-              <w:bottom w:val="single" w:color="C9D1D9" w:sz="4"/>
-              <w:right w:val="single" w:color="C9D1D9" w:sz="4"/>
-            </w:tcBorders>
-            <w:tcMar>
-              <w:top w:type="dxa" w:w="60"/>
-              <w:left w:type="dxa" w:w="100"/>
-              <w:bottom w:type="dxa" w:w="60"/>
-              <w:right w:type="dxa" w:w="100"/>
-            </w:tcMar>
-          </w:tcPr>
-          <w:p>
-            <w:pPr>
-              <w:spacing w:after="40" w:line="252"/>
-            </w:pPr>
-            <w:r>
-              <w:rPr>
-                <w:rFonts w:ascii="Consolas" w:cs="Consolas" w:eastAsia="Consolas" w:hAnsi="Consolas"/>
-                <w:color w:val="24292F"/>
-                <w:sz w:val="19"/>
-                <w:szCs w:val="19"/>
-              </w:rPr>
-              <w:t xml:space="preserve">GET /api/sessions/{session_id}/export?format=txt|srt|vtt|json</w:t>
-            </w:r>
-          </w:p>
-        </w:tc>
-        <w:tc>
-          <w:tcPr>
-            <w:tcW w:type="dxa" w:w="771"/>
-            <w:tcBorders>
-              <w:top w:val="single" w:color="C9D1D9" w:sz="4"/>
-              <w:left w:val="single" w:color="C9D1D9" w:sz="4"/>
-              <w:bottom w:val="single" w:color="C9D1D9" w:sz="4"/>
-              <w:right w:val="single" w:color="C9D1D9" w:sz="4"/>
-            </w:tcBorders>
-            <w:tcMar>
-              <w:top w:type="dxa" w:w="60"/>
-              <w:left w:type="dxa" w:w="100"/>
-              <w:bottom w:type="dxa" w:w="60"/>
-              <w:right w:type="dxa" w:w="100"/>
-            </w:tcMar>
-          </w:tcPr>
-          <w:p>
-            <w:pPr>
-              <w:spacing w:after="40" w:line="252"/>
-            </w:pPr>
-            <w:r>
-              <w:rPr>
-                <w:sz w:val="19"/>
-                <w:szCs w:val="19"/>
-              </w:rPr>
-              <w:t xml:space="preserve">1F</w:t>
-            </w:r>
-          </w:p>
-        </w:tc>
-        <w:tc>
-          <w:tcPr>
-            <w:tcW w:type="dxa" w:w="4241"/>
-            <w:tcBorders>
-              <w:top w:val="single" w:color="C9D1D9" w:sz="4"/>
-              <w:left w:val="single" w:color="C9D1D9" w:sz="4"/>
-              <w:bottom w:val="single" w:color="C9D1D9" w:sz="4"/>
-              <w:right w:val="single" w:color="C9D1D9" w:sz="4"/>
-            </w:tcBorders>
-            <w:tcMar>
-              <w:top w:type="dxa" w:w="60"/>
-              <w:left w:type="dxa" w:w="100"/>
-              <w:bottom w:type="dxa" w:w="60"/>
-              <w:right w:type="dxa" w:w="100"/>
-            </w:tcMar>
-          </w:tcPr>
-          <w:p>
-            <w:pPr>
-              <w:spacing w:after="40" w:line="252"/>
-            </w:pPr>
-            <w:r>
-              <w:rPr>
-                <w:sz w:val="19"/>
-                <w:szCs w:val="19"/>
-              </w:rPr>
-              <w:t xml:space="preserve">Download the transcript as a file.</w:t>
-            </w:r>
-          </w:p>
-        </w:tc>
-      </w:tr>
-      <w:tr>
-        <w:tc>
-          <w:tcPr>
-            <w:tcW w:type="dxa" w:w="4626"/>
-            <w:tcBorders>
-              <w:top w:val="single" w:color="C9D1D9" w:sz="4"/>
-              <w:left w:val="single" w:color="C9D1D9" w:sz="4"/>
-              <w:bottom w:val="single" w:color="C9D1D9" w:sz="4"/>
-              <w:right w:val="single" w:color="C9D1D9" w:sz="4"/>
-            </w:tcBorders>
-            <w:tcMar>
-              <w:top w:type="dxa" w:w="60"/>
-              <w:left w:type="dxa" w:w="100"/>
-              <w:bottom w:type="dxa" w:w="60"/>
-              <w:right w:type="dxa" w:w="100"/>
-            </w:tcMar>
-          </w:tcPr>
-          <w:p>
-            <w:pPr>
-              <w:spacing w:after="40" w:line="252"/>
-            </w:pPr>
-            <w:r>
-              <w:rPr>
-                <w:rFonts w:ascii="Consolas" w:cs="Consolas" w:eastAsia="Consolas" w:hAnsi="Consolas"/>
-                <w:color w:val="24292F"/>
-                <w:sz w:val="19"/>
-                <w:szCs w:val="19"/>
-              </w:rPr>
-              <w:t xml:space="preserve">DELETE /api/sessions/{session_id}</w:t>
-            </w:r>
-          </w:p>
-        </w:tc>
-        <w:tc>
-          <w:tcPr>
-            <w:tcW w:type="dxa" w:w="771"/>
-            <w:tcBorders>
-              <w:top w:val="single" w:color="C9D1D9" w:sz="4"/>
-              <w:left w:val="single" w:color="C9D1D9" w:sz="4"/>
-              <w:bottom w:val="single" w:color="C9D1D9" w:sz="4"/>
-              <w:right w:val="single" w:color="C9D1D9" w:sz="4"/>
-            </w:tcBorders>
-            <w:tcMar>
-              <w:top w:type="dxa" w:w="60"/>
-              <w:left w:type="dxa" w:w="100"/>
-              <w:bottom w:type="dxa" w:w="60"/>
-              <w:right w:type="dxa" w:w="100"/>
-            </w:tcMar>
-          </w:tcPr>
-          <w:p>
-            <w:pPr>
-              <w:spacing w:after="40" w:line="252"/>
-            </w:pPr>
-            <w:r>
-              <w:rPr>
-                <w:sz w:val="19"/>
-                <w:szCs w:val="19"/>
-              </w:rPr>
-              <w:t xml:space="preserve">1F</w:t>
-            </w:r>
-          </w:p>
-        </w:tc>
-        <w:tc>
-          <w:tcPr>
-            <w:tcW w:type="dxa" w:w="4241"/>
-            <w:tcBorders>
-              <w:top w:val="single" w:color="C9D1D9" w:sz="4"/>
-              <w:left w:val="single" w:color="C9D1D9" w:sz="4"/>
-              <w:bottom w:val="single" w:color="C9D1D9" w:sz="4"/>
-              <w:right w:val="single" w:color="C9D1D9" w:sz="4"/>
-            </w:tcBorders>
-            <w:tcMar>
-              <w:top w:type="dxa" w:w="60"/>
-              <w:left w:type="dxa" w:w="100"/>
-              <w:bottom w:type="dxa" w:w="60"/>
-              <w:right w:type="dxa" w:w="100"/>
-            </w:tcMar>
-          </w:tcPr>
-          <w:p>
-            <w:pPr>
-              <w:spacing w:after="40" w:line="252"/>
-            </w:pPr>
-            <w:r>
-              <w:rPr>
-                <w:sz w:val="19"/>
-                <w:szCs w:val="19"/>
-              </w:rPr>
-              <w:t xml:space="preserve">Delete a conversation and its transcript.</w:t>
             </w:r>
           </w:p>
         </w:tc>
@@ -13538,7 +12945,7 @@
         <w:spacing w:after="60" w:line="276"/>
       </w:pPr>
       <w:r>
-        <w:t xml:space="preserve">Open the saved WAV files. The voice should sound normal. If it sounds too fast, too slow or high-pitched, the sample rate conversion is wrong.</w:t>
+        <w:t xml:space="preserve">Speak a clear sentence and check its caption text in the browser developer tools (Network, WS, Messages). Garbled or empty text on clear speech means the sample rate conversion is wrong.</w:t>
       </w:r>
     </w:p>
     <w:p>
@@ -14326,7 +13733,7 @@
         <w:spacing w:after="120" w:before="280"/>
       </w:pPr>
       <w:r>
-        <w:t xml:space="preserve">Step 1F: Transcript, history and downloads</w:t>
+        <w:t xml:space="preserve">Step 1F: Transcript download (open decision)</w:t>
       </w:r>
     </w:p>
     <w:p>
@@ -14338,268 +13745,25 @@
           <w:b/>
           <w:bCs/>
         </w:rPr>
-        <w:t xml:space="preserve">Goal:</w:t>
-      </w:r>
-      <w:r>
-        <w:t xml:space="preserve"> every conversation is saved and can be reopened, downloaded and deleted.</w:t>
-      </w:r>
-    </w:p>
-    <w:p>
-      <w:pPr>
-        <w:pStyle w:val="Heading3"/>
-        <w:spacing w:after="80" w:before="200"/>
-      </w:pPr>
-      <w:r>
-        <w:t xml:space="preserve">Frontend tasks (Developer A, branch 1f-frontend)</w:t>
-      </w:r>
-    </w:p>
-    <w:p>
-      <w:pPr>
-        <w:pStyle w:val="ListParagraph"/>
-        <w:numPr>
-          <w:ilvl w:val="0"/>
-          <w:numId w:val="14"/>
-        </w:numPr>
-        <w:spacing w:after="60" w:line="276"/>
-      </w:pPr>
-      <w:r>
-        <w:rPr>
-          <w:rFonts w:ascii="Consolas" w:cs="Consolas" w:eastAsia="Consolas" w:hAnsi="Consolas"/>
-          <w:color w:val="24292F"/>
-          <w:sz w:val="19"/>
-          <w:szCs w:val="19"/>
-        </w:rPr>
-        <w:t xml:space="preserve">src/features/transcript/HistoryScreen.tsx</w:t>
-      </w:r>
-      <w:r>
-        <w:t xml:space="preserve">: list of past conversations from </w:t>
-      </w:r>
-      <w:r>
-        <w:rPr>
-          <w:rFonts w:ascii="Consolas" w:cs="Consolas" w:eastAsia="Consolas" w:hAnsi="Consolas"/>
-          <w:color w:val="24292F"/>
-          <w:sz w:val="19"/>
-          <w:szCs w:val="19"/>
-        </w:rPr>
-        <w:t xml:space="preserve">GET /api/sessions</w:t>
-      </w:r>
-      <w:r>
-        <w:t xml:space="preserve"> (date, names, languages, number of turns), opened from a History button.</w:t>
-      </w:r>
-    </w:p>
-    <w:p>
-      <w:pPr>
-        <w:pStyle w:val="ListParagraph"/>
-        <w:numPr>
-          <w:ilvl w:val="0"/>
-          <w:numId w:val="14"/>
-        </w:numPr>
-        <w:spacing w:after="60" w:line="276"/>
-      </w:pPr>
-      <w:r>
-        <w:rPr>
-          <w:rFonts w:ascii="Consolas" w:cs="Consolas" w:eastAsia="Consolas" w:hAnsi="Consolas"/>
-          <w:color w:val="24292F"/>
-          <w:sz w:val="19"/>
-          <w:szCs w:val="19"/>
-        </w:rPr>
-        <w:t xml:space="preserve">TranscriptView.tsx</w:t>
-      </w:r>
-      <w:r>
-        <w:t xml:space="preserve">: all turns of one conversation from </w:t>
-      </w:r>
-      <w:r>
-        <w:rPr>
-          <w:rFonts w:ascii="Consolas" w:cs="Consolas" w:eastAsia="Consolas" w:hAnsi="Consolas"/>
-          <w:color w:val="24292F"/>
-          <w:sz w:val="19"/>
-          <w:szCs w:val="19"/>
-        </w:rPr>
-        <w:t xml:space="preserve">GET /api/sessions/{id}/transcript</w:t>
-      </w:r>
-      <w:r>
-        <w:t xml:space="preserve">, with times, original and translation.</w:t>
-      </w:r>
-    </w:p>
-    <w:p>
-      <w:pPr>
-        <w:pStyle w:val="ListParagraph"/>
-        <w:numPr>
-          <w:ilvl w:val="0"/>
-          <w:numId w:val="14"/>
-        </w:numPr>
-        <w:spacing w:after="60" w:line="276"/>
-      </w:pPr>
-      <w:r>
-        <w:rPr>
-          <w:rFonts w:ascii="Consolas" w:cs="Consolas" w:eastAsia="Consolas" w:hAnsi="Consolas"/>
-          <w:color w:val="24292F"/>
-          <w:sz w:val="19"/>
-          <w:szCs w:val="19"/>
-        </w:rPr>
-        <w:t xml:space="preserve">DownloadMenu.tsx</w:t>
-      </w:r>
-      <w:r>
-        <w:t xml:space="preserve">: TXT, SRT, VTT and JSON downloads using the export endpoint.</w:t>
-      </w:r>
-    </w:p>
-    <w:p>
-      <w:pPr>
-        <w:pStyle w:val="ListParagraph"/>
-        <w:numPr>
-          <w:ilvl w:val="0"/>
-          <w:numId w:val="14"/>
-        </w:numPr>
-        <w:spacing w:after="60" w:line="276"/>
-      </w:pPr>
-      <w:r>
-        <w:t xml:space="preserve">Delete with a confirmation dialog, then remove the item from the list.</w:t>
-      </w:r>
-    </w:p>
-    <w:p>
-      <w:pPr>
-        <w:pStyle w:val="ListParagraph"/>
-        <w:numPr>
-          <w:ilvl w:val="0"/>
-          <w:numId w:val="14"/>
-        </w:numPr>
-        <w:spacing w:after="60" w:line="276"/>
-      </w:pPr>
-      <w:r>
-        <w:t xml:space="preserve">The End button on the session screen calls </w:t>
-      </w:r>
-      <w:r>
-        <w:rPr>
-          <w:rFonts w:ascii="Consolas" w:cs="Consolas" w:eastAsia="Consolas" w:hAnsi="Consolas"/>
-          <w:color w:val="24292F"/>
-          <w:sz w:val="19"/>
-          <w:szCs w:val="19"/>
-        </w:rPr>
-        <w:t xml:space="preserve">POST /api/sessions/{id}/stop</w:t>
-      </w:r>
-      <w:r>
-        <w:t xml:space="preserve"> before returning to the start.</w:t>
-      </w:r>
-    </w:p>
-    <w:p>
-      <w:pPr>
-        <w:pStyle w:val="Heading3"/>
-        <w:spacing w:after="80" w:before="200"/>
-      </w:pPr>
-      <w:r>
-        <w:t xml:space="preserve">Backend tasks (Developer B, branch 1f-backend)</w:t>
-      </w:r>
-    </w:p>
-    <w:p>
-      <w:pPr>
-        <w:pStyle w:val="ListParagraph"/>
-        <w:numPr>
-          <w:ilvl w:val="0"/>
-          <w:numId w:val="2"/>
-        </w:numPr>
-        <w:spacing w:after="60" w:line="276"/>
-      </w:pPr>
-      <w:r>
-        <w:t xml:space="preserve">SQLite storage for sessions and utterances (the database file lives in the Git-ignored </w:t>
-      </w:r>
-      <w:r>
-        <w:rPr>
-          <w:rFonts w:ascii="Consolas" w:cs="Consolas" w:eastAsia="Consolas" w:hAnsi="Consolas"/>
-          <w:color w:val="24292F"/>
-          <w:sz w:val="19"/>
-          <w:szCs w:val="19"/>
-        </w:rPr>
-        <w:t xml:space="preserve">backend/data/</w:t>
-      </w:r>
-      <w:r>
-        <w:t xml:space="preserve">).</w:t>
-      </w:r>
-    </w:p>
-    <w:p>
-      <w:pPr>
-        <w:pStyle w:val="ListParagraph"/>
-        <w:numPr>
-          <w:ilvl w:val="0"/>
-          <w:numId w:val="2"/>
-        </w:numPr>
-        <w:spacing w:after="60" w:line="276"/>
-      </w:pPr>
-      <w:r>
-        <w:t xml:space="preserve">Conversation manager: one ordered timeline for both directions, final turns stored once.</w:t>
-      </w:r>
-    </w:p>
-    <w:p>
-      <w:pPr>
-        <w:pStyle w:val="ListParagraph"/>
-        <w:numPr>
-          <w:ilvl w:val="0"/>
-          <w:numId w:val="2"/>
-        </w:numPr>
-        <w:spacing w:after="60" w:line="276"/>
-      </w:pPr>
-      <w:r>
-        <w:t xml:space="preserve">Transcript, list, stop, export (TXT, SRT, VTT, JSON) and delete endpoints, with tests for each export format.</w:t>
-      </w:r>
-    </w:p>
-    <w:p>
-      <w:pPr>
-        <w:pStyle w:val="Heading3"/>
-        <w:spacing w:after="80" w:before="200"/>
-      </w:pPr>
-      <w:r>
-        <w:t xml:space="preserve">Joint test</w:t>
-      </w:r>
-    </w:p>
-    <w:p>
-      <w:pPr>
-        <w:pStyle w:val="ListParagraph"/>
-        <w:numPr>
-          <w:ilvl w:val="0"/>
-          <w:numId w:val="15"/>
-        </w:numPr>
-        <w:spacing w:after="60" w:line="276"/>
-      </w:pPr>
-      <w:r>
-        <w:t xml:space="preserve">Hold a conversation of at least six turns, then end it.</w:t>
-      </w:r>
-    </w:p>
-    <w:p>
-      <w:pPr>
-        <w:pStyle w:val="ListParagraph"/>
-        <w:numPr>
-          <w:ilvl w:val="0"/>
-          <w:numId w:val="15"/>
-        </w:numPr>
-        <w:spacing w:after="60" w:line="276"/>
-      </w:pPr>
-      <w:r>
-        <w:t xml:space="preserve">Reopen it from History. All turns appear in order.</w:t>
-      </w:r>
-    </w:p>
-    <w:p>
-      <w:pPr>
-        <w:pStyle w:val="ListParagraph"/>
-        <w:numPr>
-          <w:ilvl w:val="0"/>
-          <w:numId w:val="15"/>
-        </w:numPr>
-        <w:spacing w:after="60" w:line="276"/>
-      </w:pPr>
-      <w:r>
-        <w:t xml:space="preserve">Download all four formats and open each. SRT and VTT timings must match the order of the turns.</w:t>
-      </w:r>
-    </w:p>
-    <w:p>
-      <w:pPr>
-        <w:pStyle w:val="ListParagraph"/>
-        <w:numPr>
-          <w:ilvl w:val="0"/>
-          <w:numId w:val="15"/>
-        </w:numPr>
-        <w:spacing w:after="60" w:line="276"/>
-      </w:pPr>
-      <w:r>
-        <w:t xml:space="preserve">Delete it. It disappears from History and its transcript address returns 404.</w:t>
+        <w:t xml:space="preserve">Status:</w:t>
+      </w:r>
+      <w:r>
+        <w:t xml:space="preserve"> to be decided before this step starts. Nothing is stored on the server, so saved history, reopening and deleting past conversations are not planned.</w:t>
+      </w:r>
+    </w:p>
+    <w:p>
+      <w:pPr>
+        <w:spacing w:after="120" w:line="276"/>
+      </w:pPr>
+      <w:r>
+        <w:rPr>
+          <w:b/>
+          <w:bCs/>
+        </w:rPr>
+        <w:t xml:space="preserve">Option to discuss:</w:t>
+      </w:r>
+      <w:r>
+        <w:t xml:space="preserve"> the browser keeps the turns of the current conversation while the page is open and offers TXT, SRT, VTT and JSON downloads built in the browser. Nothing remains after the page is closed, and the backend needs no new endpoints.</w:t>
       </w:r>
     </w:p>
     <w:p>
@@ -15151,7 +14315,7 @@
                 <w:sz w:val="19"/>
                 <w:szCs w:val="19"/>
               </w:rPr>
-              <w:t xml:space="preserve">2D Recordings</w:t>
+              <w:t xml:space="preserve">2D Recordings (open decision)</w:t>
             </w:r>
           </w:p>
         </w:tc>
@@ -15180,7 +14344,7 @@
                 <w:sz w:val="19"/>
                 <w:szCs w:val="19"/>
               </w:rPr>
-              <w:t xml:space="preserve">Upload screen with progress; transcript editor</w:t>
+              <w:t xml:space="preserve">Upload screen with progress</w:t>
             </w:r>
           </w:p>
         </w:tc>
@@ -15209,7 +14373,7 @@
                 <w:sz w:val="19"/>
                 <w:szCs w:val="19"/>
               </w:rPr>
-              <w:t xml:space="preserve">File-upload adapter; background jobs; DOCX and PDF export</w:t>
+              <w:t xml:space="preserve">File-upload adapter processed in memory</w:t>
             </w:r>
           </w:p>
         </w:tc>
@@ -15238,7 +14402,7 @@
                 <w:sz w:val="19"/>
                 <w:szCs w:val="19"/>
               </w:rPr>
-              <w:t xml:space="preserve">A saved recording becomes an edited, translated transcript</w:t>
+              <w:t xml:space="preserve">An uploaded recording is transcribed and translated without being kept</w:t>
             </w:r>
           </w:p>
         </w:tc>
@@ -15737,7 +14901,7 @@
           <w:sz w:val="18"/>
           <w:szCs w:val="18"/>
         </w:rPr>
-        <w:t xml:space="preserve">│       │   └── transcript/            HistoryScreen, TranscriptView, DownloadMenu</w:t>
+        <w:t xml:space="preserve">│       │   └── transcript/            DownloadMenu (open decision)</w:t>
       </w:r>
     </w:p>
     <w:p>
@@ -15832,7 +14996,7 @@
           <w:sz w:val="18"/>
           <w:szCs w:val="18"/>
         </w:rPr>
-        <w:t xml:space="preserve">│   │   ├── core/                      config.py, languages.py</w:t>
+        <w:t xml:space="preserve">│   │   ├── core/                      config.py, errors.py, languages.py</w:t>
       </w:r>
     </w:p>
     <w:p>
@@ -15851,7 +15015,7 @@
           <w:sz w:val="18"/>
           <w:szCs w:val="18"/>
         </w:rPr>
-        <w:t xml:space="preserve">│   │   ├── api/                       sessions.py, exports.py</w:t>
+        <w:t xml:space="preserve">│   │   ├── api/                       sessions.py, stream.py, dependencies.py</w:t>
       </w:r>
     </w:p>
     <w:p>
@@ -15889,7 +15053,7 @@
           <w:sz w:val="18"/>
           <w:szCs w:val="18"/>
         </w:rPr>
-        <w:t xml:space="preserve">│   │   │   ├── audio_ingestion/       base.py, microphone.py</w:t>
+        <w:t xml:space="preserve">│   │   │   ├── session_store.py</w:t>
       </w:r>
     </w:p>
     <w:p>
@@ -15908,7 +15072,7 @@
           <w:sz w:val="18"/>
           <w:szCs w:val="18"/>
         </w:rPr>
-        <w:t xml:space="preserve">│   │   │   ├── speech_recognition.py, translation.py, tts.py</w:t>
+        <w:t xml:space="preserve">│   │   │   ├── audio_ingestion/       microphone.py, segment.py, wav.py</w:t>
       </w:r>
     </w:p>
     <w:p>
@@ -15927,7 +15091,7 @@
           <w:sz w:val="18"/>
           <w:szCs w:val="18"/>
         </w:rPr>
-        <w:t xml:space="preserve">│   │   │   ├── providers/             the chosen free provider(s)</w:t>
+        <w:t xml:space="preserve">│   │   │   └── translation/           base.py, factory.py, gemini.py</w:t>
       </w:r>
     </w:p>
     <w:p>
@@ -15946,7 +15110,7 @@
           <w:sz w:val="18"/>
           <w:szCs w:val="18"/>
         </w:rPr>
-        <w:t xml:space="preserve">│   │   │   ├── conversation_manager.py</w:t>
+        <w:t xml:space="preserve">│   │   └── models/                    session.py, protocol.py</w:t>
       </w:r>
     </w:p>
     <w:p>
@@ -15965,7 +15129,7 @@
           <w:sz w:val="18"/>
           <w:szCs w:val="18"/>
         </w:rPr>
-        <w:t xml:space="preserve">│   │   │   └── export_service.py</w:t>
+        <w:t xml:space="preserve">│   ├── scripts/                       benchmark.py, fleurs.py</w:t>
       </w:r>
     </w:p>
     <w:p>
@@ -15984,7 +15148,7 @@
           <w:sz w:val="18"/>
           <w:szCs w:val="18"/>
         </w:rPr>
-        <w:t xml:space="preserve">│   │   └── models/                    session, utterance</w:t>
+        <w:t xml:space="preserve">│   └── tests/</w:t>
       </w:r>
     </w:p>
     <w:p>
@@ -16003,7 +15167,7 @@
           <w:sz w:val="18"/>
           <w:szCs w:val="18"/>
         </w:rPr>
-        <w:t xml:space="preserve">│   ├── tests/</w:t>
+        <w:t xml:space="preserve">├── docs/                              PROTOCOL.md, DECISIONS.md, DEVELOPER-HANDBOOK.docx</w:t>
       </w:r>
     </w:p>
     <w:p>
@@ -16022,44 +15186,6 @@
           <w:sz w:val="18"/>
           <w:szCs w:val="18"/>
         </w:rPr>
-        <w:t xml:space="preserve">│   └── data/                          database (Git-ignored)</w:t>
-      </w:r>
-    </w:p>
-    <w:p>
-      <w:pPr>
-        <w:pBdr>
-          <w:left w:val="single" w:color="0969DA" w:sz="12" w:space="6"/>
-        </w:pBdr>
-        <w:shd w:fill="F6F8FA" w:color="auto" w:val="clear"/>
-        <w:spacing w:after="0" w:before="0" w:line="252"/>
-        <w:ind w:left="180"/>
-      </w:pPr>
-      <w:r>
-        <w:rPr>
-          <w:rFonts w:ascii="Consolas" w:cs="Consolas" w:eastAsia="Consolas" w:hAnsi="Consolas"/>
-          <w:color w:val="24292F"/>
-          <w:sz w:val="18"/>
-          <w:szCs w:val="18"/>
-        </w:rPr>
-        <w:t xml:space="preserve">├── docs/                              PROTOCOL.md, DECISIONS.md, blueprint</w:t>
-      </w:r>
-    </w:p>
-    <w:p>
-      <w:pPr>
-        <w:pBdr>
-          <w:left w:val="single" w:color="0969DA" w:sz="12" w:space="6"/>
-        </w:pBdr>
-        <w:shd w:fill="F6F8FA" w:color="auto" w:val="clear"/>
-        <w:spacing w:after="0" w:before="0" w:line="252"/>
-        <w:ind w:left="180"/>
-      </w:pPr>
-      <w:r>
-        <w:rPr>
-          <w:rFonts w:ascii="Consolas" w:cs="Consolas" w:eastAsia="Consolas" w:hAnsi="Consolas"/>
-          <w:color w:val="24292F"/>
-          <w:sz w:val="18"/>
-          <w:szCs w:val="18"/>
-        </w:rPr>
         <w:t xml:space="preserve">├── .github/workflows/checks.yml       automatic checks</w:t>
       </w:r>
     </w:p>
@@ -16151,19 +15277,6 @@
       </w:pPr>
       <w:r>
         <w:t xml:space="preserve">Translations are spoken in the listener's language where a voice exists, with no echo loop, and the voice can be turned off.</w:t>
-      </w:r>
-    </w:p>
-    <w:p>
-      <w:pPr>
-        <w:pStyle w:val="ListParagraph"/>
-        <w:numPr>
-          <w:ilvl w:val="0"/>
-          <w:numId w:val="2"/>
-        </w:numPr>
-        <w:spacing w:after="60" w:line="276"/>
-      </w:pPr>
-      <w:r>
-        <w:t xml:space="preserve">Conversations are saved, reopen correctly, and download as TXT, SRT, VTT and JSON.</w:t>
       </w:r>
     </w:p>
     <w:p>
@@ -17158,18 +16271,6 @@
     </w:lvlOverride>
   </w:num>
   <w:num w:numId="13">
-    <w:abstractNumId w:val="3"/>
-    <w:lvlOverride w:ilvl="0">
-      <w:startOverride w:val="1"/>
-    </w:lvlOverride>
-  </w:num>
-  <w:num w:numId="14">
-    <w:abstractNumId w:val="3"/>
-    <w:lvlOverride w:ilvl="0">
-      <w:startOverride w:val="1"/>
-    </w:lvlOverride>
-  </w:num>
-  <w:num w:numId="15">
     <w:abstractNumId w:val="3"/>
     <w:lvlOverride w:ilvl="0">
       <w:startOverride w:val="1"/>

</xml_diff>

<commit_message>
Step 1E backend: translations spoken by a live Gemini voice, with browser voice as backup
</commit_message>
<xml_diff>
--- a/docs/DEVELOPER-HANDBOOK.docx
+++ b/docs/DEVELOPER-HANDBOOK.docx
@@ -230,7 +230,7 @@
                 <w:sz w:val="19"/>
                 <w:szCs w:val="19"/>
               </w:rPr>
-              <w:t xml:space="preserve">1.2, 18 October 2026 (aligned with docs/PROTOCOL.md during Step 1D)</w:t>
+              <w:t xml:space="preserve">1.3, 18 October 2026 (aligned with docs/PROTOCOL.md during Step 1E)</w:t>
             </w:r>
           </w:p>
         </w:tc>
@@ -3458,7 +3458,7 @@
                 <w:sz w:val="19"/>
                 <w:szCs w:val="19"/>
               </w:rPr>
-              <w:t xml:space="preserve">TextToSpeech</w:t>
+              <w:t xml:space="preserve">Voice (text to speech)</w:t>
             </w:r>
           </w:p>
         </w:tc>
@@ -3489,7 +3489,7 @@
                 <w:sz w:val="19"/>
                 <w:szCs w:val="19"/>
               </w:rPr>
-              <w:t xml:space="preserve">backend/app/services/tts.py</w:t>
+              <w:t xml:space="preserve">backend/app/services/voice/</w:t>
             </w:r>
           </w:p>
         </w:tc>
@@ -4105,7 +4105,7 @@
           <w:sz w:val="19"/>
           <w:szCs w:val="19"/>
         </w:rPr>
-        <w:t xml:space="preserve">{"status":"ok","version":"0.4.0"}</w:t>
+        <w:t xml:space="preserve">{"status":"ok","version":"0.5.0"}</w:t>
       </w:r>
       <w:r>
         <w:t xml:space="preserve">.</w:t>
@@ -6550,7 +6550,7 @@
                 <w:sz w:val="19"/>
                 <w:szCs w:val="19"/>
               </w:rPr>
-              <w:t xml:space="preserve">{"status":"ok","version":"0.4.0"}</w:t>
+              <w:t xml:space="preserve">{"status":"ok","version":"0.5.0"}</w:t>
             </w:r>
             <w:r>
               <w:rPr>
@@ -9322,6 +9322,22 @@
               </w:rPr>
               <w:t xml:space="preserve">participants</w:t>
             </w:r>
+            <w:r>
+              <w:rPr>
+                <w:sz w:val="19"/>
+                <w:szCs w:val="19"/>
+              </w:rPr>
+              <w:t xml:space="preserve">, </w:t>
+            </w:r>
+            <w:r>
+              <w:rPr>
+                <w:rFonts w:ascii="Consolas" w:cs="Consolas" w:eastAsia="Consolas" w:hAnsi="Consolas"/>
+                <w:color w:val="24292F"/>
+                <w:sz w:val="19"/>
+                <w:szCs w:val="19"/>
+              </w:rPr>
+              <w:t xml:space="preserve">server_voice</w:t>
+            </w:r>
           </w:p>
         </w:tc>
         <w:tc>
@@ -9349,7 +9365,23 @@
                 <w:sz w:val="19"/>
                 <w:szCs w:val="19"/>
               </w:rPr>
-              <w:t xml:space="preserve">The live channel is open.</w:t>
+              <w:t xml:space="preserve">The live channel is open. </w:t>
+            </w:r>
+            <w:r>
+              <w:rPr>
+                <w:rFonts w:ascii="Consolas" w:cs="Consolas" w:eastAsia="Consolas" w:hAnsi="Consolas"/>
+                <w:color w:val="24292F"/>
+                <w:sz w:val="19"/>
+                <w:szCs w:val="19"/>
+              </w:rPr>
+              <w:t xml:space="preserve">server_voice</w:t>
+            </w:r>
+            <w:r>
+              <w:rPr>
+                <w:sz w:val="19"/>
+                <w:szCs w:val="19"/>
+              </w:rPr>
+              <w:t xml:space="preserve"> says whether the server sends voices.</w:t>
             </w:r>
           </w:p>
         </w:tc>
@@ -10336,7 +10368,7 @@
                 <w:sz w:val="19"/>
                 <w:szCs w:val="19"/>
               </w:rPr>
-              <w:t xml:space="preserve"> ("mp3" or "wav"), </w:t>
+              <w:t xml:space="preserve"> ("wav"), </w:t>
             </w:r>
             <w:r>
               <w:rPr>
@@ -10374,7 +10406,39 @@
                 <w:sz w:val="19"/>
                 <w:szCs w:val="19"/>
               </w:rPr>
-              <w:t xml:space="preserve">Only sent if the server makes the voice (decided in 1E). Otherwise the browser speaks the text itself.</w:t>
+              <w:t xml:space="preserve">The translation spoken in the listener's language. Sent only when </w:t>
+            </w:r>
+            <w:r>
+              <w:rPr>
+                <w:rFonts w:ascii="Consolas" w:cs="Consolas" w:eastAsia="Consolas" w:hAnsi="Consolas"/>
+                <w:color w:val="24292F"/>
+                <w:sz w:val="19"/>
+                <w:szCs w:val="19"/>
+              </w:rPr>
+              <w:t xml:space="preserve">session.ready</w:t>
+            </w:r>
+            <w:r>
+              <w:rPr>
+                <w:sz w:val="19"/>
+                <w:szCs w:val="19"/>
+              </w:rPr>
+              <w:t xml:space="preserve"> has </w:t>
+            </w:r>
+            <w:r>
+              <w:rPr>
+                <w:rFonts w:ascii="Consolas" w:cs="Consolas" w:eastAsia="Consolas" w:hAnsi="Consolas"/>
+                <w:color w:val="24292F"/>
+                <w:sz w:val="19"/>
+                <w:szCs w:val="19"/>
+              </w:rPr>
+              <w:t xml:space="preserve">server_voice: true</w:t>
+            </w:r>
+            <w:r>
+              <w:rPr>
+                <w:sz w:val="19"/>
+                <w:szCs w:val="19"/>
+              </w:rPr>
+              <w:t xml:space="preserve">.</w:t>
             </w:r>
           </w:p>
         </w:tc>
@@ -11654,6 +11718,97 @@
                 <w:sz w:val="19"/>
                 <w:szCs w:val="19"/>
               </w:rPr>
+              <w:t xml:space="preserve">voice_unavailable</w:t>
+            </w:r>
+          </w:p>
+        </w:tc>
+        <w:tc>
+          <w:tcPr>
+            <w:tcW w:type="dxa" w:w="1349"/>
+            <w:tcBorders>
+              <w:top w:val="single" w:color="C9D1D9" w:sz="4"/>
+              <w:left w:val="single" w:color="C9D1D9" w:sz="4"/>
+              <w:bottom w:val="single" w:color="C9D1D9" w:sz="4"/>
+              <w:right w:val="single" w:color="C9D1D9" w:sz="4"/>
+            </w:tcBorders>
+            <w:tcMar>
+              <w:top w:type="dxa" w:w="60"/>
+              <w:left w:type="dxa" w:w="100"/>
+              <w:bottom w:type="dxa" w:w="60"/>
+              <w:right w:type="dxa" w:w="100"/>
+            </w:tcMar>
+          </w:tcPr>
+          <w:p>
+            <w:pPr>
+              <w:spacing w:after="40" w:line="252"/>
+            </w:pPr>
+            <w:r>
+              <w:rPr>
+                <w:sz w:val="19"/>
+                <w:szCs w:val="19"/>
+              </w:rPr>
+              <w:t xml:space="preserve">no</w:t>
+            </w:r>
+          </w:p>
+        </w:tc>
+        <w:tc>
+          <w:tcPr>
+            <w:tcW w:type="dxa" w:w="5591"/>
+            <w:tcBorders>
+              <w:top w:val="single" w:color="C9D1D9" w:sz="4"/>
+              <w:left w:val="single" w:color="C9D1D9" w:sz="4"/>
+              <w:bottom w:val="single" w:color="C9D1D9" w:sz="4"/>
+              <w:right w:val="single" w:color="C9D1D9" w:sz="4"/>
+            </w:tcBorders>
+            <w:tcMar>
+              <w:top w:type="dxa" w:w="60"/>
+              <w:left w:type="dxa" w:w="100"/>
+              <w:bottom w:type="dxa" w:w="60"/>
+              <w:right w:type="dxa" w:w="100"/>
+            </w:tcMar>
+          </w:tcPr>
+          <w:p>
+            <w:pPr>
+              <w:spacing w:after="40" w:line="252"/>
+            </w:pPr>
+            <w:r>
+              <w:rPr>
+                <w:sz w:val="19"/>
+                <w:szCs w:val="19"/>
+              </w:rPr>
+              <w:t xml:space="preserve">The server could not make this voice. Use the browser voice or captions only.</w:t>
+            </w:r>
+          </w:p>
+        </w:tc>
+      </w:tr>
+      <w:tr>
+        <w:tc>
+          <w:tcPr>
+            <w:tcW w:type="dxa" w:w="2698"/>
+            <w:tcBorders>
+              <w:top w:val="single" w:color="C9D1D9" w:sz="4"/>
+              <w:left w:val="single" w:color="C9D1D9" w:sz="4"/>
+              <w:bottom w:val="single" w:color="C9D1D9" w:sz="4"/>
+              <w:right w:val="single" w:color="C9D1D9" w:sz="4"/>
+            </w:tcBorders>
+            <w:tcMar>
+              <w:top w:type="dxa" w:w="60"/>
+              <w:left w:type="dxa" w:w="100"/>
+              <w:bottom w:type="dxa" w:w="60"/>
+              <w:right w:type="dxa" w:w="100"/>
+            </w:tcMar>
+          </w:tcPr>
+          <w:p>
+            <w:pPr>
+              <w:spacing w:after="40" w:line="252"/>
+            </w:pPr>
+            <w:r>
+              <w:rPr>
+                <w:rFonts w:ascii="Consolas" w:cs="Consolas" w:eastAsia="Consolas" w:hAnsi="Consolas"/>
+                <w:color w:val="24292F"/>
+                <w:sz w:val="19"/>
+                <w:szCs w:val="19"/>
+              </w:rPr>
               <w:t xml:space="preserve">internal_error</w:t>
             </w:r>
           </w:p>
@@ -13529,7 +13684,7 @@
         <w:spacing w:after="60" w:line="276"/>
       </w:pPr>
       <w:r>
-        <w:t xml:space="preserve">If the server sends </w:t>
+        <w:t xml:space="preserve">When </w:t>
       </w:r>
       <w:r>
         <w:rPr>
@@ -13538,10 +13693,82 @@
           <w:sz w:val="19"/>
           <w:szCs w:val="19"/>
         </w:rPr>
+        <w:t xml:space="preserve">session.ready</w:t>
+      </w:r>
+      <w:r>
+        <w:t xml:space="preserve"> has </w:t>
+      </w:r>
+      <w:r>
+        <w:rPr>
+          <w:rFonts w:ascii="Consolas" w:cs="Consolas" w:eastAsia="Consolas" w:hAnsi="Consolas"/>
+          <w:color w:val="24292F"/>
+          <w:sz w:val="19"/>
+          <w:szCs w:val="19"/>
+        </w:rPr>
+        <w:t xml:space="preserve">server_voice: true</w:t>
+      </w:r>
+      <w:r>
+        <w:t xml:space="preserve">, wait for </w:t>
+      </w:r>
+      <w:r>
+        <w:rPr>
+          <w:rFonts w:ascii="Consolas" w:cs="Consolas" w:eastAsia="Consolas" w:hAnsi="Consolas"/>
+          <w:color w:val="24292F"/>
+          <w:sz w:val="19"/>
+          <w:szCs w:val="19"/>
+        </w:rPr>
         <w:t xml:space="preserve">tts.audio</w:t>
       </w:r>
       <w:r>
-        <w:t xml:space="preserve">, play that audio instead of the browser voice.</w:t>
+        <w:t xml:space="preserve"> (decode the base64 WAV and play it) or </w:t>
+      </w:r>
+      <w:r>
+        <w:rPr>
+          <w:rFonts w:ascii="Consolas" w:cs="Consolas" w:eastAsia="Consolas" w:hAnsi="Consolas"/>
+          <w:color w:val="24292F"/>
+          <w:sz w:val="19"/>
+          <w:szCs w:val="19"/>
+        </w:rPr>
+        <w:t xml:space="preserve">voice_unavailable</w:t>
+      </w:r>
+      <w:r>
+        <w:t xml:space="preserve"> for each translated sentence; on </w:t>
+      </w:r>
+      <w:r>
+        <w:rPr>
+          <w:rFonts w:ascii="Consolas" w:cs="Consolas" w:eastAsia="Consolas" w:hAnsi="Consolas"/>
+          <w:color w:val="24292F"/>
+          <w:sz w:val="19"/>
+          <w:szCs w:val="19"/>
+        </w:rPr>
+        <w:t xml:space="preserve">voice_unavailable</w:t>
+      </w:r>
+      <w:r>
+        <w:t xml:space="preserve"> use the browser voice. When </w:t>
+      </w:r>
+      <w:r>
+        <w:rPr>
+          <w:rFonts w:ascii="Consolas" w:cs="Consolas" w:eastAsia="Consolas" w:hAnsi="Consolas"/>
+          <w:color w:val="24292F"/>
+          <w:sz w:val="19"/>
+          <w:szCs w:val="19"/>
+        </w:rPr>
+        <w:t xml:space="preserve">server_voice</w:t>
+      </w:r>
+      <w:r>
+        <w:t xml:space="preserve"> is </w:t>
+      </w:r>
+      <w:r>
+        <w:rPr>
+          <w:rFonts w:ascii="Consolas" w:cs="Consolas" w:eastAsia="Consolas" w:hAnsi="Consolas"/>
+          <w:color w:val="24292F"/>
+          <w:sz w:val="19"/>
+          <w:szCs w:val="19"/>
+        </w:rPr>
+        <w:t xml:space="preserve">false</w:t>
+      </w:r>
+      <w:r>
+        <w:t xml:space="preserve">, always use the browser voice.</w:t>
       </w:r>
     </w:p>
     <w:p>
@@ -13615,7 +13842,7 @@
         <w:spacing w:after="60" w:line="276"/>
       </w:pPr>
       <w:r>
-        <w:t xml:space="preserve">Decide per language: browser voice (default, free) or a free server voice when it is better or the browser has none. Make it a setting (</w:t>
+        <w:t xml:space="preserve">Server voice through a Gemini voice model set by </w:t>
       </w:r>
       <w:r>
         <w:rPr>
@@ -13624,10 +13851,10 @@
           <w:sz w:val="19"/>
           <w:szCs w:val="19"/>
         </w:rPr>
-        <w:t xml:space="preserve">VOICE_MODE=browser</w:t>
-      </w:r>
-      <w:r>
-        <w:t xml:space="preserve"> or </w:t>
+        <w:t xml:space="preserve">GEMINI_TTS_MODEL</w:t>
+      </w:r>
+      <w:r>
+        <w:t xml:space="preserve">, behind a </w:t>
       </w:r>
       <w:r>
         <w:rPr>
@@ -13636,10 +13863,10 @@
           <w:sz w:val="19"/>
           <w:szCs w:val="19"/>
         </w:rPr>
-        <w:t xml:space="preserve">server</w:t>
-      </w:r>
-      <w:r>
-        <w:t xml:space="preserve">).</w:t>
+        <w:t xml:space="preserve">SpeechSynthesizer</w:t>
+      </w:r>
+      <w:r>
+        <w:t xml:space="preserve"> interface. Empty setting: no server voice, the browser speaks.</w:t>
       </w:r>
     </w:p>
     <w:p>
@@ -13652,7 +13879,7 @@
         <w:spacing w:after="60" w:line="276"/>
       </w:pPr>
       <w:r>
-        <w:t xml:space="preserve">If server voice is used: a </w:t>
+        <w:t xml:space="preserve">A separate voice queue per live channel, so voices keep speaking order and never delay captions. Send </w:t>
       </w:r>
       <w:r>
         <w:rPr>
@@ -13661,10 +13888,10 @@
           <w:sz w:val="19"/>
           <w:szCs w:val="19"/>
         </w:rPr>
-        <w:t xml:space="preserve">TextToSpeech</w:t>
-      </w:r>
-      <w:r>
-        <w:t xml:space="preserve"> interface, the provider, and </w:t>
+        <w:t xml:space="preserve">tts.audio</w:t>
+      </w:r>
+      <w:r>
+        <w:t xml:space="preserve">, or </w:t>
       </w:r>
       <w:r>
         <w:rPr>
@@ -13673,10 +13900,10 @@
           <w:sz w:val="19"/>
           <w:szCs w:val="19"/>
         </w:rPr>
-        <w:t xml:space="preserve">tts.audio</w:t>
-      </w:r>
-      <w:r>
-        <w:t xml:space="preserve"> messages.</w:t>
+        <w:t xml:space="preserve">voice_unavailable</w:t>
+      </w:r>
+      <w:r>
+        <w:t xml:space="preserve"> when a voice cannot be made.</w:t>
       </w:r>
     </w:p>
     <w:p>

</xml_diff>

<commit_message>
Hands-free listening: sentences end after a pause, speaker found by language, one voice per translation
</commit_message>
<xml_diff>
--- a/docs/DEVELOPER-HANDBOOK.docx
+++ b/docs/DEVELOPER-HANDBOOK.docx
@@ -230,7 +230,7 @@
                 <w:sz w:val="19"/>
                 <w:szCs w:val="19"/>
               </w:rPr>
-              <w:t xml:space="preserve">1.3, 18 October 2026 (aligned with docs/PROTOCOL.md during Step 1E)</w:t>
+              <w:t xml:space="preserve">1.4, 18 October 2026 (aligned with docs/PROTOCOL.md v2, hands-free)</w:t>
             </w:r>
           </w:p>
         </w:tc>
@@ -1260,10 +1260,10 @@
           <w:b/>
           <w:bCs/>
         </w:rPr>
-        <w:t xml:space="preserve">Tap-to-talk first.</w:t>
-      </w:r>
-      <w:r>
-        <w:t xml:space="preserve"> Each person has their own talk button, so the app always knows who is speaking. Hands-free mode comes in Phase 2.</w:t>
+        <w:t xml:space="preserve">Hands-free.</w:t>
+      </w:r>
+      <w:r>
+        <w:t xml:space="preserve"> No talk buttons: the app listens continuously, finds each sentence by itself, and the language heard decides who spoke.</w:t>
       </w:r>
     </w:p>
     <w:p>
@@ -1586,7 +1586,7 @@
                 <w:sz w:val="19"/>
                 <w:szCs w:val="19"/>
               </w:rPr>
-              <w:t xml:space="preserve">Consent and language screens, microphone capture, talk buttons, captions, voice playback and, if decided, transcript download. Opens a pull request for every step.</w:t>
+              <w:t xml:space="preserve">Consent and language screens, hands-free microphone capture, captions, voice playback and, if decided, transcript download. Opens a pull request for every step.</w:t>
             </w:r>
           </w:p>
         </w:tc>
@@ -2482,7 +2482,7 @@
                 <w:sz w:val="19"/>
                 <w:szCs w:val="19"/>
               </w:rPr>
-              <w:t xml:space="preserve">Microphone capture and talk buttons</w:t>
+              <w:t xml:space="preserve">Hands-free microphone capture</w:t>
             </w:r>
           </w:p>
         </w:tc>
@@ -4105,7 +4105,7 @@
           <w:sz w:val="19"/>
           <w:szCs w:val="19"/>
         </w:rPr>
-        <w:t xml:space="preserve">{"status":"ok","version":"0.5.0"}</w:t>
+        <w:t xml:space="preserve">{"status":"ok","version":"0.6.0"}</w:t>
       </w:r>
       <w:r>
         <w:t xml:space="preserve">.</w:t>
@@ -6550,7 +6550,7 @@
                 <w:sz w:val="19"/>
                 <w:szCs w:val="19"/>
               </w:rPr>
-              <w:t xml:space="preserve">{"status":"ok","version":"0.5.0"}</w:t>
+              <w:t xml:space="preserve">{"status":"ok","version":"0.6.0"}</w:t>
             </w:r>
             <w:r>
               <w:rPr>
@@ -7525,8 +7525,8 @@
       <w:tblGrid>
         <w:gridCol w:w="2120"/>
         <w:gridCol w:w="578"/>
-        <w:gridCol w:w="3855"/>
-        <w:gridCol w:w="3085"/>
+        <w:gridCol w:w="2891"/>
+        <w:gridCol w:w="4049"/>
       </w:tblGrid>
       <w:tr>
         <w:trPr>
@@ -7598,7 +7598,7 @@
         </w:tc>
         <w:tc>
           <w:tcPr>
-            <w:tcW w:type="dxa" w:w="3855"/>
+            <w:tcW w:type="dxa" w:w="2891"/>
             <w:tcBorders>
               <w:top w:val="single" w:color="C9D1D9" w:sz="4"/>
               <w:left w:val="single" w:color="C9D1D9" w:sz="4"/>
@@ -7630,7 +7630,7 @@
         </w:tc>
         <w:tc>
           <w:tcPr>
-            <w:tcW w:type="dxa" w:w="3085"/>
+            <w:tcW w:type="dxa" w:w="4049"/>
             <w:tcBorders>
               <w:top w:val="single" w:color="C9D1D9" w:sz="4"/>
               <w:left w:val="single" w:color="C9D1D9" w:sz="4"/>
@@ -7684,12 +7684,130 @@
             </w:pPr>
             <w:r>
               <w:rPr>
+                <w:sz w:val="19"/>
+                <w:szCs w:val="19"/>
+              </w:rPr>
+              <w:t xml:space="preserve">(binary audio frame)</w:t>
+            </w:r>
+          </w:p>
+        </w:tc>
+        <w:tc>
+          <w:tcPr>
+            <w:tcW w:type="dxa" w:w="578"/>
+            <w:tcBorders>
+              <w:top w:val="single" w:color="C9D1D9" w:sz="4"/>
+              <w:left w:val="single" w:color="C9D1D9" w:sz="4"/>
+              <w:bottom w:val="single" w:color="C9D1D9" w:sz="4"/>
+              <w:right w:val="single" w:color="C9D1D9" w:sz="4"/>
+            </w:tcBorders>
+            <w:tcMar>
+              <w:top w:type="dxa" w:w="60"/>
+              <w:left w:type="dxa" w:w="100"/>
+              <w:bottom w:type="dxa" w:w="60"/>
+              <w:right w:type="dxa" w:w="100"/>
+            </w:tcMar>
+          </w:tcPr>
+          <w:p>
+            <w:pPr>
+              <w:spacing w:after="40" w:line="252"/>
+            </w:pPr>
+            <w:r>
+              <w:rPr>
+                <w:sz w:val="19"/>
+                <w:szCs w:val="19"/>
+              </w:rPr>
+              <w:t xml:space="preserve">1C</w:t>
+            </w:r>
+          </w:p>
+        </w:tc>
+        <w:tc>
+          <w:tcPr>
+            <w:tcW w:type="dxa" w:w="2891"/>
+            <w:tcBorders>
+              <w:top w:val="single" w:color="C9D1D9" w:sz="4"/>
+              <w:left w:val="single" w:color="C9D1D9" w:sz="4"/>
+              <w:bottom w:val="single" w:color="C9D1D9" w:sz="4"/>
+              <w:right w:val="single" w:color="C9D1D9" w:sz="4"/>
+            </w:tcBorders>
+            <w:tcMar>
+              <w:top w:type="dxa" w:w="60"/>
+              <w:left w:type="dxa" w:w="100"/>
+              <w:bottom w:type="dxa" w:w="60"/>
+              <w:right w:type="dxa" w:w="100"/>
+            </w:tcMar>
+          </w:tcPr>
+          <w:p>
+            <w:pPr>
+              <w:spacing w:after="40" w:line="252"/>
+            </w:pPr>
+            <w:r>
+              <w:rPr>
+                <w:sz w:val="19"/>
+                <w:szCs w:val="19"/>
+              </w:rPr>
+              <w:t xml:space="preserve">raw audio bytes (8.4)</w:t>
+            </w:r>
+          </w:p>
+        </w:tc>
+        <w:tc>
+          <w:tcPr>
+            <w:tcW w:type="dxa" w:w="4049"/>
+            <w:tcBorders>
+              <w:top w:val="single" w:color="C9D1D9" w:sz="4"/>
+              <w:left w:val="single" w:color="C9D1D9" w:sz="4"/>
+              <w:bottom w:val="single" w:color="C9D1D9" w:sz="4"/>
+              <w:right w:val="single" w:color="C9D1D9" w:sz="4"/>
+            </w:tcBorders>
+            <w:tcMar>
+              <w:top w:type="dxa" w:w="60"/>
+              <w:left w:type="dxa" w:w="100"/>
+              <w:bottom w:type="dxa" w:w="60"/>
+              <w:right w:type="dxa" w:w="100"/>
+            </w:tcMar>
+          </w:tcPr>
+          <w:p>
+            <w:pPr>
+              <w:spacing w:after="40" w:line="252"/>
+            </w:pPr>
+            <w:r>
+              <w:rPr>
+                <w:sz w:val="19"/>
+                <w:szCs w:val="19"/>
+              </w:rPr>
+              <w:t xml:space="preserve">Microphone audio, sent continuously while listening.</w:t>
+            </w:r>
+          </w:p>
+        </w:tc>
+      </w:tr>
+      <w:tr>
+        <w:tc>
+          <w:tcPr>
+            <w:tcW w:type="dxa" w:w="2120"/>
+            <w:tcBorders>
+              <w:top w:val="single" w:color="C9D1D9" w:sz="4"/>
+              <w:left w:val="single" w:color="C9D1D9" w:sz="4"/>
+              <w:bottom w:val="single" w:color="C9D1D9" w:sz="4"/>
+              <w:right w:val="single" w:color="C9D1D9" w:sz="4"/>
+            </w:tcBorders>
+            <w:tcMar>
+              <w:top w:type="dxa" w:w="60"/>
+              <w:left w:type="dxa" w:w="100"/>
+              <w:bottom w:type="dxa" w:w="60"/>
+              <w:right w:type="dxa" w:w="100"/>
+            </w:tcMar>
+          </w:tcPr>
+          <w:p>
+            <w:pPr>
+              <w:spacing w:after="40" w:line="252"/>
+            </w:pPr>
+            <w:r>
+              <w:rPr>
                 <w:rFonts w:ascii="Consolas" w:cs="Consolas" w:eastAsia="Consolas" w:hAnsi="Consolas"/>
                 <w:color w:val="24292F"/>
                 <w:sz w:val="19"/>
                 <w:szCs w:val="19"/>
               </w:rPr>
-              <w:t xml:space="preserve">ping</w:t>
+              <w:t xml:space="preserve">audio.pause</w:t>
             </w:r>
           </w:p>
         </w:tc>
@@ -7718,13 +7836,13 @@
                 <w:sz w:val="19"/>
                 <w:szCs w:val="19"/>
               </w:rPr>
-              <w:t xml:space="preserve">1B</w:t>
-            </w:r>
-          </w:p>
-        </w:tc>
-        <w:tc>
-          <w:tcPr>
-            <w:tcW w:type="dxa" w:w="3855"/>
+              <w:t xml:space="preserve">1C</w:t>
+            </w:r>
+          </w:p>
+        </w:tc>
+        <w:tc>
+          <w:tcPr>
+            <w:tcW w:type="dxa" w:w="2891"/>
             <w:tcBorders>
               <w:top w:val="single" w:color="C9D1D9" w:sz="4"/>
               <w:left w:val="single" w:color="C9D1D9" w:sz="4"/>
@@ -7753,31 +7871,55 @@
         </w:tc>
         <w:tc>
           <w:tcPr>
-            <w:tcW w:type="dxa" w:w="3085"/>
-            <w:tcBorders>
-              <w:top w:val="single" w:color="C9D1D9" w:sz="4"/>
-              <w:left w:val="single" w:color="C9D1D9" w:sz="4"/>
-              <w:bottom w:val="single" w:color="C9D1D9" w:sz="4"/>
-              <w:right w:val="single" w:color="C9D1D9" w:sz="4"/>
-            </w:tcBorders>
-            <w:tcMar>
-              <w:top w:type="dxa" w:w="60"/>
-              <w:left w:type="dxa" w:w="100"/>
-              <w:bottom w:type="dxa" w:w="60"/>
-              <w:right w:type="dxa" w:w="100"/>
-            </w:tcMar>
-          </w:tcPr>
-          <w:p>
-            <w:pPr>
-              <w:spacing w:after="40" w:line="252"/>
-            </w:pPr>
-            <w:r>
-              <w:rPr>
-                <w:sz w:val="19"/>
-                <w:szCs w:val="19"/>
-              </w:rPr>
-              <w:t xml:space="preserve">Keep-alive check. The server answers </w:t>
-            </w:r>
+            <w:tcW w:type="dxa" w:w="4049"/>
+            <w:tcBorders>
+              <w:top w:val="single" w:color="C9D1D9" w:sz="4"/>
+              <w:left w:val="single" w:color="C9D1D9" w:sz="4"/>
+              <w:bottom w:val="single" w:color="C9D1D9" w:sz="4"/>
+              <w:right w:val="single" w:color="C9D1D9" w:sz="4"/>
+            </w:tcBorders>
+            <w:tcMar>
+              <w:top w:type="dxa" w:w="60"/>
+              <w:left w:type="dxa" w:w="100"/>
+              <w:bottom w:type="dxa" w:w="60"/>
+              <w:right w:type="dxa" w:w="100"/>
+            </w:tcMar>
+          </w:tcPr>
+          <w:p>
+            <w:pPr>
+              <w:spacing w:after="40" w:line="252"/>
+            </w:pPr>
+            <w:r>
+              <w:rPr>
+                <w:sz w:val="19"/>
+                <w:szCs w:val="19"/>
+              </w:rPr>
+              <w:t xml:space="preserve">The browser stopped sending audio (for example while a translation is spoken). Any sentence in progress ends now.</w:t>
+            </w:r>
+          </w:p>
+        </w:tc>
+      </w:tr>
+      <w:tr>
+        <w:tc>
+          <w:tcPr>
+            <w:tcW w:type="dxa" w:w="2120"/>
+            <w:tcBorders>
+              <w:top w:val="single" w:color="C9D1D9" w:sz="4"/>
+              <w:left w:val="single" w:color="C9D1D9" w:sz="4"/>
+              <w:bottom w:val="single" w:color="C9D1D9" w:sz="4"/>
+              <w:right w:val="single" w:color="C9D1D9" w:sz="4"/>
+            </w:tcBorders>
+            <w:tcMar>
+              <w:top w:type="dxa" w:w="60"/>
+              <w:left w:type="dxa" w:w="100"/>
+              <w:bottom w:type="dxa" w:w="60"/>
+              <w:right w:type="dxa" w:w="100"/>
+            </w:tcMar>
+          </w:tcPr>
+          <w:p>
+            <w:pPr>
+              <w:spacing w:after="40" w:line="252"/>
+            </w:pPr>
             <w:r>
               <w:rPr>
                 <w:rFonts w:ascii="Consolas" w:cs="Consolas" w:eastAsia="Consolas" w:hAnsi="Consolas"/>
@@ -7785,6 +7927,102 @@
                 <w:sz w:val="19"/>
                 <w:szCs w:val="19"/>
               </w:rPr>
+              <w:t xml:space="preserve">ping</w:t>
+            </w:r>
+          </w:p>
+        </w:tc>
+        <w:tc>
+          <w:tcPr>
+            <w:tcW w:type="dxa" w:w="578"/>
+            <w:tcBorders>
+              <w:top w:val="single" w:color="C9D1D9" w:sz="4"/>
+              <w:left w:val="single" w:color="C9D1D9" w:sz="4"/>
+              <w:bottom w:val="single" w:color="C9D1D9" w:sz="4"/>
+              <w:right w:val="single" w:color="C9D1D9" w:sz="4"/>
+            </w:tcBorders>
+            <w:tcMar>
+              <w:top w:type="dxa" w:w="60"/>
+              <w:left w:type="dxa" w:w="100"/>
+              <w:bottom w:type="dxa" w:w="60"/>
+              <w:right w:type="dxa" w:w="100"/>
+            </w:tcMar>
+          </w:tcPr>
+          <w:p>
+            <w:pPr>
+              <w:spacing w:after="40" w:line="252"/>
+            </w:pPr>
+            <w:r>
+              <w:rPr>
+                <w:sz w:val="19"/>
+                <w:szCs w:val="19"/>
+              </w:rPr>
+              <w:t xml:space="preserve">1B</w:t>
+            </w:r>
+          </w:p>
+        </w:tc>
+        <w:tc>
+          <w:tcPr>
+            <w:tcW w:type="dxa" w:w="2891"/>
+            <w:tcBorders>
+              <w:top w:val="single" w:color="C9D1D9" w:sz="4"/>
+              <w:left w:val="single" w:color="C9D1D9" w:sz="4"/>
+              <w:bottom w:val="single" w:color="C9D1D9" w:sz="4"/>
+              <w:right w:val="single" w:color="C9D1D9" w:sz="4"/>
+            </w:tcBorders>
+            <w:tcMar>
+              <w:top w:type="dxa" w:w="60"/>
+              <w:left w:type="dxa" w:w="100"/>
+              <w:bottom w:type="dxa" w:w="60"/>
+              <w:right w:type="dxa" w:w="100"/>
+            </w:tcMar>
+          </w:tcPr>
+          <w:p>
+            <w:pPr>
+              <w:spacing w:after="40" w:line="252"/>
+            </w:pPr>
+            <w:r>
+              <w:rPr>
+                <w:sz w:val="19"/>
+                <w:szCs w:val="19"/>
+              </w:rPr>
+              <w:t xml:space="preserve">none</w:t>
+            </w:r>
+          </w:p>
+        </w:tc>
+        <w:tc>
+          <w:tcPr>
+            <w:tcW w:type="dxa" w:w="4049"/>
+            <w:tcBorders>
+              <w:top w:val="single" w:color="C9D1D9" w:sz="4"/>
+              <w:left w:val="single" w:color="C9D1D9" w:sz="4"/>
+              <w:bottom w:val="single" w:color="C9D1D9" w:sz="4"/>
+              <w:right w:val="single" w:color="C9D1D9" w:sz="4"/>
+            </w:tcBorders>
+            <w:tcMar>
+              <w:top w:type="dxa" w:w="60"/>
+              <w:left w:type="dxa" w:w="100"/>
+              <w:bottom w:type="dxa" w:w="60"/>
+              <w:right w:type="dxa" w:w="100"/>
+            </w:tcMar>
+          </w:tcPr>
+          <w:p>
+            <w:pPr>
+              <w:spacing w:after="40" w:line="252"/>
+            </w:pPr>
+            <w:r>
+              <w:rPr>
+                <w:sz w:val="19"/>
+                <w:szCs w:val="19"/>
+              </w:rPr>
+              <w:t xml:space="preserve">Keep-alive check. The server answers </w:t>
+            </w:r>
+            <w:r>
+              <w:rPr>
+                <w:rFonts w:ascii="Consolas" w:cs="Consolas" w:eastAsia="Consolas" w:hAnsi="Consolas"/>
+                <w:color w:val="24292F"/>
+                <w:sz w:val="19"/>
+                <w:szCs w:val="19"/>
+              </w:rPr>
               <w:t xml:space="preserve">pong</w:t>
             </w:r>
             <w:r>
@@ -7825,7 +8063,7 @@
                 <w:sz w:val="19"/>
                 <w:szCs w:val="19"/>
               </w:rPr>
-              <w:t xml:space="preserve">utterance.start</w:t>
+              <w:t xml:space="preserve">session.stop</w:t>
             </w:r>
           </w:p>
         </w:tc>
@@ -7854,430 +8092,13 @@
                 <w:sz w:val="19"/>
                 <w:szCs w:val="19"/>
               </w:rPr>
-              <w:t xml:space="preserve">1C</w:t>
-            </w:r>
-          </w:p>
-        </w:tc>
-        <w:tc>
-          <w:tcPr>
-            <w:tcW w:type="dxa" w:w="3855"/>
-            <w:tcBorders>
-              <w:top w:val="single" w:color="C9D1D9" w:sz="4"/>
-              <w:left w:val="single" w:color="C9D1D9" w:sz="4"/>
-              <w:bottom w:val="single" w:color="C9D1D9" w:sz="4"/>
-              <w:right w:val="single" w:color="C9D1D9" w:sz="4"/>
-            </w:tcBorders>
-            <w:tcMar>
-              <w:top w:type="dxa" w:w="60"/>
-              <w:left w:type="dxa" w:w="100"/>
-              <w:bottom w:type="dxa" w:w="60"/>
-              <w:right w:type="dxa" w:w="100"/>
-            </w:tcMar>
-          </w:tcPr>
-          <w:p>
-            <w:pPr>
-              <w:spacing w:after="40" w:line="252"/>
-            </w:pPr>
-            <w:r>
-              <w:rPr>
-                <w:rFonts w:ascii="Consolas" w:cs="Consolas" w:eastAsia="Consolas" w:hAnsi="Consolas"/>
-                <w:color w:val="24292F"/>
-                <w:sz w:val="19"/>
-                <w:szCs w:val="19"/>
-              </w:rPr>
-              <w:t xml:space="preserve">utterance_id</w:t>
-            </w:r>
-            <w:r>
-              <w:rPr>
-                <w:sz w:val="19"/>
-                <w:szCs w:val="19"/>
-              </w:rPr>
-              <w:t xml:space="preserve"> (standard 36-character UUID from </w:t>
-            </w:r>
-            <w:r>
-              <w:rPr>
-                <w:rFonts w:ascii="Consolas" w:cs="Consolas" w:eastAsia="Consolas" w:hAnsi="Consolas"/>
-                <w:color w:val="24292F"/>
-                <w:sz w:val="19"/>
-                <w:szCs w:val="19"/>
-              </w:rPr>
-              <w:t xml:space="preserve">crypto.randomUUID()</w:t>
-            </w:r>
-            <w:r>
-              <w:rPr>
-                <w:sz w:val="19"/>
-                <w:szCs w:val="19"/>
-              </w:rPr>
-              <w:t xml:space="preserve">), </w:t>
-            </w:r>
-            <w:r>
-              <w:rPr>
-                <w:rFonts w:ascii="Consolas" w:cs="Consolas" w:eastAsia="Consolas" w:hAnsi="Consolas"/>
-                <w:color w:val="24292F"/>
-                <w:sz w:val="19"/>
-                <w:szCs w:val="19"/>
-              </w:rPr>
-              <w:t xml:space="preserve">speaker_id</w:t>
-            </w:r>
-            <w:r>
-              <w:rPr>
-                <w:sz w:val="19"/>
-                <w:szCs w:val="19"/>
-              </w:rPr>
-              <w:t xml:space="preserve"> ("A" or "B"), </w:t>
-            </w:r>
-            <w:r>
-              <w:rPr>
-                <w:rFonts w:ascii="Consolas" w:cs="Consolas" w:eastAsia="Consolas" w:hAnsi="Consolas"/>
-                <w:color w:val="24292F"/>
-                <w:sz w:val="19"/>
-                <w:szCs w:val="19"/>
-              </w:rPr>
-              <w:t xml:space="preserve">spoken_language</w:t>
-            </w:r>
-            <w:r>
-              <w:rPr>
-                <w:sz w:val="19"/>
-                <w:szCs w:val="19"/>
-              </w:rPr>
-              <w:t xml:space="preserve"> (optional code, or null for auto-detect)</w:t>
-            </w:r>
-          </w:p>
-        </w:tc>
-        <w:tc>
-          <w:tcPr>
-            <w:tcW w:type="dxa" w:w="3085"/>
-            <w:tcBorders>
-              <w:top w:val="single" w:color="C9D1D9" w:sz="4"/>
-              <w:left w:val="single" w:color="C9D1D9" w:sz="4"/>
-              <w:bottom w:val="single" w:color="C9D1D9" w:sz="4"/>
-              <w:right w:val="single" w:color="C9D1D9" w:sz="4"/>
-            </w:tcBorders>
-            <w:tcMar>
-              <w:top w:type="dxa" w:w="60"/>
-              <w:left w:type="dxa" w:w="100"/>
-              <w:bottom w:type="dxa" w:w="60"/>
-              <w:right w:type="dxa" w:w="100"/>
-            </w:tcMar>
-          </w:tcPr>
-          <w:p>
-            <w:pPr>
-              <w:spacing w:after="40" w:line="252"/>
-            </w:pPr>
-            <w:r>
-              <w:rPr>
-                <w:sz w:val="19"/>
-                <w:szCs w:val="19"/>
-              </w:rPr>
-              <w:t xml:space="preserve">A person pressed their talk button. Audio frames follow.</w:t>
-            </w:r>
-          </w:p>
-        </w:tc>
-      </w:tr>
-      <w:tr>
-        <w:tc>
-          <w:tcPr>
-            <w:tcW w:type="dxa" w:w="2120"/>
-            <w:tcBorders>
-              <w:top w:val="single" w:color="C9D1D9" w:sz="4"/>
-              <w:left w:val="single" w:color="C9D1D9" w:sz="4"/>
-              <w:bottom w:val="single" w:color="C9D1D9" w:sz="4"/>
-              <w:right w:val="single" w:color="C9D1D9" w:sz="4"/>
-            </w:tcBorders>
-            <w:tcMar>
-              <w:top w:type="dxa" w:w="60"/>
-              <w:left w:type="dxa" w:w="100"/>
-              <w:bottom w:type="dxa" w:w="60"/>
-              <w:right w:type="dxa" w:w="100"/>
-            </w:tcMar>
-          </w:tcPr>
-          <w:p>
-            <w:pPr>
-              <w:spacing w:after="40" w:line="252"/>
-            </w:pPr>
-            <w:r>
-              <w:rPr>
-                <w:sz w:val="19"/>
-                <w:szCs w:val="19"/>
-              </w:rPr>
-              <w:t xml:space="preserve">(binary audio frame)</w:t>
-            </w:r>
-          </w:p>
-        </w:tc>
-        <w:tc>
-          <w:tcPr>
-            <w:tcW w:type="dxa" w:w="578"/>
-            <w:tcBorders>
-              <w:top w:val="single" w:color="C9D1D9" w:sz="4"/>
-              <w:left w:val="single" w:color="C9D1D9" w:sz="4"/>
-              <w:bottom w:val="single" w:color="C9D1D9" w:sz="4"/>
-              <w:right w:val="single" w:color="C9D1D9" w:sz="4"/>
-            </w:tcBorders>
-            <w:tcMar>
-              <w:top w:type="dxa" w:w="60"/>
-              <w:left w:type="dxa" w:w="100"/>
-              <w:bottom w:type="dxa" w:w="60"/>
-              <w:right w:type="dxa" w:w="100"/>
-            </w:tcMar>
-          </w:tcPr>
-          <w:p>
-            <w:pPr>
-              <w:spacing w:after="40" w:line="252"/>
-            </w:pPr>
-            <w:r>
-              <w:rPr>
-                <w:sz w:val="19"/>
-                <w:szCs w:val="19"/>
-              </w:rPr>
-              <w:t xml:space="preserve">1C</w:t>
-            </w:r>
-          </w:p>
-        </w:tc>
-        <w:tc>
-          <w:tcPr>
-            <w:tcW w:type="dxa" w:w="3855"/>
-            <w:tcBorders>
-              <w:top w:val="single" w:color="C9D1D9" w:sz="4"/>
-              <w:left w:val="single" w:color="C9D1D9" w:sz="4"/>
-              <w:bottom w:val="single" w:color="C9D1D9" w:sz="4"/>
-              <w:right w:val="single" w:color="C9D1D9" w:sz="4"/>
-            </w:tcBorders>
-            <w:tcMar>
-              <w:top w:type="dxa" w:w="60"/>
-              <w:left w:type="dxa" w:w="100"/>
-              <w:bottom w:type="dxa" w:w="60"/>
-              <w:right w:type="dxa" w:w="100"/>
-            </w:tcMar>
-          </w:tcPr>
-          <w:p>
-            <w:pPr>
-              <w:spacing w:after="40" w:line="252"/>
-            </w:pPr>
-            <w:r>
-              <w:rPr>
-                <w:sz w:val="19"/>
-                <w:szCs w:val="19"/>
-              </w:rPr>
-              <w:t xml:space="preserve">raw audio bytes (8.4)</w:t>
-            </w:r>
-          </w:p>
-        </w:tc>
-        <w:tc>
-          <w:tcPr>
-            <w:tcW w:type="dxa" w:w="3085"/>
-            <w:tcBorders>
-              <w:top w:val="single" w:color="C9D1D9" w:sz="4"/>
-              <w:left w:val="single" w:color="C9D1D9" w:sz="4"/>
-              <w:bottom w:val="single" w:color="C9D1D9" w:sz="4"/>
-              <w:right w:val="single" w:color="C9D1D9" w:sz="4"/>
-            </w:tcBorders>
-            <w:tcMar>
-              <w:top w:type="dxa" w:w="60"/>
-              <w:left w:type="dxa" w:w="100"/>
-              <w:bottom w:type="dxa" w:w="60"/>
-              <w:right w:type="dxa" w:w="100"/>
-            </w:tcMar>
-          </w:tcPr>
-          <w:p>
-            <w:pPr>
-              <w:spacing w:after="40" w:line="252"/>
-            </w:pPr>
-            <w:r>
-              <w:rPr>
-                <w:sz w:val="19"/>
-                <w:szCs w:val="19"/>
-              </w:rPr>
-              <w:t xml:space="preserve">Audio for the utterance that is currently open.</w:t>
-            </w:r>
-          </w:p>
-        </w:tc>
-      </w:tr>
-      <w:tr>
-        <w:tc>
-          <w:tcPr>
-            <w:tcW w:type="dxa" w:w="2120"/>
-            <w:tcBorders>
-              <w:top w:val="single" w:color="C9D1D9" w:sz="4"/>
-              <w:left w:val="single" w:color="C9D1D9" w:sz="4"/>
-              <w:bottom w:val="single" w:color="C9D1D9" w:sz="4"/>
-              <w:right w:val="single" w:color="C9D1D9" w:sz="4"/>
-            </w:tcBorders>
-            <w:tcMar>
-              <w:top w:type="dxa" w:w="60"/>
-              <w:left w:type="dxa" w:w="100"/>
-              <w:bottom w:type="dxa" w:w="60"/>
-              <w:right w:type="dxa" w:w="100"/>
-            </w:tcMar>
-          </w:tcPr>
-          <w:p>
-            <w:pPr>
-              <w:spacing w:after="40" w:line="252"/>
-            </w:pPr>
-            <w:r>
-              <w:rPr>
-                <w:rFonts w:ascii="Consolas" w:cs="Consolas" w:eastAsia="Consolas" w:hAnsi="Consolas"/>
-                <w:color w:val="24292F"/>
-                <w:sz w:val="19"/>
-                <w:szCs w:val="19"/>
-              </w:rPr>
-              <w:t xml:space="preserve">utterance.end</w:t>
-            </w:r>
-          </w:p>
-        </w:tc>
-        <w:tc>
-          <w:tcPr>
-            <w:tcW w:type="dxa" w:w="578"/>
-            <w:tcBorders>
-              <w:top w:val="single" w:color="C9D1D9" w:sz="4"/>
-              <w:left w:val="single" w:color="C9D1D9" w:sz="4"/>
-              <w:bottom w:val="single" w:color="C9D1D9" w:sz="4"/>
-              <w:right w:val="single" w:color="C9D1D9" w:sz="4"/>
-            </w:tcBorders>
-            <w:tcMar>
-              <w:top w:type="dxa" w:w="60"/>
-              <w:left w:type="dxa" w:w="100"/>
-              <w:bottom w:type="dxa" w:w="60"/>
-              <w:right w:type="dxa" w:w="100"/>
-            </w:tcMar>
-          </w:tcPr>
-          <w:p>
-            <w:pPr>
-              <w:spacing w:after="40" w:line="252"/>
-            </w:pPr>
-            <w:r>
-              <w:rPr>
-                <w:sz w:val="19"/>
-                <w:szCs w:val="19"/>
-              </w:rPr>
-              <w:t xml:space="preserve">1C</w:t>
-            </w:r>
-          </w:p>
-        </w:tc>
-        <w:tc>
-          <w:tcPr>
-            <w:tcW w:type="dxa" w:w="3855"/>
-            <w:tcBorders>
-              <w:top w:val="single" w:color="C9D1D9" w:sz="4"/>
-              <w:left w:val="single" w:color="C9D1D9" w:sz="4"/>
-              <w:bottom w:val="single" w:color="C9D1D9" w:sz="4"/>
-              <w:right w:val="single" w:color="C9D1D9" w:sz="4"/>
-            </w:tcBorders>
-            <w:tcMar>
-              <w:top w:type="dxa" w:w="60"/>
-              <w:left w:type="dxa" w:w="100"/>
-              <w:bottom w:type="dxa" w:w="60"/>
-              <w:right w:type="dxa" w:w="100"/>
-            </w:tcMar>
-          </w:tcPr>
-          <w:p>
-            <w:pPr>
-              <w:spacing w:after="40" w:line="252"/>
-            </w:pPr>
-            <w:r>
-              <w:rPr>
-                <w:rFonts w:ascii="Consolas" w:cs="Consolas" w:eastAsia="Consolas" w:hAnsi="Consolas"/>
-                <w:color w:val="24292F"/>
-                <w:sz w:val="19"/>
-                <w:szCs w:val="19"/>
-              </w:rPr>
-              <w:t xml:space="preserve">utterance_id</w:t>
-            </w:r>
-          </w:p>
-        </w:tc>
-        <w:tc>
-          <w:tcPr>
-            <w:tcW w:type="dxa" w:w="3085"/>
-            <w:tcBorders>
-              <w:top w:val="single" w:color="C9D1D9" w:sz="4"/>
-              <w:left w:val="single" w:color="C9D1D9" w:sz="4"/>
-              <w:bottom w:val="single" w:color="C9D1D9" w:sz="4"/>
-              <w:right w:val="single" w:color="C9D1D9" w:sz="4"/>
-            </w:tcBorders>
-            <w:tcMar>
-              <w:top w:type="dxa" w:w="60"/>
-              <w:left w:type="dxa" w:w="100"/>
-              <w:bottom w:type="dxa" w:w="60"/>
-              <w:right w:type="dxa" w:w="100"/>
-            </w:tcMar>
-          </w:tcPr>
-          <w:p>
-            <w:pPr>
-              <w:spacing w:after="40" w:line="252"/>
-            </w:pPr>
-            <w:r>
-              <w:rPr>
-                <w:sz w:val="19"/>
-                <w:szCs w:val="19"/>
-              </w:rPr>
-              <w:t xml:space="preserve">The person stopped talking. The server processes the sentence.</w:t>
-            </w:r>
-          </w:p>
-        </w:tc>
-      </w:tr>
-      <w:tr>
-        <w:tc>
-          <w:tcPr>
-            <w:tcW w:type="dxa" w:w="2120"/>
-            <w:tcBorders>
-              <w:top w:val="single" w:color="C9D1D9" w:sz="4"/>
-              <w:left w:val="single" w:color="C9D1D9" w:sz="4"/>
-              <w:bottom w:val="single" w:color="C9D1D9" w:sz="4"/>
-              <w:right w:val="single" w:color="C9D1D9" w:sz="4"/>
-            </w:tcBorders>
-            <w:tcMar>
-              <w:top w:type="dxa" w:w="60"/>
-              <w:left w:type="dxa" w:w="100"/>
-              <w:bottom w:type="dxa" w:w="60"/>
-              <w:right w:type="dxa" w:w="100"/>
-            </w:tcMar>
-          </w:tcPr>
-          <w:p>
-            <w:pPr>
-              <w:spacing w:after="40" w:line="252"/>
-            </w:pPr>
-            <w:r>
-              <w:rPr>
-                <w:rFonts w:ascii="Consolas" w:cs="Consolas" w:eastAsia="Consolas" w:hAnsi="Consolas"/>
-                <w:color w:val="24292F"/>
-                <w:sz w:val="19"/>
-                <w:szCs w:val="19"/>
-              </w:rPr>
-              <w:t xml:space="preserve">session.stop</w:t>
-            </w:r>
-          </w:p>
-        </w:tc>
-        <w:tc>
-          <w:tcPr>
-            <w:tcW w:type="dxa" w:w="578"/>
-            <w:tcBorders>
-              <w:top w:val="single" w:color="C9D1D9" w:sz="4"/>
-              <w:left w:val="single" w:color="C9D1D9" w:sz="4"/>
-              <w:bottom w:val="single" w:color="C9D1D9" w:sz="4"/>
-              <w:right w:val="single" w:color="C9D1D9" w:sz="4"/>
-            </w:tcBorders>
-            <w:tcMar>
-              <w:top w:type="dxa" w:w="60"/>
-              <w:left w:type="dxa" w:w="100"/>
-              <w:bottom w:type="dxa" w:w="60"/>
-              <w:right w:type="dxa" w:w="100"/>
-            </w:tcMar>
-          </w:tcPr>
-          <w:p>
-            <w:pPr>
-              <w:spacing w:after="40" w:line="252"/>
-            </w:pPr>
-            <w:r>
-              <w:rPr>
-                <w:sz w:val="19"/>
-                <w:szCs w:val="19"/>
-              </w:rPr>
               <w:t xml:space="preserve">1B</w:t>
             </w:r>
           </w:p>
         </w:tc>
         <w:tc>
           <w:tcPr>
-            <w:tcW w:type="dxa" w:w="3855"/>
+            <w:tcW w:type="dxa" w:w="2891"/>
             <w:tcBorders>
               <w:top w:val="single" w:color="C9D1D9" w:sz="4"/>
               <w:left w:val="single" w:color="C9D1D9" w:sz="4"/>
@@ -8306,30 +8127,30 @@
         </w:tc>
         <w:tc>
           <w:tcPr>
-            <w:tcW w:type="dxa" w:w="3085"/>
-            <w:tcBorders>
-              <w:top w:val="single" w:color="C9D1D9" w:sz="4"/>
-              <w:left w:val="single" w:color="C9D1D9" w:sz="4"/>
-              <w:bottom w:val="single" w:color="C9D1D9" w:sz="4"/>
-              <w:right w:val="single" w:color="C9D1D9" w:sz="4"/>
-            </w:tcBorders>
-            <w:tcMar>
-              <w:top w:type="dxa" w:w="60"/>
-              <w:left w:type="dxa" w:w="100"/>
-              <w:bottom w:type="dxa" w:w="60"/>
-              <w:right w:type="dxa" w:w="100"/>
-            </w:tcMar>
-          </w:tcPr>
-          <w:p>
-            <w:pPr>
-              <w:spacing w:after="40" w:line="252"/>
-            </w:pPr>
-            <w:r>
-              <w:rPr>
-                <w:sz w:val="19"/>
-                <w:szCs w:val="19"/>
-              </w:rPr>
-              <w:t xml:space="preserve">End the conversation. The server closes the socket.</w:t>
+            <w:tcW w:type="dxa" w:w="4049"/>
+            <w:tcBorders>
+              <w:top w:val="single" w:color="C9D1D9" w:sz="4"/>
+              <w:left w:val="single" w:color="C9D1D9" w:sz="4"/>
+              <w:bottom w:val="single" w:color="C9D1D9" w:sz="4"/>
+              <w:right w:val="single" w:color="C9D1D9" w:sz="4"/>
+            </w:tcBorders>
+            <w:tcMar>
+              <w:top w:type="dxa" w:w="60"/>
+              <w:left w:type="dxa" w:w="100"/>
+              <w:bottom w:type="dxa" w:w="60"/>
+              <w:right w:type="dxa" w:w="100"/>
+            </w:tcMar>
+          </w:tcPr>
+          <w:p>
+            <w:pPr>
+              <w:spacing w:after="40" w:line="252"/>
+            </w:pPr>
+            <w:r>
+              <w:rPr>
+                <w:sz w:val="19"/>
+                <w:szCs w:val="19"/>
+              </w:rPr>
+              <w:t xml:space="preserve">End the conversation. A sentence in progress is finished first, then the server closes the socket.</w:t>
             </w:r>
           </w:p>
         </w:tc>
@@ -8346,7 +8167,7 @@
         <w:spacing w:after="80" w:before="200"/>
       </w:pPr>
       <w:r>
-        <w:t xml:space="preserve">Rules for utterances</w:t>
+        <w:t xml:space="preserve">Hands-free listening</w:t>
       </w:r>
     </w:p>
     <w:p>
@@ -8359,43 +8180,7 @@
         <w:spacing w:after="60" w:line="276"/>
       </w:pPr>
       <w:r>
-        <w:t xml:space="preserve">Only one utterance can be open at a time. If a new </w:t>
-      </w:r>
-      <w:r>
-        <w:rPr>
-          <w:rFonts w:ascii="Consolas" w:cs="Consolas" w:eastAsia="Consolas" w:hAnsi="Consolas"/>
-          <w:color w:val="24292F"/>
-          <w:sz w:val="19"/>
-          <w:szCs w:val="19"/>
-        </w:rPr>
-        <w:t xml:space="preserve">utterance.start</w:t>
-      </w:r>
-      <w:r>
-        <w:t xml:space="preserve"> arrives before the previous one ended, the previous one is discarded and reported with an </w:t>
-      </w:r>
-      <w:r>
-        <w:rPr>
-          <w:rFonts w:ascii="Consolas" w:cs="Consolas" w:eastAsia="Consolas" w:hAnsi="Consolas"/>
-          <w:color w:val="24292F"/>
-          <w:sz w:val="19"/>
-          <w:szCs w:val="19"/>
-        </w:rPr>
-        <w:t xml:space="preserve">invalid_message</w:t>
-      </w:r>
-      <w:r>
-        <w:t xml:space="preserve"> error that carries its </w:t>
-      </w:r>
-      <w:r>
-        <w:rPr>
-          <w:rFonts w:ascii="Consolas" w:cs="Consolas" w:eastAsia="Consolas" w:hAnsi="Consolas"/>
-          <w:color w:val="24292F"/>
-          <w:sz w:val="19"/>
-          <w:szCs w:val="19"/>
-        </w:rPr>
-        <w:t xml:space="preserve">utterance_id</w:t>
-      </w:r>
-      <w:r>
-        <w:t xml:space="preserve">. The new one starts normally.</w:t>
+        <w:t xml:space="preserve">There are no talk buttons. The browser streams the microphone and the server finds each sentence: it starts when speech is heard, ends after about 1.5 s of silence, and is split at 30 s.</w:t>
       </w:r>
     </w:p>
     <w:p>
@@ -8408,7 +8193,7 @@
         <w:spacing w:after="60" w:line="276"/>
       </w:pPr>
       <w:r>
-        <w:t xml:space="preserve">After an utterance is rejected while audio is still arriving (</w:t>
+        <w:t xml:space="preserve">Silence and short noises are ignored. Speech with no recognisable words gets </w:t>
       </w:r>
       <w:r>
         <w:rPr>
@@ -8417,22 +8202,10 @@
           <w:sz w:val="19"/>
           <w:szCs w:val="19"/>
         </w:rPr>
-        <w:t xml:space="preserve">audio_too_long</w:t>
-      </w:r>
-      <w:r>
-        <w:t xml:space="preserve"> or a malformed frame), stop sending its audio. Any remaining frames and its </w:t>
-      </w:r>
-      <w:r>
-        <w:rPr>
-          <w:rFonts w:ascii="Consolas" w:cs="Consolas" w:eastAsia="Consolas" w:hAnsi="Consolas"/>
-          <w:color w:val="24292F"/>
-          <w:sz w:val="19"/>
-          <w:szCs w:val="19"/>
-        </w:rPr>
-        <w:t xml:space="preserve">utterance.end</w:t>
-      </w:r>
-      <w:r>
-        <w:t xml:space="preserve"> are ignored without further errors.</w:t>
+        <w:t xml:space="preserve">utterance.ignored</w:t>
+      </w:r>
+      <w:r>
+        <w:t xml:space="preserve"> and listening simply continues.</w:t>
       </w:r>
     </w:p>
     <w:p>
@@ -8445,7 +8218,7 @@
         <w:spacing w:after="60" w:line="276"/>
       </w:pPr>
       <w:r>
-        <w:t xml:space="preserve">Unknown extra fields in any message are rejected with </w:t>
+        <w:t xml:space="preserve">While a translation is spoken aloud, the browser sends </w:t>
       </w:r>
       <w:r>
         <w:rPr>
@@ -8454,10 +8227,10 @@
           <w:sz w:val="19"/>
           <w:szCs w:val="19"/>
         </w:rPr>
-        <w:t xml:space="preserve">invalid_message</w:t>
-      </w:r>
-      <w:r>
-        <w:t xml:space="preserve">.</w:t>
+        <w:t xml:space="preserve">audio.pause</w:t>
+      </w:r>
+      <w:r>
+        <w:t xml:space="preserve"> and stops sending audio, so the app never hears itself.</w:t>
       </w:r>
     </w:p>
     <w:p>
@@ -8789,7 +8562,7 @@
                 <w:sz w:val="19"/>
                 <w:szCs w:val="19"/>
               </w:rPr>
-              <w:t xml:space="preserve">About 100 ms: 1,600 samples = 3,200 bytes per binary message. Must be an even number of bytes and at most 32,000 bytes (1 s); otherwise </w:t>
+              <w:t xml:space="preserve">About 100 ms: 1,600 samples = 3,200 bytes per binary message. Must be a non-empty even number of bytes and at most 32,000 bytes (1 s); otherwise </w:t>
             </w:r>
             <w:r>
               <w:rPr>
@@ -8805,207 +8578,7 @@
                 <w:sz w:val="19"/>
                 <w:szCs w:val="19"/>
               </w:rPr>
-              <w:t xml:space="preserve"> and the utterance is dropped.</w:t>
-            </w:r>
-          </w:p>
-        </w:tc>
-      </w:tr>
-      <w:tr>
-        <w:tc>
-          <w:tcPr>
-            <w:tcW w:type="dxa" w:w="2409"/>
-            <w:tcBorders>
-              <w:top w:val="single" w:color="C9D1D9" w:sz="4"/>
-              <w:left w:val="single" w:color="C9D1D9" w:sz="4"/>
-              <w:bottom w:val="single" w:color="C9D1D9" w:sz="4"/>
-              <w:right w:val="single" w:color="C9D1D9" w:sz="4"/>
-            </w:tcBorders>
-            <w:tcMar>
-              <w:top w:type="dxa" w:w="60"/>
-              <w:left w:type="dxa" w:w="100"/>
-              <w:bottom w:type="dxa" w:w="60"/>
-              <w:right w:type="dxa" w:w="100"/>
-            </w:tcMar>
-          </w:tcPr>
-          <w:p>
-            <w:pPr>
-              <w:spacing w:after="40" w:line="252"/>
-            </w:pPr>
-            <w:r>
-              <w:rPr>
-                <w:sz w:val="19"/>
-                <w:szCs w:val="19"/>
-              </w:rPr>
-              <w:t xml:space="preserve">When</w:t>
-            </w:r>
-          </w:p>
-        </w:tc>
-        <w:tc>
-          <w:tcPr>
-            <w:tcW w:type="dxa" w:w="7229"/>
-            <w:tcBorders>
-              <w:top w:val="single" w:color="C9D1D9" w:sz="4"/>
-              <w:left w:val="single" w:color="C9D1D9" w:sz="4"/>
-              <w:bottom w:val="single" w:color="C9D1D9" w:sz="4"/>
-              <w:right w:val="single" w:color="C9D1D9" w:sz="4"/>
-            </w:tcBorders>
-            <w:tcMar>
-              <w:top w:type="dxa" w:w="60"/>
-              <w:left w:type="dxa" w:w="100"/>
-              <w:bottom w:type="dxa" w:w="60"/>
-              <w:right w:type="dxa" w:w="100"/>
-            </w:tcMar>
-          </w:tcPr>
-          <w:p>
-            <w:pPr>
-              <w:spacing w:after="40" w:line="252"/>
-            </w:pPr>
-            <w:r>
-              <w:rPr>
-                <w:sz w:val="19"/>
-                <w:szCs w:val="19"/>
-              </w:rPr>
-              <w:t xml:space="preserve">Only between </w:t>
-            </w:r>
-            <w:r>
-              <w:rPr>
-                <w:rFonts w:ascii="Consolas" w:cs="Consolas" w:eastAsia="Consolas" w:hAnsi="Consolas"/>
-                <w:color w:val="24292F"/>
-                <w:sz w:val="19"/>
-                <w:szCs w:val="19"/>
-              </w:rPr>
-              <w:t xml:space="preserve">utterance.start</w:t>
-            </w:r>
-            <w:r>
-              <w:rPr>
-                <w:sz w:val="19"/>
-                <w:szCs w:val="19"/>
-              </w:rPr>
-              <w:t xml:space="preserve"> and </w:t>
-            </w:r>
-            <w:r>
-              <w:rPr>
-                <w:rFonts w:ascii="Consolas" w:cs="Consolas" w:eastAsia="Consolas" w:hAnsi="Consolas"/>
-                <w:color w:val="24292F"/>
-                <w:sz w:val="19"/>
-                <w:szCs w:val="19"/>
-              </w:rPr>
-              <w:t xml:space="preserve">utterance.end</w:t>
-            </w:r>
-            <w:r>
-              <w:rPr>
-                <w:sz w:val="19"/>
-                <w:szCs w:val="19"/>
-              </w:rPr>
-              <w:t xml:space="preserve">. Frames outside an open utterance get an </w:t>
-            </w:r>
-            <w:r>
-              <w:rPr>
-                <w:rFonts w:ascii="Consolas" w:cs="Consolas" w:eastAsia="Consolas" w:hAnsi="Consolas"/>
-                <w:color w:val="24292F"/>
-                <w:sz w:val="19"/>
-                <w:szCs w:val="19"/>
-              </w:rPr>
-              <w:t xml:space="preserve">no_active_utterance</w:t>
-            </w:r>
-            <w:r>
-              <w:rPr>
-                <w:sz w:val="19"/>
-                <w:szCs w:val="19"/>
-              </w:rPr>
-              <w:t xml:space="preserve"> error.</w:t>
-            </w:r>
-          </w:p>
-        </w:tc>
-      </w:tr>
-      <w:tr>
-        <w:tc>
-          <w:tcPr>
-            <w:tcW w:type="dxa" w:w="2409"/>
-            <w:tcBorders>
-              <w:top w:val="single" w:color="C9D1D9" w:sz="4"/>
-              <w:left w:val="single" w:color="C9D1D9" w:sz="4"/>
-              <w:bottom w:val="single" w:color="C9D1D9" w:sz="4"/>
-              <w:right w:val="single" w:color="C9D1D9" w:sz="4"/>
-            </w:tcBorders>
-            <w:tcMar>
-              <w:top w:type="dxa" w:w="60"/>
-              <w:left w:type="dxa" w:w="100"/>
-              <w:bottom w:type="dxa" w:w="60"/>
-              <w:right w:type="dxa" w:w="100"/>
-            </w:tcMar>
-          </w:tcPr>
-          <w:p>
-            <w:pPr>
-              <w:spacing w:after="40" w:line="252"/>
-            </w:pPr>
-            <w:r>
-              <w:rPr>
-                <w:sz w:val="19"/>
-                <w:szCs w:val="19"/>
-              </w:rPr>
-              <w:t xml:space="preserve">Limits</w:t>
-            </w:r>
-          </w:p>
-        </w:tc>
-        <w:tc>
-          <w:tcPr>
-            <w:tcW w:type="dxa" w:w="7229"/>
-            <w:tcBorders>
-              <w:top w:val="single" w:color="C9D1D9" w:sz="4"/>
-              <w:left w:val="single" w:color="C9D1D9" w:sz="4"/>
-              <w:bottom w:val="single" w:color="C9D1D9" w:sz="4"/>
-              <w:right w:val="single" w:color="C9D1D9" w:sz="4"/>
-            </w:tcBorders>
-            <w:tcMar>
-              <w:top w:type="dxa" w:w="60"/>
-              <w:left w:type="dxa" w:w="100"/>
-              <w:bottom w:type="dxa" w:w="60"/>
-              <w:right w:type="dxa" w:w="100"/>
-            </w:tcMar>
-          </w:tcPr>
-          <w:p>
-            <w:pPr>
-              <w:spacing w:after="40" w:line="252"/>
-            </w:pPr>
-            <w:r>
-              <w:rPr>
-                <w:sz w:val="19"/>
-                <w:szCs w:val="19"/>
-              </w:rPr>
-              <w:t xml:space="preserve">Shorter than 0.3 s, or no 100 ms stretch louder than silence: </w:t>
-            </w:r>
-            <w:r>
-              <w:rPr>
-                <w:rFonts w:ascii="Consolas" w:cs="Consolas" w:eastAsia="Consolas" w:hAnsi="Consolas"/>
-                <w:color w:val="24292F"/>
-                <w:sz w:val="19"/>
-                <w:szCs w:val="19"/>
-              </w:rPr>
-              <w:t xml:space="preserve">audio_too_short</w:t>
-            </w:r>
-            <w:r>
-              <w:rPr>
-                <w:sz w:val="19"/>
-                <w:szCs w:val="19"/>
-              </w:rPr>
-              <w:t xml:space="preserve">. Longer than 30 s: </w:t>
-            </w:r>
-            <w:r>
-              <w:rPr>
-                <w:rFonts w:ascii="Consolas" w:cs="Consolas" w:eastAsia="Consolas" w:hAnsi="Consolas"/>
-                <w:color w:val="24292F"/>
-                <w:sz w:val="19"/>
-                <w:szCs w:val="19"/>
-              </w:rPr>
-              <w:t xml:space="preserve">audio_too_long</w:t>
-            </w:r>
-            <w:r>
-              <w:rPr>
-                <w:sz w:val="19"/>
-                <w:szCs w:val="19"/>
-              </w:rPr>
-              <w:t xml:space="preserve">, sent once. The browser should stop automatically at 30 s.</w:t>
+              <w:t xml:space="preserve"> and that frame is dropped.</w:t>
             </w:r>
           </w:p>
         </w:tc>
@@ -9626,15 +9199,61 @@
                 <w:sz w:val="19"/>
                 <w:szCs w:val="19"/>
               </w:rPr>
-              <w:t xml:space="preserve">speaker_id</w:t>
-            </w:r>
-            <w:r>
-              <w:rPr>
-                <w:sz w:val="19"/>
-                <w:szCs w:val="19"/>
-              </w:rPr>
-              <w:t xml:space="preserve">, </w:t>
-            </w:r>
+              <w:t xml:space="preserve">duration_ms</w:t>
+            </w:r>
+          </w:p>
+        </w:tc>
+        <w:tc>
+          <w:tcPr>
+            <w:tcW w:type="dxa" w:w="3182"/>
+            <w:tcBorders>
+              <w:top w:val="single" w:color="C9D1D9" w:sz="4"/>
+              <w:left w:val="single" w:color="C9D1D9" w:sz="4"/>
+              <w:bottom w:val="single" w:color="C9D1D9" w:sz="4"/>
+              <w:right w:val="single" w:color="C9D1D9" w:sz="4"/>
+            </w:tcBorders>
+            <w:tcMar>
+              <w:top w:type="dxa" w:w="60"/>
+              <w:left w:type="dxa" w:w="100"/>
+              <w:bottom w:type="dxa" w:w="60"/>
+              <w:right w:type="dxa" w:w="100"/>
+            </w:tcMar>
+          </w:tcPr>
+          <w:p>
+            <w:pPr>
+              <w:spacing w:after="40" w:line="252"/>
+            </w:pPr>
+            <w:r>
+              <w:rPr>
+                <w:sz w:val="19"/>
+                <w:szCs w:val="19"/>
+              </w:rPr>
+              <w:t xml:space="preserve">The server heard a sentence and is processing it. The id is made by the server.</w:t>
+            </w:r>
+          </w:p>
+        </w:tc>
+      </w:tr>
+      <w:tr>
+        <w:tc>
+          <w:tcPr>
+            <w:tcW w:type="dxa" w:w="2409"/>
+            <w:tcBorders>
+              <w:top w:val="single" w:color="C9D1D9" w:sz="4"/>
+              <w:left w:val="single" w:color="C9D1D9" w:sz="4"/>
+              <w:bottom w:val="single" w:color="C9D1D9" w:sz="4"/>
+              <w:right w:val="single" w:color="C9D1D9" w:sz="4"/>
+            </w:tcBorders>
+            <w:tcMar>
+              <w:top w:type="dxa" w:w="60"/>
+              <w:left w:type="dxa" w:w="100"/>
+              <w:bottom w:type="dxa" w:w="60"/>
+              <w:right w:type="dxa" w:w="100"/>
+            </w:tcMar>
+          </w:tcPr>
+          <w:p>
+            <w:pPr>
+              <w:spacing w:after="40" w:line="252"/>
+            </w:pPr>
             <w:r>
               <w:rPr>
                 <w:rFonts w:ascii="Consolas" w:cs="Consolas" w:eastAsia="Consolas" w:hAnsi="Consolas"/>
@@ -9642,7 +9261,67 @@
                 <w:sz w:val="19"/>
                 <w:szCs w:val="19"/>
               </w:rPr>
-              <w:t xml:space="preserve">duration_ms</w:t>
+              <w:t xml:space="preserve">utterance.ignored</w:t>
+            </w:r>
+          </w:p>
+        </w:tc>
+        <w:tc>
+          <w:tcPr>
+            <w:tcW w:type="dxa" w:w="578"/>
+            <w:tcBorders>
+              <w:top w:val="single" w:color="C9D1D9" w:sz="4"/>
+              <w:left w:val="single" w:color="C9D1D9" w:sz="4"/>
+              <w:bottom w:val="single" w:color="C9D1D9" w:sz="4"/>
+              <w:right w:val="single" w:color="C9D1D9" w:sz="4"/>
+            </w:tcBorders>
+            <w:tcMar>
+              <w:top w:type="dxa" w:w="60"/>
+              <w:left w:type="dxa" w:w="100"/>
+              <w:bottom w:type="dxa" w:w="60"/>
+              <w:right w:type="dxa" w:w="100"/>
+            </w:tcMar>
+          </w:tcPr>
+          <w:p>
+            <w:pPr>
+              <w:spacing w:after="40" w:line="252"/>
+            </w:pPr>
+            <w:r>
+              <w:rPr>
+                <w:sz w:val="19"/>
+                <w:szCs w:val="19"/>
+              </w:rPr>
+              <w:t xml:space="preserve">1C</w:t>
+            </w:r>
+          </w:p>
+        </w:tc>
+        <w:tc>
+          <w:tcPr>
+            <w:tcW w:type="dxa" w:w="3469"/>
+            <w:tcBorders>
+              <w:top w:val="single" w:color="C9D1D9" w:sz="4"/>
+              <w:left w:val="single" w:color="C9D1D9" w:sz="4"/>
+              <w:bottom w:val="single" w:color="C9D1D9" w:sz="4"/>
+              <w:right w:val="single" w:color="C9D1D9" w:sz="4"/>
+            </w:tcBorders>
+            <w:tcMar>
+              <w:top w:type="dxa" w:w="60"/>
+              <w:left w:type="dxa" w:w="100"/>
+              <w:bottom w:type="dxa" w:w="60"/>
+              <w:right w:type="dxa" w:w="100"/>
+            </w:tcMar>
+          </w:tcPr>
+          <w:p>
+            <w:pPr>
+              <w:spacing w:after="40" w:line="252"/>
+            </w:pPr>
+            <w:r>
+              <w:rPr>
+                <w:rFonts w:ascii="Consolas" w:cs="Consolas" w:eastAsia="Consolas" w:hAnsi="Consolas"/>
+                <w:color w:val="24292F"/>
+                <w:sz w:val="19"/>
+                <w:szCs w:val="19"/>
+              </w:rPr>
+              <w:t xml:space="preserve">utterance_id</w:t>
             </w:r>
           </w:p>
         </w:tc>
@@ -9671,7 +9350,7 @@
                 <w:sz w:val="19"/>
                 <w:szCs w:val="19"/>
               </w:rPr>
-              <w:t xml:space="preserve">The server received the whole sentence.</w:t>
+              <w:t xml:space="preserve">No words were recognised. Remove the pending turn quietly and keep listening.</w:t>
             </w:r>
           </w:p>
         </w:tc>
@@ -9941,7 +9620,7 @@
                 <w:sz w:val="19"/>
                 <w:szCs w:val="19"/>
               </w:rPr>
-              <w:t xml:space="preserve">, </w:t>
+              <w:t xml:space="preserve"> (A, B or null), </w:t>
             </w:r>
             <w:r>
               <w:rPr>
@@ -10170,13 +9849,59 @@
               </w:rPr>
               <w:t xml:space="preserve">text</w:t>
             </w:r>
-            <w:r>
-              <w:rPr>
-                <w:sz w:val="19"/>
-                <w:szCs w:val="19"/>
-              </w:rPr>
-              <w:t xml:space="preserve">, </w:t>
-            </w:r>
+          </w:p>
+        </w:tc>
+        <w:tc>
+          <w:tcPr>
+            <w:tcW w:type="dxa" w:w="3182"/>
+            <w:tcBorders>
+              <w:top w:val="single" w:color="C9D1D9" w:sz="4"/>
+              <w:left w:val="single" w:color="C9D1D9" w:sz="4"/>
+              <w:bottom w:val="single" w:color="C9D1D9" w:sz="4"/>
+              <w:right w:val="single" w:color="C9D1D9" w:sz="4"/>
+            </w:tcBorders>
+            <w:tcMar>
+              <w:top w:type="dxa" w:w="60"/>
+              <w:left w:type="dxa" w:w="100"/>
+              <w:bottom w:type="dxa" w:w="60"/>
+              <w:right w:type="dxa" w:w="100"/>
+            </w:tcMar>
+          </w:tcPr>
+          <w:p>
+            <w:pPr>
+              <w:spacing w:after="40" w:line="252"/>
+            </w:pPr>
+            <w:r>
+              <w:rPr>
+                <w:sz w:val="19"/>
+                <w:szCs w:val="19"/>
+              </w:rPr>
+              <w:t xml:space="preserve">The sentence in this listener's language. Zero, one or two per sentence (see 8.5 rules).</w:t>
+            </w:r>
+          </w:p>
+        </w:tc>
+      </w:tr>
+      <w:tr>
+        <w:tc>
+          <w:tcPr>
+            <w:tcW w:type="dxa" w:w="2409"/>
+            <w:tcBorders>
+              <w:top w:val="single" w:color="C9D1D9" w:sz="4"/>
+              <w:left w:val="single" w:color="C9D1D9" w:sz="4"/>
+              <w:bottom w:val="single" w:color="C9D1D9" w:sz="4"/>
+              <w:right w:val="single" w:color="C9D1D9" w:sz="4"/>
+            </w:tcBorders>
+            <w:tcMar>
+              <w:top w:type="dxa" w:w="60"/>
+              <w:left w:type="dxa" w:w="100"/>
+              <w:bottom w:type="dxa" w:w="60"/>
+              <w:right w:type="dxa" w:w="100"/>
+            </w:tcMar>
+          </w:tcPr>
+          <w:p>
+            <w:pPr>
+              <w:spacing w:after="40" w:line="252"/>
+            </w:pPr>
             <w:r>
               <w:rPr>
                 <w:rFonts w:ascii="Consolas" w:cs="Consolas" w:eastAsia="Consolas" w:hAnsi="Consolas"/>
@@ -10184,44 +9909,59 @@
                 <w:sz w:val="19"/>
                 <w:szCs w:val="19"/>
               </w:rPr>
-              <w:t xml:space="preserve">translated</w:t>
-            </w:r>
-            <w:r>
-              <w:rPr>
-                <w:sz w:val="19"/>
-                <w:szCs w:val="19"/>
-              </w:rPr>
-              <w:t xml:space="preserve"> (true or false)</w:t>
-            </w:r>
-          </w:p>
-        </w:tc>
-        <w:tc>
-          <w:tcPr>
-            <w:tcW w:type="dxa" w:w="3182"/>
-            <w:tcBorders>
-              <w:top w:val="single" w:color="C9D1D9" w:sz="4"/>
-              <w:left w:val="single" w:color="C9D1D9" w:sz="4"/>
-              <w:bottom w:val="single" w:color="C9D1D9" w:sz="4"/>
-              <w:right w:val="single" w:color="C9D1D9" w:sz="4"/>
-            </w:tcBorders>
-            <w:tcMar>
-              <w:top w:type="dxa" w:w="60"/>
-              <w:left w:type="dxa" w:w="100"/>
-              <w:bottom w:type="dxa" w:w="60"/>
-              <w:right w:type="dxa" w:w="100"/>
-            </w:tcMar>
-          </w:tcPr>
-          <w:p>
-            <w:pPr>
-              <w:spacing w:after="40" w:line="252"/>
-            </w:pPr>
-            <w:r>
-              <w:rPr>
-                <w:sz w:val="19"/>
-                <w:szCs w:val="19"/>
-              </w:rPr>
-              <w:t xml:space="preserve">The text for the listener. </w:t>
-            </w:r>
+              <w:t xml:space="preserve">tts.audio</w:t>
+            </w:r>
+          </w:p>
+        </w:tc>
+        <w:tc>
+          <w:tcPr>
+            <w:tcW w:type="dxa" w:w="578"/>
+            <w:tcBorders>
+              <w:top w:val="single" w:color="C9D1D9" w:sz="4"/>
+              <w:left w:val="single" w:color="C9D1D9" w:sz="4"/>
+              <w:bottom w:val="single" w:color="C9D1D9" w:sz="4"/>
+              <w:right w:val="single" w:color="C9D1D9" w:sz="4"/>
+            </w:tcBorders>
+            <w:tcMar>
+              <w:top w:type="dxa" w:w="60"/>
+              <w:left w:type="dxa" w:w="100"/>
+              <w:bottom w:type="dxa" w:w="60"/>
+              <w:right w:type="dxa" w:w="100"/>
+            </w:tcMar>
+          </w:tcPr>
+          <w:p>
+            <w:pPr>
+              <w:spacing w:after="40" w:line="252"/>
+            </w:pPr>
+            <w:r>
+              <w:rPr>
+                <w:sz w:val="19"/>
+                <w:szCs w:val="19"/>
+              </w:rPr>
+              <w:t xml:space="preserve">1E</w:t>
+            </w:r>
+          </w:p>
+        </w:tc>
+        <w:tc>
+          <w:tcPr>
+            <w:tcW w:type="dxa" w:w="3469"/>
+            <w:tcBorders>
+              <w:top w:val="single" w:color="C9D1D9" w:sz="4"/>
+              <w:left w:val="single" w:color="C9D1D9" w:sz="4"/>
+              <w:bottom w:val="single" w:color="C9D1D9" w:sz="4"/>
+              <w:right w:val="single" w:color="C9D1D9" w:sz="4"/>
+            </w:tcBorders>
+            <w:tcMar>
+              <w:top w:type="dxa" w:w="60"/>
+              <w:left w:type="dxa" w:w="100"/>
+              <w:bottom w:type="dxa" w:w="60"/>
+              <w:right w:type="dxa" w:w="100"/>
+            </w:tcMar>
+          </w:tcPr>
+          <w:p>
+            <w:pPr>
+              <w:spacing w:after="40" w:line="252"/>
+            </w:pPr>
             <w:r>
               <w:rPr>
                 <w:rFonts w:ascii="Consolas" w:cs="Consolas" w:eastAsia="Consolas" w:hAnsi="Consolas"/>
@@ -10229,14 +9969,116 @@
                 <w:sz w:val="19"/>
                 <w:szCs w:val="19"/>
               </w:rPr>
-              <w:t xml:space="preserve">translated</w:t>
-            </w:r>
-            <w:r>
-              <w:rPr>
-                <w:sz w:val="19"/>
-                <w:szCs w:val="19"/>
-              </w:rPr>
-              <w:t xml:space="preserve"> is false when the original was already in the listener's language.</w:t>
+              <w:t xml:space="preserve">utterance_id</w:t>
+            </w:r>
+            <w:r>
+              <w:rPr>
+                <w:sz w:val="19"/>
+                <w:szCs w:val="19"/>
+              </w:rPr>
+              <w:t xml:space="preserve">, </w:t>
+            </w:r>
+            <w:r>
+              <w:rPr>
+                <w:rFonts w:ascii="Consolas" w:cs="Consolas" w:eastAsia="Consolas" w:hAnsi="Consolas"/>
+                <w:color w:val="24292F"/>
+                <w:sz w:val="19"/>
+                <w:szCs w:val="19"/>
+              </w:rPr>
+              <w:t xml:space="preserve">listener_id</w:t>
+            </w:r>
+            <w:r>
+              <w:rPr>
+                <w:sz w:val="19"/>
+                <w:szCs w:val="19"/>
+              </w:rPr>
+              <w:t xml:space="preserve">, </w:t>
+            </w:r>
+            <w:r>
+              <w:rPr>
+                <w:rFonts w:ascii="Consolas" w:cs="Consolas" w:eastAsia="Consolas" w:hAnsi="Consolas"/>
+                <w:color w:val="24292F"/>
+                <w:sz w:val="19"/>
+                <w:szCs w:val="19"/>
+              </w:rPr>
+              <w:t xml:space="preserve">format</w:t>
+            </w:r>
+            <w:r>
+              <w:rPr>
+                <w:sz w:val="19"/>
+                <w:szCs w:val="19"/>
+              </w:rPr>
+              <w:t xml:space="preserve"> ("wav"), </w:t>
+            </w:r>
+            <w:r>
+              <w:rPr>
+                <w:rFonts w:ascii="Consolas" w:cs="Consolas" w:eastAsia="Consolas" w:hAnsi="Consolas"/>
+                <w:color w:val="24292F"/>
+                <w:sz w:val="19"/>
+                <w:szCs w:val="19"/>
+              </w:rPr>
+              <w:t xml:space="preserve">audio_base64</w:t>
+            </w:r>
+          </w:p>
+        </w:tc>
+        <w:tc>
+          <w:tcPr>
+            <w:tcW w:type="dxa" w:w="3182"/>
+            <w:tcBorders>
+              <w:top w:val="single" w:color="C9D1D9" w:sz="4"/>
+              <w:left w:val="single" w:color="C9D1D9" w:sz="4"/>
+              <w:bottom w:val="single" w:color="C9D1D9" w:sz="4"/>
+              <w:right w:val="single" w:color="C9D1D9" w:sz="4"/>
+            </w:tcBorders>
+            <w:tcMar>
+              <w:top w:type="dxa" w:w="60"/>
+              <w:left w:type="dxa" w:w="100"/>
+              <w:bottom w:type="dxa" w:w="60"/>
+              <w:right w:type="dxa" w:w="100"/>
+            </w:tcMar>
+          </w:tcPr>
+          <w:p>
+            <w:pPr>
+              <w:spacing w:after="40" w:line="252"/>
+            </w:pPr>
+            <w:r>
+              <w:rPr>
+                <w:sz w:val="19"/>
+                <w:szCs w:val="19"/>
+              </w:rPr>
+              <w:t xml:space="preserve">The translation spoken in the listener's language. Sent only when </w:t>
+            </w:r>
+            <w:r>
+              <w:rPr>
+                <w:rFonts w:ascii="Consolas" w:cs="Consolas" w:eastAsia="Consolas" w:hAnsi="Consolas"/>
+                <w:color w:val="24292F"/>
+                <w:sz w:val="19"/>
+                <w:szCs w:val="19"/>
+              </w:rPr>
+              <w:t xml:space="preserve">session.ready</w:t>
+            </w:r>
+            <w:r>
+              <w:rPr>
+                <w:sz w:val="19"/>
+                <w:szCs w:val="19"/>
+              </w:rPr>
+              <w:t xml:space="preserve"> has </w:t>
+            </w:r>
+            <w:r>
+              <w:rPr>
+                <w:rFonts w:ascii="Consolas" w:cs="Consolas" w:eastAsia="Consolas" w:hAnsi="Consolas"/>
+                <w:color w:val="24292F"/>
+                <w:sz w:val="19"/>
+                <w:szCs w:val="19"/>
+              </w:rPr>
+              <w:t xml:space="preserve">server_voice: true</w:t>
+            </w:r>
+            <w:r>
+              <w:rPr>
+                <w:sz w:val="19"/>
+                <w:szCs w:val="19"/>
+              </w:rPr>
+              <w:t xml:space="preserve">.</w:t>
             </w:r>
           </w:p>
         </w:tc>
@@ -10269,7 +10111,7 @@
                 <w:sz w:val="19"/>
                 <w:szCs w:val="19"/>
               </w:rPr>
-              <w:t xml:space="preserve">tts.audio</w:t>
+              <w:t xml:space="preserve">error</w:t>
             </w:r>
           </w:p>
         </w:tc>
@@ -10298,7 +10140,7 @@
                 <w:sz w:val="19"/>
                 <w:szCs w:val="19"/>
               </w:rPr>
-              <w:t xml:space="preserve">1E</w:t>
+              <w:t xml:space="preserve">1B</w:t>
             </w:r>
           </w:p>
         </w:tc>
@@ -10329,7 +10171,7 @@
                 <w:sz w:val="19"/>
                 <w:szCs w:val="19"/>
               </w:rPr>
-              <w:t xml:space="preserve">utterance_id</w:t>
+              <w:t xml:space="preserve">code</w:t>
             </w:r>
             <w:r>
               <w:rPr>
@@ -10345,7 +10187,7 @@
                 <w:sz w:val="19"/>
                 <w:szCs w:val="19"/>
               </w:rPr>
-              <w:t xml:space="preserve">listener_id</w:t>
+              <w:t xml:space="preserve">message</w:t>
             </w:r>
             <w:r>
               <w:rPr>
@@ -10361,14 +10203,14 @@
                 <w:sz w:val="19"/>
                 <w:szCs w:val="19"/>
               </w:rPr>
-              <w:t xml:space="preserve">format</w:t>
-            </w:r>
-            <w:r>
-              <w:rPr>
-                <w:sz w:val="19"/>
-                <w:szCs w:val="19"/>
-              </w:rPr>
-              <w:t xml:space="preserve"> ("wav"), </w:t>
+              <w:t xml:space="preserve">retryable</w:t>
+            </w:r>
+            <w:r>
+              <w:rPr>
+                <w:sz w:val="19"/>
+                <w:szCs w:val="19"/>
+              </w:rPr>
+              <w:t xml:space="preserve">, </w:t>
             </w:r>
             <w:r>
               <w:rPr>
@@ -10377,7 +10219,14 @@
                 <w:sz w:val="19"/>
                 <w:szCs w:val="19"/>
               </w:rPr>
-              <w:t xml:space="preserve">audio_base64</w:t>
+              <w:t xml:space="preserve">utterance_id</w:t>
+            </w:r>
+            <w:r>
+              <w:rPr>
+                <w:sz w:val="19"/>
+                <w:szCs w:val="19"/>
+              </w:rPr>
+              <w:t xml:space="preserve"> (or null)</w:t>
             </w:r>
           </w:p>
         </w:tc>
@@ -10406,7 +10255,7 @@
                 <w:sz w:val="19"/>
                 <w:szCs w:val="19"/>
               </w:rPr>
-              <w:t xml:space="preserve">The translation spoken in the listener's language. Sent only when </w:t>
+              <w:t xml:space="preserve">Something went wrong. Show </w:t>
             </w:r>
             <w:r>
               <w:rPr>
@@ -10415,215 +10264,6 @@
                 <w:sz w:val="19"/>
                 <w:szCs w:val="19"/>
               </w:rPr>
-              <w:t xml:space="preserve">session.ready</w:t>
-            </w:r>
-            <w:r>
-              <w:rPr>
-                <w:sz w:val="19"/>
-                <w:szCs w:val="19"/>
-              </w:rPr>
-              <w:t xml:space="preserve"> has </w:t>
-            </w:r>
-            <w:r>
-              <w:rPr>
-                <w:rFonts w:ascii="Consolas" w:cs="Consolas" w:eastAsia="Consolas" w:hAnsi="Consolas"/>
-                <w:color w:val="24292F"/>
-                <w:sz w:val="19"/>
-                <w:szCs w:val="19"/>
-              </w:rPr>
-              <w:t xml:space="preserve">server_voice: true</w:t>
-            </w:r>
-            <w:r>
-              <w:rPr>
-                <w:sz w:val="19"/>
-                <w:szCs w:val="19"/>
-              </w:rPr>
-              <w:t xml:space="preserve">.</w:t>
-            </w:r>
-          </w:p>
-        </w:tc>
-      </w:tr>
-      <w:tr>
-        <w:tc>
-          <w:tcPr>
-            <w:tcW w:type="dxa" w:w="2409"/>
-            <w:tcBorders>
-              <w:top w:val="single" w:color="C9D1D9" w:sz="4"/>
-              <w:left w:val="single" w:color="C9D1D9" w:sz="4"/>
-              <w:bottom w:val="single" w:color="C9D1D9" w:sz="4"/>
-              <w:right w:val="single" w:color="C9D1D9" w:sz="4"/>
-            </w:tcBorders>
-            <w:tcMar>
-              <w:top w:type="dxa" w:w="60"/>
-              <w:left w:type="dxa" w:w="100"/>
-              <w:bottom w:type="dxa" w:w="60"/>
-              <w:right w:type="dxa" w:w="100"/>
-            </w:tcMar>
-          </w:tcPr>
-          <w:p>
-            <w:pPr>
-              <w:spacing w:after="40" w:line="252"/>
-            </w:pPr>
-            <w:r>
-              <w:rPr>
-                <w:rFonts w:ascii="Consolas" w:cs="Consolas" w:eastAsia="Consolas" w:hAnsi="Consolas"/>
-                <w:color w:val="24292F"/>
-                <w:sz w:val="19"/>
-                <w:szCs w:val="19"/>
-              </w:rPr>
-              <w:t xml:space="preserve">error</w:t>
-            </w:r>
-          </w:p>
-        </w:tc>
-        <w:tc>
-          <w:tcPr>
-            <w:tcW w:type="dxa" w:w="578"/>
-            <w:tcBorders>
-              <w:top w:val="single" w:color="C9D1D9" w:sz="4"/>
-              <w:left w:val="single" w:color="C9D1D9" w:sz="4"/>
-              <w:bottom w:val="single" w:color="C9D1D9" w:sz="4"/>
-              <w:right w:val="single" w:color="C9D1D9" w:sz="4"/>
-            </w:tcBorders>
-            <w:tcMar>
-              <w:top w:type="dxa" w:w="60"/>
-              <w:left w:type="dxa" w:w="100"/>
-              <w:bottom w:type="dxa" w:w="60"/>
-              <w:right w:type="dxa" w:w="100"/>
-            </w:tcMar>
-          </w:tcPr>
-          <w:p>
-            <w:pPr>
-              <w:spacing w:after="40" w:line="252"/>
-            </w:pPr>
-            <w:r>
-              <w:rPr>
-                <w:sz w:val="19"/>
-                <w:szCs w:val="19"/>
-              </w:rPr>
-              <w:t xml:space="preserve">1B</w:t>
-            </w:r>
-          </w:p>
-        </w:tc>
-        <w:tc>
-          <w:tcPr>
-            <w:tcW w:type="dxa" w:w="3469"/>
-            <w:tcBorders>
-              <w:top w:val="single" w:color="C9D1D9" w:sz="4"/>
-              <w:left w:val="single" w:color="C9D1D9" w:sz="4"/>
-              <w:bottom w:val="single" w:color="C9D1D9" w:sz="4"/>
-              <w:right w:val="single" w:color="C9D1D9" w:sz="4"/>
-            </w:tcBorders>
-            <w:tcMar>
-              <w:top w:type="dxa" w:w="60"/>
-              <w:left w:type="dxa" w:w="100"/>
-              <w:bottom w:type="dxa" w:w="60"/>
-              <w:right w:type="dxa" w:w="100"/>
-            </w:tcMar>
-          </w:tcPr>
-          <w:p>
-            <w:pPr>
-              <w:spacing w:after="40" w:line="252"/>
-            </w:pPr>
-            <w:r>
-              <w:rPr>
-                <w:rFonts w:ascii="Consolas" w:cs="Consolas" w:eastAsia="Consolas" w:hAnsi="Consolas"/>
-                <w:color w:val="24292F"/>
-                <w:sz w:val="19"/>
-                <w:szCs w:val="19"/>
-              </w:rPr>
-              <w:t xml:space="preserve">code</w:t>
-            </w:r>
-            <w:r>
-              <w:rPr>
-                <w:sz w:val="19"/>
-                <w:szCs w:val="19"/>
-              </w:rPr>
-              <w:t xml:space="preserve">, </w:t>
-            </w:r>
-            <w:r>
-              <w:rPr>
-                <w:rFonts w:ascii="Consolas" w:cs="Consolas" w:eastAsia="Consolas" w:hAnsi="Consolas"/>
-                <w:color w:val="24292F"/>
-                <w:sz w:val="19"/>
-                <w:szCs w:val="19"/>
-              </w:rPr>
-              <w:t xml:space="preserve">message</w:t>
-            </w:r>
-            <w:r>
-              <w:rPr>
-                <w:sz w:val="19"/>
-                <w:szCs w:val="19"/>
-              </w:rPr>
-              <w:t xml:space="preserve">, </w:t>
-            </w:r>
-            <w:r>
-              <w:rPr>
-                <w:rFonts w:ascii="Consolas" w:cs="Consolas" w:eastAsia="Consolas" w:hAnsi="Consolas"/>
-                <w:color w:val="24292F"/>
-                <w:sz w:val="19"/>
-                <w:szCs w:val="19"/>
-              </w:rPr>
-              <w:t xml:space="preserve">retryable</w:t>
-            </w:r>
-            <w:r>
-              <w:rPr>
-                <w:sz w:val="19"/>
-                <w:szCs w:val="19"/>
-              </w:rPr>
-              <w:t xml:space="preserve">, </w:t>
-            </w:r>
-            <w:r>
-              <w:rPr>
-                <w:rFonts w:ascii="Consolas" w:cs="Consolas" w:eastAsia="Consolas" w:hAnsi="Consolas"/>
-                <w:color w:val="24292F"/>
-                <w:sz w:val="19"/>
-                <w:szCs w:val="19"/>
-              </w:rPr>
-              <w:t xml:space="preserve">utterance_id</w:t>
-            </w:r>
-            <w:r>
-              <w:rPr>
-                <w:sz w:val="19"/>
-                <w:szCs w:val="19"/>
-              </w:rPr>
-              <w:t xml:space="preserve"> (or null)</w:t>
-            </w:r>
-          </w:p>
-        </w:tc>
-        <w:tc>
-          <w:tcPr>
-            <w:tcW w:type="dxa" w:w="3182"/>
-            <w:tcBorders>
-              <w:top w:val="single" w:color="C9D1D9" w:sz="4"/>
-              <w:left w:val="single" w:color="C9D1D9" w:sz="4"/>
-              <w:bottom w:val="single" w:color="C9D1D9" w:sz="4"/>
-              <w:right w:val="single" w:color="C9D1D9" w:sz="4"/>
-            </w:tcBorders>
-            <w:tcMar>
-              <w:top w:type="dxa" w:w="60"/>
-              <w:left w:type="dxa" w:w="100"/>
-              <w:bottom w:type="dxa" w:w="60"/>
-              <w:right w:type="dxa" w:w="100"/>
-            </w:tcMar>
-          </w:tcPr>
-          <w:p>
-            <w:pPr>
-              <w:spacing w:after="40" w:line="252"/>
-            </w:pPr>
-            <w:r>
-              <w:rPr>
-                <w:sz w:val="19"/>
-                <w:szCs w:val="19"/>
-              </w:rPr>
-              <w:t xml:space="preserve">Something went wrong. Show </w:t>
-            </w:r>
-            <w:r>
-              <w:rPr>
-                <w:rFonts w:ascii="Consolas" w:cs="Consolas" w:eastAsia="Consolas" w:hAnsi="Consolas"/>
-                <w:color w:val="24292F"/>
-                <w:sz w:val="19"/>
-                <w:szCs w:val="19"/>
-              </w:rPr>
               <w:t xml:space="preserve">message</w:t>
             </w:r>
             <w:r>
@@ -10641,6 +10281,114 @@
       <w:pPr>
         <w:spacing w:after="120"/>
       </w:pPr>
+    </w:p>
+    <w:p>
+      <w:pPr>
+        <w:pStyle w:val="Heading3"/>
+        <w:spacing w:after="80" w:before="200"/>
+      </w:pPr>
+      <w:r>
+        <w:t xml:space="preserve">Who spoke</w:t>
+      </w:r>
+    </w:p>
+    <w:p>
+      <w:pPr>
+        <w:pStyle w:val="ListParagraph"/>
+        <w:numPr>
+          <w:ilvl w:val="0"/>
+          <w:numId w:val="2"/>
+        </w:numPr>
+        <w:spacing w:after="60" w:line="276"/>
+      </w:pPr>
+      <w:r>
+        <w:t xml:space="preserve">The language heard matches one person's chosen language: that person is the speaker and the other person gets one </w:t>
+      </w:r>
+      <w:r>
+        <w:rPr>
+          <w:rFonts w:ascii="Consolas" w:cs="Consolas" w:eastAsia="Consolas" w:hAnsi="Consolas"/>
+          <w:color w:val="24292F"/>
+          <w:sz w:val="19"/>
+          <w:szCs w:val="19"/>
+        </w:rPr>
+        <w:t xml:space="preserve">translation.final</w:t>
+      </w:r>
+      <w:r>
+        <w:t xml:space="preserve">.</w:t>
+      </w:r>
+    </w:p>
+    <w:p>
+      <w:pPr>
+        <w:pStyle w:val="ListParagraph"/>
+        <w:numPr>
+          <w:ilvl w:val="0"/>
+          <w:numId w:val="2"/>
+        </w:numPr>
+        <w:spacing w:after="60" w:line="276"/>
+      </w:pPr>
+      <w:r>
+        <w:t xml:space="preserve">A third language: </w:t>
+      </w:r>
+      <w:r>
+        <w:rPr>
+          <w:rFonts w:ascii="Consolas" w:cs="Consolas" w:eastAsia="Consolas" w:hAnsi="Consolas"/>
+          <w:color w:val="24292F"/>
+          <w:sz w:val="19"/>
+          <w:szCs w:val="19"/>
+        </w:rPr>
+        <w:t xml:space="preserve">speaker_id</w:t>
+      </w:r>
+      <w:r>
+        <w:t xml:space="preserve"> is null and both people get a </w:t>
+      </w:r>
+      <w:r>
+        <w:rPr>
+          <w:rFonts w:ascii="Consolas" w:cs="Consolas" w:eastAsia="Consolas" w:hAnsi="Consolas"/>
+          <w:color w:val="24292F"/>
+          <w:sz w:val="19"/>
+          <w:szCs w:val="19"/>
+        </w:rPr>
+        <w:t xml:space="preserve">translation.final</w:t>
+      </w:r>
+      <w:r>
+        <w:t xml:space="preserve"> in their own language.</w:t>
+      </w:r>
+    </w:p>
+    <w:p>
+      <w:pPr>
+        <w:pStyle w:val="ListParagraph"/>
+        <w:numPr>
+          <w:ilvl w:val="0"/>
+          <w:numId w:val="2"/>
+        </w:numPr>
+        <w:spacing w:after="60" w:line="276"/>
+      </w:pPr>
+      <w:r>
+        <w:t xml:space="preserve">Both people chose that language: </w:t>
+      </w:r>
+      <w:r>
+        <w:rPr>
+          <w:rFonts w:ascii="Consolas" w:cs="Consolas" w:eastAsia="Consolas" w:hAnsi="Consolas"/>
+          <w:color w:val="24292F"/>
+          <w:sz w:val="19"/>
+          <w:szCs w:val="19"/>
+        </w:rPr>
+        <w:t xml:space="preserve">speaker_id</w:t>
+      </w:r>
+      <w:r>
+        <w:t xml:space="preserve"> is null and only </w:t>
+      </w:r>
+      <w:r>
+        <w:rPr>
+          <w:rFonts w:ascii="Consolas" w:cs="Consolas" w:eastAsia="Consolas" w:hAnsi="Consolas"/>
+          <w:color w:val="24292F"/>
+          <w:sz w:val="19"/>
+          <w:szCs w:val="19"/>
+        </w:rPr>
+        <w:t xml:space="preserve">transcript.final</w:t>
+      </w:r>
+      <w:r>
+        <w:t xml:space="preserve"> is sent.</w:t>
+      </w:r>
     </w:p>
     <w:p>
       <w:pPr>
@@ -10667,7 +10415,7 @@
           <w:sz w:val="18"/>
           <w:szCs w:val="18"/>
         </w:rPr>
-        <w:t xml:space="preserve">-&gt; {"type":"utterance.start","utterance_id":"7c9e6679-7425-40de-944b-e07fc1f90ae7","speaker_id":"B","spoken_language":null}</w:t>
+        <w:t xml:space="preserve">-&gt; (binary audio frames, about 100 ms each, continuously)</w:t>
       </w:r>
     </w:p>
     <w:p>
@@ -10686,7 +10434,7 @@
           <w:sz w:val="18"/>
           <w:szCs w:val="18"/>
         </w:rPr>
-        <w:t xml:space="preserve">-&gt; (binary audio frames, about 100 ms each)</w:t>
+        <w:t xml:space="preserve">&lt;- {"type":"utterance.received","seq":2,"utterance_id":"7c9e6679-7425-40de-944b-e07fc1f90ae7","duration_ms":2100}</w:t>
       </w:r>
     </w:p>
     <w:p>
@@ -10705,7 +10453,7 @@
           <w:sz w:val="18"/>
           <w:szCs w:val="18"/>
         </w:rPr>
-        <w:t xml:space="preserve">-&gt; {"type":"utterance.end","utterance_id":"7c9e6679-7425-40de-944b-e07fc1f90ae7"}</w:t>
+        <w:t xml:space="preserve">&lt;- {"type":"transcript.final","seq":3,"utterance_id":"7c9e6679-7425-40de-944b-e07fc1f90ae7","speaker_id":"B",</w:t>
       </w:r>
     </w:p>
     <w:p>
@@ -10724,7 +10472,7 @@
           <w:sz w:val="18"/>
           <w:szCs w:val="18"/>
         </w:rPr>
-        <w:t xml:space="preserve">&lt;- {"type":"utterance.received","seq":4,"utterance_id":"7c9e6679-7425-40de-944b-e07fc1f90ae7","speaker_id":"B","duration_ms":2100}</w:t>
+        <w:t xml:space="preserve">    "text":"మీరు ఎలా ఉన్నారు?","language":"te","language_name":"Telugu"}</w:t>
       </w:r>
     </w:p>
     <w:p>
@@ -10743,45 +10491,7 @@
           <w:sz w:val="18"/>
           <w:szCs w:val="18"/>
         </w:rPr>
-        <w:t xml:space="preserve">&lt;- {"type":"transcript.final","seq":5,"utterance_id":"7c9e6679-7425-40de-944b-e07fc1f90ae7","speaker_id":"B",</w:t>
-      </w:r>
-    </w:p>
-    <w:p>
-      <w:pPr>
-        <w:pBdr>
-          <w:left w:val="single" w:color="0969DA" w:sz="12" w:space="6"/>
-        </w:pBdr>
-        <w:shd w:fill="F6F8FA" w:color="auto" w:val="clear"/>
-        <w:spacing w:after="0" w:before="0" w:line="252"/>
-        <w:ind w:left="180"/>
-      </w:pPr>
-      <w:r>
-        <w:rPr>
-          <w:rFonts w:ascii="Consolas" w:cs="Consolas" w:eastAsia="Consolas" w:hAnsi="Consolas"/>
-          <w:color w:val="24292F"/>
-          <w:sz w:val="18"/>
-          <w:szCs w:val="18"/>
-        </w:rPr>
-        <w:t xml:space="preserve">    "text":"మీరు ఎలా ఉన్నారు?","language":"te","language_name":"Telugu"}</w:t>
-      </w:r>
-    </w:p>
-    <w:p>
-      <w:pPr>
-        <w:pBdr>
-          <w:left w:val="single" w:color="0969DA" w:sz="12" w:space="6"/>
-        </w:pBdr>
-        <w:shd w:fill="F6F8FA" w:color="auto" w:val="clear"/>
-        <w:spacing w:after="0" w:before="0" w:line="252"/>
-        <w:ind w:left="180"/>
-      </w:pPr>
-      <w:r>
-        <w:rPr>
-          <w:rFonts w:ascii="Consolas" w:cs="Consolas" w:eastAsia="Consolas" w:hAnsi="Consolas"/>
-          <w:color w:val="24292F"/>
-          <w:sz w:val="18"/>
-          <w:szCs w:val="18"/>
-        </w:rPr>
-        <w:t xml:space="preserve">&lt;- {"type":"translation.final","seq":6,"utterance_id":"7c9e6679-7425-40de-944b-e07fc1f90ae7","speaker_id":"B",</w:t>
+        <w:t xml:space="preserve">&lt;- {"type":"translation.final","seq":4,"utterance_id":"7c9e6679-7425-40de-944b-e07fc1f90ae7","speaker_id":"B",</w:t>
       </w:r>
     </w:p>
     <w:p>
@@ -10800,7 +10510,7 @@
           <w:sz w:val="18"/>
           <w:szCs w:val="18"/>
         </w:rPr>
-        <w:t xml:space="preserve">    "listener_id":"A","target_language":"en","text":"How are you?","translated":true}</w:t>
+        <w:t xml:space="preserve">    "listener_id":"A","target_language":"en","text":"How are you?"}</w:t>
       </w:r>
     </w:p>
     <w:p>
@@ -11032,7 +10742,7 @@
                 <w:sz w:val="19"/>
                 <w:szCs w:val="19"/>
               </w:rPr>
-              <w:t xml:space="preserve">, missing or extra fields, a second open utterance, or a malformed audio frame.</w:t>
+              <w:t xml:space="preserve">, too large, or a malformed audio frame.</w:t>
             </w:r>
           </w:p>
         </w:tc>
@@ -11123,7 +10833,7 @@
                 <w:sz w:val="19"/>
                 <w:szCs w:val="19"/>
               </w:rPr>
-              <w:t xml:space="preserve">The session id does not exist (also socket close code 4404).</w:t>
+              <w:t xml:space="preserve">The session id does not exist, has expired or is already open (also socket close code 4404).</w:t>
             </w:r>
           </w:p>
         </w:tc>
@@ -11156,7 +10866,7 @@
                 <w:sz w:val="19"/>
                 <w:szCs w:val="19"/>
               </w:rPr>
-              <w:t xml:space="preserve">no_active_utterance</w:t>
+              <w:t xml:space="preserve">provider_unavailable</w:t>
             </w:r>
           </w:p>
         </w:tc>
@@ -11185,7 +10895,7 @@
                 <w:sz w:val="19"/>
                 <w:szCs w:val="19"/>
               </w:rPr>
-              <w:t xml:space="preserve">no</w:t>
+              <w:t xml:space="preserve">depends</w:t>
             </w:r>
           </w:p>
         </w:tc>
@@ -11214,8 +10924,32 @@
                 <w:sz w:val="19"/>
                 <w:szCs w:val="19"/>
               </w:rPr>
-              <w:t xml:space="preserve">Audio or </w:t>
-            </w:r>
+              <w:t xml:space="preserve">The speech service could not be reached, timed out, did not translate the sentence, or is not set up.</w:t>
+            </w:r>
+          </w:p>
+        </w:tc>
+      </w:tr>
+      <w:tr>
+        <w:tc>
+          <w:tcPr>
+            <w:tcW w:type="dxa" w:w="2698"/>
+            <w:tcBorders>
+              <w:top w:val="single" w:color="C9D1D9" w:sz="4"/>
+              <w:left w:val="single" w:color="C9D1D9" w:sz="4"/>
+              <w:bottom w:val="single" w:color="C9D1D9" w:sz="4"/>
+              <w:right w:val="single" w:color="C9D1D9" w:sz="4"/>
+            </w:tcBorders>
+            <w:tcMar>
+              <w:top w:type="dxa" w:w="60"/>
+              <w:left w:type="dxa" w:w="100"/>
+              <w:bottom w:type="dxa" w:w="60"/>
+              <w:right w:type="dxa" w:w="100"/>
+            </w:tcMar>
+          </w:tcPr>
+          <w:p>
+            <w:pPr>
+              <w:spacing w:after="40" w:line="252"/>
+            </w:pPr>
             <w:r>
               <w:rPr>
                 <w:rFonts w:ascii="Consolas" w:cs="Consolas" w:eastAsia="Consolas" w:hAnsi="Consolas"/>
@@ -11223,14 +10957,65 @@
                 <w:sz w:val="19"/>
                 <w:szCs w:val="19"/>
               </w:rPr>
-              <w:t xml:space="preserve">utterance.end</w:t>
-            </w:r>
-            <w:r>
-              <w:rPr>
-                <w:sz w:val="19"/>
-                <w:szCs w:val="19"/>
-              </w:rPr>
-              <w:t xml:space="preserve"> arrived without an open utterance.</w:t>
+              <w:t xml:space="preserve">quota_exceeded</w:t>
+            </w:r>
+          </w:p>
+        </w:tc>
+        <w:tc>
+          <w:tcPr>
+            <w:tcW w:type="dxa" w:w="1349"/>
+            <w:tcBorders>
+              <w:top w:val="single" w:color="C9D1D9" w:sz="4"/>
+              <w:left w:val="single" w:color="C9D1D9" w:sz="4"/>
+              <w:bottom w:val="single" w:color="C9D1D9" w:sz="4"/>
+              <w:right w:val="single" w:color="C9D1D9" w:sz="4"/>
+            </w:tcBorders>
+            <w:tcMar>
+              <w:top w:type="dxa" w:w="60"/>
+              <w:left w:type="dxa" w:w="100"/>
+              <w:bottom w:type="dxa" w:w="60"/>
+              <w:right w:type="dxa" w:w="100"/>
+            </w:tcMar>
+          </w:tcPr>
+          <w:p>
+            <w:pPr>
+              <w:spacing w:after="40" w:line="252"/>
+            </w:pPr>
+            <w:r>
+              <w:rPr>
+                <w:sz w:val="19"/>
+                <w:szCs w:val="19"/>
+              </w:rPr>
+              <w:t xml:space="preserve">yes, later</w:t>
+            </w:r>
+          </w:p>
+        </w:tc>
+        <w:tc>
+          <w:tcPr>
+            <w:tcW w:type="dxa" w:w="5591"/>
+            <w:tcBorders>
+              <w:top w:val="single" w:color="C9D1D9" w:sz="4"/>
+              <w:left w:val="single" w:color="C9D1D9" w:sz="4"/>
+              <w:bottom w:val="single" w:color="C9D1D9" w:sz="4"/>
+              <w:right w:val="single" w:color="C9D1D9" w:sz="4"/>
+            </w:tcBorders>
+            <w:tcMar>
+              <w:top w:type="dxa" w:w="60"/>
+              <w:left w:type="dxa" w:w="100"/>
+              <w:bottom w:type="dxa" w:w="60"/>
+              <w:right w:type="dxa" w:w="100"/>
+            </w:tcMar>
+          </w:tcPr>
+          <w:p>
+            <w:pPr>
+              <w:spacing w:after="40" w:line="252"/>
+            </w:pPr>
+            <w:r>
+              <w:rPr>
+                <w:sz w:val="19"/>
+                <w:szCs w:val="19"/>
+              </w:rPr>
+              <w:t xml:space="preserve">The free-tier limit was reached. Try again later.</w:t>
             </w:r>
           </w:p>
         </w:tc>
@@ -11263,7 +11048,7 @@
                 <w:sz w:val="19"/>
                 <w:szCs w:val="19"/>
               </w:rPr>
-              <w:t xml:space="preserve">audio_too_short</w:t>
+              <w:t xml:space="preserve">voice_unavailable</w:t>
             </w:r>
           </w:p>
         </w:tc>
@@ -11321,7 +11106,7 @@
                 <w:sz w:val="19"/>
                 <w:szCs w:val="19"/>
               </w:rPr>
-              <w:t xml:space="preserve">Less than 0.3 s of audio, or only silence.</w:t>
+              <w:t xml:space="preserve">The server could not make this voice. Use the browser voice or captions only.</w:t>
             </w:r>
           </w:p>
         </w:tc>
@@ -11354,7 +11139,7 @@
                 <w:sz w:val="19"/>
                 <w:szCs w:val="19"/>
               </w:rPr>
-              <w:t xml:space="preserve">audio_too_long</w:t>
+              <w:t xml:space="preserve">internal_error</w:t>
             </w:r>
           </w:p>
         </w:tc>
@@ -11383,7 +11168,7 @@
                 <w:sz w:val="19"/>
                 <w:szCs w:val="19"/>
               </w:rPr>
-              <w:t xml:space="preserve">no</w:t>
+              <w:t xml:space="preserve">yes</w:t>
             </w:r>
           </w:p>
         </w:tc>
@@ -11412,462 +11197,7 @@
                 <w:sz w:val="19"/>
                 <w:szCs w:val="19"/>
               </w:rPr>
-              <w:t xml:space="preserve">More than 30 s of audio in one utterance.</w:t>
-            </w:r>
-          </w:p>
-        </w:tc>
-      </w:tr>
-      <w:tr>
-        <w:tc>
-          <w:tcPr>
-            <w:tcW w:type="dxa" w:w="2698"/>
-            <w:tcBorders>
-              <w:top w:val="single" w:color="C9D1D9" w:sz="4"/>
-              <w:left w:val="single" w:color="C9D1D9" w:sz="4"/>
-              <w:bottom w:val="single" w:color="C9D1D9" w:sz="4"/>
-              <w:right w:val="single" w:color="C9D1D9" w:sz="4"/>
-            </w:tcBorders>
-            <w:tcMar>
-              <w:top w:type="dxa" w:w="60"/>
-              <w:left w:type="dxa" w:w="100"/>
-              <w:bottom w:type="dxa" w:w="60"/>
-              <w:right w:type="dxa" w:w="100"/>
-            </w:tcMar>
-          </w:tcPr>
-          <w:p>
-            <w:pPr>
-              <w:spacing w:after="40" w:line="252"/>
-            </w:pPr>
-            <w:r>
-              <w:rPr>
-                <w:rFonts w:ascii="Consolas" w:cs="Consolas" w:eastAsia="Consolas" w:hAnsi="Consolas"/>
-                <w:color w:val="24292F"/>
-                <w:sz w:val="19"/>
-                <w:szCs w:val="19"/>
-              </w:rPr>
-              <w:t xml:space="preserve">unsupported_language</w:t>
-            </w:r>
-          </w:p>
-        </w:tc>
-        <w:tc>
-          <w:tcPr>
-            <w:tcW w:type="dxa" w:w="1349"/>
-            <w:tcBorders>
-              <w:top w:val="single" w:color="C9D1D9" w:sz="4"/>
-              <w:left w:val="single" w:color="C9D1D9" w:sz="4"/>
-              <w:bottom w:val="single" w:color="C9D1D9" w:sz="4"/>
-              <w:right w:val="single" w:color="C9D1D9" w:sz="4"/>
-            </w:tcBorders>
-            <w:tcMar>
-              <w:top w:type="dxa" w:w="60"/>
-              <w:left w:type="dxa" w:w="100"/>
-              <w:bottom w:type="dxa" w:w="60"/>
-              <w:right w:type="dxa" w:w="100"/>
-            </w:tcMar>
-          </w:tcPr>
-          <w:p>
-            <w:pPr>
-              <w:spacing w:after="40" w:line="252"/>
-            </w:pPr>
-            <w:r>
-              <w:rPr>
-                <w:sz w:val="19"/>
-                <w:szCs w:val="19"/>
-              </w:rPr>
-              <w:t xml:space="preserve">no</w:t>
-            </w:r>
-          </w:p>
-        </w:tc>
-        <w:tc>
-          <w:tcPr>
-            <w:tcW w:type="dxa" w:w="5591"/>
-            <w:tcBorders>
-              <w:top w:val="single" w:color="C9D1D9" w:sz="4"/>
-              <w:left w:val="single" w:color="C9D1D9" w:sz="4"/>
-              <w:bottom w:val="single" w:color="C9D1D9" w:sz="4"/>
-              <w:right w:val="single" w:color="C9D1D9" w:sz="4"/>
-            </w:tcBorders>
-            <w:tcMar>
-              <w:top w:type="dxa" w:w="60"/>
-              <w:left w:type="dxa" w:w="100"/>
-              <w:bottom w:type="dxa" w:w="60"/>
-              <w:right w:type="dxa" w:w="100"/>
-            </w:tcMar>
-          </w:tcPr>
-          <w:p>
-            <w:pPr>
-              <w:spacing w:after="40" w:line="252"/>
-            </w:pPr>
-            <w:r>
-              <w:rPr>
-                <w:sz w:val="19"/>
-                <w:szCs w:val="19"/>
-              </w:rPr>
-              <w:t xml:space="preserve">The detected or requested language is not in the list.</w:t>
-            </w:r>
-          </w:p>
-        </w:tc>
-      </w:tr>
-      <w:tr>
-        <w:tc>
-          <w:tcPr>
-            <w:tcW w:type="dxa" w:w="2698"/>
-            <w:tcBorders>
-              <w:top w:val="single" w:color="C9D1D9" w:sz="4"/>
-              <w:left w:val="single" w:color="C9D1D9" w:sz="4"/>
-              <w:bottom w:val="single" w:color="C9D1D9" w:sz="4"/>
-              <w:right w:val="single" w:color="C9D1D9" w:sz="4"/>
-            </w:tcBorders>
-            <w:tcMar>
-              <w:top w:type="dxa" w:w="60"/>
-              <w:left w:type="dxa" w:w="100"/>
-              <w:bottom w:type="dxa" w:w="60"/>
-              <w:right w:type="dxa" w:w="100"/>
-            </w:tcMar>
-          </w:tcPr>
-          <w:p>
-            <w:pPr>
-              <w:spacing w:after="40" w:line="252"/>
-            </w:pPr>
-            <w:r>
-              <w:rPr>
-                <w:rFonts w:ascii="Consolas" w:cs="Consolas" w:eastAsia="Consolas" w:hAnsi="Consolas"/>
-                <w:color w:val="24292F"/>
-                <w:sz w:val="19"/>
-                <w:szCs w:val="19"/>
-              </w:rPr>
-              <w:t xml:space="preserve">provider_unavailable</w:t>
-            </w:r>
-          </w:p>
-        </w:tc>
-        <w:tc>
-          <w:tcPr>
-            <w:tcW w:type="dxa" w:w="1349"/>
-            <w:tcBorders>
-              <w:top w:val="single" w:color="C9D1D9" w:sz="4"/>
-              <w:left w:val="single" w:color="C9D1D9" w:sz="4"/>
-              <w:bottom w:val="single" w:color="C9D1D9" w:sz="4"/>
-              <w:right w:val="single" w:color="C9D1D9" w:sz="4"/>
-            </w:tcBorders>
-            <w:tcMar>
-              <w:top w:type="dxa" w:w="60"/>
-              <w:left w:type="dxa" w:w="100"/>
-              <w:bottom w:type="dxa" w:w="60"/>
-              <w:right w:type="dxa" w:w="100"/>
-            </w:tcMar>
-          </w:tcPr>
-          <w:p>
-            <w:pPr>
-              <w:spacing w:after="40" w:line="252"/>
-            </w:pPr>
-            <w:r>
-              <w:rPr>
-                <w:sz w:val="19"/>
-                <w:szCs w:val="19"/>
-              </w:rPr>
-              <w:t xml:space="preserve">yes</w:t>
-            </w:r>
-          </w:p>
-        </w:tc>
-        <w:tc>
-          <w:tcPr>
-            <w:tcW w:type="dxa" w:w="5591"/>
-            <w:tcBorders>
-              <w:top w:val="single" w:color="C9D1D9" w:sz="4"/>
-              <w:left w:val="single" w:color="C9D1D9" w:sz="4"/>
-              <w:bottom w:val="single" w:color="C9D1D9" w:sz="4"/>
-              <w:right w:val="single" w:color="C9D1D9" w:sz="4"/>
-            </w:tcBorders>
-            <w:tcMar>
-              <w:top w:type="dxa" w:w="60"/>
-              <w:left w:type="dxa" w:w="100"/>
-              <w:bottom w:type="dxa" w:w="60"/>
-              <w:right w:type="dxa" w:w="100"/>
-            </w:tcMar>
-          </w:tcPr>
-          <w:p>
-            <w:pPr>
-              <w:spacing w:after="40" w:line="252"/>
-            </w:pPr>
-            <w:r>
-              <w:rPr>
-                <w:sz w:val="19"/>
-                <w:szCs w:val="19"/>
-              </w:rPr>
-              <w:t xml:space="preserve">The speech or translation service could not be reached or timed out.</w:t>
-            </w:r>
-          </w:p>
-        </w:tc>
-      </w:tr>
-      <w:tr>
-        <w:tc>
-          <w:tcPr>
-            <w:tcW w:type="dxa" w:w="2698"/>
-            <w:tcBorders>
-              <w:top w:val="single" w:color="C9D1D9" w:sz="4"/>
-              <w:left w:val="single" w:color="C9D1D9" w:sz="4"/>
-              <w:bottom w:val="single" w:color="C9D1D9" w:sz="4"/>
-              <w:right w:val="single" w:color="C9D1D9" w:sz="4"/>
-            </w:tcBorders>
-            <w:tcMar>
-              <w:top w:type="dxa" w:w="60"/>
-              <w:left w:type="dxa" w:w="100"/>
-              <w:bottom w:type="dxa" w:w="60"/>
-              <w:right w:type="dxa" w:w="100"/>
-            </w:tcMar>
-          </w:tcPr>
-          <w:p>
-            <w:pPr>
-              <w:spacing w:after="40" w:line="252"/>
-            </w:pPr>
-            <w:r>
-              <w:rPr>
-                <w:rFonts w:ascii="Consolas" w:cs="Consolas" w:eastAsia="Consolas" w:hAnsi="Consolas"/>
-                <w:color w:val="24292F"/>
-                <w:sz w:val="19"/>
-                <w:szCs w:val="19"/>
-              </w:rPr>
-              <w:t xml:space="preserve">quota_exceeded</w:t>
-            </w:r>
-          </w:p>
-        </w:tc>
-        <w:tc>
-          <w:tcPr>
-            <w:tcW w:type="dxa" w:w="1349"/>
-            <w:tcBorders>
-              <w:top w:val="single" w:color="C9D1D9" w:sz="4"/>
-              <w:left w:val="single" w:color="C9D1D9" w:sz="4"/>
-              <w:bottom w:val="single" w:color="C9D1D9" w:sz="4"/>
-              <w:right w:val="single" w:color="C9D1D9" w:sz="4"/>
-            </w:tcBorders>
-            <w:tcMar>
-              <w:top w:type="dxa" w:w="60"/>
-              <w:left w:type="dxa" w:w="100"/>
-              <w:bottom w:type="dxa" w:w="60"/>
-              <w:right w:type="dxa" w:w="100"/>
-            </w:tcMar>
-          </w:tcPr>
-          <w:p>
-            <w:pPr>
-              <w:spacing w:after="40" w:line="252"/>
-            </w:pPr>
-            <w:r>
-              <w:rPr>
-                <w:sz w:val="19"/>
-                <w:szCs w:val="19"/>
-              </w:rPr>
-              <w:t xml:space="preserve">yes, later</w:t>
-            </w:r>
-          </w:p>
-        </w:tc>
-        <w:tc>
-          <w:tcPr>
-            <w:tcW w:type="dxa" w:w="5591"/>
-            <w:tcBorders>
-              <w:top w:val="single" w:color="C9D1D9" w:sz="4"/>
-              <w:left w:val="single" w:color="C9D1D9" w:sz="4"/>
-              <w:bottom w:val="single" w:color="C9D1D9" w:sz="4"/>
-              <w:right w:val="single" w:color="C9D1D9" w:sz="4"/>
-            </w:tcBorders>
-            <w:tcMar>
-              <w:top w:type="dxa" w:w="60"/>
-              <w:left w:type="dxa" w:w="100"/>
-              <w:bottom w:type="dxa" w:w="60"/>
-              <w:right w:type="dxa" w:w="100"/>
-            </w:tcMar>
-          </w:tcPr>
-          <w:p>
-            <w:pPr>
-              <w:spacing w:after="40" w:line="252"/>
-            </w:pPr>
-            <w:r>
-              <w:rPr>
-                <w:sz w:val="19"/>
-                <w:szCs w:val="19"/>
-              </w:rPr>
-              <w:t xml:space="preserve">The free-tier limit was reached. Try again later.</w:t>
-            </w:r>
-          </w:p>
-        </w:tc>
-      </w:tr>
-      <w:tr>
-        <w:tc>
-          <w:tcPr>
-            <w:tcW w:type="dxa" w:w="2698"/>
-            <w:tcBorders>
-              <w:top w:val="single" w:color="C9D1D9" w:sz="4"/>
-              <w:left w:val="single" w:color="C9D1D9" w:sz="4"/>
-              <w:bottom w:val="single" w:color="C9D1D9" w:sz="4"/>
-              <w:right w:val="single" w:color="C9D1D9" w:sz="4"/>
-            </w:tcBorders>
-            <w:tcMar>
-              <w:top w:type="dxa" w:w="60"/>
-              <w:left w:type="dxa" w:w="100"/>
-              <w:bottom w:type="dxa" w:w="60"/>
-              <w:right w:type="dxa" w:w="100"/>
-            </w:tcMar>
-          </w:tcPr>
-          <w:p>
-            <w:pPr>
-              <w:spacing w:after="40" w:line="252"/>
-            </w:pPr>
-            <w:r>
-              <w:rPr>
-                <w:rFonts w:ascii="Consolas" w:cs="Consolas" w:eastAsia="Consolas" w:hAnsi="Consolas"/>
-                <w:color w:val="24292F"/>
-                <w:sz w:val="19"/>
-                <w:szCs w:val="19"/>
-              </w:rPr>
-              <w:t xml:space="preserve">voice_unavailable</w:t>
-            </w:r>
-          </w:p>
-        </w:tc>
-        <w:tc>
-          <w:tcPr>
-            <w:tcW w:type="dxa" w:w="1349"/>
-            <w:tcBorders>
-              <w:top w:val="single" w:color="C9D1D9" w:sz="4"/>
-              <w:left w:val="single" w:color="C9D1D9" w:sz="4"/>
-              <w:bottom w:val="single" w:color="C9D1D9" w:sz="4"/>
-              <w:right w:val="single" w:color="C9D1D9" w:sz="4"/>
-            </w:tcBorders>
-            <w:tcMar>
-              <w:top w:type="dxa" w:w="60"/>
-              <w:left w:type="dxa" w:w="100"/>
-              <w:bottom w:type="dxa" w:w="60"/>
-              <w:right w:type="dxa" w:w="100"/>
-            </w:tcMar>
-          </w:tcPr>
-          <w:p>
-            <w:pPr>
-              <w:spacing w:after="40" w:line="252"/>
-            </w:pPr>
-            <w:r>
-              <w:rPr>
-                <w:sz w:val="19"/>
-                <w:szCs w:val="19"/>
-              </w:rPr>
-              <w:t xml:space="preserve">no</w:t>
-            </w:r>
-          </w:p>
-        </w:tc>
-        <w:tc>
-          <w:tcPr>
-            <w:tcW w:type="dxa" w:w="5591"/>
-            <w:tcBorders>
-              <w:top w:val="single" w:color="C9D1D9" w:sz="4"/>
-              <w:left w:val="single" w:color="C9D1D9" w:sz="4"/>
-              <w:bottom w:val="single" w:color="C9D1D9" w:sz="4"/>
-              <w:right w:val="single" w:color="C9D1D9" w:sz="4"/>
-            </w:tcBorders>
-            <w:tcMar>
-              <w:top w:type="dxa" w:w="60"/>
-              <w:left w:type="dxa" w:w="100"/>
-              <w:bottom w:type="dxa" w:w="60"/>
-              <w:right w:type="dxa" w:w="100"/>
-            </w:tcMar>
-          </w:tcPr>
-          <w:p>
-            <w:pPr>
-              <w:spacing w:after="40" w:line="252"/>
-            </w:pPr>
-            <w:r>
-              <w:rPr>
-                <w:sz w:val="19"/>
-                <w:szCs w:val="19"/>
-              </w:rPr>
-              <w:t xml:space="preserve">The server could not make this voice. Use the browser voice or captions only.</w:t>
-            </w:r>
-          </w:p>
-        </w:tc>
-      </w:tr>
-      <w:tr>
-        <w:tc>
-          <w:tcPr>
-            <w:tcW w:type="dxa" w:w="2698"/>
-            <w:tcBorders>
-              <w:top w:val="single" w:color="C9D1D9" w:sz="4"/>
-              <w:left w:val="single" w:color="C9D1D9" w:sz="4"/>
-              <w:bottom w:val="single" w:color="C9D1D9" w:sz="4"/>
-              <w:right w:val="single" w:color="C9D1D9" w:sz="4"/>
-            </w:tcBorders>
-            <w:tcMar>
-              <w:top w:type="dxa" w:w="60"/>
-              <w:left w:type="dxa" w:w="100"/>
-              <w:bottom w:type="dxa" w:w="60"/>
-              <w:right w:type="dxa" w:w="100"/>
-            </w:tcMar>
-          </w:tcPr>
-          <w:p>
-            <w:pPr>
-              <w:spacing w:after="40" w:line="252"/>
-            </w:pPr>
-            <w:r>
-              <w:rPr>
-                <w:rFonts w:ascii="Consolas" w:cs="Consolas" w:eastAsia="Consolas" w:hAnsi="Consolas"/>
-                <w:color w:val="24292F"/>
-                <w:sz w:val="19"/>
-                <w:szCs w:val="19"/>
-              </w:rPr>
-              <w:t xml:space="preserve">internal_error</w:t>
-            </w:r>
-          </w:p>
-        </w:tc>
-        <w:tc>
-          <w:tcPr>
-            <w:tcW w:type="dxa" w:w="1349"/>
-            <w:tcBorders>
-              <w:top w:val="single" w:color="C9D1D9" w:sz="4"/>
-              <w:left w:val="single" w:color="C9D1D9" w:sz="4"/>
-              <w:bottom w:val="single" w:color="C9D1D9" w:sz="4"/>
-              <w:right w:val="single" w:color="C9D1D9" w:sz="4"/>
-            </w:tcBorders>
-            <w:tcMar>
-              <w:top w:type="dxa" w:w="60"/>
-              <w:left w:type="dxa" w:w="100"/>
-              <w:bottom w:type="dxa" w:w="60"/>
-              <w:right w:type="dxa" w:w="100"/>
-            </w:tcMar>
-          </w:tcPr>
-          <w:p>
-            <w:pPr>
-              <w:spacing w:after="40" w:line="252"/>
-            </w:pPr>
-            <w:r>
-              <w:rPr>
-                <w:sz w:val="19"/>
-                <w:szCs w:val="19"/>
-              </w:rPr>
-              <w:t xml:space="preserve">yes</w:t>
-            </w:r>
-          </w:p>
-        </w:tc>
-        <w:tc>
-          <w:tcPr>
-            <w:tcW w:type="dxa" w:w="5591"/>
-            <w:tcBorders>
-              <w:top w:val="single" w:color="C9D1D9" w:sz="4"/>
-              <w:left w:val="single" w:color="C9D1D9" w:sz="4"/>
-              <w:bottom w:val="single" w:color="C9D1D9" w:sz="4"/>
-              <w:right w:val="single" w:color="C9D1D9" w:sz="4"/>
-            </w:tcBorders>
-            <w:tcMar>
-              <w:top w:type="dxa" w:w="60"/>
-              <w:left w:type="dxa" w:w="100"/>
-              <w:bottom w:type="dxa" w:w="60"/>
-              <w:right w:type="dxa" w:w="100"/>
-            </w:tcMar>
-          </w:tcPr>
-          <w:p>
-            <w:pPr>
-              <w:spacing w:after="40" w:line="252"/>
-            </w:pPr>
-            <w:r>
-              <w:rPr>
-                <w:sz w:val="19"/>
-                <w:szCs w:val="19"/>
-              </w:rPr>
-              <w:t xml:space="preserve">Unexpected server error. Details are in the backend log only. The socket then closes with 1011.</w:t>
+              <w:t xml:space="preserve">Unexpected server error. Details are in the backend log only.</w:t>
             </w:r>
           </w:p>
         </w:tc>
@@ -12203,7 +11533,7 @@
         <w:t xml:space="preserve">src/features/consent/ConsentScreen.tsx</w:t>
       </w:r>
       <w:r>
-        <w:t xml:space="preserve">: a short explanation (the microphone is used only while a talk button is on; audio is sent to an online service to be transcribed and translated), two participant cards (name and preferred language, defaults "Person A"/English and "Person B"/Telugu), a checkbox "Both people agree", and a Start button that stays disabled until everything is valid. Start calls </w:t>
+        <w:t xml:space="preserve">: a short explanation (the microphone listens only while the conversation is open; audio is sent to an online service to be transcribed and translated), two participant cards (name and preferred language, defaults "Person A"/English and "Person B"/Telugu), a checkbox "Both people agree", and a Start button that stays disabled until everything is valid. Start calls </w:t>
       </w:r>
       <w:r>
         <w:rPr>
@@ -12427,7 +11757,7 @@
         <w:t xml:space="preserve">docs/DECISIONS.md</w:t>
       </w:r>
       <w:r>
-        <w:t xml:space="preserve"> (any language in, listener's language out; free only; tap-to-talk first).</w:t>
+        <w:t xml:space="preserve"> (any language in, listener's language out; free only; hands-free listening).</w:t>
       </w:r>
     </w:p>
     <w:p>
@@ -12651,7 +11981,7 @@
         <w:spacing w:after="120" w:before="280"/>
       </w:pPr>
       <w:r>
-        <w:t xml:space="preserve">Step 1C: Microphone and audio streaming</w:t>
+        <w:t xml:space="preserve">Step 1C: Hands-free microphone streaming</w:t>
       </w:r>
     </w:p>
     <w:p>
@@ -12666,7 +11996,7 @@
         <w:t xml:space="preserve">Goal:</w:t>
       </w:r>
       <w:r>
-        <w:t xml:space="preserve"> a person presses their talk button, speaks, and the backend receives clean 16 kHz audio for that sentence.</w:t>
+        <w:t xml:space="preserve"> once the conversation starts, the microphone streams continuously and the backend finds each sentence by itself.</w:t>
       </w:r>
     </w:p>
     <w:p>
@@ -12801,7 +12131,7 @@
         <w:t xml:space="preserve">getUserMedia({ audio: { channelCount: 1, echoCancellation: true, noiseSuppression: true, autoGainControl: true } })</w:t>
       </w:r>
       <w:r>
-        <w:t xml:space="preserve">, starts and stops capture, and exposes a level from 0 to 1.</w:t>
+        <w:t xml:space="preserve">, starts when the live channel opens, stops on End, and exposes a level from 0 to 1.</w:t>
       </w:r>
     </w:p>
     <w:p>
@@ -12826,7 +12156,7 @@
         <w:t xml:space="preserve">sendAudio</w:t>
       </w:r>
       <w:r>
-        <w:t xml:space="preserve">.</w:t>
+        <w:t xml:space="preserve">, continuously while listening.</w:t>
       </w:r>
     </w:p>
     <w:p>
@@ -12839,76 +12169,7 @@
         <w:spacing w:after="60" w:line="276"/>
       </w:pPr>
       <w:r>
-        <w:rPr>
-          <w:rFonts w:ascii="Consolas" w:cs="Consolas" w:eastAsia="Consolas" w:hAnsi="Consolas"/>
-          <w:color w:val="24292F"/>
-          <w:sz w:val="19"/>
-          <w:szCs w:val="19"/>
-        </w:rPr>
-        <w:t xml:space="preserve">TalkButton</w:t>
-      </w:r>
-      <w:r>
-        <w:t xml:space="preserve">, one per person: click to start (send </w:t>
-      </w:r>
-      <w:r>
-        <w:rPr>
-          <w:rFonts w:ascii="Consolas" w:cs="Consolas" w:eastAsia="Consolas" w:hAnsi="Consolas"/>
-          <w:color w:val="24292F"/>
-          <w:sz w:val="19"/>
-          <w:szCs w:val="19"/>
-        </w:rPr>
-        <w:t xml:space="preserve">utterance.start</w:t>
-      </w:r>
-      <w:r>
-        <w:t xml:space="preserve"> with a new </w:t>
-      </w:r>
-      <w:r>
-        <w:rPr>
-          <w:rFonts w:ascii="Consolas" w:cs="Consolas" w:eastAsia="Consolas" w:hAnsi="Consolas"/>
-          <w:color w:val="24292F"/>
-          <w:sz w:val="19"/>
-          <w:szCs w:val="19"/>
-        </w:rPr>
-        <w:t xml:space="preserve">crypto.randomUUID()</w:t>
-      </w:r>
-      <w:r>
-        <w:t xml:space="preserve">), click again to stop (send </w:t>
-      </w:r>
-      <w:r>
-        <w:rPr>
-          <w:rFonts w:ascii="Consolas" w:cs="Consolas" w:eastAsia="Consolas" w:hAnsi="Consolas"/>
-          <w:color w:val="24292F"/>
-          <w:sz w:val="19"/>
-          <w:szCs w:val="19"/>
-        </w:rPr>
-        <w:t xml:space="preserve">utterance.end</w:t>
-      </w:r>
-      <w:r>
-        <w:t xml:space="preserve">). Only one button can be active. Stop automatically after 30 s. If an </w:t>
-      </w:r>
-      <w:r>
-        <w:rPr>
-          <w:rFonts w:ascii="Consolas" w:cs="Consolas" w:eastAsia="Consolas" w:hAnsi="Consolas"/>
-          <w:color w:val="24292F"/>
-          <w:sz w:val="19"/>
-          <w:szCs w:val="19"/>
-        </w:rPr>
-        <w:t xml:space="preserve">error</w:t>
-      </w:r>
-      <w:r>
-        <w:t xml:space="preserve"> arrives for the current </w:t>
-      </w:r>
-      <w:r>
-        <w:rPr>
-          <w:rFonts w:ascii="Consolas" w:cs="Consolas" w:eastAsia="Consolas" w:hAnsi="Consolas"/>
-          <w:color w:val="24292F"/>
-          <w:sz w:val="19"/>
-          <w:szCs w:val="19"/>
-        </w:rPr>
-        <w:t xml:space="preserve">utterance_id</w:t>
-      </w:r>
-      <w:r>
-        <w:t xml:space="preserve">, stop sending its audio and reset the button.</w:t>
+        <w:t xml:space="preserve">A listening indicator with a level meter, so people can see the microphone is hearing them. No talk buttons.</w:t>
       </w:r>
     </w:p>
     <w:p>
@@ -12921,7 +12182,7 @@
         <w:spacing w:after="60" w:line="276"/>
       </w:pPr>
       <w:r>
-        <w:t xml:space="preserve">A small level meter next to the active button, so people can see the mic is hearing them.</w:t>
+        <w:t xml:space="preserve">Friendly messages: microphone blocked ("Allow the microphone using the lock icon in the address bar"), no microphone found, and microphone in use by another app.</w:t>
       </w:r>
     </w:p>
     <w:p>
@@ -12934,20 +12195,7 @@
         <w:spacing w:after="60" w:line="276"/>
       </w:pPr>
       <w:r>
-        <w:t xml:space="preserve">Friendly messages: microphone blocked ("Allow the microphone using the lock icon in the address bar"), no microphone found, and microphone in use by another app.</w:t>
-      </w:r>
-    </w:p>
-    <w:p>
-      <w:pPr>
-        <w:pStyle w:val="ListParagraph"/>
-        <w:numPr>
-          <w:ilvl w:val="0"/>
-          <w:numId w:val="8"/>
-        </w:numPr>
-        <w:spacing w:after="60" w:line="276"/>
-      </w:pPr>
-      <w:r>
-        <w:t xml:space="preserve">Show "Received 2.1 s of audio" when </w:t>
+        <w:t xml:space="preserve">Show a pending turn when </w:t>
       </w:r>
       <w:r>
         <w:rPr>
@@ -12959,7 +12207,7 @@
         <w:t xml:space="preserve">utterance.received</w:t>
       </w:r>
       <w:r>
-        <w:t xml:space="preserve"> arrives, and the error message for </w:t>
+        <w:t xml:space="preserve"> arrives and remove it quietly on </w:t>
       </w:r>
       <w:r>
         <w:rPr>
@@ -12968,10 +12216,10 @@
           <w:sz w:val="19"/>
           <w:szCs w:val="19"/>
         </w:rPr>
-        <w:t xml:space="preserve">audio_too_short</w:t>
-      </w:r>
-      <w:r>
-        <w:t xml:space="preserve"> ("No speech was heard"). The received line is a temporary debug aid for the joint test.</w:t>
+        <w:t xml:space="preserve">utterance.ignored</w:t>
+      </w:r>
+      <w:r>
+        <w:t xml:space="preserve">.</w:t>
       </w:r>
     </w:p>
     <w:p>
@@ -12980,7 +12228,7 @@
         <w:spacing w:after="80" w:before="200"/>
       </w:pPr>
       <w:r>
-        <w:t xml:space="preserve">Backend tasks (Developer B, branch 1c-backend): done</w:t>
+        <w:t xml:space="preserve">Backend tasks (Developer B): done</w:t>
       </w:r>
     </w:p>
     <w:p>
@@ -12999,22 +12247,10 @@
           <w:sz w:val="19"/>
           <w:szCs w:val="19"/>
         </w:rPr>
-        <w:t xml:space="preserve">app/services/audio_ingestion/base.py</w:t>
-      </w:r>
-      <w:r>
-        <w:t xml:space="preserve"> (adapter interface) and </w:t>
-      </w:r>
-      <w:r>
-        <w:rPr>
-          <w:rFonts w:ascii="Consolas" w:cs="Consolas" w:eastAsia="Consolas" w:hAnsi="Consolas"/>
-          <w:color w:val="24292F"/>
-          <w:sz w:val="19"/>
-          <w:szCs w:val="19"/>
-        </w:rPr>
-        <w:t xml:space="preserve">microphone.py</w:t>
-      </w:r>
-      <w:r>
-        <w:t xml:space="preserve"> (browser microphone adapter).</w:t>
+        <w:t xml:space="preserve">app/services/audio_ingestion/speech_detector.py</w:t>
+      </w:r>
+      <w:r>
+        <w:t xml:space="preserve">: finds sentences in the continuous audio (start on speech, end after about 1.5 s of silence, split at 30 s, short noises ignored).</w:t>
       </w:r>
     </w:p>
     <w:p>
@@ -13027,8 +12263,112 @@
         <w:spacing w:after="60" w:line="276"/>
       </w:pPr>
       <w:r>
-        <w:t xml:space="preserve">Collect frames per open utterance, enforce the format and the 0.3 s and 30 s limits, and send </w:t>
-      </w:r>
+        <w:t xml:space="preserve">Audio is never written to disk: each sentence is held in memory only until it is translated.</w:t>
+      </w:r>
+    </w:p>
+    <w:p>
+      <w:pPr>
+        <w:pStyle w:val="Heading3"/>
+        <w:spacing w:after="80" w:before="200"/>
+      </w:pPr>
+      <w:r>
+        <w:t xml:space="preserve">Joint test</w:t>
+      </w:r>
+    </w:p>
+    <w:p>
+      <w:pPr>
+        <w:pStyle w:val="ListParagraph"/>
+        <w:numPr>
+          <w:ilvl w:val="0"/>
+          <w:numId w:val="9"/>
+        </w:numPr>
+        <w:spacing w:after="60" w:line="276"/>
+      </w:pPr>
+      <w:r>
+        <w:t xml:space="preserve">Start a conversation and speak a sentence without pressing anything: a pending turn appears after the pause.</w:t>
+      </w:r>
+    </w:p>
+    <w:p>
+      <w:pPr>
+        <w:pStyle w:val="ListParagraph"/>
+        <w:numPr>
+          <w:ilvl w:val="0"/>
+          <w:numId w:val="9"/>
+        </w:numPr>
+        <w:spacing w:after="60" w:line="276"/>
+      </w:pPr>
+      <w:r>
+        <w:t xml:space="preserve">Check the caption text in the browser developer tools (Network, WS, Messages). Garbled or empty text on clear speech means the sample rate conversion is wrong.</w:t>
+      </w:r>
+    </w:p>
+    <w:p>
+      <w:pPr>
+        <w:pStyle w:val="ListParagraph"/>
+        <w:numPr>
+          <w:ilvl w:val="0"/>
+          <w:numId w:val="9"/>
+        </w:numPr>
+        <w:spacing w:after="60" w:line="276"/>
+      </w:pPr>
+      <w:r>
+        <w:t xml:space="preserve">Stay quiet or cough: nothing appears, and listening continues.</w:t>
+      </w:r>
+    </w:p>
+    <w:p>
+      <w:pPr>
+        <w:pStyle w:val="ListParagraph"/>
+        <w:numPr>
+          <w:ilvl w:val="0"/>
+          <w:numId w:val="9"/>
+        </w:numPr>
+        <w:spacing w:after="60" w:line="276"/>
+      </w:pPr>
+      <w:r>
+        <w:t xml:space="preserve">Block the microphone in the browser and check the message. Allow it again and check that listening works.</w:t>
+      </w:r>
+    </w:p>
+    <w:p>
+      <w:pPr>
+        <w:pStyle w:val="Heading2"/>
+        <w:spacing w:after="120" w:before="280"/>
+      </w:pPr>
+      <w:r>
+        <w:t xml:space="preserve">Step 1D: Recognition, language detection and translation</w:t>
+      </w:r>
+    </w:p>
+    <w:p>
+      <w:pPr>
+        <w:spacing w:after="120" w:line="276"/>
+      </w:pPr>
+      <w:r>
+        <w:rPr>
+          <w:b/>
+          <w:bCs/>
+        </w:rPr>
+        <w:t xml:space="preserve">Goal:</w:t>
+      </w:r>
+      <w:r>
+        <w:t xml:space="preserve"> whatever language a person speaks, the other person reads it in their preferred language.</w:t>
+      </w:r>
+    </w:p>
+    <w:p>
+      <w:pPr>
+        <w:pStyle w:val="Heading3"/>
+        <w:spacing w:after="80" w:before="200"/>
+      </w:pPr>
+      <w:r>
+        <w:t xml:space="preserve">Frontend tasks (Developer A, branch 1d-frontend)</w:t>
+      </w:r>
+    </w:p>
+    <w:p>
+      <w:pPr>
+        <w:pStyle w:val="ListParagraph"/>
+        <w:numPr>
+          <w:ilvl w:val="0"/>
+          <w:numId w:val="10"/>
+        </w:numPr>
+        <w:spacing w:after="60" w:line="276"/>
+      </w:pPr>
       <w:r>
         <w:rPr>
           <w:rFonts w:ascii="Consolas" w:cs="Consolas" w:eastAsia="Consolas" w:hAnsi="Consolas"/>
@@ -13036,10 +12376,214 @@
           <w:sz w:val="19"/>
           <w:szCs w:val="19"/>
         </w:rPr>
+        <w:t xml:space="preserve">src/features/live-session/conversationStore.ts</w:t>
+      </w:r>
+      <w:r>
+        <w:t xml:space="preserve">: a reducer that builds the list of turns from server messages, keyed by </w:t>
+      </w:r>
+      <w:r>
+        <w:rPr>
+          <w:rFonts w:ascii="Consolas" w:cs="Consolas" w:eastAsia="Consolas" w:hAnsi="Consolas"/>
+          <w:color w:val="24292F"/>
+          <w:sz w:val="19"/>
+          <w:szCs w:val="19"/>
+        </w:rPr>
+        <w:t xml:space="preserve">utterance_id</w:t>
+      </w:r>
+      <w:r>
+        <w:t xml:space="preserve">, in </w:t>
+      </w:r>
+      <w:r>
+        <w:rPr>
+          <w:rFonts w:ascii="Consolas" w:cs="Consolas" w:eastAsia="Consolas" w:hAnsi="Consolas"/>
+          <w:color w:val="24292F"/>
+          <w:sz w:val="19"/>
+          <w:szCs w:val="19"/>
+        </w:rPr>
+        <w:t xml:space="preserve">seq</w:t>
+      </w:r>
+      <w:r>
+        <w:t xml:space="preserve"> order, ignoring duplicates.</w:t>
+      </w:r>
+    </w:p>
+    <w:p>
+      <w:pPr>
+        <w:pStyle w:val="ListParagraph"/>
+        <w:numPr>
+          <w:ilvl w:val="0"/>
+          <w:numId w:val="10"/>
+        </w:numPr>
+        <w:spacing w:after="60" w:line="276"/>
+      </w:pPr>
+      <w:r>
+        <w:rPr>
+          <w:rFonts w:ascii="Consolas" w:cs="Consolas" w:eastAsia="Consolas" w:hAnsi="Consolas"/>
+          <w:color w:val="24292F"/>
+          <w:sz w:val="19"/>
+          <w:szCs w:val="19"/>
+        </w:rPr>
+        <w:t xml:space="preserve">SplitView</w:t>
+      </w:r>
+      <w:r>
+        <w:t xml:space="preserve">: two panels, one per person. Each panel shows every turn in that person's preferred language as the main text, with the original underneath in smaller text when it differs.</w:t>
+      </w:r>
+    </w:p>
+    <w:p>
+      <w:pPr>
+        <w:pStyle w:val="ListParagraph"/>
+        <w:numPr>
+          <w:ilvl w:val="0"/>
+          <w:numId w:val="10"/>
+        </w:numPr>
+        <w:spacing w:after="60" w:line="276"/>
+      </w:pPr>
+      <w:r>
+        <w:t xml:space="preserve">Each turn shows the speaker's name (or "Unknown speaker" when </w:t>
+      </w:r>
+      <w:r>
+        <w:rPr>
+          <w:rFonts w:ascii="Consolas" w:cs="Consolas" w:eastAsia="Consolas" w:hAnsi="Consolas"/>
+          <w:color w:val="24292F"/>
+          <w:sz w:val="19"/>
+          <w:szCs w:val="19"/>
+        </w:rPr>
+        <w:t xml:space="preserve">speaker_id</w:t>
+      </w:r>
+      <w:r>
+        <w:t xml:space="preserve"> is null), a language badge such as "Telugu (detected)", and a status: processing (after </w:t>
+      </w:r>
+      <w:r>
+        <w:rPr>
+          <w:rFonts w:ascii="Consolas" w:cs="Consolas" w:eastAsia="Consolas" w:hAnsi="Consolas"/>
+          <w:color w:val="24292F"/>
+          <w:sz w:val="19"/>
+          <w:szCs w:val="19"/>
+        </w:rPr>
         <w:t xml:space="preserve">utterance.received</w:t>
       </w:r>
       <w:r>
-        <w:t xml:space="preserve">.</w:t>
+        <w:t xml:space="preserve">), done, or failed with the error message.</w:t>
+      </w:r>
+    </w:p>
+    <w:p>
+      <w:pPr>
+        <w:pStyle w:val="ListParagraph"/>
+        <w:numPr>
+          <w:ilvl w:val="0"/>
+          <w:numId w:val="10"/>
+        </w:numPr>
+        <w:spacing w:after="60" w:line="276"/>
+      </w:pPr>
+      <w:r>
+        <w:t xml:space="preserve">A person with no </w:t>
+      </w:r>
+      <w:r>
+        <w:rPr>
+          <w:rFonts w:ascii="Consolas" w:cs="Consolas" w:eastAsia="Consolas" w:hAnsi="Consolas"/>
+          <w:color w:val="24292F"/>
+          <w:sz w:val="19"/>
+          <w:szCs w:val="19"/>
+        </w:rPr>
+        <w:t xml:space="preserve">translation.final</w:t>
+      </w:r>
+      <w:r>
+        <w:t xml:space="preserve"> for a turn already understands it: show the original in their panel.</w:t>
+      </w:r>
+    </w:p>
+    <w:p>
+      <w:pPr>
+        <w:pStyle w:val="ListParagraph"/>
+        <w:numPr>
+          <w:ilvl w:val="0"/>
+          <w:numId w:val="10"/>
+        </w:numPr>
+        <w:spacing w:after="60" w:line="276"/>
+      </w:pPr>
+      <w:r>
+        <w:t xml:space="preserve">Fonts: include </w:t>
+      </w:r>
+      <w:r>
+        <w:rPr>
+          <w:rFonts w:ascii="Consolas" w:cs="Consolas" w:eastAsia="Consolas" w:hAnsi="Consolas"/>
+          <w:color w:val="24292F"/>
+          <w:sz w:val="19"/>
+          <w:szCs w:val="19"/>
+        </w:rPr>
+        <w:t xml:space="preserve">"Nirmala UI"</w:t>
+      </w:r>
+      <w:r>
+        <w:t xml:space="preserve"> (Windows) and </w:t>
+      </w:r>
+      <w:r>
+        <w:rPr>
+          <w:rFonts w:ascii="Consolas" w:cs="Consolas" w:eastAsia="Consolas" w:hAnsi="Consolas"/>
+          <w:color w:val="24292F"/>
+          <w:sz w:val="19"/>
+          <w:szCs w:val="19"/>
+        </w:rPr>
+        <w:t xml:space="preserve">"Noto Sans"</w:t>
+      </w:r>
+      <w:r>
+        <w:t xml:space="preserve"> in the font list so Indian scripts display correctly.</w:t>
+      </w:r>
+    </w:p>
+    <w:p>
+      <w:pPr>
+        <w:pStyle w:val="ListParagraph"/>
+        <w:numPr>
+          <w:ilvl w:val="0"/>
+          <w:numId w:val="10"/>
+        </w:numPr>
+        <w:spacing w:after="60" w:line="276"/>
+      </w:pPr>
+      <w:r>
+        <w:t xml:space="preserve">Before the backend is ready, build against mock events: </w:t>
+      </w:r>
+      <w:r>
+        <w:rPr>
+          <w:rFonts w:ascii="Consolas" w:cs="Consolas" w:eastAsia="Consolas" w:hAnsi="Consolas"/>
+          <w:color w:val="24292F"/>
+          <w:sz w:val="19"/>
+          <w:szCs w:val="19"/>
+        </w:rPr>
+        <w:t xml:space="preserve">src/dev/mockEvents.ts</w:t>
+      </w:r>
+      <w:r>
+        <w:t xml:space="preserve"> with the example exchange from section 8.6, enabled with </w:t>
+      </w:r>
+      <w:r>
+        <w:rPr>
+          <w:rFonts w:ascii="Consolas" w:cs="Consolas" w:eastAsia="Consolas" w:hAnsi="Consolas"/>
+          <w:color w:val="24292F"/>
+          <w:sz w:val="19"/>
+          <w:szCs w:val="19"/>
+        </w:rPr>
+        <w:t xml:space="preserve">?mock=1</w:t>
+      </w:r>
+      <w:r>
+        <w:t xml:space="preserve"> in the address.</w:t>
+      </w:r>
+    </w:p>
+    <w:p>
+      <w:pPr>
+        <w:pStyle w:val="ListParagraph"/>
+        <w:numPr>
+          <w:ilvl w:val="0"/>
+          <w:numId w:val="10"/>
+        </w:numPr>
+        <w:spacing w:after="60" w:line="276"/>
+      </w:pPr>
+      <w:r>
+        <w:t xml:space="preserve">Tests for the reducer: ordering, duplicates, errors, ignored sentences, and turns with zero, one or two translations.</w:t>
+      </w:r>
+    </w:p>
+    <w:p>
+      <w:pPr>
+        <w:pStyle w:val="Heading3"/>
+        <w:spacing w:after="80" w:before="200"/>
+      </w:pPr>
+      <w:r>
+        <w:t xml:space="preserve">Backend tasks (Developer B, branch 1d-backend)</w:t>
       </w:r>
     </w:p>
     <w:p>
@@ -13052,7 +12596,7 @@
         <w:spacing w:after="60" w:line="276"/>
       </w:pPr>
       <w:r>
-        <w:t xml:space="preserve">Audio is never written to disk: each utterance is held in memory only until it is translated.</w:t>
+        <w:t xml:space="preserve">Benchmark the free options (Gemini API free tier and local Whisper) with about 20 recorded sentences each in Telugu, English and Hindi. Record accuracy and time per sentence, check current free-tier limits, then choose.</w:t>
       </w:r>
     </w:p>
     <w:p>
@@ -13065,110 +12609,16 @@
         <w:spacing w:after="60" w:line="276"/>
       </w:pPr>
       <w:r>
-        <w:t xml:space="preserve">Tests with recorded audio fixtures instead of a live microphone.</w:t>
-      </w:r>
-    </w:p>
-    <w:p>
-      <w:pPr>
-        <w:pStyle w:val="Heading3"/>
-        <w:spacing w:after="80" w:before="200"/>
-      </w:pPr>
-      <w:r>
-        <w:t xml:space="preserve">Joint test</w:t>
-      </w:r>
-    </w:p>
-    <w:p>
-      <w:pPr>
-        <w:pStyle w:val="ListParagraph"/>
-        <w:numPr>
-          <w:ilvl w:val="0"/>
-          <w:numId w:val="9"/>
-        </w:numPr>
-        <w:spacing w:after="60" w:line="276"/>
-      </w:pPr>
-      <w:r>
-        <w:t xml:space="preserve">Each person presses their button and says one sentence.</w:t>
-      </w:r>
-    </w:p>
-    <w:p>
-      <w:pPr>
-        <w:pStyle w:val="ListParagraph"/>
-        <w:numPr>
-          <w:ilvl w:val="0"/>
-          <w:numId w:val="9"/>
-        </w:numPr>
-        <w:spacing w:after="60" w:line="276"/>
-      </w:pPr>
-      <w:r>
-        <w:t xml:space="preserve">Speak a clear sentence and check its caption text in the browser developer tools (Network, WS, Messages). Garbled or empty text on clear speech means the sample rate conversion is wrong.</w:t>
-      </w:r>
-    </w:p>
-    <w:p>
-      <w:pPr>
-        <w:pStyle w:val="ListParagraph"/>
-        <w:numPr>
-          <w:ilvl w:val="0"/>
-          <w:numId w:val="9"/>
-        </w:numPr>
-        <w:spacing w:after="60" w:line="276"/>
-      </w:pPr>
-      <w:r>
-        <w:t xml:space="preserve">Block the microphone in the browser and check the message. Allow it again and check that recording works.</w:t>
-      </w:r>
-    </w:p>
-    <w:p>
-      <w:pPr>
-        <w:pStyle w:val="Heading2"/>
-        <w:spacing w:after="120" w:before="280"/>
-      </w:pPr>
-      <w:r>
-        <w:t xml:space="preserve">Step 1D: Recognition, language detection and translation</w:t>
-      </w:r>
-    </w:p>
-    <w:p>
-      <w:pPr>
-        <w:spacing w:after="120" w:line="276"/>
-      </w:pPr>
-      <w:r>
-        <w:rPr>
-          <w:b/>
-          <w:bCs/>
-        </w:rPr>
-        <w:t xml:space="preserve">Goal:</w:t>
-      </w:r>
-      <w:r>
-        <w:t xml:space="preserve"> whatever language a person speaks, the other person reads it in their preferred language.</w:t>
-      </w:r>
-    </w:p>
-    <w:p>
-      <w:pPr>
-        <w:pStyle w:val="Heading3"/>
-        <w:spacing w:after="80" w:before="200"/>
-      </w:pPr>
-      <w:r>
-        <w:t xml:space="preserve">Frontend tasks (Developer A, branch 1d-frontend)</w:t>
-      </w:r>
-    </w:p>
-    <w:p>
-      <w:pPr>
-        <w:pStyle w:val="ListParagraph"/>
-        <w:numPr>
-          <w:ilvl w:val="0"/>
-          <w:numId w:val="10"/>
-        </w:numPr>
-        <w:spacing w:after="60" w:line="276"/>
-      </w:pPr>
-      <w:r>
         <w:rPr>
           <w:rFonts w:ascii="Consolas" w:cs="Consolas" w:eastAsia="Consolas" w:hAnsi="Consolas"/>
           <w:color w:val="24292F"/>
           <w:sz w:val="19"/>
           <w:szCs w:val="19"/>
         </w:rPr>
-        <w:t xml:space="preserve">src/features/live-session/conversationStore.ts</w:t>
-      </w:r>
-      <w:r>
-        <w:t xml:space="preserve">: a reducer that builds the list of turns from server messages, keyed by </w:t>
+        <w:t xml:space="preserve">SpeechToText</w:t>
+      </w:r>
+      <w:r>
+        <w:t xml:space="preserve"> and </w:t>
       </w:r>
       <w:r>
         <w:rPr>
@@ -13177,202 +12627,10 @@
           <w:sz w:val="19"/>
           <w:szCs w:val="19"/>
         </w:rPr>
-        <w:t xml:space="preserve">utterance_id</w:t>
-      </w:r>
-      <w:r>
-        <w:t xml:space="preserve">, in </w:t>
-      </w:r>
-      <w:r>
-        <w:rPr>
-          <w:rFonts w:ascii="Consolas" w:cs="Consolas" w:eastAsia="Consolas" w:hAnsi="Consolas"/>
-          <w:color w:val="24292F"/>
-          <w:sz w:val="19"/>
-          <w:szCs w:val="19"/>
-        </w:rPr>
-        <w:t xml:space="preserve">seq</w:t>
-      </w:r>
-      <w:r>
-        <w:t xml:space="preserve"> order, ignoring duplicates.</w:t>
-      </w:r>
-    </w:p>
-    <w:p>
-      <w:pPr>
-        <w:pStyle w:val="ListParagraph"/>
-        <w:numPr>
-          <w:ilvl w:val="0"/>
-          <w:numId w:val="10"/>
-        </w:numPr>
-        <w:spacing w:after="60" w:line="276"/>
-      </w:pPr>
-      <w:r>
-        <w:rPr>
-          <w:rFonts w:ascii="Consolas" w:cs="Consolas" w:eastAsia="Consolas" w:hAnsi="Consolas"/>
-          <w:color w:val="24292F"/>
-          <w:sz w:val="19"/>
-          <w:szCs w:val="19"/>
-        </w:rPr>
-        <w:t xml:space="preserve">SplitView</w:t>
-      </w:r>
-      <w:r>
-        <w:t xml:space="preserve">: two panels, one per person. Each panel shows every turn in that person's preferred language as the main text, with the original underneath in smaller text when it differs.</w:t>
-      </w:r>
-    </w:p>
-    <w:p>
-      <w:pPr>
-        <w:pStyle w:val="ListParagraph"/>
-        <w:numPr>
-          <w:ilvl w:val="0"/>
-          <w:numId w:val="10"/>
-        </w:numPr>
-        <w:spacing w:after="60" w:line="276"/>
-      </w:pPr>
-      <w:r>
-        <w:t xml:space="preserve">Each turn shows the speaker's name, a language badge such as "Telugu (detected)", and a status: processing (between </w:t>
-      </w:r>
-      <w:r>
-        <w:rPr>
-          <w:rFonts w:ascii="Consolas" w:cs="Consolas" w:eastAsia="Consolas" w:hAnsi="Consolas"/>
-          <w:color w:val="24292F"/>
-          <w:sz w:val="19"/>
-          <w:szCs w:val="19"/>
-        </w:rPr>
-        <w:t xml:space="preserve">utterance.end</w:t>
-      </w:r>
-      <w:r>
-        <w:t xml:space="preserve"> and the result), done, or failed with the error message.</w:t>
-      </w:r>
-    </w:p>
-    <w:p>
-      <w:pPr>
-        <w:pStyle w:val="ListParagraph"/>
-        <w:numPr>
-          <w:ilvl w:val="0"/>
-          <w:numId w:val="10"/>
-        </w:numPr>
-        <w:spacing w:after="60" w:line="276"/>
-      </w:pPr>
-      <w:r>
-        <w:t xml:space="preserve">When </w:t>
-      </w:r>
-      <w:r>
-        <w:rPr>
-          <w:rFonts w:ascii="Consolas" w:cs="Consolas" w:eastAsia="Consolas" w:hAnsi="Consolas"/>
-          <w:color w:val="24292F"/>
-          <w:sz w:val="19"/>
-          <w:szCs w:val="19"/>
-        </w:rPr>
-        <w:t xml:space="preserve">translated</w:t>
-      </w:r>
-      <w:r>
-        <w:t xml:space="preserve"> is false, show the original once with a small note "already in your language".</w:t>
-      </w:r>
-    </w:p>
-    <w:p>
-      <w:pPr>
-        <w:pStyle w:val="ListParagraph"/>
-        <w:numPr>
-          <w:ilvl w:val="0"/>
-          <w:numId w:val="10"/>
-        </w:numPr>
-        <w:spacing w:after="60" w:line="276"/>
-      </w:pPr>
-      <w:r>
-        <w:t xml:space="preserve">Fonts: include </w:t>
-      </w:r>
-      <w:r>
-        <w:rPr>
-          <w:rFonts w:ascii="Consolas" w:cs="Consolas" w:eastAsia="Consolas" w:hAnsi="Consolas"/>
-          <w:color w:val="24292F"/>
-          <w:sz w:val="19"/>
-          <w:szCs w:val="19"/>
-        </w:rPr>
-        <w:t xml:space="preserve">"Nirmala UI"</w:t>
-      </w:r>
-      <w:r>
-        <w:t xml:space="preserve"> (Windows) and </w:t>
-      </w:r>
-      <w:r>
-        <w:rPr>
-          <w:rFonts w:ascii="Consolas" w:cs="Consolas" w:eastAsia="Consolas" w:hAnsi="Consolas"/>
-          <w:color w:val="24292F"/>
-          <w:sz w:val="19"/>
-          <w:szCs w:val="19"/>
-        </w:rPr>
-        <w:t xml:space="preserve">"Noto Sans"</w:t>
-      </w:r>
-      <w:r>
-        <w:t xml:space="preserve"> in the font list so Indian scripts display correctly.</w:t>
-      </w:r>
-    </w:p>
-    <w:p>
-      <w:pPr>
-        <w:pStyle w:val="ListParagraph"/>
-        <w:numPr>
-          <w:ilvl w:val="0"/>
-          <w:numId w:val="10"/>
-        </w:numPr>
-        <w:spacing w:after="60" w:line="276"/>
-      </w:pPr>
-      <w:r>
-        <w:t xml:space="preserve">Before the backend is ready, build against mock events: </w:t>
-      </w:r>
-      <w:r>
-        <w:rPr>
-          <w:rFonts w:ascii="Consolas" w:cs="Consolas" w:eastAsia="Consolas" w:hAnsi="Consolas"/>
-          <w:color w:val="24292F"/>
-          <w:sz w:val="19"/>
-          <w:szCs w:val="19"/>
-        </w:rPr>
-        <w:t xml:space="preserve">src/dev/mockEvents.ts</w:t>
-      </w:r>
-      <w:r>
-        <w:t xml:space="preserve"> with the example exchange from section 8.6, enabled with </w:t>
-      </w:r>
-      <w:r>
-        <w:rPr>
-          <w:rFonts w:ascii="Consolas" w:cs="Consolas" w:eastAsia="Consolas" w:hAnsi="Consolas"/>
-          <w:color w:val="24292F"/>
-          <w:sz w:val="19"/>
-          <w:szCs w:val="19"/>
-        </w:rPr>
-        <w:t xml:space="preserve">?mock=1</w:t>
-      </w:r>
-      <w:r>
-        <w:t xml:space="preserve"> in the address.</w:t>
-      </w:r>
-    </w:p>
-    <w:p>
-      <w:pPr>
-        <w:pStyle w:val="ListParagraph"/>
-        <w:numPr>
-          <w:ilvl w:val="0"/>
-          <w:numId w:val="10"/>
-        </w:numPr>
-        <w:spacing w:after="60" w:line="276"/>
-      </w:pPr>
-      <w:r>
-        <w:t xml:space="preserve">Tests for the reducer: ordering, duplicates, errors, and the </w:t>
-      </w:r>
-      <w:r>
-        <w:rPr>
-          <w:rFonts w:ascii="Consolas" w:cs="Consolas" w:eastAsia="Consolas" w:hAnsi="Consolas"/>
-          <w:color w:val="24292F"/>
-          <w:sz w:val="19"/>
-          <w:szCs w:val="19"/>
-        </w:rPr>
-        <w:t xml:space="preserve">translated: false</w:t>
-      </w:r>
-      <w:r>
-        <w:t xml:space="preserve"> case.</w:t>
-      </w:r>
-    </w:p>
-    <w:p>
-      <w:pPr>
-        <w:pStyle w:val="Heading3"/>
-        <w:spacing w:after="80" w:before="200"/>
-      </w:pPr>
-      <w:r>
-        <w:t xml:space="preserve">Backend tasks (Developer B, branch 1d-backend)</w:t>
+        <w:t xml:space="preserve">Translator</w:t>
+      </w:r>
+      <w:r>
+        <w:t xml:space="preserve"> interfaces and the chosen free provider. Prefer one request per sentence (audio in; text, language and translation out) to save free quota.</w:t>
       </w:r>
     </w:p>
     <w:p>
@@ -13385,7 +12643,7 @@
         <w:spacing w:after="60" w:line="276"/>
       </w:pPr>
       <w:r>
-        <w:t xml:space="preserve">Benchmark the free options (Gemini API free tier and local Whisper) with about 20 recorded sentences each in Telugu, English and Hindi. Record accuracy and time per sentence, check current free-tier limits, then choose.</w:t>
+        <w:t xml:space="preserve">One request per sentence returns the transcript and a translation into each person's language; the language heard decides the speaker and listeners.</w:t>
       </w:r>
     </w:p>
     <w:p>
@@ -13398,13 +12656,16 @@
         <w:spacing w:after="60" w:line="276"/>
       </w:pPr>
       <w:r>
+        <w:t xml:space="preserve">Send </w:t>
+      </w:r>
+      <w:r>
         <w:rPr>
           <w:rFonts w:ascii="Consolas" w:cs="Consolas" w:eastAsia="Consolas" w:hAnsi="Consolas"/>
           <w:color w:val="24292F"/>
           <w:sz w:val="19"/>
           <w:szCs w:val="19"/>
         </w:rPr>
-        <w:t xml:space="preserve">SpeechToText</w:t>
+        <w:t xml:space="preserve">transcript.final</w:t>
       </w:r>
       <w:r>
         <w:t xml:space="preserve"> and </w:t>
@@ -13416,10 +12677,34 @@
           <w:sz w:val="19"/>
           <w:szCs w:val="19"/>
         </w:rPr>
-        <w:t xml:space="preserve">Translator</w:t>
-      </w:r>
-      <w:r>
-        <w:t xml:space="preserve"> interfaces and the chosen free provider. Prefer one request per sentence (audio in; text, language and translation out) to save free quota.</w:t>
+        <w:t xml:space="preserve">translation.final</w:t>
+      </w:r>
+      <w:r>
+        <w:t xml:space="preserve">, or errors such as </w:t>
+      </w:r>
+      <w:r>
+        <w:rPr>
+          <w:rFonts w:ascii="Consolas" w:cs="Consolas" w:eastAsia="Consolas" w:hAnsi="Consolas"/>
+          <w:color w:val="24292F"/>
+          <w:sz w:val="19"/>
+          <w:szCs w:val="19"/>
+        </w:rPr>
+        <w:t xml:space="preserve">provider_unavailable</w:t>
+      </w:r>
+      <w:r>
+        <w:t xml:space="preserve"> and </w:t>
+      </w:r>
+      <w:r>
+        <w:rPr>
+          <w:rFonts w:ascii="Consolas" w:cs="Consolas" w:eastAsia="Consolas" w:hAnsi="Consolas"/>
+          <w:color w:val="24292F"/>
+          <w:sz w:val="19"/>
+          <w:szCs w:val="19"/>
+        </w:rPr>
+        <w:t xml:space="preserve">quota_exceeded</w:t>
+      </w:r>
+      <w:r>
+        <w:t xml:space="preserve">.</w:t>
       </w:r>
     </w:p>
     <w:p>
@@ -13432,92 +12717,6 @@
         <w:spacing w:after="60" w:line="276"/>
       </w:pPr>
       <w:r>
-        <w:t xml:space="preserve">Target language = the other participant's preferred language. Skip translation when it already matches. Respect </w:t>
-      </w:r>
-      <w:r>
-        <w:rPr>
-          <w:rFonts w:ascii="Consolas" w:cs="Consolas" w:eastAsia="Consolas" w:hAnsi="Consolas"/>
-          <w:color w:val="24292F"/>
-          <w:sz w:val="19"/>
-          <w:szCs w:val="19"/>
-        </w:rPr>
-        <w:t xml:space="preserve">spoken_language</w:t>
-      </w:r>
-      <w:r>
-        <w:t xml:space="preserve"> when it is set.</w:t>
-      </w:r>
-    </w:p>
-    <w:p>
-      <w:pPr>
-        <w:pStyle w:val="ListParagraph"/>
-        <w:numPr>
-          <w:ilvl w:val="0"/>
-          <w:numId w:val="2"/>
-        </w:numPr>
-        <w:spacing w:after="60" w:line="276"/>
-      </w:pPr>
-      <w:r>
-        <w:t xml:space="preserve">Send </w:t>
-      </w:r>
-      <w:r>
-        <w:rPr>
-          <w:rFonts w:ascii="Consolas" w:cs="Consolas" w:eastAsia="Consolas" w:hAnsi="Consolas"/>
-          <w:color w:val="24292F"/>
-          <w:sz w:val="19"/>
-          <w:szCs w:val="19"/>
-        </w:rPr>
-        <w:t xml:space="preserve">transcript.final</w:t>
-      </w:r>
-      <w:r>
-        <w:t xml:space="preserve"> and </w:t>
-      </w:r>
-      <w:r>
-        <w:rPr>
-          <w:rFonts w:ascii="Consolas" w:cs="Consolas" w:eastAsia="Consolas" w:hAnsi="Consolas"/>
-          <w:color w:val="24292F"/>
-          <w:sz w:val="19"/>
-          <w:szCs w:val="19"/>
-        </w:rPr>
-        <w:t xml:space="preserve">translation.final</w:t>
-      </w:r>
-      <w:r>
-        <w:t xml:space="preserve">, or errors such as </w:t>
-      </w:r>
-      <w:r>
-        <w:rPr>
-          <w:rFonts w:ascii="Consolas" w:cs="Consolas" w:eastAsia="Consolas" w:hAnsi="Consolas"/>
-          <w:color w:val="24292F"/>
-          <w:sz w:val="19"/>
-          <w:szCs w:val="19"/>
-        </w:rPr>
-        <w:t xml:space="preserve">provider_unavailable</w:t>
-      </w:r>
-      <w:r>
-        <w:t xml:space="preserve"> and </w:t>
-      </w:r>
-      <w:r>
-        <w:rPr>
-          <w:rFonts w:ascii="Consolas" w:cs="Consolas" w:eastAsia="Consolas" w:hAnsi="Consolas"/>
-          <w:color w:val="24292F"/>
-          <w:sz w:val="19"/>
-          <w:szCs w:val="19"/>
-        </w:rPr>
-        <w:t xml:space="preserve">quota_exceeded</w:t>
-      </w:r>
-      <w:r>
-        <w:t xml:space="preserve">.</w:t>
-      </w:r>
-    </w:p>
-    <w:p>
-      <w:pPr>
-        <w:pStyle w:val="ListParagraph"/>
-        <w:numPr>
-          <w:ilvl w:val="0"/>
-          <w:numId w:val="2"/>
-        </w:numPr>
-        <w:spacing w:after="60" w:line="276"/>
-      </w:pPr>
-      <w:r>
         <w:t xml:space="preserve">Tests with a fake provider, so tests never call the real service or use the quota.</w:t>
       </w:r>
     </w:p>
@@ -13579,7 +12778,7 @@
         <w:spacing w:after="60" w:line="276"/>
       </w:pPr>
       <w:r>
-        <w:t xml:space="preserve">Speaking the listener's own language shows the original with "already in your language".</w:t>
+        <w:t xml:space="preserve">Noise or coughing is ignored and listening continues.</w:t>
       </w:r>
     </w:p>
     <w:p>
@@ -13781,7 +12980,19 @@
         <w:spacing w:after="60" w:line="276"/>
       </w:pPr>
       <w:r>
-        <w:t xml:space="preserve">While a voice is playing, disable both talk buttons and send no audio frames, so the translation is not recorded again.</w:t>
+        <w:t xml:space="preserve">While a voice is playing, send </w:t>
+      </w:r>
+      <w:r>
+        <w:rPr>
+          <w:rFonts w:ascii="Consolas" w:cs="Consolas" w:eastAsia="Consolas" w:hAnsi="Consolas"/>
+          <w:color w:val="24292F"/>
+          <w:sz w:val="19"/>
+          <w:szCs w:val="19"/>
+        </w:rPr>
+        <w:t xml:space="preserve">audio.pause</w:t>
+      </w:r>
+      <w:r>
+        <w:t xml:space="preserve"> and no audio frames, so the translation is not heard again; resume streaming when playback ends.</w:t>
       </w:r>
     </w:p>
     <w:p>
@@ -14306,7 +13517,7 @@
                 <w:sz w:val="19"/>
                 <w:szCs w:val="19"/>
               </w:rPr>
-              <w:t xml:space="preserve">2B Hands-free</w:t>
+              <w:t xml:space="preserve">2B Two devices (open decision)</w:t>
             </w:r>
           </w:p>
         </w:tc>
@@ -14335,7 +13546,7 @@
                 <w:sz w:val="19"/>
                 <w:szCs w:val="19"/>
               </w:rPr>
-              <w:t xml:space="preserve">Hands-free toggle; who-is-speaking indicator</w:t>
+              <w:t xml:space="preserve">Each person joins from their own device</w:t>
             </w:r>
           </w:p>
         </w:tc>
@@ -14364,7 +13575,7 @@
                 <w:sz w:val="19"/>
                 <w:szCs w:val="19"/>
               </w:rPr>
-              <w:t xml:space="preserve">Detected language decides the direction when the two languages differ</w:t>
+              <w:t xml:space="preserve">Speaker known from the device</w:t>
             </w:r>
           </w:p>
         </w:tc>
@@ -14393,7 +13604,7 @@
                 <w:sz w:val="19"/>
                 <w:szCs w:val="19"/>
               </w:rPr>
-              <w:t xml:space="preserve">A conversation works without tapping</w:t>
+              <w:t xml:space="preserve">Works even when both people choose the same language</w:t>
             </w:r>
           </w:p>
         </w:tc>
@@ -15090,7 +14301,7 @@
           <w:sz w:val="18"/>
           <w:szCs w:val="18"/>
         </w:rPr>
-        <w:t xml:space="preserve">│       │   ├── live-session/          SplitView, TalkButton, conversationStore</w:t>
+        <w:t xml:space="preserve">│       │   ├── live-session/          SplitView, ListeningIndicator, conversationStore</w:t>
       </w:r>
     </w:p>
     <w:p>

</xml_diff>

<commit_message>
Revert "Revert "Hands free""
</commit_message>
<xml_diff>
--- a/docs/DEVELOPER-HANDBOOK.docx
+++ b/docs/DEVELOPER-HANDBOOK.docx
@@ -230,7 +230,7 @@
                 <w:sz w:val="19"/>
                 <w:szCs w:val="19"/>
               </w:rPr>
-              <w:t xml:space="preserve">1.3, 18 October 2026 (aligned with docs/PROTOCOL.md during Step 1E)</w:t>
+              <w:t xml:space="preserve">1.4, 18 October 2026 (aligned with docs/PROTOCOL.md v2, hands-free)</w:t>
             </w:r>
           </w:p>
         </w:tc>
@@ -1260,10 +1260,10 @@
           <w:b/>
           <w:bCs/>
         </w:rPr>
-        <w:t xml:space="preserve">Tap-to-talk first.</w:t>
-      </w:r>
-      <w:r>
-        <w:t xml:space="preserve"> Each person has their own talk button, so the app always knows who is speaking. Hands-free mode comes in Phase 2.</w:t>
+        <w:t xml:space="preserve">Hands-free.</w:t>
+      </w:r>
+      <w:r>
+        <w:t xml:space="preserve"> No talk buttons: the app listens continuously, finds each sentence by itself, and the language heard decides who spoke.</w:t>
       </w:r>
     </w:p>
     <w:p>
@@ -1586,7 +1586,7 @@
                 <w:sz w:val="19"/>
                 <w:szCs w:val="19"/>
               </w:rPr>
-              <w:t xml:space="preserve">Consent and language screens, microphone capture, talk buttons, captions, voice playback and, if decided, transcript download. Opens a pull request for every step.</w:t>
+              <w:t xml:space="preserve">Consent and language screens, hands-free microphone capture, captions, voice playback and, if decided, transcript download. Opens a pull request for every step.</w:t>
             </w:r>
           </w:p>
         </w:tc>
@@ -2482,7 +2482,7 @@
                 <w:sz w:val="19"/>
                 <w:szCs w:val="19"/>
               </w:rPr>
-              <w:t xml:space="preserve">Microphone capture and talk buttons</w:t>
+              <w:t xml:space="preserve">Hands-free microphone capture</w:t>
             </w:r>
           </w:p>
         </w:tc>
@@ -4105,7 +4105,7 @@
           <w:sz w:val="19"/>
           <w:szCs w:val="19"/>
         </w:rPr>
-        <w:t xml:space="preserve">{"status":"ok","version":"0.5.0"}</w:t>
+        <w:t xml:space="preserve">{"status":"ok","version":"0.6.0"}</w:t>
       </w:r>
       <w:r>
         <w:t xml:space="preserve">.</w:t>
@@ -6550,7 +6550,7 @@
                 <w:sz w:val="19"/>
                 <w:szCs w:val="19"/>
               </w:rPr>
-              <w:t xml:space="preserve">{"status":"ok","version":"0.5.0"}</w:t>
+              <w:t xml:space="preserve">{"status":"ok","version":"0.6.0"}</w:t>
             </w:r>
             <w:r>
               <w:rPr>
@@ -7525,8 +7525,8 @@
       <w:tblGrid>
         <w:gridCol w:w="2120"/>
         <w:gridCol w:w="578"/>
-        <w:gridCol w:w="3855"/>
-        <w:gridCol w:w="3085"/>
+        <w:gridCol w:w="2891"/>
+        <w:gridCol w:w="4049"/>
       </w:tblGrid>
       <w:tr>
         <w:trPr>
@@ -7598,7 +7598,7 @@
         </w:tc>
         <w:tc>
           <w:tcPr>
-            <w:tcW w:type="dxa" w:w="3855"/>
+            <w:tcW w:type="dxa" w:w="2891"/>
             <w:tcBorders>
               <w:top w:val="single" w:color="C9D1D9" w:sz="4"/>
               <w:left w:val="single" w:color="C9D1D9" w:sz="4"/>
@@ -7630,7 +7630,7 @@
         </w:tc>
         <w:tc>
           <w:tcPr>
-            <w:tcW w:type="dxa" w:w="3085"/>
+            <w:tcW w:type="dxa" w:w="4049"/>
             <w:tcBorders>
               <w:top w:val="single" w:color="C9D1D9" w:sz="4"/>
               <w:left w:val="single" w:color="C9D1D9" w:sz="4"/>
@@ -7684,12 +7684,130 @@
             </w:pPr>
             <w:r>
               <w:rPr>
+                <w:sz w:val="19"/>
+                <w:szCs w:val="19"/>
+              </w:rPr>
+              <w:t xml:space="preserve">(binary audio frame)</w:t>
+            </w:r>
+          </w:p>
+        </w:tc>
+        <w:tc>
+          <w:tcPr>
+            <w:tcW w:type="dxa" w:w="578"/>
+            <w:tcBorders>
+              <w:top w:val="single" w:color="C9D1D9" w:sz="4"/>
+              <w:left w:val="single" w:color="C9D1D9" w:sz="4"/>
+              <w:bottom w:val="single" w:color="C9D1D9" w:sz="4"/>
+              <w:right w:val="single" w:color="C9D1D9" w:sz="4"/>
+            </w:tcBorders>
+            <w:tcMar>
+              <w:top w:type="dxa" w:w="60"/>
+              <w:left w:type="dxa" w:w="100"/>
+              <w:bottom w:type="dxa" w:w="60"/>
+              <w:right w:type="dxa" w:w="100"/>
+            </w:tcMar>
+          </w:tcPr>
+          <w:p>
+            <w:pPr>
+              <w:spacing w:after="40" w:line="252"/>
+            </w:pPr>
+            <w:r>
+              <w:rPr>
+                <w:sz w:val="19"/>
+                <w:szCs w:val="19"/>
+              </w:rPr>
+              <w:t xml:space="preserve">1C</w:t>
+            </w:r>
+          </w:p>
+        </w:tc>
+        <w:tc>
+          <w:tcPr>
+            <w:tcW w:type="dxa" w:w="2891"/>
+            <w:tcBorders>
+              <w:top w:val="single" w:color="C9D1D9" w:sz="4"/>
+              <w:left w:val="single" w:color="C9D1D9" w:sz="4"/>
+              <w:bottom w:val="single" w:color="C9D1D9" w:sz="4"/>
+              <w:right w:val="single" w:color="C9D1D9" w:sz="4"/>
+            </w:tcBorders>
+            <w:tcMar>
+              <w:top w:type="dxa" w:w="60"/>
+              <w:left w:type="dxa" w:w="100"/>
+              <w:bottom w:type="dxa" w:w="60"/>
+              <w:right w:type="dxa" w:w="100"/>
+            </w:tcMar>
+          </w:tcPr>
+          <w:p>
+            <w:pPr>
+              <w:spacing w:after="40" w:line="252"/>
+            </w:pPr>
+            <w:r>
+              <w:rPr>
+                <w:sz w:val="19"/>
+                <w:szCs w:val="19"/>
+              </w:rPr>
+              <w:t xml:space="preserve">raw audio bytes (8.4)</w:t>
+            </w:r>
+          </w:p>
+        </w:tc>
+        <w:tc>
+          <w:tcPr>
+            <w:tcW w:type="dxa" w:w="4049"/>
+            <w:tcBorders>
+              <w:top w:val="single" w:color="C9D1D9" w:sz="4"/>
+              <w:left w:val="single" w:color="C9D1D9" w:sz="4"/>
+              <w:bottom w:val="single" w:color="C9D1D9" w:sz="4"/>
+              <w:right w:val="single" w:color="C9D1D9" w:sz="4"/>
+            </w:tcBorders>
+            <w:tcMar>
+              <w:top w:type="dxa" w:w="60"/>
+              <w:left w:type="dxa" w:w="100"/>
+              <w:bottom w:type="dxa" w:w="60"/>
+              <w:right w:type="dxa" w:w="100"/>
+            </w:tcMar>
+          </w:tcPr>
+          <w:p>
+            <w:pPr>
+              <w:spacing w:after="40" w:line="252"/>
+            </w:pPr>
+            <w:r>
+              <w:rPr>
+                <w:sz w:val="19"/>
+                <w:szCs w:val="19"/>
+              </w:rPr>
+              <w:t xml:space="preserve">Microphone audio, sent continuously while listening.</w:t>
+            </w:r>
+          </w:p>
+        </w:tc>
+      </w:tr>
+      <w:tr>
+        <w:tc>
+          <w:tcPr>
+            <w:tcW w:type="dxa" w:w="2120"/>
+            <w:tcBorders>
+              <w:top w:val="single" w:color="C9D1D9" w:sz="4"/>
+              <w:left w:val="single" w:color="C9D1D9" w:sz="4"/>
+              <w:bottom w:val="single" w:color="C9D1D9" w:sz="4"/>
+              <w:right w:val="single" w:color="C9D1D9" w:sz="4"/>
+            </w:tcBorders>
+            <w:tcMar>
+              <w:top w:type="dxa" w:w="60"/>
+              <w:left w:type="dxa" w:w="100"/>
+              <w:bottom w:type="dxa" w:w="60"/>
+              <w:right w:type="dxa" w:w="100"/>
+            </w:tcMar>
+          </w:tcPr>
+          <w:p>
+            <w:pPr>
+              <w:spacing w:after="40" w:line="252"/>
+            </w:pPr>
+            <w:r>
+              <w:rPr>
                 <w:rFonts w:ascii="Consolas" w:cs="Consolas" w:eastAsia="Consolas" w:hAnsi="Consolas"/>
                 <w:color w:val="24292F"/>
                 <w:sz w:val="19"/>
                 <w:szCs w:val="19"/>
               </w:rPr>
-              <w:t xml:space="preserve">ping</w:t>
+              <w:t xml:space="preserve">audio.pause</w:t>
             </w:r>
           </w:p>
         </w:tc>
@@ -7718,13 +7836,13 @@
                 <w:sz w:val="19"/>
                 <w:szCs w:val="19"/>
               </w:rPr>
-              <w:t xml:space="preserve">1B</w:t>
-            </w:r>
-          </w:p>
-        </w:tc>
-        <w:tc>
-          <w:tcPr>
-            <w:tcW w:type="dxa" w:w="3855"/>
+              <w:t xml:space="preserve">1C</w:t>
+            </w:r>
+          </w:p>
+        </w:tc>
+        <w:tc>
+          <w:tcPr>
+            <w:tcW w:type="dxa" w:w="2891"/>
             <w:tcBorders>
               <w:top w:val="single" w:color="C9D1D9" w:sz="4"/>
               <w:left w:val="single" w:color="C9D1D9" w:sz="4"/>
@@ -7753,31 +7871,55 @@
         </w:tc>
         <w:tc>
           <w:tcPr>
-            <w:tcW w:type="dxa" w:w="3085"/>
-            <w:tcBorders>
-              <w:top w:val="single" w:color="C9D1D9" w:sz="4"/>
-              <w:left w:val="single" w:color="C9D1D9" w:sz="4"/>
-              <w:bottom w:val="single" w:color="C9D1D9" w:sz="4"/>
-              <w:right w:val="single" w:color="C9D1D9" w:sz="4"/>
-            </w:tcBorders>
-            <w:tcMar>
-              <w:top w:type="dxa" w:w="60"/>
-              <w:left w:type="dxa" w:w="100"/>
-              <w:bottom w:type="dxa" w:w="60"/>
-              <w:right w:type="dxa" w:w="100"/>
-            </w:tcMar>
-          </w:tcPr>
-          <w:p>
-            <w:pPr>
-              <w:spacing w:after="40" w:line="252"/>
-            </w:pPr>
-            <w:r>
-              <w:rPr>
-                <w:sz w:val="19"/>
-                <w:szCs w:val="19"/>
-              </w:rPr>
-              <w:t xml:space="preserve">Keep-alive check. The server answers </w:t>
-            </w:r>
+            <w:tcW w:type="dxa" w:w="4049"/>
+            <w:tcBorders>
+              <w:top w:val="single" w:color="C9D1D9" w:sz="4"/>
+              <w:left w:val="single" w:color="C9D1D9" w:sz="4"/>
+              <w:bottom w:val="single" w:color="C9D1D9" w:sz="4"/>
+              <w:right w:val="single" w:color="C9D1D9" w:sz="4"/>
+            </w:tcBorders>
+            <w:tcMar>
+              <w:top w:type="dxa" w:w="60"/>
+              <w:left w:type="dxa" w:w="100"/>
+              <w:bottom w:type="dxa" w:w="60"/>
+              <w:right w:type="dxa" w:w="100"/>
+            </w:tcMar>
+          </w:tcPr>
+          <w:p>
+            <w:pPr>
+              <w:spacing w:after="40" w:line="252"/>
+            </w:pPr>
+            <w:r>
+              <w:rPr>
+                <w:sz w:val="19"/>
+                <w:szCs w:val="19"/>
+              </w:rPr>
+              <w:t xml:space="preserve">The browser stopped sending audio (for example while a translation is spoken). Any sentence in progress ends now.</w:t>
+            </w:r>
+          </w:p>
+        </w:tc>
+      </w:tr>
+      <w:tr>
+        <w:tc>
+          <w:tcPr>
+            <w:tcW w:type="dxa" w:w="2120"/>
+            <w:tcBorders>
+              <w:top w:val="single" w:color="C9D1D9" w:sz="4"/>
+              <w:left w:val="single" w:color="C9D1D9" w:sz="4"/>
+              <w:bottom w:val="single" w:color="C9D1D9" w:sz="4"/>
+              <w:right w:val="single" w:color="C9D1D9" w:sz="4"/>
+            </w:tcBorders>
+            <w:tcMar>
+              <w:top w:type="dxa" w:w="60"/>
+              <w:left w:type="dxa" w:w="100"/>
+              <w:bottom w:type="dxa" w:w="60"/>
+              <w:right w:type="dxa" w:w="100"/>
+            </w:tcMar>
+          </w:tcPr>
+          <w:p>
+            <w:pPr>
+              <w:spacing w:after="40" w:line="252"/>
+            </w:pPr>
             <w:r>
               <w:rPr>
                 <w:rFonts w:ascii="Consolas" w:cs="Consolas" w:eastAsia="Consolas" w:hAnsi="Consolas"/>
@@ -7785,6 +7927,102 @@
                 <w:sz w:val="19"/>
                 <w:szCs w:val="19"/>
               </w:rPr>
+              <w:t xml:space="preserve">ping</w:t>
+            </w:r>
+          </w:p>
+        </w:tc>
+        <w:tc>
+          <w:tcPr>
+            <w:tcW w:type="dxa" w:w="578"/>
+            <w:tcBorders>
+              <w:top w:val="single" w:color="C9D1D9" w:sz="4"/>
+              <w:left w:val="single" w:color="C9D1D9" w:sz="4"/>
+              <w:bottom w:val="single" w:color="C9D1D9" w:sz="4"/>
+              <w:right w:val="single" w:color="C9D1D9" w:sz="4"/>
+            </w:tcBorders>
+            <w:tcMar>
+              <w:top w:type="dxa" w:w="60"/>
+              <w:left w:type="dxa" w:w="100"/>
+              <w:bottom w:type="dxa" w:w="60"/>
+              <w:right w:type="dxa" w:w="100"/>
+            </w:tcMar>
+          </w:tcPr>
+          <w:p>
+            <w:pPr>
+              <w:spacing w:after="40" w:line="252"/>
+            </w:pPr>
+            <w:r>
+              <w:rPr>
+                <w:sz w:val="19"/>
+                <w:szCs w:val="19"/>
+              </w:rPr>
+              <w:t xml:space="preserve">1B</w:t>
+            </w:r>
+          </w:p>
+        </w:tc>
+        <w:tc>
+          <w:tcPr>
+            <w:tcW w:type="dxa" w:w="2891"/>
+            <w:tcBorders>
+              <w:top w:val="single" w:color="C9D1D9" w:sz="4"/>
+              <w:left w:val="single" w:color="C9D1D9" w:sz="4"/>
+              <w:bottom w:val="single" w:color="C9D1D9" w:sz="4"/>
+              <w:right w:val="single" w:color="C9D1D9" w:sz="4"/>
+            </w:tcBorders>
+            <w:tcMar>
+              <w:top w:type="dxa" w:w="60"/>
+              <w:left w:type="dxa" w:w="100"/>
+              <w:bottom w:type="dxa" w:w="60"/>
+              <w:right w:type="dxa" w:w="100"/>
+            </w:tcMar>
+          </w:tcPr>
+          <w:p>
+            <w:pPr>
+              <w:spacing w:after="40" w:line="252"/>
+            </w:pPr>
+            <w:r>
+              <w:rPr>
+                <w:sz w:val="19"/>
+                <w:szCs w:val="19"/>
+              </w:rPr>
+              <w:t xml:space="preserve">none</w:t>
+            </w:r>
+          </w:p>
+        </w:tc>
+        <w:tc>
+          <w:tcPr>
+            <w:tcW w:type="dxa" w:w="4049"/>
+            <w:tcBorders>
+              <w:top w:val="single" w:color="C9D1D9" w:sz="4"/>
+              <w:left w:val="single" w:color="C9D1D9" w:sz="4"/>
+              <w:bottom w:val="single" w:color="C9D1D9" w:sz="4"/>
+              <w:right w:val="single" w:color="C9D1D9" w:sz="4"/>
+            </w:tcBorders>
+            <w:tcMar>
+              <w:top w:type="dxa" w:w="60"/>
+              <w:left w:type="dxa" w:w="100"/>
+              <w:bottom w:type="dxa" w:w="60"/>
+              <w:right w:type="dxa" w:w="100"/>
+            </w:tcMar>
+          </w:tcPr>
+          <w:p>
+            <w:pPr>
+              <w:spacing w:after="40" w:line="252"/>
+            </w:pPr>
+            <w:r>
+              <w:rPr>
+                <w:sz w:val="19"/>
+                <w:szCs w:val="19"/>
+              </w:rPr>
+              <w:t xml:space="preserve">Keep-alive check. The server answers </w:t>
+            </w:r>
+            <w:r>
+              <w:rPr>
+                <w:rFonts w:ascii="Consolas" w:cs="Consolas" w:eastAsia="Consolas" w:hAnsi="Consolas"/>
+                <w:color w:val="24292F"/>
+                <w:sz w:val="19"/>
+                <w:szCs w:val="19"/>
+              </w:rPr>
               <w:t xml:space="preserve">pong</w:t>
             </w:r>
             <w:r>
@@ -7825,7 +8063,7 @@
                 <w:sz w:val="19"/>
                 <w:szCs w:val="19"/>
               </w:rPr>
-              <w:t xml:space="preserve">utterance.start</w:t>
+              <w:t xml:space="preserve">session.stop</w:t>
             </w:r>
           </w:p>
         </w:tc>
@@ -7854,430 +8092,13 @@
                 <w:sz w:val="19"/>
                 <w:szCs w:val="19"/>
               </w:rPr>
-              <w:t xml:space="preserve">1C</w:t>
-            </w:r>
-          </w:p>
-        </w:tc>
-        <w:tc>
-          <w:tcPr>
-            <w:tcW w:type="dxa" w:w="3855"/>
-            <w:tcBorders>
-              <w:top w:val="single" w:color="C9D1D9" w:sz="4"/>
-              <w:left w:val="single" w:color="C9D1D9" w:sz="4"/>
-              <w:bottom w:val="single" w:color="C9D1D9" w:sz="4"/>
-              <w:right w:val="single" w:color="C9D1D9" w:sz="4"/>
-            </w:tcBorders>
-            <w:tcMar>
-              <w:top w:type="dxa" w:w="60"/>
-              <w:left w:type="dxa" w:w="100"/>
-              <w:bottom w:type="dxa" w:w="60"/>
-              <w:right w:type="dxa" w:w="100"/>
-            </w:tcMar>
-          </w:tcPr>
-          <w:p>
-            <w:pPr>
-              <w:spacing w:after="40" w:line="252"/>
-            </w:pPr>
-            <w:r>
-              <w:rPr>
-                <w:rFonts w:ascii="Consolas" w:cs="Consolas" w:eastAsia="Consolas" w:hAnsi="Consolas"/>
-                <w:color w:val="24292F"/>
-                <w:sz w:val="19"/>
-                <w:szCs w:val="19"/>
-              </w:rPr>
-              <w:t xml:space="preserve">utterance_id</w:t>
-            </w:r>
-            <w:r>
-              <w:rPr>
-                <w:sz w:val="19"/>
-                <w:szCs w:val="19"/>
-              </w:rPr>
-              <w:t xml:space="preserve"> (standard 36-character UUID from </w:t>
-            </w:r>
-            <w:r>
-              <w:rPr>
-                <w:rFonts w:ascii="Consolas" w:cs="Consolas" w:eastAsia="Consolas" w:hAnsi="Consolas"/>
-                <w:color w:val="24292F"/>
-                <w:sz w:val="19"/>
-                <w:szCs w:val="19"/>
-              </w:rPr>
-              <w:t xml:space="preserve">crypto.randomUUID()</w:t>
-            </w:r>
-            <w:r>
-              <w:rPr>
-                <w:sz w:val="19"/>
-                <w:szCs w:val="19"/>
-              </w:rPr>
-              <w:t xml:space="preserve">), </w:t>
-            </w:r>
-            <w:r>
-              <w:rPr>
-                <w:rFonts w:ascii="Consolas" w:cs="Consolas" w:eastAsia="Consolas" w:hAnsi="Consolas"/>
-                <w:color w:val="24292F"/>
-                <w:sz w:val="19"/>
-                <w:szCs w:val="19"/>
-              </w:rPr>
-              <w:t xml:space="preserve">speaker_id</w:t>
-            </w:r>
-            <w:r>
-              <w:rPr>
-                <w:sz w:val="19"/>
-                <w:szCs w:val="19"/>
-              </w:rPr>
-              <w:t xml:space="preserve"> ("A" or "B"), </w:t>
-            </w:r>
-            <w:r>
-              <w:rPr>
-                <w:rFonts w:ascii="Consolas" w:cs="Consolas" w:eastAsia="Consolas" w:hAnsi="Consolas"/>
-                <w:color w:val="24292F"/>
-                <w:sz w:val="19"/>
-                <w:szCs w:val="19"/>
-              </w:rPr>
-              <w:t xml:space="preserve">spoken_language</w:t>
-            </w:r>
-            <w:r>
-              <w:rPr>
-                <w:sz w:val="19"/>
-                <w:szCs w:val="19"/>
-              </w:rPr>
-              <w:t xml:space="preserve"> (optional code, or null for auto-detect)</w:t>
-            </w:r>
-          </w:p>
-        </w:tc>
-        <w:tc>
-          <w:tcPr>
-            <w:tcW w:type="dxa" w:w="3085"/>
-            <w:tcBorders>
-              <w:top w:val="single" w:color="C9D1D9" w:sz="4"/>
-              <w:left w:val="single" w:color="C9D1D9" w:sz="4"/>
-              <w:bottom w:val="single" w:color="C9D1D9" w:sz="4"/>
-              <w:right w:val="single" w:color="C9D1D9" w:sz="4"/>
-            </w:tcBorders>
-            <w:tcMar>
-              <w:top w:type="dxa" w:w="60"/>
-              <w:left w:type="dxa" w:w="100"/>
-              <w:bottom w:type="dxa" w:w="60"/>
-              <w:right w:type="dxa" w:w="100"/>
-            </w:tcMar>
-          </w:tcPr>
-          <w:p>
-            <w:pPr>
-              <w:spacing w:after="40" w:line="252"/>
-            </w:pPr>
-            <w:r>
-              <w:rPr>
-                <w:sz w:val="19"/>
-                <w:szCs w:val="19"/>
-              </w:rPr>
-              <w:t xml:space="preserve">A person pressed their talk button. Audio frames follow.</w:t>
-            </w:r>
-          </w:p>
-        </w:tc>
-      </w:tr>
-      <w:tr>
-        <w:tc>
-          <w:tcPr>
-            <w:tcW w:type="dxa" w:w="2120"/>
-            <w:tcBorders>
-              <w:top w:val="single" w:color="C9D1D9" w:sz="4"/>
-              <w:left w:val="single" w:color="C9D1D9" w:sz="4"/>
-              <w:bottom w:val="single" w:color="C9D1D9" w:sz="4"/>
-              <w:right w:val="single" w:color="C9D1D9" w:sz="4"/>
-            </w:tcBorders>
-            <w:tcMar>
-              <w:top w:type="dxa" w:w="60"/>
-              <w:left w:type="dxa" w:w="100"/>
-              <w:bottom w:type="dxa" w:w="60"/>
-              <w:right w:type="dxa" w:w="100"/>
-            </w:tcMar>
-          </w:tcPr>
-          <w:p>
-            <w:pPr>
-              <w:spacing w:after="40" w:line="252"/>
-            </w:pPr>
-            <w:r>
-              <w:rPr>
-                <w:sz w:val="19"/>
-                <w:szCs w:val="19"/>
-              </w:rPr>
-              <w:t xml:space="preserve">(binary audio frame)</w:t>
-            </w:r>
-          </w:p>
-        </w:tc>
-        <w:tc>
-          <w:tcPr>
-            <w:tcW w:type="dxa" w:w="578"/>
-            <w:tcBorders>
-              <w:top w:val="single" w:color="C9D1D9" w:sz="4"/>
-              <w:left w:val="single" w:color="C9D1D9" w:sz="4"/>
-              <w:bottom w:val="single" w:color="C9D1D9" w:sz="4"/>
-              <w:right w:val="single" w:color="C9D1D9" w:sz="4"/>
-            </w:tcBorders>
-            <w:tcMar>
-              <w:top w:type="dxa" w:w="60"/>
-              <w:left w:type="dxa" w:w="100"/>
-              <w:bottom w:type="dxa" w:w="60"/>
-              <w:right w:type="dxa" w:w="100"/>
-            </w:tcMar>
-          </w:tcPr>
-          <w:p>
-            <w:pPr>
-              <w:spacing w:after="40" w:line="252"/>
-            </w:pPr>
-            <w:r>
-              <w:rPr>
-                <w:sz w:val="19"/>
-                <w:szCs w:val="19"/>
-              </w:rPr>
-              <w:t xml:space="preserve">1C</w:t>
-            </w:r>
-          </w:p>
-        </w:tc>
-        <w:tc>
-          <w:tcPr>
-            <w:tcW w:type="dxa" w:w="3855"/>
-            <w:tcBorders>
-              <w:top w:val="single" w:color="C9D1D9" w:sz="4"/>
-              <w:left w:val="single" w:color="C9D1D9" w:sz="4"/>
-              <w:bottom w:val="single" w:color="C9D1D9" w:sz="4"/>
-              <w:right w:val="single" w:color="C9D1D9" w:sz="4"/>
-            </w:tcBorders>
-            <w:tcMar>
-              <w:top w:type="dxa" w:w="60"/>
-              <w:left w:type="dxa" w:w="100"/>
-              <w:bottom w:type="dxa" w:w="60"/>
-              <w:right w:type="dxa" w:w="100"/>
-            </w:tcMar>
-          </w:tcPr>
-          <w:p>
-            <w:pPr>
-              <w:spacing w:after="40" w:line="252"/>
-            </w:pPr>
-            <w:r>
-              <w:rPr>
-                <w:sz w:val="19"/>
-                <w:szCs w:val="19"/>
-              </w:rPr>
-              <w:t xml:space="preserve">raw audio bytes (8.4)</w:t>
-            </w:r>
-          </w:p>
-        </w:tc>
-        <w:tc>
-          <w:tcPr>
-            <w:tcW w:type="dxa" w:w="3085"/>
-            <w:tcBorders>
-              <w:top w:val="single" w:color="C9D1D9" w:sz="4"/>
-              <w:left w:val="single" w:color="C9D1D9" w:sz="4"/>
-              <w:bottom w:val="single" w:color="C9D1D9" w:sz="4"/>
-              <w:right w:val="single" w:color="C9D1D9" w:sz="4"/>
-            </w:tcBorders>
-            <w:tcMar>
-              <w:top w:type="dxa" w:w="60"/>
-              <w:left w:type="dxa" w:w="100"/>
-              <w:bottom w:type="dxa" w:w="60"/>
-              <w:right w:type="dxa" w:w="100"/>
-            </w:tcMar>
-          </w:tcPr>
-          <w:p>
-            <w:pPr>
-              <w:spacing w:after="40" w:line="252"/>
-            </w:pPr>
-            <w:r>
-              <w:rPr>
-                <w:sz w:val="19"/>
-                <w:szCs w:val="19"/>
-              </w:rPr>
-              <w:t xml:space="preserve">Audio for the utterance that is currently open.</w:t>
-            </w:r>
-          </w:p>
-        </w:tc>
-      </w:tr>
-      <w:tr>
-        <w:tc>
-          <w:tcPr>
-            <w:tcW w:type="dxa" w:w="2120"/>
-            <w:tcBorders>
-              <w:top w:val="single" w:color="C9D1D9" w:sz="4"/>
-              <w:left w:val="single" w:color="C9D1D9" w:sz="4"/>
-              <w:bottom w:val="single" w:color="C9D1D9" w:sz="4"/>
-              <w:right w:val="single" w:color="C9D1D9" w:sz="4"/>
-            </w:tcBorders>
-            <w:tcMar>
-              <w:top w:type="dxa" w:w="60"/>
-              <w:left w:type="dxa" w:w="100"/>
-              <w:bottom w:type="dxa" w:w="60"/>
-              <w:right w:type="dxa" w:w="100"/>
-            </w:tcMar>
-          </w:tcPr>
-          <w:p>
-            <w:pPr>
-              <w:spacing w:after="40" w:line="252"/>
-            </w:pPr>
-            <w:r>
-              <w:rPr>
-                <w:rFonts w:ascii="Consolas" w:cs="Consolas" w:eastAsia="Consolas" w:hAnsi="Consolas"/>
-                <w:color w:val="24292F"/>
-                <w:sz w:val="19"/>
-                <w:szCs w:val="19"/>
-              </w:rPr>
-              <w:t xml:space="preserve">utterance.end</w:t>
-            </w:r>
-          </w:p>
-        </w:tc>
-        <w:tc>
-          <w:tcPr>
-            <w:tcW w:type="dxa" w:w="578"/>
-            <w:tcBorders>
-              <w:top w:val="single" w:color="C9D1D9" w:sz="4"/>
-              <w:left w:val="single" w:color="C9D1D9" w:sz="4"/>
-              <w:bottom w:val="single" w:color="C9D1D9" w:sz="4"/>
-              <w:right w:val="single" w:color="C9D1D9" w:sz="4"/>
-            </w:tcBorders>
-            <w:tcMar>
-              <w:top w:type="dxa" w:w="60"/>
-              <w:left w:type="dxa" w:w="100"/>
-              <w:bottom w:type="dxa" w:w="60"/>
-              <w:right w:type="dxa" w:w="100"/>
-            </w:tcMar>
-          </w:tcPr>
-          <w:p>
-            <w:pPr>
-              <w:spacing w:after="40" w:line="252"/>
-            </w:pPr>
-            <w:r>
-              <w:rPr>
-                <w:sz w:val="19"/>
-                <w:szCs w:val="19"/>
-              </w:rPr>
-              <w:t xml:space="preserve">1C</w:t>
-            </w:r>
-          </w:p>
-        </w:tc>
-        <w:tc>
-          <w:tcPr>
-            <w:tcW w:type="dxa" w:w="3855"/>
-            <w:tcBorders>
-              <w:top w:val="single" w:color="C9D1D9" w:sz="4"/>
-              <w:left w:val="single" w:color="C9D1D9" w:sz="4"/>
-              <w:bottom w:val="single" w:color="C9D1D9" w:sz="4"/>
-              <w:right w:val="single" w:color="C9D1D9" w:sz="4"/>
-            </w:tcBorders>
-            <w:tcMar>
-              <w:top w:type="dxa" w:w="60"/>
-              <w:left w:type="dxa" w:w="100"/>
-              <w:bottom w:type="dxa" w:w="60"/>
-              <w:right w:type="dxa" w:w="100"/>
-            </w:tcMar>
-          </w:tcPr>
-          <w:p>
-            <w:pPr>
-              <w:spacing w:after="40" w:line="252"/>
-            </w:pPr>
-            <w:r>
-              <w:rPr>
-                <w:rFonts w:ascii="Consolas" w:cs="Consolas" w:eastAsia="Consolas" w:hAnsi="Consolas"/>
-                <w:color w:val="24292F"/>
-                <w:sz w:val="19"/>
-                <w:szCs w:val="19"/>
-              </w:rPr>
-              <w:t xml:space="preserve">utterance_id</w:t>
-            </w:r>
-          </w:p>
-        </w:tc>
-        <w:tc>
-          <w:tcPr>
-            <w:tcW w:type="dxa" w:w="3085"/>
-            <w:tcBorders>
-              <w:top w:val="single" w:color="C9D1D9" w:sz="4"/>
-              <w:left w:val="single" w:color="C9D1D9" w:sz="4"/>
-              <w:bottom w:val="single" w:color="C9D1D9" w:sz="4"/>
-              <w:right w:val="single" w:color="C9D1D9" w:sz="4"/>
-            </w:tcBorders>
-            <w:tcMar>
-              <w:top w:type="dxa" w:w="60"/>
-              <w:left w:type="dxa" w:w="100"/>
-              <w:bottom w:type="dxa" w:w="60"/>
-              <w:right w:type="dxa" w:w="100"/>
-            </w:tcMar>
-          </w:tcPr>
-          <w:p>
-            <w:pPr>
-              <w:spacing w:after="40" w:line="252"/>
-            </w:pPr>
-            <w:r>
-              <w:rPr>
-                <w:sz w:val="19"/>
-                <w:szCs w:val="19"/>
-              </w:rPr>
-              <w:t xml:space="preserve">The person stopped talking. The server processes the sentence.</w:t>
-            </w:r>
-          </w:p>
-        </w:tc>
-      </w:tr>
-      <w:tr>
-        <w:tc>
-          <w:tcPr>
-            <w:tcW w:type="dxa" w:w="2120"/>
-            <w:tcBorders>
-              <w:top w:val="single" w:color="C9D1D9" w:sz="4"/>
-              <w:left w:val="single" w:color="C9D1D9" w:sz="4"/>
-              <w:bottom w:val="single" w:color="C9D1D9" w:sz="4"/>
-              <w:right w:val="single" w:color="C9D1D9" w:sz="4"/>
-            </w:tcBorders>
-            <w:tcMar>
-              <w:top w:type="dxa" w:w="60"/>
-              <w:left w:type="dxa" w:w="100"/>
-              <w:bottom w:type="dxa" w:w="60"/>
-              <w:right w:type="dxa" w:w="100"/>
-            </w:tcMar>
-          </w:tcPr>
-          <w:p>
-            <w:pPr>
-              <w:spacing w:after="40" w:line="252"/>
-            </w:pPr>
-            <w:r>
-              <w:rPr>
-                <w:rFonts w:ascii="Consolas" w:cs="Consolas" w:eastAsia="Consolas" w:hAnsi="Consolas"/>
-                <w:color w:val="24292F"/>
-                <w:sz w:val="19"/>
-                <w:szCs w:val="19"/>
-              </w:rPr>
-              <w:t xml:space="preserve">session.stop</w:t>
-            </w:r>
-          </w:p>
-        </w:tc>
-        <w:tc>
-          <w:tcPr>
-            <w:tcW w:type="dxa" w:w="578"/>
-            <w:tcBorders>
-              <w:top w:val="single" w:color="C9D1D9" w:sz="4"/>
-              <w:left w:val="single" w:color="C9D1D9" w:sz="4"/>
-              <w:bottom w:val="single" w:color="C9D1D9" w:sz="4"/>
-              <w:right w:val="single" w:color="C9D1D9" w:sz="4"/>
-            </w:tcBorders>
-            <w:tcMar>
-              <w:top w:type="dxa" w:w="60"/>
-              <w:left w:type="dxa" w:w="100"/>
-              <w:bottom w:type="dxa" w:w="60"/>
-              <w:right w:type="dxa" w:w="100"/>
-            </w:tcMar>
-          </w:tcPr>
-          <w:p>
-            <w:pPr>
-              <w:spacing w:after="40" w:line="252"/>
-            </w:pPr>
-            <w:r>
-              <w:rPr>
-                <w:sz w:val="19"/>
-                <w:szCs w:val="19"/>
-              </w:rPr>
               <w:t xml:space="preserve">1B</w:t>
             </w:r>
           </w:p>
         </w:tc>
         <w:tc>
           <w:tcPr>
-            <w:tcW w:type="dxa" w:w="3855"/>
+            <w:tcW w:type="dxa" w:w="2891"/>
             <w:tcBorders>
               <w:top w:val="single" w:color="C9D1D9" w:sz="4"/>
               <w:left w:val="single" w:color="C9D1D9" w:sz="4"/>
@@ -8306,30 +8127,30 @@
         </w:tc>
         <w:tc>
           <w:tcPr>
-            <w:tcW w:type="dxa" w:w="3085"/>
-            <w:tcBorders>
-              <w:top w:val="single" w:color="C9D1D9" w:sz="4"/>
-              <w:left w:val="single" w:color="C9D1D9" w:sz="4"/>
-              <w:bottom w:val="single" w:color="C9D1D9" w:sz="4"/>
-              <w:right w:val="single" w:color="C9D1D9" w:sz="4"/>
-            </w:tcBorders>
-            <w:tcMar>
-              <w:top w:type="dxa" w:w="60"/>
-              <w:left w:type="dxa" w:w="100"/>
-              <w:bottom w:type="dxa" w:w="60"/>
-              <w:right w:type="dxa" w:w="100"/>
-            </w:tcMar>
-          </w:tcPr>
-          <w:p>
-            <w:pPr>
-              <w:spacing w:after="40" w:line="252"/>
-            </w:pPr>
-            <w:r>
-              <w:rPr>
-                <w:sz w:val="19"/>
-                <w:szCs w:val="19"/>
-              </w:rPr>
-              <w:t xml:space="preserve">End the conversation. The server closes the socket.</w:t>
+            <w:tcW w:type="dxa" w:w="4049"/>
+            <w:tcBorders>
+              <w:top w:val="single" w:color="C9D1D9" w:sz="4"/>
+              <w:left w:val="single" w:color="C9D1D9" w:sz="4"/>
+              <w:bottom w:val="single" w:color="C9D1D9" w:sz="4"/>
+              <w:right w:val="single" w:color="C9D1D9" w:sz="4"/>
+            </w:tcBorders>
+            <w:tcMar>
+              <w:top w:type="dxa" w:w="60"/>
+              <w:left w:type="dxa" w:w="100"/>
+              <w:bottom w:type="dxa" w:w="60"/>
+              <w:right w:type="dxa" w:w="100"/>
+            </w:tcMar>
+          </w:tcPr>
+          <w:p>
+            <w:pPr>
+              <w:spacing w:after="40" w:line="252"/>
+            </w:pPr>
+            <w:r>
+              <w:rPr>
+                <w:sz w:val="19"/>
+                <w:szCs w:val="19"/>
+              </w:rPr>
+              <w:t xml:space="preserve">End the conversation. A sentence in progress is finished first, then the server closes the socket.</w:t>
             </w:r>
           </w:p>
         </w:tc>
@@ -8346,7 +8167,7 @@
         <w:spacing w:after="80" w:before="200"/>
       </w:pPr>
       <w:r>
-        <w:t xml:space="preserve">Rules for utterances</w:t>
+        <w:t xml:space="preserve">Hands-free listening</w:t>
       </w:r>
     </w:p>
     <w:p>
@@ -8359,43 +8180,7 @@
         <w:spacing w:after="60" w:line="276"/>
       </w:pPr>
       <w:r>
-        <w:t xml:space="preserve">Only one utterance can be open at a time. If a new </w:t>
-      </w:r>
-      <w:r>
-        <w:rPr>
-          <w:rFonts w:ascii="Consolas" w:cs="Consolas" w:eastAsia="Consolas" w:hAnsi="Consolas"/>
-          <w:color w:val="24292F"/>
-          <w:sz w:val="19"/>
-          <w:szCs w:val="19"/>
-        </w:rPr>
-        <w:t xml:space="preserve">utterance.start</w:t>
-      </w:r>
-      <w:r>
-        <w:t xml:space="preserve"> arrives before the previous one ended, the previous one is discarded and reported with an </w:t>
-      </w:r>
-      <w:r>
-        <w:rPr>
-          <w:rFonts w:ascii="Consolas" w:cs="Consolas" w:eastAsia="Consolas" w:hAnsi="Consolas"/>
-          <w:color w:val="24292F"/>
-          <w:sz w:val="19"/>
-          <w:szCs w:val="19"/>
-        </w:rPr>
-        <w:t xml:space="preserve">invalid_message</w:t>
-      </w:r>
-      <w:r>
-        <w:t xml:space="preserve"> error that carries its </w:t>
-      </w:r>
-      <w:r>
-        <w:rPr>
-          <w:rFonts w:ascii="Consolas" w:cs="Consolas" w:eastAsia="Consolas" w:hAnsi="Consolas"/>
-          <w:color w:val="24292F"/>
-          <w:sz w:val="19"/>
-          <w:szCs w:val="19"/>
-        </w:rPr>
-        <w:t xml:space="preserve">utterance_id</w:t>
-      </w:r>
-      <w:r>
-        <w:t xml:space="preserve">. The new one starts normally.</w:t>
+        <w:t xml:space="preserve">There are no talk buttons. The browser streams the microphone and the server finds each sentence: it starts when speech is heard, ends after about 1.5 s of silence, and is split at 30 s.</w:t>
       </w:r>
     </w:p>
     <w:p>
@@ -8408,7 +8193,7 @@
         <w:spacing w:after="60" w:line="276"/>
       </w:pPr>
       <w:r>
-        <w:t xml:space="preserve">After an utterance is rejected while audio is still arriving (</w:t>
+        <w:t xml:space="preserve">Silence and short noises are ignored. Speech with no recognisable words gets </w:t>
       </w:r>
       <w:r>
         <w:rPr>
@@ -8417,22 +8202,10 @@
           <w:sz w:val="19"/>
           <w:szCs w:val="19"/>
         </w:rPr>
-        <w:t xml:space="preserve">audio_too_long</w:t>
-      </w:r>
-      <w:r>
-        <w:t xml:space="preserve"> or a malformed frame), stop sending its audio. Any remaining frames and its </w:t>
-      </w:r>
-      <w:r>
-        <w:rPr>
-          <w:rFonts w:ascii="Consolas" w:cs="Consolas" w:eastAsia="Consolas" w:hAnsi="Consolas"/>
-          <w:color w:val="24292F"/>
-          <w:sz w:val="19"/>
-          <w:szCs w:val="19"/>
-        </w:rPr>
-        <w:t xml:space="preserve">utterance.end</w:t>
-      </w:r>
-      <w:r>
-        <w:t xml:space="preserve"> are ignored without further errors.</w:t>
+        <w:t xml:space="preserve">utterance.ignored</w:t>
+      </w:r>
+      <w:r>
+        <w:t xml:space="preserve"> and listening simply continues.</w:t>
       </w:r>
     </w:p>
     <w:p>
@@ -8445,7 +8218,7 @@
         <w:spacing w:after="60" w:line="276"/>
       </w:pPr>
       <w:r>
-        <w:t xml:space="preserve">Unknown extra fields in any message are rejected with </w:t>
+        <w:t xml:space="preserve">While a translation is spoken aloud, the browser sends </w:t>
       </w:r>
       <w:r>
         <w:rPr>
@@ -8454,10 +8227,10 @@
           <w:sz w:val="19"/>
           <w:szCs w:val="19"/>
         </w:rPr>
-        <w:t xml:space="preserve">invalid_message</w:t>
-      </w:r>
-      <w:r>
-        <w:t xml:space="preserve">.</w:t>
+        <w:t xml:space="preserve">audio.pause</w:t>
+      </w:r>
+      <w:r>
+        <w:t xml:space="preserve"> and stops sending audio, so the app never hears itself.</w:t>
       </w:r>
     </w:p>
     <w:p>
@@ -8789,7 +8562,7 @@
                 <w:sz w:val="19"/>
                 <w:szCs w:val="19"/>
               </w:rPr>
-              <w:t xml:space="preserve">About 100 ms: 1,600 samples = 3,200 bytes per binary message. Must be an even number of bytes and at most 32,000 bytes (1 s); otherwise </w:t>
+              <w:t xml:space="preserve">About 100 ms: 1,600 samples = 3,200 bytes per binary message. Must be a non-empty even number of bytes and at most 32,000 bytes (1 s); otherwise </w:t>
             </w:r>
             <w:r>
               <w:rPr>
@@ -8805,207 +8578,7 @@
                 <w:sz w:val="19"/>
                 <w:szCs w:val="19"/>
               </w:rPr>
-              <w:t xml:space="preserve"> and the utterance is dropped.</w:t>
-            </w:r>
-          </w:p>
-        </w:tc>
-      </w:tr>
-      <w:tr>
-        <w:tc>
-          <w:tcPr>
-            <w:tcW w:type="dxa" w:w="2409"/>
-            <w:tcBorders>
-              <w:top w:val="single" w:color="C9D1D9" w:sz="4"/>
-              <w:left w:val="single" w:color="C9D1D9" w:sz="4"/>
-              <w:bottom w:val="single" w:color="C9D1D9" w:sz="4"/>
-              <w:right w:val="single" w:color="C9D1D9" w:sz="4"/>
-            </w:tcBorders>
-            <w:tcMar>
-              <w:top w:type="dxa" w:w="60"/>
-              <w:left w:type="dxa" w:w="100"/>
-              <w:bottom w:type="dxa" w:w="60"/>
-              <w:right w:type="dxa" w:w="100"/>
-            </w:tcMar>
-          </w:tcPr>
-          <w:p>
-            <w:pPr>
-              <w:spacing w:after="40" w:line="252"/>
-            </w:pPr>
-            <w:r>
-              <w:rPr>
-                <w:sz w:val="19"/>
-                <w:szCs w:val="19"/>
-              </w:rPr>
-              <w:t xml:space="preserve">When</w:t>
-            </w:r>
-          </w:p>
-        </w:tc>
-        <w:tc>
-          <w:tcPr>
-            <w:tcW w:type="dxa" w:w="7229"/>
-            <w:tcBorders>
-              <w:top w:val="single" w:color="C9D1D9" w:sz="4"/>
-              <w:left w:val="single" w:color="C9D1D9" w:sz="4"/>
-              <w:bottom w:val="single" w:color="C9D1D9" w:sz="4"/>
-              <w:right w:val="single" w:color="C9D1D9" w:sz="4"/>
-            </w:tcBorders>
-            <w:tcMar>
-              <w:top w:type="dxa" w:w="60"/>
-              <w:left w:type="dxa" w:w="100"/>
-              <w:bottom w:type="dxa" w:w="60"/>
-              <w:right w:type="dxa" w:w="100"/>
-            </w:tcMar>
-          </w:tcPr>
-          <w:p>
-            <w:pPr>
-              <w:spacing w:after="40" w:line="252"/>
-            </w:pPr>
-            <w:r>
-              <w:rPr>
-                <w:sz w:val="19"/>
-                <w:szCs w:val="19"/>
-              </w:rPr>
-              <w:t xml:space="preserve">Only between </w:t>
-            </w:r>
-            <w:r>
-              <w:rPr>
-                <w:rFonts w:ascii="Consolas" w:cs="Consolas" w:eastAsia="Consolas" w:hAnsi="Consolas"/>
-                <w:color w:val="24292F"/>
-                <w:sz w:val="19"/>
-                <w:szCs w:val="19"/>
-              </w:rPr>
-              <w:t xml:space="preserve">utterance.start</w:t>
-            </w:r>
-            <w:r>
-              <w:rPr>
-                <w:sz w:val="19"/>
-                <w:szCs w:val="19"/>
-              </w:rPr>
-              <w:t xml:space="preserve"> and </w:t>
-            </w:r>
-            <w:r>
-              <w:rPr>
-                <w:rFonts w:ascii="Consolas" w:cs="Consolas" w:eastAsia="Consolas" w:hAnsi="Consolas"/>
-                <w:color w:val="24292F"/>
-                <w:sz w:val="19"/>
-                <w:szCs w:val="19"/>
-              </w:rPr>
-              <w:t xml:space="preserve">utterance.end</w:t>
-            </w:r>
-            <w:r>
-              <w:rPr>
-                <w:sz w:val="19"/>
-                <w:szCs w:val="19"/>
-              </w:rPr>
-              <w:t xml:space="preserve">. Frames outside an open utterance get an </w:t>
-            </w:r>
-            <w:r>
-              <w:rPr>
-                <w:rFonts w:ascii="Consolas" w:cs="Consolas" w:eastAsia="Consolas" w:hAnsi="Consolas"/>
-                <w:color w:val="24292F"/>
-                <w:sz w:val="19"/>
-                <w:szCs w:val="19"/>
-              </w:rPr>
-              <w:t xml:space="preserve">no_active_utterance</w:t>
-            </w:r>
-            <w:r>
-              <w:rPr>
-                <w:sz w:val="19"/>
-                <w:szCs w:val="19"/>
-              </w:rPr>
-              <w:t xml:space="preserve"> error.</w:t>
-            </w:r>
-          </w:p>
-        </w:tc>
-      </w:tr>
-      <w:tr>
-        <w:tc>
-          <w:tcPr>
-            <w:tcW w:type="dxa" w:w="2409"/>
-            <w:tcBorders>
-              <w:top w:val="single" w:color="C9D1D9" w:sz="4"/>
-              <w:left w:val="single" w:color="C9D1D9" w:sz="4"/>
-              <w:bottom w:val="single" w:color="C9D1D9" w:sz="4"/>
-              <w:right w:val="single" w:color="C9D1D9" w:sz="4"/>
-            </w:tcBorders>
-            <w:tcMar>
-              <w:top w:type="dxa" w:w="60"/>
-              <w:left w:type="dxa" w:w="100"/>
-              <w:bottom w:type="dxa" w:w="60"/>
-              <w:right w:type="dxa" w:w="100"/>
-            </w:tcMar>
-          </w:tcPr>
-          <w:p>
-            <w:pPr>
-              <w:spacing w:after="40" w:line="252"/>
-            </w:pPr>
-            <w:r>
-              <w:rPr>
-                <w:sz w:val="19"/>
-                <w:szCs w:val="19"/>
-              </w:rPr>
-              <w:t xml:space="preserve">Limits</w:t>
-            </w:r>
-          </w:p>
-        </w:tc>
-        <w:tc>
-          <w:tcPr>
-            <w:tcW w:type="dxa" w:w="7229"/>
-            <w:tcBorders>
-              <w:top w:val="single" w:color="C9D1D9" w:sz="4"/>
-              <w:left w:val="single" w:color="C9D1D9" w:sz="4"/>
-              <w:bottom w:val="single" w:color="C9D1D9" w:sz="4"/>
-              <w:right w:val="single" w:color="C9D1D9" w:sz="4"/>
-            </w:tcBorders>
-            <w:tcMar>
-              <w:top w:type="dxa" w:w="60"/>
-              <w:left w:type="dxa" w:w="100"/>
-              <w:bottom w:type="dxa" w:w="60"/>
-              <w:right w:type="dxa" w:w="100"/>
-            </w:tcMar>
-          </w:tcPr>
-          <w:p>
-            <w:pPr>
-              <w:spacing w:after="40" w:line="252"/>
-            </w:pPr>
-            <w:r>
-              <w:rPr>
-                <w:sz w:val="19"/>
-                <w:szCs w:val="19"/>
-              </w:rPr>
-              <w:t xml:space="preserve">Shorter than 0.3 s, or no 100 ms stretch louder than silence: </w:t>
-            </w:r>
-            <w:r>
-              <w:rPr>
-                <w:rFonts w:ascii="Consolas" w:cs="Consolas" w:eastAsia="Consolas" w:hAnsi="Consolas"/>
-                <w:color w:val="24292F"/>
-                <w:sz w:val="19"/>
-                <w:szCs w:val="19"/>
-              </w:rPr>
-              <w:t xml:space="preserve">audio_too_short</w:t>
-            </w:r>
-            <w:r>
-              <w:rPr>
-                <w:sz w:val="19"/>
-                <w:szCs w:val="19"/>
-              </w:rPr>
-              <w:t xml:space="preserve">. Longer than 30 s: </w:t>
-            </w:r>
-            <w:r>
-              <w:rPr>
-                <w:rFonts w:ascii="Consolas" w:cs="Consolas" w:eastAsia="Consolas" w:hAnsi="Consolas"/>
-                <w:color w:val="24292F"/>
-                <w:sz w:val="19"/>
-                <w:szCs w:val="19"/>
-              </w:rPr>
-              <w:t xml:space="preserve">audio_too_long</w:t>
-            </w:r>
-            <w:r>
-              <w:rPr>
-                <w:sz w:val="19"/>
-                <w:szCs w:val="19"/>
-              </w:rPr>
-              <w:t xml:space="preserve">, sent once. The browser should stop automatically at 30 s.</w:t>
+              <w:t xml:space="preserve"> and that frame is dropped.</w:t>
             </w:r>
           </w:p>
         </w:tc>
@@ -9626,15 +9199,61 @@
                 <w:sz w:val="19"/>
                 <w:szCs w:val="19"/>
               </w:rPr>
-              <w:t xml:space="preserve">speaker_id</w:t>
-            </w:r>
-            <w:r>
-              <w:rPr>
-                <w:sz w:val="19"/>
-                <w:szCs w:val="19"/>
-              </w:rPr>
-              <w:t xml:space="preserve">, </w:t>
-            </w:r>
+              <w:t xml:space="preserve">duration_ms</w:t>
+            </w:r>
+          </w:p>
+        </w:tc>
+        <w:tc>
+          <w:tcPr>
+            <w:tcW w:type="dxa" w:w="3182"/>
+            <w:tcBorders>
+              <w:top w:val="single" w:color="C9D1D9" w:sz="4"/>
+              <w:left w:val="single" w:color="C9D1D9" w:sz="4"/>
+              <w:bottom w:val="single" w:color="C9D1D9" w:sz="4"/>
+              <w:right w:val="single" w:color="C9D1D9" w:sz="4"/>
+            </w:tcBorders>
+            <w:tcMar>
+              <w:top w:type="dxa" w:w="60"/>
+              <w:left w:type="dxa" w:w="100"/>
+              <w:bottom w:type="dxa" w:w="60"/>
+              <w:right w:type="dxa" w:w="100"/>
+            </w:tcMar>
+          </w:tcPr>
+          <w:p>
+            <w:pPr>
+              <w:spacing w:after="40" w:line="252"/>
+            </w:pPr>
+            <w:r>
+              <w:rPr>
+                <w:sz w:val="19"/>
+                <w:szCs w:val="19"/>
+              </w:rPr>
+              <w:t xml:space="preserve">The server heard a sentence and is processing it. The id is made by the server.</w:t>
+            </w:r>
+          </w:p>
+        </w:tc>
+      </w:tr>
+      <w:tr>
+        <w:tc>
+          <w:tcPr>
+            <w:tcW w:type="dxa" w:w="2409"/>
+            <w:tcBorders>
+              <w:top w:val="single" w:color="C9D1D9" w:sz="4"/>
+              <w:left w:val="single" w:color="C9D1D9" w:sz="4"/>
+              <w:bottom w:val="single" w:color="C9D1D9" w:sz="4"/>
+              <w:right w:val="single" w:color="C9D1D9" w:sz="4"/>
+            </w:tcBorders>
+            <w:tcMar>
+              <w:top w:type="dxa" w:w="60"/>
+              <w:left w:type="dxa" w:w="100"/>
+              <w:bottom w:type="dxa" w:w="60"/>
+              <w:right w:type="dxa" w:w="100"/>
+            </w:tcMar>
+          </w:tcPr>
+          <w:p>
+            <w:pPr>
+              <w:spacing w:after="40" w:line="252"/>
+            </w:pPr>
             <w:r>
               <w:rPr>
                 <w:rFonts w:ascii="Consolas" w:cs="Consolas" w:eastAsia="Consolas" w:hAnsi="Consolas"/>
@@ -9642,7 +9261,67 @@
                 <w:sz w:val="19"/>
                 <w:szCs w:val="19"/>
               </w:rPr>
-              <w:t xml:space="preserve">duration_ms</w:t>
+              <w:t xml:space="preserve">utterance.ignored</w:t>
+            </w:r>
+          </w:p>
+        </w:tc>
+        <w:tc>
+          <w:tcPr>
+            <w:tcW w:type="dxa" w:w="578"/>
+            <w:tcBorders>
+              <w:top w:val="single" w:color="C9D1D9" w:sz="4"/>
+              <w:left w:val="single" w:color="C9D1D9" w:sz="4"/>
+              <w:bottom w:val="single" w:color="C9D1D9" w:sz="4"/>
+              <w:right w:val="single" w:color="C9D1D9" w:sz="4"/>
+            </w:tcBorders>
+            <w:tcMar>
+              <w:top w:type="dxa" w:w="60"/>
+              <w:left w:type="dxa" w:w="100"/>
+              <w:bottom w:type="dxa" w:w="60"/>
+              <w:right w:type="dxa" w:w="100"/>
+            </w:tcMar>
+          </w:tcPr>
+          <w:p>
+            <w:pPr>
+              <w:spacing w:after="40" w:line="252"/>
+            </w:pPr>
+            <w:r>
+              <w:rPr>
+                <w:sz w:val="19"/>
+                <w:szCs w:val="19"/>
+              </w:rPr>
+              <w:t xml:space="preserve">1C</w:t>
+            </w:r>
+          </w:p>
+        </w:tc>
+        <w:tc>
+          <w:tcPr>
+            <w:tcW w:type="dxa" w:w="3469"/>
+            <w:tcBorders>
+              <w:top w:val="single" w:color="C9D1D9" w:sz="4"/>
+              <w:left w:val="single" w:color="C9D1D9" w:sz="4"/>
+              <w:bottom w:val="single" w:color="C9D1D9" w:sz="4"/>
+              <w:right w:val="single" w:color="C9D1D9" w:sz="4"/>
+            </w:tcBorders>
+            <w:tcMar>
+              <w:top w:type="dxa" w:w="60"/>
+              <w:left w:type="dxa" w:w="100"/>
+              <w:bottom w:type="dxa" w:w="60"/>
+              <w:right w:type="dxa" w:w="100"/>
+            </w:tcMar>
+          </w:tcPr>
+          <w:p>
+            <w:pPr>
+              <w:spacing w:after="40" w:line="252"/>
+            </w:pPr>
+            <w:r>
+              <w:rPr>
+                <w:rFonts w:ascii="Consolas" w:cs="Consolas" w:eastAsia="Consolas" w:hAnsi="Consolas"/>
+                <w:color w:val="24292F"/>
+                <w:sz w:val="19"/>
+                <w:szCs w:val="19"/>
+              </w:rPr>
+              <w:t xml:space="preserve">utterance_id</w:t>
             </w:r>
           </w:p>
         </w:tc>
@@ -9671,7 +9350,7 @@
                 <w:sz w:val="19"/>
                 <w:szCs w:val="19"/>
               </w:rPr>
-              <w:t xml:space="preserve">The server received the whole sentence.</w:t>
+              <w:t xml:space="preserve">No words were recognised. Remove the pending turn quietly and keep listening.</w:t>
             </w:r>
           </w:p>
         </w:tc>
@@ -9941,7 +9620,7 @@
                 <w:sz w:val="19"/>
                 <w:szCs w:val="19"/>
               </w:rPr>
-              <w:t xml:space="preserve">, </w:t>
+              <w:t xml:space="preserve"> (A, B or null), </w:t>
             </w:r>
             <w:r>
               <w:rPr>
@@ -10170,13 +9849,59 @@
               </w:rPr>
               <w:t xml:space="preserve">text</w:t>
             </w:r>
-            <w:r>
-              <w:rPr>
-                <w:sz w:val="19"/>
-                <w:szCs w:val="19"/>
-              </w:rPr>
-              <w:t xml:space="preserve">, </w:t>
-            </w:r>
+          </w:p>
+        </w:tc>
+        <w:tc>
+          <w:tcPr>
+            <w:tcW w:type="dxa" w:w="3182"/>
+            <w:tcBorders>
+              <w:top w:val="single" w:color="C9D1D9" w:sz="4"/>
+              <w:left w:val="single" w:color="C9D1D9" w:sz="4"/>
+              <w:bottom w:val="single" w:color="C9D1D9" w:sz="4"/>
+              <w:right w:val="single" w:color="C9D1D9" w:sz="4"/>
+            </w:tcBorders>
+            <w:tcMar>
+              <w:top w:type="dxa" w:w="60"/>
+              <w:left w:type="dxa" w:w="100"/>
+              <w:bottom w:type="dxa" w:w="60"/>
+              <w:right w:type="dxa" w:w="100"/>
+            </w:tcMar>
+          </w:tcPr>
+          <w:p>
+            <w:pPr>
+              <w:spacing w:after="40" w:line="252"/>
+            </w:pPr>
+            <w:r>
+              <w:rPr>
+                <w:sz w:val="19"/>
+                <w:szCs w:val="19"/>
+              </w:rPr>
+              <w:t xml:space="preserve">The sentence in this listener's language. Zero, one or two per sentence (see 8.5 rules).</w:t>
+            </w:r>
+          </w:p>
+        </w:tc>
+      </w:tr>
+      <w:tr>
+        <w:tc>
+          <w:tcPr>
+            <w:tcW w:type="dxa" w:w="2409"/>
+            <w:tcBorders>
+              <w:top w:val="single" w:color="C9D1D9" w:sz="4"/>
+              <w:left w:val="single" w:color="C9D1D9" w:sz="4"/>
+              <w:bottom w:val="single" w:color="C9D1D9" w:sz="4"/>
+              <w:right w:val="single" w:color="C9D1D9" w:sz="4"/>
+            </w:tcBorders>
+            <w:tcMar>
+              <w:top w:type="dxa" w:w="60"/>
+              <w:left w:type="dxa" w:w="100"/>
+              <w:bottom w:type="dxa" w:w="60"/>
+              <w:right w:type="dxa" w:w="100"/>
+            </w:tcMar>
+          </w:tcPr>
+          <w:p>
+            <w:pPr>
+              <w:spacing w:after="40" w:line="252"/>
+            </w:pPr>
             <w:r>
               <w:rPr>
                 <w:rFonts w:ascii="Consolas" w:cs="Consolas" w:eastAsia="Consolas" w:hAnsi="Consolas"/>
@@ -10184,44 +9909,59 @@
                 <w:sz w:val="19"/>
                 <w:szCs w:val="19"/>
               </w:rPr>
-              <w:t xml:space="preserve">translated</w:t>
-            </w:r>
-            <w:r>
-              <w:rPr>
-                <w:sz w:val="19"/>
-                <w:szCs w:val="19"/>
-              </w:rPr>
-              <w:t xml:space="preserve"> (true or false)</w:t>
-            </w:r>
-          </w:p>
-        </w:tc>
-        <w:tc>
-          <w:tcPr>
-            <w:tcW w:type="dxa" w:w="3182"/>
-            <w:tcBorders>
-              <w:top w:val="single" w:color="C9D1D9" w:sz="4"/>
-              <w:left w:val="single" w:color="C9D1D9" w:sz="4"/>
-              <w:bottom w:val="single" w:color="C9D1D9" w:sz="4"/>
-              <w:right w:val="single" w:color="C9D1D9" w:sz="4"/>
-            </w:tcBorders>
-            <w:tcMar>
-              <w:top w:type="dxa" w:w="60"/>
-              <w:left w:type="dxa" w:w="100"/>
-              <w:bottom w:type="dxa" w:w="60"/>
-              <w:right w:type="dxa" w:w="100"/>
-            </w:tcMar>
-          </w:tcPr>
-          <w:p>
-            <w:pPr>
-              <w:spacing w:after="40" w:line="252"/>
-            </w:pPr>
-            <w:r>
-              <w:rPr>
-                <w:sz w:val="19"/>
-                <w:szCs w:val="19"/>
-              </w:rPr>
-              <w:t xml:space="preserve">The text for the listener. </w:t>
-            </w:r>
+              <w:t xml:space="preserve">tts.audio</w:t>
+            </w:r>
+          </w:p>
+        </w:tc>
+        <w:tc>
+          <w:tcPr>
+            <w:tcW w:type="dxa" w:w="578"/>
+            <w:tcBorders>
+              <w:top w:val="single" w:color="C9D1D9" w:sz="4"/>
+              <w:left w:val="single" w:color="C9D1D9" w:sz="4"/>
+              <w:bottom w:val="single" w:color="C9D1D9" w:sz="4"/>
+              <w:right w:val="single" w:color="C9D1D9" w:sz="4"/>
+            </w:tcBorders>
+            <w:tcMar>
+              <w:top w:type="dxa" w:w="60"/>
+              <w:left w:type="dxa" w:w="100"/>
+              <w:bottom w:type="dxa" w:w="60"/>
+              <w:right w:type="dxa" w:w="100"/>
+            </w:tcMar>
+          </w:tcPr>
+          <w:p>
+            <w:pPr>
+              <w:spacing w:after="40" w:line="252"/>
+            </w:pPr>
+            <w:r>
+              <w:rPr>
+                <w:sz w:val="19"/>
+                <w:szCs w:val="19"/>
+              </w:rPr>
+              <w:t xml:space="preserve">1E</w:t>
+            </w:r>
+          </w:p>
+        </w:tc>
+        <w:tc>
+          <w:tcPr>
+            <w:tcW w:type="dxa" w:w="3469"/>
+            <w:tcBorders>
+              <w:top w:val="single" w:color="C9D1D9" w:sz="4"/>
+              <w:left w:val="single" w:color="C9D1D9" w:sz="4"/>
+              <w:bottom w:val="single" w:color="C9D1D9" w:sz="4"/>
+              <w:right w:val="single" w:color="C9D1D9" w:sz="4"/>
+            </w:tcBorders>
+            <w:tcMar>
+              <w:top w:type="dxa" w:w="60"/>
+              <w:left w:type="dxa" w:w="100"/>
+              <w:bottom w:type="dxa" w:w="60"/>
+              <w:right w:type="dxa" w:w="100"/>
+            </w:tcMar>
+          </w:tcPr>
+          <w:p>
+            <w:pPr>
+              <w:spacing w:after="40" w:line="252"/>
+            </w:pPr>
             <w:r>
               <w:rPr>
                 <w:rFonts w:ascii="Consolas" w:cs="Consolas" w:eastAsia="Consolas" w:hAnsi="Consolas"/>
@@ -10229,14 +9969,116 @@
                 <w:sz w:val="19"/>
                 <w:szCs w:val="19"/>
               </w:rPr>
-              <w:t xml:space="preserve">translated</w:t>
-            </w:r>
-            <w:r>
-              <w:rPr>
-                <w:sz w:val="19"/>
-                <w:szCs w:val="19"/>
-              </w:rPr>
-              <w:t xml:space="preserve"> is false when the original was already in the listener's language.</w:t>
+              <w:t xml:space="preserve">utterance_id</w:t>
+            </w:r>
+            <w:r>
+              <w:rPr>
+                <w:sz w:val="19"/>
+                <w:szCs w:val="19"/>
+              </w:rPr>
+              <w:t xml:space="preserve">, </w:t>
+            </w:r>
+            <w:r>
+              <w:rPr>
+                <w:rFonts w:ascii="Consolas" w:cs="Consolas" w:eastAsia="Consolas" w:hAnsi="Consolas"/>
+                <w:color w:val="24292F"/>
+                <w:sz w:val="19"/>
+                <w:szCs w:val="19"/>
+              </w:rPr>
+              <w:t xml:space="preserve">listener_id</w:t>
+            </w:r>
+            <w:r>
+              <w:rPr>
+                <w:sz w:val="19"/>
+                <w:szCs w:val="19"/>
+              </w:rPr>
+              <w:t xml:space="preserve">, </w:t>
+            </w:r>
+            <w:r>
+              <w:rPr>
+                <w:rFonts w:ascii="Consolas" w:cs="Consolas" w:eastAsia="Consolas" w:hAnsi="Consolas"/>
+                <w:color w:val="24292F"/>
+                <w:sz w:val="19"/>
+                <w:szCs w:val="19"/>
+              </w:rPr>
+              <w:t xml:space="preserve">format</w:t>
+            </w:r>
+            <w:r>
+              <w:rPr>
+                <w:sz w:val="19"/>
+                <w:szCs w:val="19"/>
+              </w:rPr>
+              <w:t xml:space="preserve"> ("wav"), </w:t>
+            </w:r>
+            <w:r>
+              <w:rPr>
+                <w:rFonts w:ascii="Consolas" w:cs="Consolas" w:eastAsia="Consolas" w:hAnsi="Consolas"/>
+                <w:color w:val="24292F"/>
+                <w:sz w:val="19"/>
+                <w:szCs w:val="19"/>
+              </w:rPr>
+              <w:t xml:space="preserve">audio_base64</w:t>
+            </w:r>
+          </w:p>
+        </w:tc>
+        <w:tc>
+          <w:tcPr>
+            <w:tcW w:type="dxa" w:w="3182"/>
+            <w:tcBorders>
+              <w:top w:val="single" w:color="C9D1D9" w:sz="4"/>
+              <w:left w:val="single" w:color="C9D1D9" w:sz="4"/>
+              <w:bottom w:val="single" w:color="C9D1D9" w:sz="4"/>
+              <w:right w:val="single" w:color="C9D1D9" w:sz="4"/>
+            </w:tcBorders>
+            <w:tcMar>
+              <w:top w:type="dxa" w:w="60"/>
+              <w:left w:type="dxa" w:w="100"/>
+              <w:bottom w:type="dxa" w:w="60"/>
+              <w:right w:type="dxa" w:w="100"/>
+            </w:tcMar>
+          </w:tcPr>
+          <w:p>
+            <w:pPr>
+              <w:spacing w:after="40" w:line="252"/>
+            </w:pPr>
+            <w:r>
+              <w:rPr>
+                <w:sz w:val="19"/>
+                <w:szCs w:val="19"/>
+              </w:rPr>
+              <w:t xml:space="preserve">The translation spoken in the listener's language. Sent only when </w:t>
+            </w:r>
+            <w:r>
+              <w:rPr>
+                <w:rFonts w:ascii="Consolas" w:cs="Consolas" w:eastAsia="Consolas" w:hAnsi="Consolas"/>
+                <w:color w:val="24292F"/>
+                <w:sz w:val="19"/>
+                <w:szCs w:val="19"/>
+              </w:rPr>
+              <w:t xml:space="preserve">session.ready</w:t>
+            </w:r>
+            <w:r>
+              <w:rPr>
+                <w:sz w:val="19"/>
+                <w:szCs w:val="19"/>
+              </w:rPr>
+              <w:t xml:space="preserve"> has </w:t>
+            </w:r>
+            <w:r>
+              <w:rPr>
+                <w:rFonts w:ascii="Consolas" w:cs="Consolas" w:eastAsia="Consolas" w:hAnsi="Consolas"/>
+                <w:color w:val="24292F"/>
+                <w:sz w:val="19"/>
+                <w:szCs w:val="19"/>
+              </w:rPr>
+              <w:t xml:space="preserve">server_voice: true</w:t>
+            </w:r>
+            <w:r>
+              <w:rPr>
+                <w:sz w:val="19"/>
+                <w:szCs w:val="19"/>
+              </w:rPr>
+              <w:t xml:space="preserve">.</w:t>
             </w:r>
           </w:p>
         </w:tc>
@@ -10269,7 +10111,7 @@
                 <w:sz w:val="19"/>
                 <w:szCs w:val="19"/>
               </w:rPr>
-              <w:t xml:space="preserve">tts.audio</w:t>
+              <w:t xml:space="preserve">error</w:t>
             </w:r>
           </w:p>
         </w:tc>
@@ -10298,7 +10140,7 @@
                 <w:sz w:val="19"/>
                 <w:szCs w:val="19"/>
               </w:rPr>
-              <w:t xml:space="preserve">1E</w:t>
+              <w:t xml:space="preserve">1B</w:t>
             </w:r>
           </w:p>
         </w:tc>
@@ -10329,7 +10171,7 @@
                 <w:sz w:val="19"/>
                 <w:szCs w:val="19"/>
               </w:rPr>
-              <w:t xml:space="preserve">utterance_id</w:t>
+              <w:t xml:space="preserve">code</w:t>
             </w:r>
             <w:r>
               <w:rPr>
@@ -10345,7 +10187,7 @@
                 <w:sz w:val="19"/>
                 <w:szCs w:val="19"/>
               </w:rPr>
-              <w:t xml:space="preserve">listener_id</w:t>
+              <w:t xml:space="preserve">message</w:t>
             </w:r>
             <w:r>
               <w:rPr>
@@ -10361,14 +10203,14 @@
                 <w:sz w:val="19"/>
                 <w:szCs w:val="19"/>
               </w:rPr>
-              <w:t xml:space="preserve">format</w:t>
-            </w:r>
-            <w:r>
-              <w:rPr>
-                <w:sz w:val="19"/>
-                <w:szCs w:val="19"/>
-              </w:rPr>
-              <w:t xml:space="preserve"> ("wav"), </w:t>
+              <w:t xml:space="preserve">retryable</w:t>
+            </w:r>
+            <w:r>
+              <w:rPr>
+                <w:sz w:val="19"/>
+                <w:szCs w:val="19"/>
+              </w:rPr>
+              <w:t xml:space="preserve">, </w:t>
             </w:r>
             <w:r>
               <w:rPr>
@@ -10377,7 +10219,14 @@
                 <w:sz w:val="19"/>
                 <w:szCs w:val="19"/>
               </w:rPr>
-              <w:t xml:space="preserve">audio_base64</w:t>
+              <w:t xml:space="preserve">utterance_id</w:t>
+            </w:r>
+            <w:r>
+              <w:rPr>
+                <w:sz w:val="19"/>
+                <w:szCs w:val="19"/>
+              </w:rPr>
+              <w:t xml:space="preserve"> (or null)</w:t>
             </w:r>
           </w:p>
         </w:tc>
@@ -10406,7 +10255,7 @@
                 <w:sz w:val="19"/>
                 <w:szCs w:val="19"/>
               </w:rPr>
-              <w:t xml:space="preserve">The translation spoken in the listener's language. Sent only when </w:t>
+              <w:t xml:space="preserve">Something went wrong. Show </w:t>
             </w:r>
             <w:r>
               <w:rPr>
@@ -10415,215 +10264,6 @@
                 <w:sz w:val="19"/>
                 <w:szCs w:val="19"/>
               </w:rPr>
-              <w:t xml:space="preserve">session.ready</w:t>
-            </w:r>
-            <w:r>
-              <w:rPr>
-                <w:sz w:val="19"/>
-                <w:szCs w:val="19"/>
-              </w:rPr>
-              <w:t xml:space="preserve"> has </w:t>
-            </w:r>
-            <w:r>
-              <w:rPr>
-                <w:rFonts w:ascii="Consolas" w:cs="Consolas" w:eastAsia="Consolas" w:hAnsi="Consolas"/>
-                <w:color w:val="24292F"/>
-                <w:sz w:val="19"/>
-                <w:szCs w:val="19"/>
-              </w:rPr>
-              <w:t xml:space="preserve">server_voice: true</w:t>
-            </w:r>
-            <w:r>
-              <w:rPr>
-                <w:sz w:val="19"/>
-                <w:szCs w:val="19"/>
-              </w:rPr>
-              <w:t xml:space="preserve">.</w:t>
-            </w:r>
-          </w:p>
-        </w:tc>
-      </w:tr>
-      <w:tr>
-        <w:tc>
-          <w:tcPr>
-            <w:tcW w:type="dxa" w:w="2409"/>
-            <w:tcBorders>
-              <w:top w:val="single" w:color="C9D1D9" w:sz="4"/>
-              <w:left w:val="single" w:color="C9D1D9" w:sz="4"/>
-              <w:bottom w:val="single" w:color="C9D1D9" w:sz="4"/>
-              <w:right w:val="single" w:color="C9D1D9" w:sz="4"/>
-            </w:tcBorders>
-            <w:tcMar>
-              <w:top w:type="dxa" w:w="60"/>
-              <w:left w:type="dxa" w:w="100"/>
-              <w:bottom w:type="dxa" w:w="60"/>
-              <w:right w:type="dxa" w:w="100"/>
-            </w:tcMar>
-          </w:tcPr>
-          <w:p>
-            <w:pPr>
-              <w:spacing w:after="40" w:line="252"/>
-            </w:pPr>
-            <w:r>
-              <w:rPr>
-                <w:rFonts w:ascii="Consolas" w:cs="Consolas" w:eastAsia="Consolas" w:hAnsi="Consolas"/>
-                <w:color w:val="24292F"/>
-                <w:sz w:val="19"/>
-                <w:szCs w:val="19"/>
-              </w:rPr>
-              <w:t xml:space="preserve">error</w:t>
-            </w:r>
-          </w:p>
-        </w:tc>
-        <w:tc>
-          <w:tcPr>
-            <w:tcW w:type="dxa" w:w="578"/>
-            <w:tcBorders>
-              <w:top w:val="single" w:color="C9D1D9" w:sz="4"/>
-              <w:left w:val="single" w:color="C9D1D9" w:sz="4"/>
-              <w:bottom w:val="single" w:color="C9D1D9" w:sz="4"/>
-              <w:right w:val="single" w:color="C9D1D9" w:sz="4"/>
-            </w:tcBorders>
-            <w:tcMar>
-              <w:top w:type="dxa" w:w="60"/>
-              <w:left w:type="dxa" w:w="100"/>
-              <w:bottom w:type="dxa" w:w="60"/>
-              <w:right w:type="dxa" w:w="100"/>
-            </w:tcMar>
-          </w:tcPr>
-          <w:p>
-            <w:pPr>
-              <w:spacing w:after="40" w:line="252"/>
-            </w:pPr>
-            <w:r>
-              <w:rPr>
-                <w:sz w:val="19"/>
-                <w:szCs w:val="19"/>
-              </w:rPr>
-              <w:t xml:space="preserve">1B</w:t>
-            </w:r>
-          </w:p>
-        </w:tc>
-        <w:tc>
-          <w:tcPr>
-            <w:tcW w:type="dxa" w:w="3469"/>
-            <w:tcBorders>
-              <w:top w:val="single" w:color="C9D1D9" w:sz="4"/>
-              <w:left w:val="single" w:color="C9D1D9" w:sz="4"/>
-              <w:bottom w:val="single" w:color="C9D1D9" w:sz="4"/>
-              <w:right w:val="single" w:color="C9D1D9" w:sz="4"/>
-            </w:tcBorders>
-            <w:tcMar>
-              <w:top w:type="dxa" w:w="60"/>
-              <w:left w:type="dxa" w:w="100"/>
-              <w:bottom w:type="dxa" w:w="60"/>
-              <w:right w:type="dxa" w:w="100"/>
-            </w:tcMar>
-          </w:tcPr>
-          <w:p>
-            <w:pPr>
-              <w:spacing w:after="40" w:line="252"/>
-            </w:pPr>
-            <w:r>
-              <w:rPr>
-                <w:rFonts w:ascii="Consolas" w:cs="Consolas" w:eastAsia="Consolas" w:hAnsi="Consolas"/>
-                <w:color w:val="24292F"/>
-                <w:sz w:val="19"/>
-                <w:szCs w:val="19"/>
-              </w:rPr>
-              <w:t xml:space="preserve">code</w:t>
-            </w:r>
-            <w:r>
-              <w:rPr>
-                <w:sz w:val="19"/>
-                <w:szCs w:val="19"/>
-              </w:rPr>
-              <w:t xml:space="preserve">, </w:t>
-            </w:r>
-            <w:r>
-              <w:rPr>
-                <w:rFonts w:ascii="Consolas" w:cs="Consolas" w:eastAsia="Consolas" w:hAnsi="Consolas"/>
-                <w:color w:val="24292F"/>
-                <w:sz w:val="19"/>
-                <w:szCs w:val="19"/>
-              </w:rPr>
-              <w:t xml:space="preserve">message</w:t>
-            </w:r>
-            <w:r>
-              <w:rPr>
-                <w:sz w:val="19"/>
-                <w:szCs w:val="19"/>
-              </w:rPr>
-              <w:t xml:space="preserve">, </w:t>
-            </w:r>
-            <w:r>
-              <w:rPr>
-                <w:rFonts w:ascii="Consolas" w:cs="Consolas" w:eastAsia="Consolas" w:hAnsi="Consolas"/>
-                <w:color w:val="24292F"/>
-                <w:sz w:val="19"/>
-                <w:szCs w:val="19"/>
-              </w:rPr>
-              <w:t xml:space="preserve">retryable</w:t>
-            </w:r>
-            <w:r>
-              <w:rPr>
-                <w:sz w:val="19"/>
-                <w:szCs w:val="19"/>
-              </w:rPr>
-              <w:t xml:space="preserve">, </w:t>
-            </w:r>
-            <w:r>
-              <w:rPr>
-                <w:rFonts w:ascii="Consolas" w:cs="Consolas" w:eastAsia="Consolas" w:hAnsi="Consolas"/>
-                <w:color w:val="24292F"/>
-                <w:sz w:val="19"/>
-                <w:szCs w:val="19"/>
-              </w:rPr>
-              <w:t xml:space="preserve">utterance_id</w:t>
-            </w:r>
-            <w:r>
-              <w:rPr>
-                <w:sz w:val="19"/>
-                <w:szCs w:val="19"/>
-              </w:rPr>
-              <w:t xml:space="preserve"> (or null)</w:t>
-            </w:r>
-          </w:p>
-        </w:tc>
-        <w:tc>
-          <w:tcPr>
-            <w:tcW w:type="dxa" w:w="3182"/>
-            <w:tcBorders>
-              <w:top w:val="single" w:color="C9D1D9" w:sz="4"/>
-              <w:left w:val="single" w:color="C9D1D9" w:sz="4"/>
-              <w:bottom w:val="single" w:color="C9D1D9" w:sz="4"/>
-              <w:right w:val="single" w:color="C9D1D9" w:sz="4"/>
-            </w:tcBorders>
-            <w:tcMar>
-              <w:top w:type="dxa" w:w="60"/>
-              <w:left w:type="dxa" w:w="100"/>
-              <w:bottom w:type="dxa" w:w="60"/>
-              <w:right w:type="dxa" w:w="100"/>
-            </w:tcMar>
-          </w:tcPr>
-          <w:p>
-            <w:pPr>
-              <w:spacing w:after="40" w:line="252"/>
-            </w:pPr>
-            <w:r>
-              <w:rPr>
-                <w:sz w:val="19"/>
-                <w:szCs w:val="19"/>
-              </w:rPr>
-              <w:t xml:space="preserve">Something went wrong. Show </w:t>
-            </w:r>
-            <w:r>
-              <w:rPr>
-                <w:rFonts w:ascii="Consolas" w:cs="Consolas" w:eastAsia="Consolas" w:hAnsi="Consolas"/>
-                <w:color w:val="24292F"/>
-                <w:sz w:val="19"/>
-                <w:szCs w:val="19"/>
-              </w:rPr>
               <w:t xml:space="preserve">message</w:t>
             </w:r>
             <w:r>
@@ -10641,6 +10281,114 @@
       <w:pPr>
         <w:spacing w:after="120"/>
       </w:pPr>
+    </w:p>
+    <w:p>
+      <w:pPr>
+        <w:pStyle w:val="Heading3"/>
+        <w:spacing w:after="80" w:before="200"/>
+      </w:pPr>
+      <w:r>
+        <w:t xml:space="preserve">Who spoke</w:t>
+      </w:r>
+    </w:p>
+    <w:p>
+      <w:pPr>
+        <w:pStyle w:val="ListParagraph"/>
+        <w:numPr>
+          <w:ilvl w:val="0"/>
+          <w:numId w:val="2"/>
+        </w:numPr>
+        <w:spacing w:after="60" w:line="276"/>
+      </w:pPr>
+      <w:r>
+        <w:t xml:space="preserve">The language heard matches one person's chosen language: that person is the speaker and the other person gets one </w:t>
+      </w:r>
+      <w:r>
+        <w:rPr>
+          <w:rFonts w:ascii="Consolas" w:cs="Consolas" w:eastAsia="Consolas" w:hAnsi="Consolas"/>
+          <w:color w:val="24292F"/>
+          <w:sz w:val="19"/>
+          <w:szCs w:val="19"/>
+        </w:rPr>
+        <w:t xml:space="preserve">translation.final</w:t>
+      </w:r>
+      <w:r>
+        <w:t xml:space="preserve">.</w:t>
+      </w:r>
+    </w:p>
+    <w:p>
+      <w:pPr>
+        <w:pStyle w:val="ListParagraph"/>
+        <w:numPr>
+          <w:ilvl w:val="0"/>
+          <w:numId w:val="2"/>
+        </w:numPr>
+        <w:spacing w:after="60" w:line="276"/>
+      </w:pPr>
+      <w:r>
+        <w:t xml:space="preserve">A third language: </w:t>
+      </w:r>
+      <w:r>
+        <w:rPr>
+          <w:rFonts w:ascii="Consolas" w:cs="Consolas" w:eastAsia="Consolas" w:hAnsi="Consolas"/>
+          <w:color w:val="24292F"/>
+          <w:sz w:val="19"/>
+          <w:szCs w:val="19"/>
+        </w:rPr>
+        <w:t xml:space="preserve">speaker_id</w:t>
+      </w:r>
+      <w:r>
+        <w:t xml:space="preserve"> is null and both people get a </w:t>
+      </w:r>
+      <w:r>
+        <w:rPr>
+          <w:rFonts w:ascii="Consolas" w:cs="Consolas" w:eastAsia="Consolas" w:hAnsi="Consolas"/>
+          <w:color w:val="24292F"/>
+          <w:sz w:val="19"/>
+          <w:szCs w:val="19"/>
+        </w:rPr>
+        <w:t xml:space="preserve">translation.final</w:t>
+      </w:r>
+      <w:r>
+        <w:t xml:space="preserve"> in their own language.</w:t>
+      </w:r>
+    </w:p>
+    <w:p>
+      <w:pPr>
+        <w:pStyle w:val="ListParagraph"/>
+        <w:numPr>
+          <w:ilvl w:val="0"/>
+          <w:numId w:val="2"/>
+        </w:numPr>
+        <w:spacing w:after="60" w:line="276"/>
+      </w:pPr>
+      <w:r>
+        <w:t xml:space="preserve">Both people chose that language: </w:t>
+      </w:r>
+      <w:r>
+        <w:rPr>
+          <w:rFonts w:ascii="Consolas" w:cs="Consolas" w:eastAsia="Consolas" w:hAnsi="Consolas"/>
+          <w:color w:val="24292F"/>
+          <w:sz w:val="19"/>
+          <w:szCs w:val="19"/>
+        </w:rPr>
+        <w:t xml:space="preserve">speaker_id</w:t>
+      </w:r>
+      <w:r>
+        <w:t xml:space="preserve"> is null and only </w:t>
+      </w:r>
+      <w:r>
+        <w:rPr>
+          <w:rFonts w:ascii="Consolas" w:cs="Consolas" w:eastAsia="Consolas" w:hAnsi="Consolas"/>
+          <w:color w:val="24292F"/>
+          <w:sz w:val="19"/>
+          <w:szCs w:val="19"/>
+        </w:rPr>
+        <w:t xml:space="preserve">transcript.final</w:t>
+      </w:r>
+      <w:r>
+        <w:t xml:space="preserve"> is sent.</w:t>
+      </w:r>
     </w:p>
     <w:p>
       <w:pPr>
@@ -10667,7 +10415,7 @@
           <w:sz w:val="18"/>
           <w:szCs w:val="18"/>
         </w:rPr>
-        <w:t xml:space="preserve">-&gt; {"type":"utterance.start","utterance_id":"7c9e6679-7425-40de-944b-e07fc1f90ae7","speaker_id":"B","spoken_language":null}</w:t>
+        <w:t xml:space="preserve">-&gt; (binary audio frames, about 100 ms each, continuously)</w:t>
       </w:r>
     </w:p>
     <w:p>
@@ -10686,7 +10434,7 @@
           <w:sz w:val="18"/>
           <w:szCs w:val="18"/>
         </w:rPr>
-        <w:t xml:space="preserve">-&gt; (binary audio frames, about 100 ms each)</w:t>
+        <w:t xml:space="preserve">&lt;- {"type":"utterance.received","seq":2,"utterance_id":"7c9e6679-7425-40de-944b-e07fc1f90ae7","duration_ms":2100}</w:t>
       </w:r>
     </w:p>
     <w:p>
@@ -10705,7 +10453,7 @@
           <w:sz w:val="18"/>
           <w:szCs w:val="18"/>
         </w:rPr>
-        <w:t xml:space="preserve">-&gt; {"type":"utterance.end","utterance_id":"7c9e6679-7425-40de-944b-e07fc1f90ae7"}</w:t>
+        <w:t xml:space="preserve">&lt;- {"type":"transcript.final","seq":3,"utterance_id":"7c9e6679-7425-40de-944b-e07fc1f90ae7","speaker_id":"B",</w:t>
       </w:r>
     </w:p>
     <w:p>
@@ -10724,7 +10472,7 @@
           <w:sz w:val="18"/>
           <w:szCs w:val="18"/>
         </w:rPr>
-        <w:t xml:space="preserve">&lt;- {"type":"utterance.received","seq":4,"utterance_id":"7c9e6679-7425-40de-944b-e07fc1f90ae7","speaker_id":"B","duration_ms":2100}</w:t>
+        <w:t xml:space="preserve">    "text":"మీరు ఎలా ఉన్నారు?","language":"te","language_name":"Telugu"}</w:t>
       </w:r>
     </w:p>
     <w:p>
@@ -10743,45 +10491,7 @@
           <w:sz w:val="18"/>
           <w:szCs w:val="18"/>
         </w:rPr>
-        <w:t xml:space="preserve">&lt;- {"type":"transcript.final","seq":5,"utterance_id":"7c9e6679-7425-40de-944b-e07fc1f90ae7","speaker_id":"B",</w:t>
-      </w:r>
-    </w:p>
-    <w:p>
-      <w:pPr>
-        <w:pBdr>
-          <w:left w:val="single" w:color="0969DA" w:sz="12" w:space="6"/>
-        </w:pBdr>
-        <w:shd w:fill="F6F8FA" w:color="auto" w:val="clear"/>
-        <w:spacing w:after="0" w:before="0" w:line="252"/>
-        <w:ind w:left="180"/>
-      </w:pPr>
-      <w:r>
-        <w:rPr>
-          <w:rFonts w:ascii="Consolas" w:cs="Consolas" w:eastAsia="Consolas" w:hAnsi="Consolas"/>
-          <w:color w:val="24292F"/>
-          <w:sz w:val="18"/>
-          <w:szCs w:val="18"/>
-        </w:rPr>
-        <w:t xml:space="preserve">    "text":"మీరు ఎలా ఉన్నారు?","language":"te","language_name":"Telugu"}</w:t>
-      </w:r>
-    </w:p>
-    <w:p>
-      <w:pPr>
-        <w:pBdr>
-          <w:left w:val="single" w:color="0969DA" w:sz="12" w:space="6"/>
-        </w:pBdr>
-        <w:shd w:fill="F6F8FA" w:color="auto" w:val="clear"/>
-        <w:spacing w:after="0" w:before="0" w:line="252"/>
-        <w:ind w:left="180"/>
-      </w:pPr>
-      <w:r>
-        <w:rPr>
-          <w:rFonts w:ascii="Consolas" w:cs="Consolas" w:eastAsia="Consolas" w:hAnsi="Consolas"/>
-          <w:color w:val="24292F"/>
-          <w:sz w:val="18"/>
-          <w:szCs w:val="18"/>
-        </w:rPr>
-        <w:t xml:space="preserve">&lt;- {"type":"translation.final","seq":6,"utterance_id":"7c9e6679-7425-40de-944b-e07fc1f90ae7","speaker_id":"B",</w:t>
+        <w:t xml:space="preserve">&lt;- {"type":"translation.final","seq":4,"utterance_id":"7c9e6679-7425-40de-944b-e07fc1f90ae7","speaker_id":"B",</w:t>
       </w:r>
     </w:p>
     <w:p>
@@ -10800,7 +10510,7 @@
           <w:sz w:val="18"/>
           <w:szCs w:val="18"/>
         </w:rPr>
-        <w:t xml:space="preserve">    "listener_id":"A","target_language":"en","text":"How are you?","translated":true}</w:t>
+        <w:t xml:space="preserve">    "listener_id":"A","target_language":"en","text":"How are you?"}</w:t>
       </w:r>
     </w:p>
     <w:p>
@@ -11032,7 +10742,7 @@
                 <w:sz w:val="19"/>
                 <w:szCs w:val="19"/>
               </w:rPr>
-              <w:t xml:space="preserve">, missing or extra fields, a second open utterance, or a malformed audio frame.</w:t>
+              <w:t xml:space="preserve">, too large, or a malformed audio frame.</w:t>
             </w:r>
           </w:p>
         </w:tc>
@@ -11123,7 +10833,7 @@
                 <w:sz w:val="19"/>
                 <w:szCs w:val="19"/>
               </w:rPr>
-              <w:t xml:space="preserve">The session id does not exist (also socket close code 4404).</w:t>
+              <w:t xml:space="preserve">The session id does not exist, has expired or is already open (also socket close code 4404).</w:t>
             </w:r>
           </w:p>
         </w:tc>
@@ -11156,7 +10866,7 @@
                 <w:sz w:val="19"/>
                 <w:szCs w:val="19"/>
               </w:rPr>
-              <w:t xml:space="preserve">no_active_utterance</w:t>
+              <w:t xml:space="preserve">provider_unavailable</w:t>
             </w:r>
           </w:p>
         </w:tc>
@@ -11185,7 +10895,7 @@
                 <w:sz w:val="19"/>
                 <w:szCs w:val="19"/>
               </w:rPr>
-              <w:t xml:space="preserve">no</w:t>
+              <w:t xml:space="preserve">depends</w:t>
             </w:r>
           </w:p>
         </w:tc>
@@ -11214,8 +10924,32 @@
                 <w:sz w:val="19"/>
                 <w:szCs w:val="19"/>
               </w:rPr>
-              <w:t xml:space="preserve">Audio or </w:t>
-            </w:r>
+              <w:t xml:space="preserve">The speech service could not be reached, timed out, did not translate the sentence, or is not set up.</w:t>
+            </w:r>
+          </w:p>
+        </w:tc>
+      </w:tr>
+      <w:tr>
+        <w:tc>
+          <w:tcPr>
+            <w:tcW w:type="dxa" w:w="2698"/>
+            <w:tcBorders>
+              <w:top w:val="single" w:color="C9D1D9" w:sz="4"/>
+              <w:left w:val="single" w:color="C9D1D9" w:sz="4"/>
+              <w:bottom w:val="single" w:color="C9D1D9" w:sz="4"/>
+              <w:right w:val="single" w:color="C9D1D9" w:sz="4"/>
+            </w:tcBorders>
+            <w:tcMar>
+              <w:top w:type="dxa" w:w="60"/>
+              <w:left w:type="dxa" w:w="100"/>
+              <w:bottom w:type="dxa" w:w="60"/>
+              <w:right w:type="dxa" w:w="100"/>
+            </w:tcMar>
+          </w:tcPr>
+          <w:p>
+            <w:pPr>
+              <w:spacing w:after="40" w:line="252"/>
+            </w:pPr>
             <w:r>
               <w:rPr>
                 <w:rFonts w:ascii="Consolas" w:cs="Consolas" w:eastAsia="Consolas" w:hAnsi="Consolas"/>
@@ -11223,14 +10957,65 @@
                 <w:sz w:val="19"/>
                 <w:szCs w:val="19"/>
               </w:rPr>
-              <w:t xml:space="preserve">utterance.end</w:t>
-            </w:r>
-            <w:r>
-              <w:rPr>
-                <w:sz w:val="19"/>
-                <w:szCs w:val="19"/>
-              </w:rPr>
-              <w:t xml:space="preserve"> arrived without an open utterance.</w:t>
+              <w:t xml:space="preserve">quota_exceeded</w:t>
+            </w:r>
+          </w:p>
+        </w:tc>
+        <w:tc>
+          <w:tcPr>
+            <w:tcW w:type="dxa" w:w="1349"/>
+            <w:tcBorders>
+              <w:top w:val="single" w:color="C9D1D9" w:sz="4"/>
+              <w:left w:val="single" w:color="C9D1D9" w:sz="4"/>
+              <w:bottom w:val="single" w:color="C9D1D9" w:sz="4"/>
+              <w:right w:val="single" w:color="C9D1D9" w:sz="4"/>
+            </w:tcBorders>
+            <w:tcMar>
+              <w:top w:type="dxa" w:w="60"/>
+              <w:left w:type="dxa" w:w="100"/>
+              <w:bottom w:type="dxa" w:w="60"/>
+              <w:right w:type="dxa" w:w="100"/>
+            </w:tcMar>
+          </w:tcPr>
+          <w:p>
+            <w:pPr>
+              <w:spacing w:after="40" w:line="252"/>
+            </w:pPr>
+            <w:r>
+              <w:rPr>
+                <w:sz w:val="19"/>
+                <w:szCs w:val="19"/>
+              </w:rPr>
+              <w:t xml:space="preserve">yes, later</w:t>
+            </w:r>
+          </w:p>
+        </w:tc>
+        <w:tc>
+          <w:tcPr>
+            <w:tcW w:type="dxa" w:w="5591"/>
+            <w:tcBorders>
+              <w:top w:val="single" w:color="C9D1D9" w:sz="4"/>
+              <w:left w:val="single" w:color="C9D1D9" w:sz="4"/>
+              <w:bottom w:val="single" w:color="C9D1D9" w:sz="4"/>
+              <w:right w:val="single" w:color="C9D1D9" w:sz="4"/>
+            </w:tcBorders>
+            <w:tcMar>
+              <w:top w:type="dxa" w:w="60"/>
+              <w:left w:type="dxa" w:w="100"/>
+              <w:bottom w:type="dxa" w:w="60"/>
+              <w:right w:type="dxa" w:w="100"/>
+            </w:tcMar>
+          </w:tcPr>
+          <w:p>
+            <w:pPr>
+              <w:spacing w:after="40" w:line="252"/>
+            </w:pPr>
+            <w:r>
+              <w:rPr>
+                <w:sz w:val="19"/>
+                <w:szCs w:val="19"/>
+              </w:rPr>
+              <w:t xml:space="preserve">The free-tier limit was reached. Try again later.</w:t>
             </w:r>
           </w:p>
         </w:tc>
@@ -11263,7 +11048,7 @@
                 <w:sz w:val="19"/>
                 <w:szCs w:val="19"/>
               </w:rPr>
-              <w:t xml:space="preserve">audio_too_short</w:t>
+              <w:t xml:space="preserve">voice_unavailable</w:t>
             </w:r>
           </w:p>
         </w:tc>
@@ -11321,7 +11106,7 @@
                 <w:sz w:val="19"/>
                 <w:szCs w:val="19"/>
               </w:rPr>
-              <w:t xml:space="preserve">Less than 0.3 s of audio, or only silence.</w:t>
+              <w:t xml:space="preserve">The server could not make this voice. Use the browser voice or captions only.</w:t>
             </w:r>
           </w:p>
         </w:tc>
@@ -11354,7 +11139,7 @@
                 <w:sz w:val="19"/>
                 <w:szCs w:val="19"/>
               </w:rPr>
-              <w:t xml:space="preserve">audio_too_long</w:t>
+              <w:t xml:space="preserve">internal_error</w:t>
             </w:r>
           </w:p>
         </w:tc>
@@ -11383,7 +11168,7 @@
                 <w:sz w:val="19"/>
                 <w:szCs w:val="19"/>
               </w:rPr>
-              <w:t xml:space="preserve">no</w:t>
+              <w:t xml:space="preserve">yes</w:t>
             </w:r>
           </w:p>
         </w:tc>
@@ -11412,462 +11197,7 @@
                 <w:sz w:val="19"/>
                 <w:szCs w:val="19"/>
               </w:rPr>
-              <w:t xml:space="preserve">More than 30 s of audio in one utterance.</w:t>
-            </w:r>
-          </w:p>
-        </w:tc>
-      </w:tr>
-      <w:tr>
-        <w:tc>
-          <w:tcPr>
-            <w:tcW w:type="dxa" w:w="2698"/>
-            <w:tcBorders>
-              <w:top w:val="single" w:color="C9D1D9" w:sz="4"/>
-              <w:left w:val="single" w:color="C9D1D9" w:sz="4"/>
-              <w:bottom w:val="single" w:color="C9D1D9" w:sz="4"/>
-              <w:right w:val="single" w:color="C9D1D9" w:sz="4"/>
-            </w:tcBorders>
-            <w:tcMar>
-              <w:top w:type="dxa" w:w="60"/>
-              <w:left w:type="dxa" w:w="100"/>
-              <w:bottom w:type="dxa" w:w="60"/>
-              <w:right w:type="dxa" w:w="100"/>
-            </w:tcMar>
-          </w:tcPr>
-          <w:p>
-            <w:pPr>
-              <w:spacing w:after="40" w:line="252"/>
-            </w:pPr>
-            <w:r>
-              <w:rPr>
-                <w:rFonts w:ascii="Consolas" w:cs="Consolas" w:eastAsia="Consolas" w:hAnsi="Consolas"/>
-                <w:color w:val="24292F"/>
-                <w:sz w:val="19"/>
-                <w:szCs w:val="19"/>
-              </w:rPr>
-              <w:t xml:space="preserve">unsupported_language</w:t>
-            </w:r>
-          </w:p>
-        </w:tc>
-        <w:tc>
-          <w:tcPr>
-            <w:tcW w:type="dxa" w:w="1349"/>
-            <w:tcBorders>
-              <w:top w:val="single" w:color="C9D1D9" w:sz="4"/>
-              <w:left w:val="single" w:color="C9D1D9" w:sz="4"/>
-              <w:bottom w:val="single" w:color="C9D1D9" w:sz="4"/>
-              <w:right w:val="single" w:color="C9D1D9" w:sz="4"/>
-            </w:tcBorders>
-            <w:tcMar>
-              <w:top w:type="dxa" w:w="60"/>
-              <w:left w:type="dxa" w:w="100"/>
-              <w:bottom w:type="dxa" w:w="60"/>
-              <w:right w:type="dxa" w:w="100"/>
-            </w:tcMar>
-          </w:tcPr>
-          <w:p>
-            <w:pPr>
-              <w:spacing w:after="40" w:line="252"/>
-            </w:pPr>
-            <w:r>
-              <w:rPr>
-                <w:sz w:val="19"/>
-                <w:szCs w:val="19"/>
-              </w:rPr>
-              <w:t xml:space="preserve">no</w:t>
-            </w:r>
-          </w:p>
-        </w:tc>
-        <w:tc>
-          <w:tcPr>
-            <w:tcW w:type="dxa" w:w="5591"/>
-            <w:tcBorders>
-              <w:top w:val="single" w:color="C9D1D9" w:sz="4"/>
-              <w:left w:val="single" w:color="C9D1D9" w:sz="4"/>
-              <w:bottom w:val="single" w:color="C9D1D9" w:sz="4"/>
-              <w:right w:val="single" w:color="C9D1D9" w:sz="4"/>
-            </w:tcBorders>
-            <w:tcMar>
-              <w:top w:type="dxa" w:w="60"/>
-              <w:left w:type="dxa" w:w="100"/>
-              <w:bottom w:type="dxa" w:w="60"/>
-              <w:right w:type="dxa" w:w="100"/>
-            </w:tcMar>
-          </w:tcPr>
-          <w:p>
-            <w:pPr>
-              <w:spacing w:after="40" w:line="252"/>
-            </w:pPr>
-            <w:r>
-              <w:rPr>
-                <w:sz w:val="19"/>
-                <w:szCs w:val="19"/>
-              </w:rPr>
-              <w:t xml:space="preserve">The detected or requested language is not in the list.</w:t>
-            </w:r>
-          </w:p>
-        </w:tc>
-      </w:tr>
-      <w:tr>
-        <w:tc>
-          <w:tcPr>
-            <w:tcW w:type="dxa" w:w="2698"/>
-            <w:tcBorders>
-              <w:top w:val="single" w:color="C9D1D9" w:sz="4"/>
-              <w:left w:val="single" w:color="C9D1D9" w:sz="4"/>
-              <w:bottom w:val="single" w:color="C9D1D9" w:sz="4"/>
-              <w:right w:val="single" w:color="C9D1D9" w:sz="4"/>
-            </w:tcBorders>
-            <w:tcMar>
-              <w:top w:type="dxa" w:w="60"/>
-              <w:left w:type="dxa" w:w="100"/>
-              <w:bottom w:type="dxa" w:w="60"/>
-              <w:right w:type="dxa" w:w="100"/>
-            </w:tcMar>
-          </w:tcPr>
-          <w:p>
-            <w:pPr>
-              <w:spacing w:after="40" w:line="252"/>
-            </w:pPr>
-            <w:r>
-              <w:rPr>
-                <w:rFonts w:ascii="Consolas" w:cs="Consolas" w:eastAsia="Consolas" w:hAnsi="Consolas"/>
-                <w:color w:val="24292F"/>
-                <w:sz w:val="19"/>
-                <w:szCs w:val="19"/>
-              </w:rPr>
-              <w:t xml:space="preserve">provider_unavailable</w:t>
-            </w:r>
-          </w:p>
-        </w:tc>
-        <w:tc>
-          <w:tcPr>
-            <w:tcW w:type="dxa" w:w="1349"/>
-            <w:tcBorders>
-              <w:top w:val="single" w:color="C9D1D9" w:sz="4"/>
-              <w:left w:val="single" w:color="C9D1D9" w:sz="4"/>
-              <w:bottom w:val="single" w:color="C9D1D9" w:sz="4"/>
-              <w:right w:val="single" w:color="C9D1D9" w:sz="4"/>
-            </w:tcBorders>
-            <w:tcMar>
-              <w:top w:type="dxa" w:w="60"/>
-              <w:left w:type="dxa" w:w="100"/>
-              <w:bottom w:type="dxa" w:w="60"/>
-              <w:right w:type="dxa" w:w="100"/>
-            </w:tcMar>
-          </w:tcPr>
-          <w:p>
-            <w:pPr>
-              <w:spacing w:after="40" w:line="252"/>
-            </w:pPr>
-            <w:r>
-              <w:rPr>
-                <w:sz w:val="19"/>
-                <w:szCs w:val="19"/>
-              </w:rPr>
-              <w:t xml:space="preserve">yes</w:t>
-            </w:r>
-          </w:p>
-        </w:tc>
-        <w:tc>
-          <w:tcPr>
-            <w:tcW w:type="dxa" w:w="5591"/>
-            <w:tcBorders>
-              <w:top w:val="single" w:color="C9D1D9" w:sz="4"/>
-              <w:left w:val="single" w:color="C9D1D9" w:sz="4"/>
-              <w:bottom w:val="single" w:color="C9D1D9" w:sz="4"/>
-              <w:right w:val="single" w:color="C9D1D9" w:sz="4"/>
-            </w:tcBorders>
-            <w:tcMar>
-              <w:top w:type="dxa" w:w="60"/>
-              <w:left w:type="dxa" w:w="100"/>
-              <w:bottom w:type="dxa" w:w="60"/>
-              <w:right w:type="dxa" w:w="100"/>
-            </w:tcMar>
-          </w:tcPr>
-          <w:p>
-            <w:pPr>
-              <w:spacing w:after="40" w:line="252"/>
-            </w:pPr>
-            <w:r>
-              <w:rPr>
-                <w:sz w:val="19"/>
-                <w:szCs w:val="19"/>
-              </w:rPr>
-              <w:t xml:space="preserve">The speech or translation service could not be reached or timed out.</w:t>
-            </w:r>
-          </w:p>
-        </w:tc>
-      </w:tr>
-      <w:tr>
-        <w:tc>
-          <w:tcPr>
-            <w:tcW w:type="dxa" w:w="2698"/>
-            <w:tcBorders>
-              <w:top w:val="single" w:color="C9D1D9" w:sz="4"/>
-              <w:left w:val="single" w:color="C9D1D9" w:sz="4"/>
-              <w:bottom w:val="single" w:color="C9D1D9" w:sz="4"/>
-              <w:right w:val="single" w:color="C9D1D9" w:sz="4"/>
-            </w:tcBorders>
-            <w:tcMar>
-              <w:top w:type="dxa" w:w="60"/>
-              <w:left w:type="dxa" w:w="100"/>
-              <w:bottom w:type="dxa" w:w="60"/>
-              <w:right w:type="dxa" w:w="100"/>
-            </w:tcMar>
-          </w:tcPr>
-          <w:p>
-            <w:pPr>
-              <w:spacing w:after="40" w:line="252"/>
-            </w:pPr>
-            <w:r>
-              <w:rPr>
-                <w:rFonts w:ascii="Consolas" w:cs="Consolas" w:eastAsia="Consolas" w:hAnsi="Consolas"/>
-                <w:color w:val="24292F"/>
-                <w:sz w:val="19"/>
-                <w:szCs w:val="19"/>
-              </w:rPr>
-              <w:t xml:space="preserve">quota_exceeded</w:t>
-            </w:r>
-          </w:p>
-        </w:tc>
-        <w:tc>
-          <w:tcPr>
-            <w:tcW w:type="dxa" w:w="1349"/>
-            <w:tcBorders>
-              <w:top w:val="single" w:color="C9D1D9" w:sz="4"/>
-              <w:left w:val="single" w:color="C9D1D9" w:sz="4"/>
-              <w:bottom w:val="single" w:color="C9D1D9" w:sz="4"/>
-              <w:right w:val="single" w:color="C9D1D9" w:sz="4"/>
-            </w:tcBorders>
-            <w:tcMar>
-              <w:top w:type="dxa" w:w="60"/>
-              <w:left w:type="dxa" w:w="100"/>
-              <w:bottom w:type="dxa" w:w="60"/>
-              <w:right w:type="dxa" w:w="100"/>
-            </w:tcMar>
-          </w:tcPr>
-          <w:p>
-            <w:pPr>
-              <w:spacing w:after="40" w:line="252"/>
-            </w:pPr>
-            <w:r>
-              <w:rPr>
-                <w:sz w:val="19"/>
-                <w:szCs w:val="19"/>
-              </w:rPr>
-              <w:t xml:space="preserve">yes, later</w:t>
-            </w:r>
-          </w:p>
-        </w:tc>
-        <w:tc>
-          <w:tcPr>
-            <w:tcW w:type="dxa" w:w="5591"/>
-            <w:tcBorders>
-              <w:top w:val="single" w:color="C9D1D9" w:sz="4"/>
-              <w:left w:val="single" w:color="C9D1D9" w:sz="4"/>
-              <w:bottom w:val="single" w:color="C9D1D9" w:sz="4"/>
-              <w:right w:val="single" w:color="C9D1D9" w:sz="4"/>
-            </w:tcBorders>
-            <w:tcMar>
-              <w:top w:type="dxa" w:w="60"/>
-              <w:left w:type="dxa" w:w="100"/>
-              <w:bottom w:type="dxa" w:w="60"/>
-              <w:right w:type="dxa" w:w="100"/>
-            </w:tcMar>
-          </w:tcPr>
-          <w:p>
-            <w:pPr>
-              <w:spacing w:after="40" w:line="252"/>
-            </w:pPr>
-            <w:r>
-              <w:rPr>
-                <w:sz w:val="19"/>
-                <w:szCs w:val="19"/>
-              </w:rPr>
-              <w:t xml:space="preserve">The free-tier limit was reached. Try again later.</w:t>
-            </w:r>
-          </w:p>
-        </w:tc>
-      </w:tr>
-      <w:tr>
-        <w:tc>
-          <w:tcPr>
-            <w:tcW w:type="dxa" w:w="2698"/>
-            <w:tcBorders>
-              <w:top w:val="single" w:color="C9D1D9" w:sz="4"/>
-              <w:left w:val="single" w:color="C9D1D9" w:sz="4"/>
-              <w:bottom w:val="single" w:color="C9D1D9" w:sz="4"/>
-              <w:right w:val="single" w:color="C9D1D9" w:sz="4"/>
-            </w:tcBorders>
-            <w:tcMar>
-              <w:top w:type="dxa" w:w="60"/>
-              <w:left w:type="dxa" w:w="100"/>
-              <w:bottom w:type="dxa" w:w="60"/>
-              <w:right w:type="dxa" w:w="100"/>
-            </w:tcMar>
-          </w:tcPr>
-          <w:p>
-            <w:pPr>
-              <w:spacing w:after="40" w:line="252"/>
-            </w:pPr>
-            <w:r>
-              <w:rPr>
-                <w:rFonts w:ascii="Consolas" w:cs="Consolas" w:eastAsia="Consolas" w:hAnsi="Consolas"/>
-                <w:color w:val="24292F"/>
-                <w:sz w:val="19"/>
-                <w:szCs w:val="19"/>
-              </w:rPr>
-              <w:t xml:space="preserve">voice_unavailable</w:t>
-            </w:r>
-          </w:p>
-        </w:tc>
-        <w:tc>
-          <w:tcPr>
-            <w:tcW w:type="dxa" w:w="1349"/>
-            <w:tcBorders>
-              <w:top w:val="single" w:color="C9D1D9" w:sz="4"/>
-              <w:left w:val="single" w:color="C9D1D9" w:sz="4"/>
-              <w:bottom w:val="single" w:color="C9D1D9" w:sz="4"/>
-              <w:right w:val="single" w:color="C9D1D9" w:sz="4"/>
-            </w:tcBorders>
-            <w:tcMar>
-              <w:top w:type="dxa" w:w="60"/>
-              <w:left w:type="dxa" w:w="100"/>
-              <w:bottom w:type="dxa" w:w="60"/>
-              <w:right w:type="dxa" w:w="100"/>
-            </w:tcMar>
-          </w:tcPr>
-          <w:p>
-            <w:pPr>
-              <w:spacing w:after="40" w:line="252"/>
-            </w:pPr>
-            <w:r>
-              <w:rPr>
-                <w:sz w:val="19"/>
-                <w:szCs w:val="19"/>
-              </w:rPr>
-              <w:t xml:space="preserve">no</w:t>
-            </w:r>
-          </w:p>
-        </w:tc>
-        <w:tc>
-          <w:tcPr>
-            <w:tcW w:type="dxa" w:w="5591"/>
-            <w:tcBorders>
-              <w:top w:val="single" w:color="C9D1D9" w:sz="4"/>
-              <w:left w:val="single" w:color="C9D1D9" w:sz="4"/>
-              <w:bottom w:val="single" w:color="C9D1D9" w:sz="4"/>
-              <w:right w:val="single" w:color="C9D1D9" w:sz="4"/>
-            </w:tcBorders>
-            <w:tcMar>
-              <w:top w:type="dxa" w:w="60"/>
-              <w:left w:type="dxa" w:w="100"/>
-              <w:bottom w:type="dxa" w:w="60"/>
-              <w:right w:type="dxa" w:w="100"/>
-            </w:tcMar>
-          </w:tcPr>
-          <w:p>
-            <w:pPr>
-              <w:spacing w:after="40" w:line="252"/>
-            </w:pPr>
-            <w:r>
-              <w:rPr>
-                <w:sz w:val="19"/>
-                <w:szCs w:val="19"/>
-              </w:rPr>
-              <w:t xml:space="preserve">The server could not make this voice. Use the browser voice or captions only.</w:t>
-            </w:r>
-          </w:p>
-        </w:tc>
-      </w:tr>
-      <w:tr>
-        <w:tc>
-          <w:tcPr>
-            <w:tcW w:type="dxa" w:w="2698"/>
-            <w:tcBorders>
-              <w:top w:val="single" w:color="C9D1D9" w:sz="4"/>
-              <w:left w:val="single" w:color="C9D1D9" w:sz="4"/>
-              <w:bottom w:val="single" w:color="C9D1D9" w:sz="4"/>
-              <w:right w:val="single" w:color="C9D1D9" w:sz="4"/>
-            </w:tcBorders>
-            <w:tcMar>
-              <w:top w:type="dxa" w:w="60"/>
-              <w:left w:type="dxa" w:w="100"/>
-              <w:bottom w:type="dxa" w:w="60"/>
-              <w:right w:type="dxa" w:w="100"/>
-            </w:tcMar>
-          </w:tcPr>
-          <w:p>
-            <w:pPr>
-              <w:spacing w:after="40" w:line="252"/>
-            </w:pPr>
-            <w:r>
-              <w:rPr>
-                <w:rFonts w:ascii="Consolas" w:cs="Consolas" w:eastAsia="Consolas" w:hAnsi="Consolas"/>
-                <w:color w:val="24292F"/>
-                <w:sz w:val="19"/>
-                <w:szCs w:val="19"/>
-              </w:rPr>
-              <w:t xml:space="preserve">internal_error</w:t>
-            </w:r>
-          </w:p>
-        </w:tc>
-        <w:tc>
-          <w:tcPr>
-            <w:tcW w:type="dxa" w:w="1349"/>
-            <w:tcBorders>
-              <w:top w:val="single" w:color="C9D1D9" w:sz="4"/>
-              <w:left w:val="single" w:color="C9D1D9" w:sz="4"/>
-              <w:bottom w:val="single" w:color="C9D1D9" w:sz="4"/>
-              <w:right w:val="single" w:color="C9D1D9" w:sz="4"/>
-            </w:tcBorders>
-            <w:tcMar>
-              <w:top w:type="dxa" w:w="60"/>
-              <w:left w:type="dxa" w:w="100"/>
-              <w:bottom w:type="dxa" w:w="60"/>
-              <w:right w:type="dxa" w:w="100"/>
-            </w:tcMar>
-          </w:tcPr>
-          <w:p>
-            <w:pPr>
-              <w:spacing w:after="40" w:line="252"/>
-            </w:pPr>
-            <w:r>
-              <w:rPr>
-                <w:sz w:val="19"/>
-                <w:szCs w:val="19"/>
-              </w:rPr>
-              <w:t xml:space="preserve">yes</w:t>
-            </w:r>
-          </w:p>
-        </w:tc>
-        <w:tc>
-          <w:tcPr>
-            <w:tcW w:type="dxa" w:w="5591"/>
-            <w:tcBorders>
-              <w:top w:val="single" w:color="C9D1D9" w:sz="4"/>
-              <w:left w:val="single" w:color="C9D1D9" w:sz="4"/>
-              <w:bottom w:val="single" w:color="C9D1D9" w:sz="4"/>
-              <w:right w:val="single" w:color="C9D1D9" w:sz="4"/>
-            </w:tcBorders>
-            <w:tcMar>
-              <w:top w:type="dxa" w:w="60"/>
-              <w:left w:type="dxa" w:w="100"/>
-              <w:bottom w:type="dxa" w:w="60"/>
-              <w:right w:type="dxa" w:w="100"/>
-            </w:tcMar>
-          </w:tcPr>
-          <w:p>
-            <w:pPr>
-              <w:spacing w:after="40" w:line="252"/>
-            </w:pPr>
-            <w:r>
-              <w:rPr>
-                <w:sz w:val="19"/>
-                <w:szCs w:val="19"/>
-              </w:rPr>
-              <w:t xml:space="preserve">Unexpected server error. Details are in the backend log only. The socket then closes with 1011.</w:t>
+              <w:t xml:space="preserve">Unexpected server error. Details are in the backend log only.</w:t>
             </w:r>
           </w:p>
         </w:tc>
@@ -12203,7 +11533,7 @@
         <w:t xml:space="preserve">src/features/consent/ConsentScreen.tsx</w:t>
       </w:r>
       <w:r>
-        <w:t xml:space="preserve">: a short explanation (the microphone is used only while a talk button is on; audio is sent to an online service to be transcribed and translated), two participant cards (name and preferred language, defaults "Person A"/English and "Person B"/Telugu), a checkbox "Both people agree", and a Start button that stays disabled until everything is valid. Start calls </w:t>
+        <w:t xml:space="preserve">: a short explanation (the microphone listens only while the conversation is open; audio is sent to an online service to be transcribed and translated), two participant cards (name and preferred language, defaults "Person A"/English and "Person B"/Telugu), a checkbox "Both people agree", and a Start button that stays disabled until everything is valid. Start calls </w:t>
       </w:r>
       <w:r>
         <w:rPr>
@@ -12427,7 +11757,7 @@
         <w:t xml:space="preserve">docs/DECISIONS.md</w:t>
       </w:r>
       <w:r>
-        <w:t xml:space="preserve"> (any language in, listener's language out; free only; tap-to-talk first).</w:t>
+        <w:t xml:space="preserve"> (any language in, listener's language out; free only; hands-free listening).</w:t>
       </w:r>
     </w:p>
     <w:p>
@@ -12651,7 +11981,7 @@
         <w:spacing w:after="120" w:before="280"/>
       </w:pPr>
       <w:r>
-        <w:t xml:space="preserve">Step 1C: Microphone and audio streaming</w:t>
+        <w:t xml:space="preserve">Step 1C: Hands-free microphone streaming</w:t>
       </w:r>
     </w:p>
     <w:p>
@@ -12666,7 +11996,7 @@
         <w:t xml:space="preserve">Goal:</w:t>
       </w:r>
       <w:r>
-        <w:t xml:space="preserve"> a person presses their talk button, speaks, and the backend receives clean 16 kHz audio for that sentence.</w:t>
+        <w:t xml:space="preserve"> once the conversation starts, the microphone streams continuously and the backend finds each sentence by itself.</w:t>
       </w:r>
     </w:p>
     <w:p>
@@ -12801,7 +12131,7 @@
         <w:t xml:space="preserve">getUserMedia({ audio: { channelCount: 1, echoCancellation: true, noiseSuppression: true, autoGainControl: true } })</w:t>
       </w:r>
       <w:r>
-        <w:t xml:space="preserve">, starts and stops capture, and exposes a level from 0 to 1.</w:t>
+        <w:t xml:space="preserve">, starts when the live channel opens, stops on End, and exposes a level from 0 to 1.</w:t>
       </w:r>
     </w:p>
     <w:p>
@@ -12826,7 +12156,7 @@
         <w:t xml:space="preserve">sendAudio</w:t>
       </w:r>
       <w:r>
-        <w:t xml:space="preserve">.</w:t>
+        <w:t xml:space="preserve">, continuously while listening.</w:t>
       </w:r>
     </w:p>
     <w:p>
@@ -12839,76 +12169,7 @@
         <w:spacing w:after="60" w:line="276"/>
       </w:pPr>
       <w:r>
-        <w:rPr>
-          <w:rFonts w:ascii="Consolas" w:cs="Consolas" w:eastAsia="Consolas" w:hAnsi="Consolas"/>
-          <w:color w:val="24292F"/>
-          <w:sz w:val="19"/>
-          <w:szCs w:val="19"/>
-        </w:rPr>
-        <w:t xml:space="preserve">TalkButton</w:t>
-      </w:r>
-      <w:r>
-        <w:t xml:space="preserve">, one per person: click to start (send </w:t>
-      </w:r>
-      <w:r>
-        <w:rPr>
-          <w:rFonts w:ascii="Consolas" w:cs="Consolas" w:eastAsia="Consolas" w:hAnsi="Consolas"/>
-          <w:color w:val="24292F"/>
-          <w:sz w:val="19"/>
-          <w:szCs w:val="19"/>
-        </w:rPr>
-        <w:t xml:space="preserve">utterance.start</w:t>
-      </w:r>
-      <w:r>
-        <w:t xml:space="preserve"> with a new </w:t>
-      </w:r>
-      <w:r>
-        <w:rPr>
-          <w:rFonts w:ascii="Consolas" w:cs="Consolas" w:eastAsia="Consolas" w:hAnsi="Consolas"/>
-          <w:color w:val="24292F"/>
-          <w:sz w:val="19"/>
-          <w:szCs w:val="19"/>
-        </w:rPr>
-        <w:t xml:space="preserve">crypto.randomUUID()</w:t>
-      </w:r>
-      <w:r>
-        <w:t xml:space="preserve">), click again to stop (send </w:t>
-      </w:r>
-      <w:r>
-        <w:rPr>
-          <w:rFonts w:ascii="Consolas" w:cs="Consolas" w:eastAsia="Consolas" w:hAnsi="Consolas"/>
-          <w:color w:val="24292F"/>
-          <w:sz w:val="19"/>
-          <w:szCs w:val="19"/>
-        </w:rPr>
-        <w:t xml:space="preserve">utterance.end</w:t>
-      </w:r>
-      <w:r>
-        <w:t xml:space="preserve">). Only one button can be active. Stop automatically after 30 s. If an </w:t>
-      </w:r>
-      <w:r>
-        <w:rPr>
-          <w:rFonts w:ascii="Consolas" w:cs="Consolas" w:eastAsia="Consolas" w:hAnsi="Consolas"/>
-          <w:color w:val="24292F"/>
-          <w:sz w:val="19"/>
-          <w:szCs w:val="19"/>
-        </w:rPr>
-        <w:t xml:space="preserve">error</w:t>
-      </w:r>
-      <w:r>
-        <w:t xml:space="preserve"> arrives for the current </w:t>
-      </w:r>
-      <w:r>
-        <w:rPr>
-          <w:rFonts w:ascii="Consolas" w:cs="Consolas" w:eastAsia="Consolas" w:hAnsi="Consolas"/>
-          <w:color w:val="24292F"/>
-          <w:sz w:val="19"/>
-          <w:szCs w:val="19"/>
-        </w:rPr>
-        <w:t xml:space="preserve">utterance_id</w:t>
-      </w:r>
-      <w:r>
-        <w:t xml:space="preserve">, stop sending its audio and reset the button.</w:t>
+        <w:t xml:space="preserve">A listening indicator with a level meter, so people can see the microphone is hearing them. No talk buttons.</w:t>
       </w:r>
     </w:p>
     <w:p>
@@ -12921,7 +12182,7 @@
         <w:spacing w:after="60" w:line="276"/>
       </w:pPr>
       <w:r>
-        <w:t xml:space="preserve">A small level meter next to the active button, so people can see the mic is hearing them.</w:t>
+        <w:t xml:space="preserve">Friendly messages: microphone blocked ("Allow the microphone using the lock icon in the address bar"), no microphone found, and microphone in use by another app.</w:t>
       </w:r>
     </w:p>
     <w:p>
@@ -12934,20 +12195,7 @@
         <w:spacing w:after="60" w:line="276"/>
       </w:pPr>
       <w:r>
-        <w:t xml:space="preserve">Friendly messages: microphone blocked ("Allow the microphone using the lock icon in the address bar"), no microphone found, and microphone in use by another app.</w:t>
-      </w:r>
-    </w:p>
-    <w:p>
-      <w:pPr>
-        <w:pStyle w:val="ListParagraph"/>
-        <w:numPr>
-          <w:ilvl w:val="0"/>
-          <w:numId w:val="8"/>
-        </w:numPr>
-        <w:spacing w:after="60" w:line="276"/>
-      </w:pPr>
-      <w:r>
-        <w:t xml:space="preserve">Show "Received 2.1 s of audio" when </w:t>
+        <w:t xml:space="preserve">Show a pending turn when </w:t>
       </w:r>
       <w:r>
         <w:rPr>
@@ -12959,7 +12207,7 @@
         <w:t xml:space="preserve">utterance.received</w:t>
       </w:r>
       <w:r>
-        <w:t xml:space="preserve"> arrives, and the error message for </w:t>
+        <w:t xml:space="preserve"> arrives and remove it quietly on </w:t>
       </w:r>
       <w:r>
         <w:rPr>
@@ -12968,10 +12216,10 @@
           <w:sz w:val="19"/>
           <w:szCs w:val="19"/>
         </w:rPr>
-        <w:t xml:space="preserve">audio_too_short</w:t>
-      </w:r>
-      <w:r>
-        <w:t xml:space="preserve"> ("No speech was heard"). The received line is a temporary debug aid for the joint test.</w:t>
+        <w:t xml:space="preserve">utterance.ignored</w:t>
+      </w:r>
+      <w:r>
+        <w:t xml:space="preserve">.</w:t>
       </w:r>
     </w:p>
     <w:p>
@@ -12980,7 +12228,7 @@
         <w:spacing w:after="80" w:before="200"/>
       </w:pPr>
       <w:r>
-        <w:t xml:space="preserve">Backend tasks (Developer B, branch 1c-backend): done</w:t>
+        <w:t xml:space="preserve">Backend tasks (Developer B): done</w:t>
       </w:r>
     </w:p>
     <w:p>
@@ -12999,22 +12247,10 @@
           <w:sz w:val="19"/>
           <w:szCs w:val="19"/>
         </w:rPr>
-        <w:t xml:space="preserve">app/services/audio_ingestion/base.py</w:t>
-      </w:r>
-      <w:r>
-        <w:t xml:space="preserve"> (adapter interface) and </w:t>
-      </w:r>
-      <w:r>
-        <w:rPr>
-          <w:rFonts w:ascii="Consolas" w:cs="Consolas" w:eastAsia="Consolas" w:hAnsi="Consolas"/>
-          <w:color w:val="24292F"/>
-          <w:sz w:val="19"/>
-          <w:szCs w:val="19"/>
-        </w:rPr>
-        <w:t xml:space="preserve">microphone.py</w:t>
-      </w:r>
-      <w:r>
-        <w:t xml:space="preserve"> (browser microphone adapter).</w:t>
+        <w:t xml:space="preserve">app/services/audio_ingestion/speech_detector.py</w:t>
+      </w:r>
+      <w:r>
+        <w:t xml:space="preserve">: finds sentences in the continuous audio (start on speech, end after about 1.5 s of silence, split at 30 s, short noises ignored).</w:t>
       </w:r>
     </w:p>
     <w:p>
@@ -13027,8 +12263,112 @@
         <w:spacing w:after="60" w:line="276"/>
       </w:pPr>
       <w:r>
-        <w:t xml:space="preserve">Collect frames per open utterance, enforce the format and the 0.3 s and 30 s limits, and send </w:t>
-      </w:r>
+        <w:t xml:space="preserve">Audio is never written to disk: each sentence is held in memory only until it is translated.</w:t>
+      </w:r>
+    </w:p>
+    <w:p>
+      <w:pPr>
+        <w:pStyle w:val="Heading3"/>
+        <w:spacing w:after="80" w:before="200"/>
+      </w:pPr>
+      <w:r>
+        <w:t xml:space="preserve">Joint test</w:t>
+      </w:r>
+    </w:p>
+    <w:p>
+      <w:pPr>
+        <w:pStyle w:val="ListParagraph"/>
+        <w:numPr>
+          <w:ilvl w:val="0"/>
+          <w:numId w:val="9"/>
+        </w:numPr>
+        <w:spacing w:after="60" w:line="276"/>
+      </w:pPr>
+      <w:r>
+        <w:t xml:space="preserve">Start a conversation and speak a sentence without pressing anything: a pending turn appears after the pause.</w:t>
+      </w:r>
+    </w:p>
+    <w:p>
+      <w:pPr>
+        <w:pStyle w:val="ListParagraph"/>
+        <w:numPr>
+          <w:ilvl w:val="0"/>
+          <w:numId w:val="9"/>
+        </w:numPr>
+        <w:spacing w:after="60" w:line="276"/>
+      </w:pPr>
+      <w:r>
+        <w:t xml:space="preserve">Check the caption text in the browser developer tools (Network, WS, Messages). Garbled or empty text on clear speech means the sample rate conversion is wrong.</w:t>
+      </w:r>
+    </w:p>
+    <w:p>
+      <w:pPr>
+        <w:pStyle w:val="ListParagraph"/>
+        <w:numPr>
+          <w:ilvl w:val="0"/>
+          <w:numId w:val="9"/>
+        </w:numPr>
+        <w:spacing w:after="60" w:line="276"/>
+      </w:pPr>
+      <w:r>
+        <w:t xml:space="preserve">Stay quiet or cough: nothing appears, and listening continues.</w:t>
+      </w:r>
+    </w:p>
+    <w:p>
+      <w:pPr>
+        <w:pStyle w:val="ListParagraph"/>
+        <w:numPr>
+          <w:ilvl w:val="0"/>
+          <w:numId w:val="9"/>
+        </w:numPr>
+        <w:spacing w:after="60" w:line="276"/>
+      </w:pPr>
+      <w:r>
+        <w:t xml:space="preserve">Block the microphone in the browser and check the message. Allow it again and check that listening works.</w:t>
+      </w:r>
+    </w:p>
+    <w:p>
+      <w:pPr>
+        <w:pStyle w:val="Heading2"/>
+        <w:spacing w:after="120" w:before="280"/>
+      </w:pPr>
+      <w:r>
+        <w:t xml:space="preserve">Step 1D: Recognition, language detection and translation</w:t>
+      </w:r>
+    </w:p>
+    <w:p>
+      <w:pPr>
+        <w:spacing w:after="120" w:line="276"/>
+      </w:pPr>
+      <w:r>
+        <w:rPr>
+          <w:b/>
+          <w:bCs/>
+        </w:rPr>
+        <w:t xml:space="preserve">Goal:</w:t>
+      </w:r>
+      <w:r>
+        <w:t xml:space="preserve"> whatever language a person speaks, the other person reads it in their preferred language.</w:t>
+      </w:r>
+    </w:p>
+    <w:p>
+      <w:pPr>
+        <w:pStyle w:val="Heading3"/>
+        <w:spacing w:after="80" w:before="200"/>
+      </w:pPr>
+      <w:r>
+        <w:t xml:space="preserve">Frontend tasks (Developer A, branch 1d-frontend)</w:t>
+      </w:r>
+    </w:p>
+    <w:p>
+      <w:pPr>
+        <w:pStyle w:val="ListParagraph"/>
+        <w:numPr>
+          <w:ilvl w:val="0"/>
+          <w:numId w:val="10"/>
+        </w:numPr>
+        <w:spacing w:after="60" w:line="276"/>
+      </w:pPr>
       <w:r>
         <w:rPr>
           <w:rFonts w:ascii="Consolas" w:cs="Consolas" w:eastAsia="Consolas" w:hAnsi="Consolas"/>
@@ -13036,10 +12376,214 @@
           <w:sz w:val="19"/>
           <w:szCs w:val="19"/>
         </w:rPr>
+        <w:t xml:space="preserve">src/features/live-session/conversationStore.ts</w:t>
+      </w:r>
+      <w:r>
+        <w:t xml:space="preserve">: a reducer that builds the list of turns from server messages, keyed by </w:t>
+      </w:r>
+      <w:r>
+        <w:rPr>
+          <w:rFonts w:ascii="Consolas" w:cs="Consolas" w:eastAsia="Consolas" w:hAnsi="Consolas"/>
+          <w:color w:val="24292F"/>
+          <w:sz w:val="19"/>
+          <w:szCs w:val="19"/>
+        </w:rPr>
+        <w:t xml:space="preserve">utterance_id</w:t>
+      </w:r>
+      <w:r>
+        <w:t xml:space="preserve">, in </w:t>
+      </w:r>
+      <w:r>
+        <w:rPr>
+          <w:rFonts w:ascii="Consolas" w:cs="Consolas" w:eastAsia="Consolas" w:hAnsi="Consolas"/>
+          <w:color w:val="24292F"/>
+          <w:sz w:val="19"/>
+          <w:szCs w:val="19"/>
+        </w:rPr>
+        <w:t xml:space="preserve">seq</w:t>
+      </w:r>
+      <w:r>
+        <w:t xml:space="preserve"> order, ignoring duplicates.</w:t>
+      </w:r>
+    </w:p>
+    <w:p>
+      <w:pPr>
+        <w:pStyle w:val="ListParagraph"/>
+        <w:numPr>
+          <w:ilvl w:val="0"/>
+          <w:numId w:val="10"/>
+        </w:numPr>
+        <w:spacing w:after="60" w:line="276"/>
+      </w:pPr>
+      <w:r>
+        <w:rPr>
+          <w:rFonts w:ascii="Consolas" w:cs="Consolas" w:eastAsia="Consolas" w:hAnsi="Consolas"/>
+          <w:color w:val="24292F"/>
+          <w:sz w:val="19"/>
+          <w:szCs w:val="19"/>
+        </w:rPr>
+        <w:t xml:space="preserve">SplitView</w:t>
+      </w:r>
+      <w:r>
+        <w:t xml:space="preserve">: two panels, one per person. Each panel shows every turn in that person's preferred language as the main text, with the original underneath in smaller text when it differs.</w:t>
+      </w:r>
+    </w:p>
+    <w:p>
+      <w:pPr>
+        <w:pStyle w:val="ListParagraph"/>
+        <w:numPr>
+          <w:ilvl w:val="0"/>
+          <w:numId w:val="10"/>
+        </w:numPr>
+        <w:spacing w:after="60" w:line="276"/>
+      </w:pPr>
+      <w:r>
+        <w:t xml:space="preserve">Each turn shows the speaker's name (or "Unknown speaker" when </w:t>
+      </w:r>
+      <w:r>
+        <w:rPr>
+          <w:rFonts w:ascii="Consolas" w:cs="Consolas" w:eastAsia="Consolas" w:hAnsi="Consolas"/>
+          <w:color w:val="24292F"/>
+          <w:sz w:val="19"/>
+          <w:szCs w:val="19"/>
+        </w:rPr>
+        <w:t xml:space="preserve">speaker_id</w:t>
+      </w:r>
+      <w:r>
+        <w:t xml:space="preserve"> is null), a language badge such as "Telugu (detected)", and a status: processing (after </w:t>
+      </w:r>
+      <w:r>
+        <w:rPr>
+          <w:rFonts w:ascii="Consolas" w:cs="Consolas" w:eastAsia="Consolas" w:hAnsi="Consolas"/>
+          <w:color w:val="24292F"/>
+          <w:sz w:val="19"/>
+          <w:szCs w:val="19"/>
+        </w:rPr>
         <w:t xml:space="preserve">utterance.received</w:t>
       </w:r>
       <w:r>
-        <w:t xml:space="preserve">.</w:t>
+        <w:t xml:space="preserve">), done, or failed with the error message.</w:t>
+      </w:r>
+    </w:p>
+    <w:p>
+      <w:pPr>
+        <w:pStyle w:val="ListParagraph"/>
+        <w:numPr>
+          <w:ilvl w:val="0"/>
+          <w:numId w:val="10"/>
+        </w:numPr>
+        <w:spacing w:after="60" w:line="276"/>
+      </w:pPr>
+      <w:r>
+        <w:t xml:space="preserve">A person with no </w:t>
+      </w:r>
+      <w:r>
+        <w:rPr>
+          <w:rFonts w:ascii="Consolas" w:cs="Consolas" w:eastAsia="Consolas" w:hAnsi="Consolas"/>
+          <w:color w:val="24292F"/>
+          <w:sz w:val="19"/>
+          <w:szCs w:val="19"/>
+        </w:rPr>
+        <w:t xml:space="preserve">translation.final</w:t>
+      </w:r>
+      <w:r>
+        <w:t xml:space="preserve"> for a turn already understands it: show the original in their panel.</w:t>
+      </w:r>
+    </w:p>
+    <w:p>
+      <w:pPr>
+        <w:pStyle w:val="ListParagraph"/>
+        <w:numPr>
+          <w:ilvl w:val="0"/>
+          <w:numId w:val="10"/>
+        </w:numPr>
+        <w:spacing w:after="60" w:line="276"/>
+      </w:pPr>
+      <w:r>
+        <w:t xml:space="preserve">Fonts: include </w:t>
+      </w:r>
+      <w:r>
+        <w:rPr>
+          <w:rFonts w:ascii="Consolas" w:cs="Consolas" w:eastAsia="Consolas" w:hAnsi="Consolas"/>
+          <w:color w:val="24292F"/>
+          <w:sz w:val="19"/>
+          <w:szCs w:val="19"/>
+        </w:rPr>
+        <w:t xml:space="preserve">"Nirmala UI"</w:t>
+      </w:r>
+      <w:r>
+        <w:t xml:space="preserve"> (Windows) and </w:t>
+      </w:r>
+      <w:r>
+        <w:rPr>
+          <w:rFonts w:ascii="Consolas" w:cs="Consolas" w:eastAsia="Consolas" w:hAnsi="Consolas"/>
+          <w:color w:val="24292F"/>
+          <w:sz w:val="19"/>
+          <w:szCs w:val="19"/>
+        </w:rPr>
+        <w:t xml:space="preserve">"Noto Sans"</w:t>
+      </w:r>
+      <w:r>
+        <w:t xml:space="preserve"> in the font list so Indian scripts display correctly.</w:t>
+      </w:r>
+    </w:p>
+    <w:p>
+      <w:pPr>
+        <w:pStyle w:val="ListParagraph"/>
+        <w:numPr>
+          <w:ilvl w:val="0"/>
+          <w:numId w:val="10"/>
+        </w:numPr>
+        <w:spacing w:after="60" w:line="276"/>
+      </w:pPr>
+      <w:r>
+        <w:t xml:space="preserve">Before the backend is ready, build against mock events: </w:t>
+      </w:r>
+      <w:r>
+        <w:rPr>
+          <w:rFonts w:ascii="Consolas" w:cs="Consolas" w:eastAsia="Consolas" w:hAnsi="Consolas"/>
+          <w:color w:val="24292F"/>
+          <w:sz w:val="19"/>
+          <w:szCs w:val="19"/>
+        </w:rPr>
+        <w:t xml:space="preserve">src/dev/mockEvents.ts</w:t>
+      </w:r>
+      <w:r>
+        <w:t xml:space="preserve"> with the example exchange from section 8.6, enabled with </w:t>
+      </w:r>
+      <w:r>
+        <w:rPr>
+          <w:rFonts w:ascii="Consolas" w:cs="Consolas" w:eastAsia="Consolas" w:hAnsi="Consolas"/>
+          <w:color w:val="24292F"/>
+          <w:sz w:val="19"/>
+          <w:szCs w:val="19"/>
+        </w:rPr>
+        <w:t xml:space="preserve">?mock=1</w:t>
+      </w:r>
+      <w:r>
+        <w:t xml:space="preserve"> in the address.</w:t>
+      </w:r>
+    </w:p>
+    <w:p>
+      <w:pPr>
+        <w:pStyle w:val="ListParagraph"/>
+        <w:numPr>
+          <w:ilvl w:val="0"/>
+          <w:numId w:val="10"/>
+        </w:numPr>
+        <w:spacing w:after="60" w:line="276"/>
+      </w:pPr>
+      <w:r>
+        <w:t xml:space="preserve">Tests for the reducer: ordering, duplicates, errors, ignored sentences, and turns with zero, one or two translations.</w:t>
+      </w:r>
+    </w:p>
+    <w:p>
+      <w:pPr>
+        <w:pStyle w:val="Heading3"/>
+        <w:spacing w:after="80" w:before="200"/>
+      </w:pPr>
+      <w:r>
+        <w:t xml:space="preserve">Backend tasks (Developer B, branch 1d-backend)</w:t>
       </w:r>
     </w:p>
     <w:p>
@@ -13052,7 +12596,7 @@
         <w:spacing w:after="60" w:line="276"/>
       </w:pPr>
       <w:r>
-        <w:t xml:space="preserve">Audio is never written to disk: each utterance is held in memory only until it is translated.</w:t>
+        <w:t xml:space="preserve">Benchmark the free options (Gemini API free tier and local Whisper) with about 20 recorded sentences each in Telugu, English and Hindi. Record accuracy and time per sentence, check current free-tier limits, then choose.</w:t>
       </w:r>
     </w:p>
     <w:p>
@@ -13065,110 +12609,16 @@
         <w:spacing w:after="60" w:line="276"/>
       </w:pPr>
       <w:r>
-        <w:t xml:space="preserve">Tests with recorded audio fixtures instead of a live microphone.</w:t>
-      </w:r>
-    </w:p>
-    <w:p>
-      <w:pPr>
-        <w:pStyle w:val="Heading3"/>
-        <w:spacing w:after="80" w:before="200"/>
-      </w:pPr>
-      <w:r>
-        <w:t xml:space="preserve">Joint test</w:t>
-      </w:r>
-    </w:p>
-    <w:p>
-      <w:pPr>
-        <w:pStyle w:val="ListParagraph"/>
-        <w:numPr>
-          <w:ilvl w:val="0"/>
-          <w:numId w:val="9"/>
-        </w:numPr>
-        <w:spacing w:after="60" w:line="276"/>
-      </w:pPr>
-      <w:r>
-        <w:t xml:space="preserve">Each person presses their button and says one sentence.</w:t>
-      </w:r>
-    </w:p>
-    <w:p>
-      <w:pPr>
-        <w:pStyle w:val="ListParagraph"/>
-        <w:numPr>
-          <w:ilvl w:val="0"/>
-          <w:numId w:val="9"/>
-        </w:numPr>
-        <w:spacing w:after="60" w:line="276"/>
-      </w:pPr>
-      <w:r>
-        <w:t xml:space="preserve">Speak a clear sentence and check its caption text in the browser developer tools (Network, WS, Messages). Garbled or empty text on clear speech means the sample rate conversion is wrong.</w:t>
-      </w:r>
-    </w:p>
-    <w:p>
-      <w:pPr>
-        <w:pStyle w:val="ListParagraph"/>
-        <w:numPr>
-          <w:ilvl w:val="0"/>
-          <w:numId w:val="9"/>
-        </w:numPr>
-        <w:spacing w:after="60" w:line="276"/>
-      </w:pPr>
-      <w:r>
-        <w:t xml:space="preserve">Block the microphone in the browser and check the message. Allow it again and check that recording works.</w:t>
-      </w:r>
-    </w:p>
-    <w:p>
-      <w:pPr>
-        <w:pStyle w:val="Heading2"/>
-        <w:spacing w:after="120" w:before="280"/>
-      </w:pPr>
-      <w:r>
-        <w:t xml:space="preserve">Step 1D: Recognition, language detection and translation</w:t>
-      </w:r>
-    </w:p>
-    <w:p>
-      <w:pPr>
-        <w:spacing w:after="120" w:line="276"/>
-      </w:pPr>
-      <w:r>
-        <w:rPr>
-          <w:b/>
-          <w:bCs/>
-        </w:rPr>
-        <w:t xml:space="preserve">Goal:</w:t>
-      </w:r>
-      <w:r>
-        <w:t xml:space="preserve"> whatever language a person speaks, the other person reads it in their preferred language.</w:t>
-      </w:r>
-    </w:p>
-    <w:p>
-      <w:pPr>
-        <w:pStyle w:val="Heading3"/>
-        <w:spacing w:after="80" w:before="200"/>
-      </w:pPr>
-      <w:r>
-        <w:t xml:space="preserve">Frontend tasks (Developer A, branch 1d-frontend)</w:t>
-      </w:r>
-    </w:p>
-    <w:p>
-      <w:pPr>
-        <w:pStyle w:val="ListParagraph"/>
-        <w:numPr>
-          <w:ilvl w:val="0"/>
-          <w:numId w:val="10"/>
-        </w:numPr>
-        <w:spacing w:after="60" w:line="276"/>
-      </w:pPr>
-      <w:r>
         <w:rPr>
           <w:rFonts w:ascii="Consolas" w:cs="Consolas" w:eastAsia="Consolas" w:hAnsi="Consolas"/>
           <w:color w:val="24292F"/>
           <w:sz w:val="19"/>
           <w:szCs w:val="19"/>
         </w:rPr>
-        <w:t xml:space="preserve">src/features/live-session/conversationStore.ts</w:t>
-      </w:r>
-      <w:r>
-        <w:t xml:space="preserve">: a reducer that builds the list of turns from server messages, keyed by </w:t>
+        <w:t xml:space="preserve">SpeechToText</w:t>
+      </w:r>
+      <w:r>
+        <w:t xml:space="preserve"> and </w:t>
       </w:r>
       <w:r>
         <w:rPr>
@@ -13177,202 +12627,10 @@
           <w:sz w:val="19"/>
           <w:szCs w:val="19"/>
         </w:rPr>
-        <w:t xml:space="preserve">utterance_id</w:t>
-      </w:r>
-      <w:r>
-        <w:t xml:space="preserve">, in </w:t>
-      </w:r>
-      <w:r>
-        <w:rPr>
-          <w:rFonts w:ascii="Consolas" w:cs="Consolas" w:eastAsia="Consolas" w:hAnsi="Consolas"/>
-          <w:color w:val="24292F"/>
-          <w:sz w:val="19"/>
-          <w:szCs w:val="19"/>
-        </w:rPr>
-        <w:t xml:space="preserve">seq</w:t>
-      </w:r>
-      <w:r>
-        <w:t xml:space="preserve"> order, ignoring duplicates.</w:t>
-      </w:r>
-    </w:p>
-    <w:p>
-      <w:pPr>
-        <w:pStyle w:val="ListParagraph"/>
-        <w:numPr>
-          <w:ilvl w:val="0"/>
-          <w:numId w:val="10"/>
-        </w:numPr>
-        <w:spacing w:after="60" w:line="276"/>
-      </w:pPr>
-      <w:r>
-        <w:rPr>
-          <w:rFonts w:ascii="Consolas" w:cs="Consolas" w:eastAsia="Consolas" w:hAnsi="Consolas"/>
-          <w:color w:val="24292F"/>
-          <w:sz w:val="19"/>
-          <w:szCs w:val="19"/>
-        </w:rPr>
-        <w:t xml:space="preserve">SplitView</w:t>
-      </w:r>
-      <w:r>
-        <w:t xml:space="preserve">: two panels, one per person. Each panel shows every turn in that person's preferred language as the main text, with the original underneath in smaller text when it differs.</w:t>
-      </w:r>
-    </w:p>
-    <w:p>
-      <w:pPr>
-        <w:pStyle w:val="ListParagraph"/>
-        <w:numPr>
-          <w:ilvl w:val="0"/>
-          <w:numId w:val="10"/>
-        </w:numPr>
-        <w:spacing w:after="60" w:line="276"/>
-      </w:pPr>
-      <w:r>
-        <w:t xml:space="preserve">Each turn shows the speaker's name, a language badge such as "Telugu (detected)", and a status: processing (between </w:t>
-      </w:r>
-      <w:r>
-        <w:rPr>
-          <w:rFonts w:ascii="Consolas" w:cs="Consolas" w:eastAsia="Consolas" w:hAnsi="Consolas"/>
-          <w:color w:val="24292F"/>
-          <w:sz w:val="19"/>
-          <w:szCs w:val="19"/>
-        </w:rPr>
-        <w:t xml:space="preserve">utterance.end</w:t>
-      </w:r>
-      <w:r>
-        <w:t xml:space="preserve"> and the result), done, or failed with the error message.</w:t>
-      </w:r>
-    </w:p>
-    <w:p>
-      <w:pPr>
-        <w:pStyle w:val="ListParagraph"/>
-        <w:numPr>
-          <w:ilvl w:val="0"/>
-          <w:numId w:val="10"/>
-        </w:numPr>
-        <w:spacing w:after="60" w:line="276"/>
-      </w:pPr>
-      <w:r>
-        <w:t xml:space="preserve">When </w:t>
-      </w:r>
-      <w:r>
-        <w:rPr>
-          <w:rFonts w:ascii="Consolas" w:cs="Consolas" w:eastAsia="Consolas" w:hAnsi="Consolas"/>
-          <w:color w:val="24292F"/>
-          <w:sz w:val="19"/>
-          <w:szCs w:val="19"/>
-        </w:rPr>
-        <w:t xml:space="preserve">translated</w:t>
-      </w:r>
-      <w:r>
-        <w:t xml:space="preserve"> is false, show the original once with a small note "already in your language".</w:t>
-      </w:r>
-    </w:p>
-    <w:p>
-      <w:pPr>
-        <w:pStyle w:val="ListParagraph"/>
-        <w:numPr>
-          <w:ilvl w:val="0"/>
-          <w:numId w:val="10"/>
-        </w:numPr>
-        <w:spacing w:after="60" w:line="276"/>
-      </w:pPr>
-      <w:r>
-        <w:t xml:space="preserve">Fonts: include </w:t>
-      </w:r>
-      <w:r>
-        <w:rPr>
-          <w:rFonts w:ascii="Consolas" w:cs="Consolas" w:eastAsia="Consolas" w:hAnsi="Consolas"/>
-          <w:color w:val="24292F"/>
-          <w:sz w:val="19"/>
-          <w:szCs w:val="19"/>
-        </w:rPr>
-        <w:t xml:space="preserve">"Nirmala UI"</w:t>
-      </w:r>
-      <w:r>
-        <w:t xml:space="preserve"> (Windows) and </w:t>
-      </w:r>
-      <w:r>
-        <w:rPr>
-          <w:rFonts w:ascii="Consolas" w:cs="Consolas" w:eastAsia="Consolas" w:hAnsi="Consolas"/>
-          <w:color w:val="24292F"/>
-          <w:sz w:val="19"/>
-          <w:szCs w:val="19"/>
-        </w:rPr>
-        <w:t xml:space="preserve">"Noto Sans"</w:t>
-      </w:r>
-      <w:r>
-        <w:t xml:space="preserve"> in the font list so Indian scripts display correctly.</w:t>
-      </w:r>
-    </w:p>
-    <w:p>
-      <w:pPr>
-        <w:pStyle w:val="ListParagraph"/>
-        <w:numPr>
-          <w:ilvl w:val="0"/>
-          <w:numId w:val="10"/>
-        </w:numPr>
-        <w:spacing w:after="60" w:line="276"/>
-      </w:pPr>
-      <w:r>
-        <w:t xml:space="preserve">Before the backend is ready, build against mock events: </w:t>
-      </w:r>
-      <w:r>
-        <w:rPr>
-          <w:rFonts w:ascii="Consolas" w:cs="Consolas" w:eastAsia="Consolas" w:hAnsi="Consolas"/>
-          <w:color w:val="24292F"/>
-          <w:sz w:val="19"/>
-          <w:szCs w:val="19"/>
-        </w:rPr>
-        <w:t xml:space="preserve">src/dev/mockEvents.ts</w:t>
-      </w:r>
-      <w:r>
-        <w:t xml:space="preserve"> with the example exchange from section 8.6, enabled with </w:t>
-      </w:r>
-      <w:r>
-        <w:rPr>
-          <w:rFonts w:ascii="Consolas" w:cs="Consolas" w:eastAsia="Consolas" w:hAnsi="Consolas"/>
-          <w:color w:val="24292F"/>
-          <w:sz w:val="19"/>
-          <w:szCs w:val="19"/>
-        </w:rPr>
-        <w:t xml:space="preserve">?mock=1</w:t>
-      </w:r>
-      <w:r>
-        <w:t xml:space="preserve"> in the address.</w:t>
-      </w:r>
-    </w:p>
-    <w:p>
-      <w:pPr>
-        <w:pStyle w:val="ListParagraph"/>
-        <w:numPr>
-          <w:ilvl w:val="0"/>
-          <w:numId w:val="10"/>
-        </w:numPr>
-        <w:spacing w:after="60" w:line="276"/>
-      </w:pPr>
-      <w:r>
-        <w:t xml:space="preserve">Tests for the reducer: ordering, duplicates, errors, and the </w:t>
-      </w:r>
-      <w:r>
-        <w:rPr>
-          <w:rFonts w:ascii="Consolas" w:cs="Consolas" w:eastAsia="Consolas" w:hAnsi="Consolas"/>
-          <w:color w:val="24292F"/>
-          <w:sz w:val="19"/>
-          <w:szCs w:val="19"/>
-        </w:rPr>
-        <w:t xml:space="preserve">translated: false</w:t>
-      </w:r>
-      <w:r>
-        <w:t xml:space="preserve"> case.</w:t>
-      </w:r>
-    </w:p>
-    <w:p>
-      <w:pPr>
-        <w:pStyle w:val="Heading3"/>
-        <w:spacing w:after="80" w:before="200"/>
-      </w:pPr>
-      <w:r>
-        <w:t xml:space="preserve">Backend tasks (Developer B, branch 1d-backend)</w:t>
+        <w:t xml:space="preserve">Translator</w:t>
+      </w:r>
+      <w:r>
+        <w:t xml:space="preserve"> interfaces and the chosen free provider. Prefer one request per sentence (audio in; text, language and translation out) to save free quota.</w:t>
       </w:r>
     </w:p>
     <w:p>
@@ -13385,7 +12643,7 @@
         <w:spacing w:after="60" w:line="276"/>
       </w:pPr>
       <w:r>
-        <w:t xml:space="preserve">Benchmark the free options (Gemini API free tier and local Whisper) with about 20 recorded sentences each in Telugu, English and Hindi. Record accuracy and time per sentence, check current free-tier limits, then choose.</w:t>
+        <w:t xml:space="preserve">One request per sentence returns the transcript and a translation into each person's language; the language heard decides the speaker and listeners.</w:t>
       </w:r>
     </w:p>
     <w:p>
@@ -13398,13 +12656,16 @@
         <w:spacing w:after="60" w:line="276"/>
       </w:pPr>
       <w:r>
+        <w:t xml:space="preserve">Send </w:t>
+      </w:r>
+      <w:r>
         <w:rPr>
           <w:rFonts w:ascii="Consolas" w:cs="Consolas" w:eastAsia="Consolas" w:hAnsi="Consolas"/>
           <w:color w:val="24292F"/>
           <w:sz w:val="19"/>
           <w:szCs w:val="19"/>
         </w:rPr>
-        <w:t xml:space="preserve">SpeechToText</w:t>
+        <w:t xml:space="preserve">transcript.final</w:t>
       </w:r>
       <w:r>
         <w:t xml:space="preserve"> and </w:t>
@@ -13416,10 +12677,34 @@
           <w:sz w:val="19"/>
           <w:szCs w:val="19"/>
         </w:rPr>
-        <w:t xml:space="preserve">Translator</w:t>
-      </w:r>
-      <w:r>
-        <w:t xml:space="preserve"> interfaces and the chosen free provider. Prefer one request per sentence (audio in; text, language and translation out) to save free quota.</w:t>
+        <w:t xml:space="preserve">translation.final</w:t>
+      </w:r>
+      <w:r>
+        <w:t xml:space="preserve">, or errors such as </w:t>
+      </w:r>
+      <w:r>
+        <w:rPr>
+          <w:rFonts w:ascii="Consolas" w:cs="Consolas" w:eastAsia="Consolas" w:hAnsi="Consolas"/>
+          <w:color w:val="24292F"/>
+          <w:sz w:val="19"/>
+          <w:szCs w:val="19"/>
+        </w:rPr>
+        <w:t xml:space="preserve">provider_unavailable</w:t>
+      </w:r>
+      <w:r>
+        <w:t xml:space="preserve"> and </w:t>
+      </w:r>
+      <w:r>
+        <w:rPr>
+          <w:rFonts w:ascii="Consolas" w:cs="Consolas" w:eastAsia="Consolas" w:hAnsi="Consolas"/>
+          <w:color w:val="24292F"/>
+          <w:sz w:val="19"/>
+          <w:szCs w:val="19"/>
+        </w:rPr>
+        <w:t xml:space="preserve">quota_exceeded</w:t>
+      </w:r>
+      <w:r>
+        <w:t xml:space="preserve">.</w:t>
       </w:r>
     </w:p>
     <w:p>
@@ -13432,92 +12717,6 @@
         <w:spacing w:after="60" w:line="276"/>
       </w:pPr>
       <w:r>
-        <w:t xml:space="preserve">Target language = the other participant's preferred language. Skip translation when it already matches. Respect </w:t>
-      </w:r>
-      <w:r>
-        <w:rPr>
-          <w:rFonts w:ascii="Consolas" w:cs="Consolas" w:eastAsia="Consolas" w:hAnsi="Consolas"/>
-          <w:color w:val="24292F"/>
-          <w:sz w:val="19"/>
-          <w:szCs w:val="19"/>
-        </w:rPr>
-        <w:t xml:space="preserve">spoken_language</w:t>
-      </w:r>
-      <w:r>
-        <w:t xml:space="preserve"> when it is set.</w:t>
-      </w:r>
-    </w:p>
-    <w:p>
-      <w:pPr>
-        <w:pStyle w:val="ListParagraph"/>
-        <w:numPr>
-          <w:ilvl w:val="0"/>
-          <w:numId w:val="2"/>
-        </w:numPr>
-        <w:spacing w:after="60" w:line="276"/>
-      </w:pPr>
-      <w:r>
-        <w:t xml:space="preserve">Send </w:t>
-      </w:r>
-      <w:r>
-        <w:rPr>
-          <w:rFonts w:ascii="Consolas" w:cs="Consolas" w:eastAsia="Consolas" w:hAnsi="Consolas"/>
-          <w:color w:val="24292F"/>
-          <w:sz w:val="19"/>
-          <w:szCs w:val="19"/>
-        </w:rPr>
-        <w:t xml:space="preserve">transcript.final</w:t>
-      </w:r>
-      <w:r>
-        <w:t xml:space="preserve"> and </w:t>
-      </w:r>
-      <w:r>
-        <w:rPr>
-          <w:rFonts w:ascii="Consolas" w:cs="Consolas" w:eastAsia="Consolas" w:hAnsi="Consolas"/>
-          <w:color w:val="24292F"/>
-          <w:sz w:val="19"/>
-          <w:szCs w:val="19"/>
-        </w:rPr>
-        <w:t xml:space="preserve">translation.final</w:t>
-      </w:r>
-      <w:r>
-        <w:t xml:space="preserve">, or errors such as </w:t>
-      </w:r>
-      <w:r>
-        <w:rPr>
-          <w:rFonts w:ascii="Consolas" w:cs="Consolas" w:eastAsia="Consolas" w:hAnsi="Consolas"/>
-          <w:color w:val="24292F"/>
-          <w:sz w:val="19"/>
-          <w:szCs w:val="19"/>
-        </w:rPr>
-        <w:t xml:space="preserve">provider_unavailable</w:t>
-      </w:r>
-      <w:r>
-        <w:t xml:space="preserve"> and </w:t>
-      </w:r>
-      <w:r>
-        <w:rPr>
-          <w:rFonts w:ascii="Consolas" w:cs="Consolas" w:eastAsia="Consolas" w:hAnsi="Consolas"/>
-          <w:color w:val="24292F"/>
-          <w:sz w:val="19"/>
-          <w:szCs w:val="19"/>
-        </w:rPr>
-        <w:t xml:space="preserve">quota_exceeded</w:t>
-      </w:r>
-      <w:r>
-        <w:t xml:space="preserve">.</w:t>
-      </w:r>
-    </w:p>
-    <w:p>
-      <w:pPr>
-        <w:pStyle w:val="ListParagraph"/>
-        <w:numPr>
-          <w:ilvl w:val="0"/>
-          <w:numId w:val="2"/>
-        </w:numPr>
-        <w:spacing w:after="60" w:line="276"/>
-      </w:pPr>
-      <w:r>
         <w:t xml:space="preserve">Tests with a fake provider, so tests never call the real service or use the quota.</w:t>
       </w:r>
     </w:p>
@@ -13579,7 +12778,7 @@
         <w:spacing w:after="60" w:line="276"/>
       </w:pPr>
       <w:r>
-        <w:t xml:space="preserve">Speaking the listener's own language shows the original with "already in your language".</w:t>
+        <w:t xml:space="preserve">Noise or coughing is ignored and listening continues.</w:t>
       </w:r>
     </w:p>
     <w:p>
@@ -13781,7 +12980,19 @@
         <w:spacing w:after="60" w:line="276"/>
       </w:pPr>
       <w:r>
-        <w:t xml:space="preserve">While a voice is playing, disable both talk buttons and send no audio frames, so the translation is not recorded again.</w:t>
+        <w:t xml:space="preserve">While a voice is playing, send </w:t>
+      </w:r>
+      <w:r>
+        <w:rPr>
+          <w:rFonts w:ascii="Consolas" w:cs="Consolas" w:eastAsia="Consolas" w:hAnsi="Consolas"/>
+          <w:color w:val="24292F"/>
+          <w:sz w:val="19"/>
+          <w:szCs w:val="19"/>
+        </w:rPr>
+        <w:t xml:space="preserve">audio.pause</w:t>
+      </w:r>
+      <w:r>
+        <w:t xml:space="preserve"> and no audio frames, so the translation is not heard again; resume streaming when playback ends.</w:t>
       </w:r>
     </w:p>
     <w:p>
@@ -14306,7 +13517,7 @@
                 <w:sz w:val="19"/>
                 <w:szCs w:val="19"/>
               </w:rPr>
-              <w:t xml:space="preserve">2B Hands-free</w:t>
+              <w:t xml:space="preserve">2B Two devices (open decision)</w:t>
             </w:r>
           </w:p>
         </w:tc>
@@ -14335,7 +13546,7 @@
                 <w:sz w:val="19"/>
                 <w:szCs w:val="19"/>
               </w:rPr>
-              <w:t xml:space="preserve">Hands-free toggle; who-is-speaking indicator</w:t>
+              <w:t xml:space="preserve">Each person joins from their own device</w:t>
             </w:r>
           </w:p>
         </w:tc>
@@ -14364,7 +13575,7 @@
                 <w:sz w:val="19"/>
                 <w:szCs w:val="19"/>
               </w:rPr>
-              <w:t xml:space="preserve">Detected language decides the direction when the two languages differ</w:t>
+              <w:t xml:space="preserve">Speaker known from the device</w:t>
             </w:r>
           </w:p>
         </w:tc>
@@ -14393,7 +13604,7 @@
                 <w:sz w:val="19"/>
                 <w:szCs w:val="19"/>
               </w:rPr>
-              <w:t xml:space="preserve">A conversation works without tapping</w:t>
+              <w:t xml:space="preserve">Works even when both people choose the same language</w:t>
             </w:r>
           </w:p>
         </w:tc>
@@ -15090,7 +14301,7 @@
           <w:sz w:val="18"/>
           <w:szCs w:val="18"/>
         </w:rPr>
-        <w:t xml:space="preserve">│       │   ├── live-session/          SplitView, TalkButton, conversationStore</w:t>
+        <w:t xml:space="preserve">│       │   ├── live-session/          SplitView, ListeningIndicator, conversationStore</w:t>
       </w:r>
     </w:p>
     <w:p>

</xml_diff>

<commit_message>
Call mode: translate browser-tab calls such as Google Meet from two tagged audio sources, speaker taken from the source
</commit_message>
<xml_diff>
--- a/docs/DEVELOPER-HANDBOOK.docx
+++ b/docs/DEVELOPER-HANDBOOK.docx
@@ -230,7 +230,7 @@
                 <w:sz w:val="19"/>
                 <w:szCs w:val="19"/>
               </w:rPr>
-              <w:t xml:space="preserve">1.4, 18 October 2026 (aligned with docs/PROTOCOL.md v2, hands-free)</w:t>
+              <w:t xml:space="preserve">1.5, 18 October 2026 (aligned with docs/PROTOCOL.md v3: hands-free and call mode)</w:t>
             </w:r>
           </w:p>
         </w:tc>
@@ -4105,7 +4105,7 @@
           <w:sz w:val="19"/>
           <w:szCs w:val="19"/>
         </w:rPr>
-        <w:t xml:space="preserve">{"status":"ok","version":"0.6.0"}</w:t>
+        <w:t xml:space="preserve">{"status":"ok","version":"0.7.0"}</w:t>
       </w:r>
       <w:r>
         <w:t xml:space="preserve">.</w:t>
@@ -5115,6 +5115,99 @@
                 <w:sz w:val="19"/>
                 <w:szCs w:val="19"/>
               </w:rPr>
+              <w:t xml:space="preserve">1G Call mode</w:t>
+            </w:r>
+          </w:p>
+        </w:tc>
+        <w:tc>
+          <w:tcPr>
+            <w:tcW w:type="dxa" w:w="2891"/>
+            <w:tcBorders>
+              <w:top w:val="single" w:color="C9D1D9" w:sz="4"/>
+              <w:left w:val="single" w:color="C9D1D9" w:sz="4"/>
+              <w:bottom w:val="single" w:color="C9D1D9" w:sz="4"/>
+              <w:right w:val="single" w:color="C9D1D9" w:sz="4"/>
+            </w:tcBorders>
+            <w:tcMar>
+              <w:top w:type="dxa" w:w="60"/>
+              <w:left w:type="dxa" w:w="100"/>
+              <w:bottom w:type="dxa" w:w="60"/>
+              <w:right w:type="dxa" w:w="100"/>
+            </w:tcMar>
+          </w:tcPr>
+          <w:p>
+            <w:pPr>
+              <w:spacing w:after="40" w:line="252"/>
+            </w:pPr>
+            <w:r>
+              <w:rPr>
+                <w:rFonts w:ascii="Consolas" w:cs="Consolas" w:eastAsia="Consolas" w:hAnsi="Consolas"/>
+                <w:color w:val="24292F"/>
+                <w:sz w:val="19"/>
+                <w:szCs w:val="19"/>
+              </w:rPr>
+              <w:t xml:space="preserve">1g-frontend</w:t>
+            </w:r>
+          </w:p>
+        </w:tc>
+        <w:tc>
+          <w:tcPr>
+            <w:tcW w:type="dxa" w:w="2892"/>
+            <w:tcBorders>
+              <w:top w:val="single" w:color="C9D1D9" w:sz="4"/>
+              <w:left w:val="single" w:color="C9D1D9" w:sz="4"/>
+              <w:bottom w:val="single" w:color="C9D1D9" w:sz="4"/>
+              <w:right w:val="single" w:color="C9D1D9" w:sz="4"/>
+            </w:tcBorders>
+            <w:tcMar>
+              <w:top w:type="dxa" w:w="60"/>
+              <w:left w:type="dxa" w:w="100"/>
+              <w:bottom w:type="dxa" w:w="60"/>
+              <w:right w:type="dxa" w:w="100"/>
+            </w:tcMar>
+          </w:tcPr>
+          <w:p>
+            <w:pPr>
+              <w:spacing w:after="40" w:line="252"/>
+            </w:pPr>
+            <w:r>
+              <w:rPr>
+                <w:rFonts w:ascii="Consolas" w:cs="Consolas" w:eastAsia="Consolas" w:hAnsi="Consolas"/>
+                <w:color w:val="24292F"/>
+                <w:sz w:val="19"/>
+                <w:szCs w:val="19"/>
+              </w:rPr>
+              <w:t xml:space="preserve">call-mode</w:t>
+            </w:r>
+          </w:p>
+        </w:tc>
+      </w:tr>
+      <w:tr>
+        <w:tc>
+          <w:tcPr>
+            <w:tcW w:type="dxa" w:w="3855"/>
+            <w:tcBorders>
+              <w:top w:val="single" w:color="C9D1D9" w:sz="4"/>
+              <w:left w:val="single" w:color="C9D1D9" w:sz="4"/>
+              <w:bottom w:val="single" w:color="C9D1D9" w:sz="4"/>
+              <w:right w:val="single" w:color="C9D1D9" w:sz="4"/>
+            </w:tcBorders>
+            <w:tcMar>
+              <w:top w:type="dxa" w:w="60"/>
+              <w:left w:type="dxa" w:w="100"/>
+              <w:bottom w:type="dxa" w:w="60"/>
+              <w:right w:type="dxa" w:w="100"/>
+            </w:tcMar>
+          </w:tcPr>
+          <w:p>
+            <w:pPr>
+              <w:spacing w:after="40" w:line="252"/>
+            </w:pPr>
+            <w:r>
+              <w:rPr>
+                <w:sz w:val="19"/>
+                <w:szCs w:val="19"/>
+              </w:rPr>
               <w:t xml:space="preserve">1F Transcript download (open decision)</w:t>
             </w:r>
           </w:p>
@@ -6550,7 +6643,7 @@
                 <w:sz w:val="19"/>
                 <w:szCs w:val="19"/>
               </w:rPr>
-              <w:t xml:space="preserve">{"status":"ok","version":"0.6.0"}</w:t>
+              <w:t xml:space="preserve">{"status":"ok","version":"0.7.0"}</w:t>
             </w:r>
             <w:r>
               <w:rPr>
@@ -6965,7 +7058,7 @@
           <w:sz w:val="18"/>
           <w:szCs w:val="18"/>
         </w:rPr>
-        <w:t xml:space="preserve">  "participants": [</w:t>
+        <w:t xml:space="preserve">  "mode": "together",</w:t>
       </w:r>
     </w:p>
     <w:p>
@@ -6984,7 +7077,7 @@
           <w:sz w:val="18"/>
           <w:szCs w:val="18"/>
         </w:rPr>
-        <w:t xml:space="preserve">    { "id": "A", "name": "Person A", "preferred_language": "en" },</w:t>
+        <w:t xml:space="preserve">  "participants": [</w:t>
       </w:r>
     </w:p>
     <w:p>
@@ -7003,7 +7096,7 @@
           <w:sz w:val="18"/>
           <w:szCs w:val="18"/>
         </w:rPr>
-        <w:t xml:space="preserve">    { "id": "B", "name": "Person B", "preferred_language": "te" }</w:t>
+        <w:t xml:space="preserve">    { "id": "A", "name": "Person A", "preferred_language": "en" },</w:t>
       </w:r>
     </w:p>
     <w:p>
@@ -7022,7 +7115,7 @@
           <w:sz w:val="18"/>
           <w:szCs w:val="18"/>
         </w:rPr>
-        <w:t xml:space="preserve">  ]</w:t>
+        <w:t xml:space="preserve">    { "id": "B", "name": "Person B", "preferred_language": "te" }</w:t>
       </w:r>
     </w:p>
     <w:p>
@@ -7041,7 +7134,7 @@
           <w:sz w:val="18"/>
           <w:szCs w:val="18"/>
         </w:rPr>
-        <w:t xml:space="preserve">}</w:t>
+        <w:t xml:space="preserve">  ]</w:t>
       </w:r>
     </w:p>
     <w:p>
@@ -7060,7 +7153,7 @@
           <w:sz w:val="18"/>
           <w:szCs w:val="18"/>
         </w:rPr>
-        <w:t xml:space="preserve"> </w:t>
+        <w:t xml:space="preserve">}</w:t>
       </w:r>
     </w:p>
     <w:p>
@@ -7079,7 +7172,7 @@
           <w:sz w:val="18"/>
           <w:szCs w:val="18"/>
         </w:rPr>
-        <w:t xml:space="preserve">// response: 201 Created</w:t>
+        <w:t xml:space="preserve"> </w:t>
       </w:r>
     </w:p>
     <w:p>
@@ -7098,7 +7191,7 @@
           <w:sz w:val="18"/>
           <w:szCs w:val="18"/>
         </w:rPr>
-        <w:t xml:space="preserve">{</w:t>
+        <w:t xml:space="preserve">// response: 201 Created</w:t>
       </w:r>
     </w:p>
     <w:p>
@@ -7117,7 +7210,7 @@
           <w:sz w:val="18"/>
           <w:szCs w:val="18"/>
         </w:rPr>
-        <w:t xml:space="preserve">  "session_id": "6f1c2a9e-0d4b-4b8e-9a51-2f0e7c3d1a77",</w:t>
+        <w:t xml:space="preserve">{</w:t>
       </w:r>
     </w:p>
     <w:p>
@@ -7136,7 +7229,7 @@
           <w:sz w:val="18"/>
           <w:szCs w:val="18"/>
         </w:rPr>
-        <w:t xml:space="preserve">  "participants": [ ...same as sent... ],</w:t>
+        <w:t xml:space="preserve">  "session_id": "6f1c2a9e-0d4b-4b8e-9a51-2f0e7c3d1a77",</w:t>
       </w:r>
     </w:p>
     <w:p>
@@ -7155,6 +7248,44 @@
           <w:sz w:val="18"/>
           <w:szCs w:val="18"/>
         </w:rPr>
+        <w:t xml:space="preserve">  "mode": "together",</w:t>
+      </w:r>
+    </w:p>
+    <w:p>
+      <w:pPr>
+        <w:pBdr>
+          <w:left w:val="single" w:color="0969DA" w:sz="12" w:space="6"/>
+        </w:pBdr>
+        <w:shd w:fill="F6F8FA" w:color="auto" w:val="clear"/>
+        <w:spacing w:after="0" w:before="0" w:line="252"/>
+        <w:ind w:left="180"/>
+      </w:pPr>
+      <w:r>
+        <w:rPr>
+          <w:rFonts w:ascii="Consolas" w:cs="Consolas" w:eastAsia="Consolas" w:hAnsi="Consolas"/>
+          <w:color w:val="24292F"/>
+          <w:sz w:val="18"/>
+          <w:szCs w:val="18"/>
+        </w:rPr>
+        <w:t xml:space="preserve">  "participants": [ ...same as sent... ],</w:t>
+      </w:r>
+    </w:p>
+    <w:p>
+      <w:pPr>
+        <w:pBdr>
+          <w:left w:val="single" w:color="0969DA" w:sz="12" w:space="6"/>
+        </w:pBdr>
+        <w:shd w:fill="F6F8FA" w:color="auto" w:val="clear"/>
+        <w:spacing w:after="0" w:before="0" w:line="252"/>
+        <w:ind w:left="180"/>
+      </w:pPr>
+      <w:r>
+        <w:rPr>
+          <w:rFonts w:ascii="Consolas" w:cs="Consolas" w:eastAsia="Consolas" w:hAnsi="Consolas"/>
+          <w:color w:val="24292F"/>
+          <w:sz w:val="18"/>
+          <w:szCs w:val="18"/>
+        </w:rPr>
         <w:t xml:space="preserve">  "created_at": "2026-10-18T09:30:00Z"</w:t>
       </w:r>
     </w:p>
@@ -7230,7 +7361,43 @@
         <w:t xml:space="preserve">consent</w:t>
       </w:r>
       <w:r>
-        <w:t xml:space="preserve"> set to true. Otherwise the response is 422 with a readable message.</w:t>
+        <w:t xml:space="preserve"> set to true. </w:t>
+      </w:r>
+      <w:r>
+        <w:rPr>
+          <w:rFonts w:ascii="Consolas" w:cs="Consolas" w:eastAsia="Consolas" w:hAnsi="Consolas"/>
+          <w:color w:val="24292F"/>
+          <w:sz w:val="19"/>
+          <w:szCs w:val="19"/>
+        </w:rPr>
+        <w:t xml:space="preserve">mode</w:t>
+      </w:r>
+      <w:r>
+        <w:t xml:space="preserve"> is </w:t>
+      </w:r>
+      <w:r>
+        <w:rPr>
+          <w:rFonts w:ascii="Consolas" w:cs="Consolas" w:eastAsia="Consolas" w:hAnsi="Consolas"/>
+          <w:color w:val="24292F"/>
+          <w:sz w:val="19"/>
+          <w:szCs w:val="19"/>
+        </w:rPr>
+        <w:t xml:space="preserve">together</w:t>
+      </w:r>
+      <w:r>
+        <w:t xml:space="preserve"> (default, one shared microphone) or </w:t>
+      </w:r>
+      <w:r>
+        <w:rPr>
+          <w:rFonts w:ascii="Consolas" w:cs="Consolas" w:eastAsia="Consolas" w:hAnsi="Consolas"/>
+          <w:color w:val="24292F"/>
+          <w:sz w:val="19"/>
+          <w:szCs w:val="19"/>
+        </w:rPr>
+        <w:t xml:space="preserve">call</w:t>
+      </w:r>
+      <w:r>
+        <w:t xml:space="preserve"> (see Call mode). Otherwise the response is 422 with a readable message.</w:t>
       </w:r>
     </w:p>
     <w:p>
@@ -7326,7 +7493,7 @@
         <w:spacing w:after="60" w:line="276"/>
       </w:pPr>
       <w:r>
-        <w:t xml:space="preserve">Binary frames carry microphone audio (section 8.4).</w:t>
+        <w:t xml:space="preserve">Binary frames carry microphone audio (section 8.4); in call mode each starts with a one-byte source tag.</w:t>
       </w:r>
     </w:p>
     <w:p>
@@ -7745,7 +7912,7 @@
                 <w:sz w:val="19"/>
                 <w:szCs w:val="19"/>
               </w:rPr>
-              <w:t xml:space="preserve">raw audio bytes (8.4)</w:t>
+              <w:t xml:space="preserve">raw audio bytes (8.4); in call mode a one-byte source tag first</w:t>
             </w:r>
           </w:p>
         </w:tc>
@@ -7862,10 +8029,19 @@
             </w:pPr>
             <w:r>
               <w:rPr>
-                <w:sz w:val="19"/>
-                <w:szCs w:val="19"/>
-              </w:rPr>
-              <w:t xml:space="preserve">none</w:t>
+                <w:rFonts w:ascii="Consolas" w:cs="Consolas" w:eastAsia="Consolas" w:hAnsi="Consolas"/>
+                <w:color w:val="24292F"/>
+                <w:sz w:val="19"/>
+                <w:szCs w:val="19"/>
+              </w:rPr>
+              <w:t xml:space="preserve">participant_id</w:t>
+            </w:r>
+            <w:r>
+              <w:rPr>
+                <w:sz w:val="19"/>
+                <w:szCs w:val="19"/>
+              </w:rPr>
+              <w:t xml:space="preserve"> (optional, call mode only)</w:t>
             </w:r>
           </w:p>
         </w:tc>
@@ -7894,7 +8070,23 @@
                 <w:sz w:val="19"/>
                 <w:szCs w:val="19"/>
               </w:rPr>
-              <w:t xml:space="preserve">The browser stopped sending audio (for example while a translation is spoken). Any sentence in progress ends now.</w:t>
+              <w:t xml:space="preserve">The browser stopped sending audio (for example while a translation is spoken). Any sentence in progress ends now; in call mode, only that side's when </w:t>
+            </w:r>
+            <w:r>
+              <w:rPr>
+                <w:rFonts w:ascii="Consolas" w:cs="Consolas" w:eastAsia="Consolas" w:hAnsi="Consolas"/>
+                <w:color w:val="24292F"/>
+                <w:sz w:val="19"/>
+                <w:szCs w:val="19"/>
+              </w:rPr>
+              <w:t xml:space="preserve">participant_id</w:t>
+            </w:r>
+            <w:r>
+              <w:rPr>
+                <w:sz w:val="19"/>
+                <w:szCs w:val="19"/>
+              </w:rPr>
+              <w:t xml:space="preserve"> is given.</w:t>
             </w:r>
           </w:p>
         </w:tc>
@@ -8231,6 +8423,127 @@
       </w:r>
       <w:r>
         <w:t xml:space="preserve"> and stops sending audio, so the app never hears itself.</w:t>
+      </w:r>
+    </w:p>
+    <w:p>
+      <w:pPr>
+        <w:pStyle w:val="Heading3"/>
+        <w:spacing w:after="80" w:before="200"/>
+      </w:pPr>
+      <w:r>
+        <w:t xml:space="preserve">Call mode</w:t>
+      </w:r>
+    </w:p>
+    <w:p>
+      <w:pPr>
+        <w:pStyle w:val="ListParagraph"/>
+        <w:numPr>
+          <w:ilvl w:val="0"/>
+          <w:numId w:val="2"/>
+        </w:numPr>
+        <w:spacing w:after="60" w:line="276"/>
+      </w:pPr>
+      <w:r>
+        <w:t xml:space="preserve">For translating a call that runs in a browser tab: Google Meet, or Zoom and Teams on the web (desktop call apps have no tab to capture). It needs the server voice; without </w:t>
+      </w:r>
+      <w:r>
+        <w:rPr>
+          <w:rFonts w:ascii="Consolas" w:cs="Consolas" w:eastAsia="Consolas" w:hAnsi="Consolas"/>
+          <w:color w:val="24292F"/>
+          <w:sz w:val="19"/>
+          <w:szCs w:val="19"/>
+        </w:rPr>
+        <w:t xml:space="preserve">GEMINI_TTS_MODEL</w:t>
+      </w:r>
+      <w:r>
+        <w:t xml:space="preserve"> creating a call session gets 503. Person A is the user of this device; Person B is the other person on the call. Create the session with </w:t>
+      </w:r>
+      <w:r>
+        <w:rPr>
+          <w:rFonts w:ascii="Consolas" w:cs="Consolas" w:eastAsia="Consolas" w:hAnsi="Consolas"/>
+          <w:color w:val="24292F"/>
+          <w:sz w:val="19"/>
+          <w:szCs w:val="19"/>
+        </w:rPr>
+        <w:t xml:space="preserve">"mode": "call"</w:t>
+      </w:r>
+      <w:r>
+        <w:t xml:space="preserve">.</w:t>
+      </w:r>
+    </w:p>
+    <w:p>
+      <w:pPr>
+        <w:pStyle w:val="ListParagraph"/>
+        <w:numPr>
+          <w:ilvl w:val="0"/>
+          <w:numId w:val="2"/>
+        </w:numPr>
+        <w:spacing w:after="60" w:line="276"/>
+      </w:pPr>
+      <w:r>
+        <w:t xml:space="preserve">The browser streams two sources on one live channel: the microphone (A) and the call tab's sound (B). Every binary frame starts with one byte, </w:t>
+      </w:r>
+      <w:r>
+        <w:rPr>
+          <w:rFonts w:ascii="Consolas" w:cs="Consolas" w:eastAsia="Consolas" w:hAnsi="Consolas"/>
+          <w:color w:val="24292F"/>
+          <w:sz w:val="19"/>
+          <w:szCs w:val="19"/>
+        </w:rPr>
+        <w:t xml:space="preserve">A</w:t>
+      </w:r>
+      <w:r>
+        <w:t xml:space="preserve"> or </w:t>
+      </w:r>
+      <w:r>
+        <w:rPr>
+          <w:rFonts w:ascii="Consolas" w:cs="Consolas" w:eastAsia="Consolas" w:hAnsi="Consolas"/>
+          <w:color w:val="24292F"/>
+          <w:sz w:val="19"/>
+          <w:szCs w:val="19"/>
+        </w:rPr>
+        <w:t xml:space="preserve">B</w:t>
+      </w:r>
+      <w:r>
+        <w:t xml:space="preserve">, then the audio. Each source is listened to separately.</w:t>
+      </w:r>
+    </w:p>
+    <w:p>
+      <w:pPr>
+        <w:pStyle w:val="ListParagraph"/>
+        <w:numPr>
+          <w:ilvl w:val="0"/>
+          <w:numId w:val="2"/>
+        </w:numPr>
+        <w:spacing w:after="60" w:line="276"/>
+      </w:pPr>
+      <w:r>
+        <w:t xml:space="preserve">The speaker is the source, never guessed from the language. The other person gets a translation and a voice for every sentence, even in their own language, because they hear the user only through the voice.</w:t>
+      </w:r>
+    </w:p>
+    <w:p>
+      <w:pPr>
+        <w:pStyle w:val="ListParagraph"/>
+        <w:numPr>
+          <w:ilvl w:val="0"/>
+          <w:numId w:val="2"/>
+        </w:numPr>
+        <w:spacing w:after="60" w:line="276"/>
+      </w:pPr>
+      <w:r>
+        <w:t xml:space="preserve">Voices for A play in the headphones; voices for B play into a free virtual microphone (VB-Cable) that the call app uses, so the other person hears only the translation. Headphones are required, and </w:t>
+      </w:r>
+      <w:r>
+        <w:rPr>
+          <w:rFonts w:ascii="Consolas" w:cs="Consolas" w:eastAsia="Consolas" w:hAnsi="Consolas"/>
+          <w:color w:val="24292F"/>
+          <w:sz w:val="19"/>
+          <w:szCs w:val="19"/>
+        </w:rPr>
+        <w:t xml:space="preserve">audio.pause</w:t>
+      </w:r>
+      <w:r>
+        <w:t xml:space="preserve"> is not sent while voices play.</w:t>
       </w:r>
     </w:p>
     <w:p>
@@ -8911,34 +9224,12 @@
               </w:rPr>
               <w:t xml:space="preserve">server_voice</w:t>
             </w:r>
-          </w:p>
-        </w:tc>
-        <w:tc>
-          <w:tcPr>
-            <w:tcW w:type="dxa" w:w="3182"/>
-            <w:tcBorders>
-              <w:top w:val="single" w:color="C9D1D9" w:sz="4"/>
-              <w:left w:val="single" w:color="C9D1D9" w:sz="4"/>
-              <w:bottom w:val="single" w:color="C9D1D9" w:sz="4"/>
-              <w:right w:val="single" w:color="C9D1D9" w:sz="4"/>
-            </w:tcBorders>
-            <w:tcMar>
-              <w:top w:type="dxa" w:w="60"/>
-              <w:left w:type="dxa" w:w="100"/>
-              <w:bottom w:type="dxa" w:w="60"/>
-              <w:right w:type="dxa" w:w="100"/>
-            </w:tcMar>
-          </w:tcPr>
-          <w:p>
-            <w:pPr>
-              <w:spacing w:after="40" w:line="252"/>
-            </w:pPr>
-            <w:r>
-              <w:rPr>
-                <w:sz w:val="19"/>
-                <w:szCs w:val="19"/>
-              </w:rPr>
-              <w:t xml:space="preserve">The live channel is open. </w:t>
+            <w:r>
+              <w:rPr>
+                <w:sz w:val="19"/>
+                <w:szCs w:val="19"/>
+              </w:rPr>
+              <w:t xml:space="preserve">, </w:t>
             </w:r>
             <w:r>
               <w:rPr>
@@ -8947,6 +9238,44 @@
                 <w:sz w:val="19"/>
                 <w:szCs w:val="19"/>
               </w:rPr>
+              <w:t xml:space="preserve">mode</w:t>
+            </w:r>
+          </w:p>
+        </w:tc>
+        <w:tc>
+          <w:tcPr>
+            <w:tcW w:type="dxa" w:w="3182"/>
+            <w:tcBorders>
+              <w:top w:val="single" w:color="C9D1D9" w:sz="4"/>
+              <w:left w:val="single" w:color="C9D1D9" w:sz="4"/>
+              <w:bottom w:val="single" w:color="C9D1D9" w:sz="4"/>
+              <w:right w:val="single" w:color="C9D1D9" w:sz="4"/>
+            </w:tcBorders>
+            <w:tcMar>
+              <w:top w:type="dxa" w:w="60"/>
+              <w:left w:type="dxa" w:w="100"/>
+              <w:bottom w:type="dxa" w:w="60"/>
+              <w:right w:type="dxa" w:w="100"/>
+            </w:tcMar>
+          </w:tcPr>
+          <w:p>
+            <w:pPr>
+              <w:spacing w:after="40" w:line="252"/>
+            </w:pPr>
+            <w:r>
+              <w:rPr>
+                <w:sz w:val="19"/>
+                <w:szCs w:val="19"/>
+              </w:rPr>
+              <w:t xml:space="preserve">The live channel is open. </w:t>
+            </w:r>
+            <w:r>
+              <w:rPr>
+                <w:rFonts w:ascii="Consolas" w:cs="Consolas" w:eastAsia="Consolas" w:hAnsi="Consolas"/>
+                <w:color w:val="24292F"/>
+                <w:sz w:val="19"/>
+                <w:szCs w:val="19"/>
+              </w:rPr>
               <w:t xml:space="preserve">server_voice</w:t>
             </w:r>
             <w:r>
@@ -9199,6 +9528,22 @@
                 <w:sz w:val="19"/>
                 <w:szCs w:val="19"/>
               </w:rPr>
+              <w:t xml:space="preserve">speaker_id</w:t>
+            </w:r>
+            <w:r>
+              <w:rPr>
+                <w:sz w:val="19"/>
+                <w:szCs w:val="19"/>
+              </w:rPr>
+              <w:t xml:space="preserve"> (null until known), </w:t>
+            </w:r>
+            <w:r>
+              <w:rPr>
+                <w:rFonts w:ascii="Consolas" w:cs="Consolas" w:eastAsia="Consolas" w:hAnsi="Consolas"/>
+                <w:color w:val="24292F"/>
+                <w:sz w:val="19"/>
+                <w:szCs w:val="19"/>
+              </w:rPr>
               <w:t xml:space="preserve">duration_ms</w:t>
             </w:r>
           </w:p>
@@ -10226,36 +10571,7 @@
                 <w:sz w:val="19"/>
                 <w:szCs w:val="19"/>
               </w:rPr>
-              <w:t xml:space="preserve"> (or null)</w:t>
-            </w:r>
-          </w:p>
-        </w:tc>
-        <w:tc>
-          <w:tcPr>
-            <w:tcW w:type="dxa" w:w="3182"/>
-            <w:tcBorders>
-              <w:top w:val="single" w:color="C9D1D9" w:sz="4"/>
-              <w:left w:val="single" w:color="C9D1D9" w:sz="4"/>
-              <w:bottom w:val="single" w:color="C9D1D9" w:sz="4"/>
-              <w:right w:val="single" w:color="C9D1D9" w:sz="4"/>
-            </w:tcBorders>
-            <w:tcMar>
-              <w:top w:type="dxa" w:w="60"/>
-              <w:left w:type="dxa" w:w="100"/>
-              <w:bottom w:type="dxa" w:w="60"/>
-              <w:right w:type="dxa" w:w="100"/>
-            </w:tcMar>
-          </w:tcPr>
-          <w:p>
-            <w:pPr>
-              <w:spacing w:after="40" w:line="252"/>
-            </w:pPr>
-            <w:r>
-              <w:rPr>
-                <w:sz w:val="19"/>
-                <w:szCs w:val="19"/>
-              </w:rPr>
-              <w:t xml:space="preserve">Something went wrong. Show </w:t>
+              <w:t xml:space="preserve"> (or null); </w:t>
             </w:r>
             <w:r>
               <w:rPr>
@@ -10264,6 +10580,60 @@
                 <w:sz w:val="19"/>
                 <w:szCs w:val="19"/>
               </w:rPr>
+              <w:t xml:space="preserve">voice_unavailable</w:t>
+            </w:r>
+            <w:r>
+              <w:rPr>
+                <w:sz w:val="19"/>
+                <w:szCs w:val="19"/>
+              </w:rPr>
+              <w:t xml:space="preserve"> also has </w:t>
+            </w:r>
+            <w:r>
+              <w:rPr>
+                <w:rFonts w:ascii="Consolas" w:cs="Consolas" w:eastAsia="Consolas" w:hAnsi="Consolas"/>
+                <w:color w:val="24292F"/>
+                <w:sz w:val="19"/>
+                <w:szCs w:val="19"/>
+              </w:rPr>
+              <w:t xml:space="preserve">listener_id</w:t>
+            </w:r>
+          </w:p>
+        </w:tc>
+        <w:tc>
+          <w:tcPr>
+            <w:tcW w:type="dxa" w:w="3182"/>
+            <w:tcBorders>
+              <w:top w:val="single" w:color="C9D1D9" w:sz="4"/>
+              <w:left w:val="single" w:color="C9D1D9" w:sz="4"/>
+              <w:bottom w:val="single" w:color="C9D1D9" w:sz="4"/>
+              <w:right w:val="single" w:color="C9D1D9" w:sz="4"/>
+            </w:tcBorders>
+            <w:tcMar>
+              <w:top w:type="dxa" w:w="60"/>
+              <w:left w:type="dxa" w:w="100"/>
+              <w:bottom w:type="dxa" w:w="60"/>
+              <w:right w:type="dxa" w:w="100"/>
+            </w:tcMar>
+          </w:tcPr>
+          <w:p>
+            <w:pPr>
+              <w:spacing w:after="40" w:line="252"/>
+            </w:pPr>
+            <w:r>
+              <w:rPr>
+                <w:sz w:val="19"/>
+                <w:szCs w:val="19"/>
+              </w:rPr>
+              <w:t xml:space="preserve">Something went wrong. Show </w:t>
+            </w:r>
+            <w:r>
+              <w:rPr>
+                <w:rFonts w:ascii="Consolas" w:cs="Consolas" w:eastAsia="Consolas" w:hAnsi="Consolas"/>
+                <w:color w:val="24292F"/>
+                <w:sz w:val="19"/>
+                <w:szCs w:val="19"/>
+              </w:rPr>
               <w:t xml:space="preserve">message</w:t>
             </w:r>
             <w:r>
@@ -10289,6 +10659,14 @@
       </w:pPr>
       <w:r>
         <w:t xml:space="preserve">Who spoke</w:t>
+      </w:r>
+    </w:p>
+    <w:p>
+      <w:pPr>
+        <w:spacing w:after="120" w:line="276"/>
+      </w:pPr>
+      <w:r>
+        <w:t xml:space="preserve">In together mode the language heard decides; in call mode the speaker is the audio source (see Call mode).</w:t>
       </w:r>
     </w:p>
     <w:p>
@@ -10434,7 +10812,7 @@
           <w:sz w:val="18"/>
           <w:szCs w:val="18"/>
         </w:rPr>
-        <w:t xml:space="preserve">&lt;- {"type":"utterance.received","seq":2,"utterance_id":"7c9e6679-7425-40de-944b-e07fc1f90ae7","duration_ms":2100}</w:t>
+        <w:t xml:space="preserve">&lt;- {"type":"utterance.received","seq":2,"utterance_id":"7c9e6679-7425-40de-944b-e07fc1f90ae7","speaker_id":null,"duration_ms":2100}</w:t>
       </w:r>
     </w:p>
     <w:p>
@@ -13163,6 +13541,295 @@
       </w:pPr>
       <w:r>
         <w:t xml:space="preserve">A language without a voice shows the captions-only message.</w:t>
+      </w:r>
+    </w:p>
+    <w:p>
+      <w:pPr>
+        <w:pStyle w:val="Heading2"/>
+        <w:spacing w:after="120" w:before="280"/>
+      </w:pPr>
+      <w:r>
+        <w:t xml:space="preserve">Step 1G: Call mode</w:t>
+      </w:r>
+    </w:p>
+    <w:p>
+      <w:pPr>
+        <w:spacing w:after="120" w:line="276"/>
+      </w:pPr>
+      <w:r>
+        <w:rPr>
+          <w:b/>
+          <w:bCs/>
+        </w:rPr>
+        <w:t xml:space="preserve">Goal:</w:t>
+      </w:r>
+      <w:r>
+        <w:t xml:space="preserve"> translate a call that runs in a browser tab (Google Meet, or Zoom and Teams on the web). The user reads and hears the other person in their own language; the other person hears only the user's translated voice and installs nothing. Starts after Step 1E is merged.</w:t>
+      </w:r>
+    </w:p>
+    <w:p>
+      <w:pPr>
+        <w:pStyle w:val="Heading3"/>
+        <w:spacing w:after="80" w:before="200"/>
+      </w:pPr>
+      <w:r>
+        <w:t xml:space="preserve">One-time setup on the user's computer</w:t>
+      </w:r>
+    </w:p>
+    <w:p>
+      <w:pPr>
+        <w:pStyle w:val="ListParagraph"/>
+        <w:numPr>
+          <w:ilvl w:val="0"/>
+          <w:numId w:val="14"/>
+        </w:numPr>
+        <w:spacing w:after="60" w:line="276"/>
+      </w:pPr>
+      <w:r>
+        <w:t xml:space="preserve">Install the free VB-Cable (vb-audio.com/Cable). It adds a speaker called "CABLE Input" and a microphone called "CABLE Output".</w:t>
+      </w:r>
+    </w:p>
+    <w:p>
+      <w:pPr>
+        <w:pStyle w:val="ListParagraph"/>
+        <w:numPr>
+          <w:ilvl w:val="0"/>
+          <w:numId w:val="14"/>
+        </w:numPr>
+        <w:spacing w:after="60" w:line="276"/>
+      </w:pPr>
+      <w:r>
+        <w:t xml:space="preserve">In the call app, set the microphone to "CABLE Output" and keep the speaker on the headphones.</w:t>
+      </w:r>
+    </w:p>
+    <w:p>
+      <w:pPr>
+        <w:pStyle w:val="ListParagraph"/>
+        <w:numPr>
+          <w:ilvl w:val="0"/>
+          <w:numId w:val="14"/>
+        </w:numPr>
+        <w:spacing w:after="60" w:line="276"/>
+      </w:pPr>
+      <w:r>
+        <w:t xml:space="preserve">Wear headphones.</w:t>
+      </w:r>
+    </w:p>
+    <w:p>
+      <w:pPr>
+        <w:pStyle w:val="Heading3"/>
+        <w:spacing w:after="80" w:before="200"/>
+      </w:pPr>
+      <w:r>
+        <w:t xml:space="preserve">Frontend tasks (Developer A, branch 1g-frontend)</w:t>
+      </w:r>
+    </w:p>
+    <w:p>
+      <w:pPr>
+        <w:pStyle w:val="ListParagraph"/>
+        <w:numPr>
+          <w:ilvl w:val="0"/>
+          <w:numId w:val="15"/>
+        </w:numPr>
+        <w:spacing w:after="60" w:line="276"/>
+      </w:pPr>
+      <w:r>
+        <w:t xml:space="preserve">A mode choice on the welcome screen: "Together (one device)" or "Call (Google Meet or another call in a browser tab)". In call mode, Person A is "You" and Person B is "Other person on the call".</w:t>
+      </w:r>
+    </w:p>
+    <w:p>
+      <w:pPr>
+        <w:pStyle w:val="ListParagraph"/>
+        <w:numPr>
+          <w:ilvl w:val="0"/>
+          <w:numId w:val="15"/>
+        </w:numPr>
+        <w:spacing w:after="60" w:line="276"/>
+      </w:pPr>
+      <w:r>
+        <w:t xml:space="preserve">Capture the call's sound with </w:t>
+      </w:r>
+      <w:r>
+        <w:rPr>
+          <w:rFonts w:ascii="Consolas" w:cs="Consolas" w:eastAsia="Consolas" w:hAnsi="Consolas"/>
+          <w:color w:val="24292F"/>
+          <w:sz w:val="19"/>
+          <w:szCs w:val="19"/>
+        </w:rPr>
+        <w:t xml:space="preserve">getDisplayMedia({ video: true, audio: true })</w:t>
+      </w:r>
+      <w:r>
+        <w:t xml:space="preserve"> on the call's tab ("Also share tab audio"), keep only the audio track, and stream it as source B next to the microphone as source A, each frame tagged with its byte.</w:t>
+      </w:r>
+    </w:p>
+    <w:p>
+      <w:pPr>
+        <w:pStyle w:val="ListParagraph"/>
+        <w:numPr>
+          <w:ilvl w:val="0"/>
+          <w:numId w:val="15"/>
+        </w:numPr>
+        <w:spacing w:after="60" w:line="276"/>
+      </w:pPr>
+      <w:r>
+        <w:t xml:space="preserve">Play voices for listener A on the default output and voices for listener B on "CABLE Input" with </w:t>
+      </w:r>
+      <w:r>
+        <w:rPr>
+          <w:rFonts w:ascii="Consolas" w:cs="Consolas" w:eastAsia="Consolas" w:hAnsi="Consolas"/>
+          <w:color w:val="24292F"/>
+          <w:sz w:val="19"/>
+          <w:szCs w:val="19"/>
+        </w:rPr>
+        <w:t xml:space="preserve">setSinkId</w:t>
+      </w:r>
+      <w:r>
+        <w:t xml:space="preserve">, in two separate queues. Do not send </w:t>
+      </w:r>
+      <w:r>
+        <w:rPr>
+          <w:rFonts w:ascii="Consolas" w:cs="Consolas" w:eastAsia="Consolas" w:hAnsi="Consolas"/>
+          <w:color w:val="24292F"/>
+          <w:sz w:val="19"/>
+          <w:szCs w:val="19"/>
+        </w:rPr>
+        <w:t xml:space="preserve">audio.pause</w:t>
+      </w:r>
+      <w:r>
+        <w:t xml:space="preserve"> while voices play.</w:t>
+      </w:r>
+    </w:p>
+    <w:p>
+      <w:pPr>
+        <w:pStyle w:val="ListParagraph"/>
+        <w:numPr>
+          <w:ilvl w:val="0"/>
+          <w:numId w:val="15"/>
+        </w:numPr>
+        <w:spacing w:after="60" w:line="276"/>
+      </w:pPr>
+      <w:r>
+        <w:t xml:space="preserve">When no server voice is available for listener B, show "The other person could not hear this sentence" on that turn.</w:t>
+      </w:r>
+    </w:p>
+    <w:p>
+      <w:pPr>
+        <w:pStyle w:val="ListParagraph"/>
+        <w:numPr>
+          <w:ilvl w:val="0"/>
+          <w:numId w:val="15"/>
+        </w:numPr>
+        <w:spacing w:after="60" w:line="276"/>
+      </w:pPr>
+      <w:r>
+        <w:t xml:space="preserve">A call layout, a "Test the virtual microphone" button, and clear errors for missing tab audio, a missing VB-Cable and browsers without </w:t>
+      </w:r>
+      <w:r>
+        <w:rPr>
+          <w:rFonts w:ascii="Consolas" w:cs="Consolas" w:eastAsia="Consolas" w:hAnsi="Consolas"/>
+          <w:color w:val="24292F"/>
+          <w:sz w:val="19"/>
+          <w:szCs w:val="19"/>
+        </w:rPr>
+        <w:t xml:space="preserve">setSinkId</w:t>
+      </w:r>
+      <w:r>
+        <w:t xml:space="preserve">.</w:t>
+      </w:r>
+    </w:p>
+    <w:p>
+      <w:pPr>
+        <w:pStyle w:val="Heading3"/>
+        <w:spacing w:after="80" w:before="200"/>
+      </w:pPr>
+      <w:r>
+        <w:t xml:space="preserve">Backend tasks (Developer B, branch call-mode)</w:t>
+      </w:r>
+    </w:p>
+    <w:p>
+      <w:pPr>
+        <w:pStyle w:val="ListParagraph"/>
+        <w:numPr>
+          <w:ilvl w:val="0"/>
+          <w:numId w:val="2"/>
+        </w:numPr>
+        <w:spacing w:after="60" w:line="276"/>
+      </w:pPr>
+      <w:r>
+        <w:t xml:space="preserve">Accept </w:t>
+      </w:r>
+      <w:r>
+        <w:rPr>
+          <w:rFonts w:ascii="Consolas" w:cs="Consolas" w:eastAsia="Consolas" w:hAnsi="Consolas"/>
+          <w:color w:val="24292F"/>
+          <w:sz w:val="19"/>
+          <w:szCs w:val="19"/>
+        </w:rPr>
+        <w:t xml:space="preserve">"mode": "call"</w:t>
+      </w:r>
+      <w:r>
+        <w:t xml:space="preserve">, one speech detector per tagged source, the speaker taken from the source, and translations only for the other person. Done.</w:t>
+      </w:r>
+    </w:p>
+    <w:p>
+      <w:pPr>
+        <w:pStyle w:val="Heading3"/>
+        <w:spacing w:after="80" w:before="200"/>
+      </w:pPr>
+      <w:r>
+        <w:t xml:space="preserve">Joint test</w:t>
+      </w:r>
+    </w:p>
+    <w:p>
+      <w:pPr>
+        <w:pStyle w:val="ListParagraph"/>
+        <w:numPr>
+          <w:ilvl w:val="0"/>
+          <w:numId w:val="16"/>
+        </w:numPr>
+        <w:spacing w:after="60" w:line="276"/>
+      </w:pPr>
+      <w:r>
+        <w:t xml:space="preserve">A Google Meet call between two devices, with our app in call mode on one of them.</w:t>
+      </w:r>
+    </w:p>
+    <w:p>
+      <w:pPr>
+        <w:pStyle w:val="ListParagraph"/>
+        <w:numPr>
+          <w:ilvl w:val="0"/>
+          <w:numId w:val="16"/>
+        </w:numPr>
+        <w:spacing w:after="60" w:line="276"/>
+      </w:pPr>
+      <w:r>
+        <w:t xml:space="preserve">The other person speaks Telugu: English captions appear and the English voice plays in the headphones.</w:t>
+      </w:r>
+    </w:p>
+    <w:p>
+      <w:pPr>
+        <w:pStyle w:val="ListParagraph"/>
+        <w:numPr>
+          <w:ilvl w:val="0"/>
+          <w:numId w:val="16"/>
+        </w:numPr>
+        <w:spacing w:after="60" w:line="276"/>
+      </w:pPr>
+      <w:r>
+        <w:t xml:space="preserve">The user speaks English: the other person hears the Telugu voice in Meet, and none of the original voice.</w:t>
+      </w:r>
+    </w:p>
+    <w:p>
+      <w:pPr>
+        <w:pStyle w:val="ListParagraph"/>
+        <w:numPr>
+          <w:ilvl w:val="0"/>
+          <w:numId w:val="16"/>
+        </w:numPr>
+        <w:spacing w:after="60" w:line="276"/>
+      </w:pPr>
+      <w:r>
+        <w:t xml:space="preserve">Both talk at once: both sentences are captioned with the right speaker.</w:t>
       </w:r>
     </w:p>
     <w:p>
@@ -14728,6 +15395,19 @@
       </w:pPr>
       <w:r>
         <w:t xml:space="preserve">A missing API key, network errors, an exhausted free quota, unsupported audio and a blocked microphone all show clear messages.</w:t>
+      </w:r>
+    </w:p>
+    <w:p>
+      <w:pPr>
+        <w:pStyle w:val="ListParagraph"/>
+        <w:numPr>
+          <w:ilvl w:val="0"/>
+          <w:numId w:val="2"/>
+        </w:numPr>
+        <w:spacing w:after="60" w:line="276"/>
+      </w:pPr>
+      <w:r>
+        <w:t xml:space="preserve">Call mode: on a Google Meet call, each person reads and hears the other in their own language, and the other person hears every sentence through the virtual microphone.</w:t>
       </w:r>
     </w:p>
     <w:p>
@@ -15709,6 +16389,24 @@
     </w:lvlOverride>
   </w:num>
   <w:num w:numId="13">
+    <w:abstractNumId w:val="3"/>
+    <w:lvlOverride w:ilvl="0">
+      <w:startOverride w:val="1"/>
+    </w:lvlOverride>
+  </w:num>
+  <w:num w:numId="14">
+    <w:abstractNumId w:val="3"/>
+    <w:lvlOverride w:ilvl="0">
+      <w:startOverride w:val="1"/>
+    </w:lvlOverride>
+  </w:num>
+  <w:num w:numId="15">
+    <w:abstractNumId w:val="3"/>
+    <w:lvlOverride w:ilvl="0">
+      <w:startOverride w:val="1"/>
+    </w:lvlOverride>
+  </w:num>
+  <w:num w:numId="16">
     <w:abstractNumId w:val="3"/>
     <w:lvlOverride w:ilvl="0">
       <w:startOverride w:val="1"/>

</xml_diff>